<commit_message>
Polish GitHub Pages and embed SoftareX Word figures.
Brand-first home, honest corpus counts on Results/Metrics, quickstart
from GitHub, and PNG figures embedded in the OSP manuscript for Word
submission requirements.

Co-authored-by: Cursor <cursoragent@cursor.com>
</commit_message>
<xml_diff>
--- a/papers/softwarex/ChromeRAG_SoftwareX_OSP.docx
+++ b/papers/softwarex/ChromeRAG_SoftwareX_OSP.docx
@@ -1,6 +1,6 @@
 
 <file path=word/document.xml><?xml version="1.0" encoding="utf-8"?>
-<w:document xmlns:ns1="http://schemas.openxmlformats.org/markup-compatibility/2006" xmlns:ns2="http://schemas.microsoft.com/office/word/2010/wordml" xmlns:ns3="http://schemas.openxmlformats.org/officeDocument/2006/relationships" xmlns:w="http://schemas.openxmlformats.org/wordprocessingml/2006/main" ns1:Ignorable="w14 w15 w16se w16cid w16 w16cex w16sdtdh w16sdtfl w16du wp14">
+<w:document xmlns:a="http://schemas.openxmlformats.org/drawingml/2006/main" xmlns:ns1="http://schemas.openxmlformats.org/markup-compatibility/2006" xmlns:ns2="http://schemas.microsoft.com/office/word/2010/wordml" xmlns:pic="http://schemas.openxmlformats.org/drawingml/2006/picture" xmlns:r="http://schemas.openxmlformats.org/officeDocument/2006/relationships" xmlns:w="http://schemas.openxmlformats.org/wordprocessingml/2006/main" xmlns:wp="http://schemas.openxmlformats.org/drawingml/2006/wordprocessingDrawing" ns1:Ignorable="w14 w15 w16se w16cid w16 w16cex w16sdtdh w16sdtfl w16du wp14">
   <w:background w:color="FFFFFF"/>
   <w:body>
     <w:p ns2:paraId="51D86622" ns2:textId="60C12F37">
@@ -1227,6 +1227,190 @@
         <w:t>Priority knobs trade recall vs noise. Passing a near-empty div id=root shell prints a stderr WARNING that the caller must render first—reviewers should trust that disclosure more than a table that silently averages those failures.</w:t>
       </w:r>
     </w:p>
+    <w:p>
+      <w:r>
+        <w:drawing>
+          <wp:inline distT="0" distB="0" distL="0" distR="0">
+            <wp:extent cx="5943600" cy="3439800"/>
+            <wp:docPr id="1" name="fig1_fbal.png"/>
+            <a:graphic>
+              <a:graphicData uri="http://schemas.openxmlformats.org/drawingml/2006/picture">
+                <pic:pic>
+                  <pic:nvPicPr>
+                    <pic:cNvPr id="0" name="fig1_fbal.png"/>
+                    <pic:cNvPicPr/>
+                  </pic:nvPicPr>
+                  <pic:blipFill>
+                    <a:blip r:embed="rId26"/>
+                    <a:stretch>
+                      <a:fillRect/>
+                    </a:stretch>
+                  </pic:blipFill>
+                  <pic:spPr>
+                    <a:xfrm>
+                      <a:off x="0" y="0"/>
+                      <a:ext cx="5943600" cy="3439800"/>
+                    </a:xfrm>
+                    <a:prstGeom prst="rect">
+                      <a:avLst/>
+                    </a:prstGeom>
+                  </pic:spPr>
+                </pic:pic>
+              </a:graphicData>
+            </a:graphic>
+          </wp:inline>
+        </w:drawing>
+      </w:r>
+    </w:p>
+    <w:p>
+      <w:pPr>
+        <w:pStyle w:val="Body"/>
+      </w:pPr>
+      <w:r>
+        <w:rPr>
+          <w:i/>
+        </w:rPr>
+        <w:t>Figure 1. Fbal on 238 scoreable pages.</w:t>
+      </w:r>
+    </w:p>
+    <w:p>
+      <w:r>
+        <w:drawing>
+          <wp:inline distT="0" distB="0" distL="0" distR="0">
+            <wp:extent cx="5943600" cy="3439800"/>
+            <wp:docPr id="1" name="fig2_recall.png"/>
+            <a:graphic>
+              <a:graphicData uri="http://schemas.openxmlformats.org/drawingml/2006/picture">
+                <pic:pic>
+                  <pic:nvPicPr>
+                    <pic:cNvPr id="0" name="fig2_recall.png"/>
+                    <pic:cNvPicPr/>
+                  </pic:nvPicPr>
+                  <pic:blipFill>
+                    <a:blip r:embed="rId27"/>
+                    <a:stretch>
+                      <a:fillRect/>
+                    </a:stretch>
+                  </pic:blipFill>
+                  <pic:spPr>
+                    <a:xfrm>
+                      <a:off x="0" y="0"/>
+                      <a:ext cx="5943600" cy="3439800"/>
+                    </a:xfrm>
+                    <a:prstGeom prst="rect">
+                      <a:avLst/>
+                    </a:prstGeom>
+                  </pic:spPr>
+                </pic:pic>
+              </a:graphicData>
+            </a:graphic>
+          </wp:inline>
+        </w:drawing>
+      </w:r>
+    </w:p>
+    <w:p>
+      <w:pPr>
+        <w:pStyle w:val="Body"/>
+      </w:pPr>
+      <w:r>
+        <w:rPr>
+          <w:i/>
+        </w:rPr>
+        <w:t>Figure 2. Content recall on the same scoreable set.</w:t>
+      </w:r>
+    </w:p>
+    <w:p>
+      <w:r>
+        <w:drawing>
+          <wp:inline distT="0" distB="0" distL="0" distR="0">
+            <wp:extent cx="5943600" cy="3439800"/>
+            <wp:docPr id="1" name="fig3_noise.png"/>
+            <a:graphic>
+              <a:graphicData uri="http://schemas.openxmlformats.org/drawingml/2006/picture">
+                <pic:pic>
+                  <pic:nvPicPr>
+                    <pic:cNvPr id="0" name="fig3_noise.png"/>
+                    <pic:cNvPicPr/>
+                  </pic:nvPicPr>
+                  <pic:blipFill>
+                    <a:blip r:embed="rId28"/>
+                    <a:stretch>
+                      <a:fillRect/>
+                    </a:stretch>
+                  </pic:blipFill>
+                  <pic:spPr>
+                    <a:xfrm>
+                      <a:off x="0" y="0"/>
+                      <a:ext cx="5943600" cy="3439800"/>
+                    </a:xfrm>
+                    <a:prstGeom prst="rect">
+                      <a:avLst/>
+                    </a:prstGeom>
+                  </pic:spPr>
+                </pic:pic>
+              </a:graphicData>
+            </a:graphic>
+          </wp:inline>
+        </w:drawing>
+      </w:r>
+    </w:p>
+    <w:p>
+      <w:pPr>
+        <w:pStyle w:val="Body"/>
+      </w:pPr>
+      <w:r>
+        <w:rPr>
+          <w:i/>
+        </w:rPr>
+        <w:t>Figure 3. Noise retention (lower is better).</w:t>
+      </w:r>
+    </w:p>
+    <w:p>
+      <w:r>
+        <w:drawing>
+          <wp:inline distT="0" distB="0" distL="0" distR="0">
+            <wp:extent cx="5943600" cy="2376000"/>
+            <wp:docPr id="1" name="fig4_corpus_gate.png"/>
+            <a:graphic>
+              <a:graphicData uri="http://schemas.openxmlformats.org/drawingml/2006/picture">
+                <pic:pic>
+                  <pic:nvPicPr>
+                    <pic:cNvPr id="0" name="fig4_corpus_gate.png"/>
+                    <pic:cNvPicPr/>
+                  </pic:nvPicPr>
+                  <pic:blipFill>
+                    <a:blip r:embed="rId29"/>
+                    <a:stretch>
+                      <a:fillRect/>
+                    </a:stretch>
+                  </pic:blipFill>
+                  <pic:spPr>
+                    <a:xfrm>
+                      <a:off x="0" y="0"/>
+                      <a:ext cx="5943600" cy="2376000"/>
+                    </a:xfrm>
+                    <a:prstGeom prst="rect">
+                      <a:avLst/>
+                    </a:prstGeom>
+                  </pic:spPr>
+                </pic:pic>
+              </a:graphicData>
+            </a:graphic>
+          </wp:inline>
+        </w:drawing>
+      </w:r>
+    </w:p>
+    <w:p>
+      <w:pPr>
+        <w:pStyle w:val="Body"/>
+      </w:pPr>
+      <w:r>
+        <w:rPr>
+          <w:i/>
+        </w:rPr>
+        <w:t>Figure 4. Corpus honesty gate: listed → fetched → scoreable / thin.</w:t>
+      </w:r>
+    </w:p>
     <w:p ns2:paraId="50F2D018" ns2:textId="77948274">
       <w:pPr>
         <w:numPr>
@@ -1512,12 +1696,12 @@
       </w:pPr>
     </w:p>
     <w:sectPr>
-      <w:headerReference w:type="even" ns3:id="rId18"/>
-      <w:headerReference w:type="default" ns3:id="rId19"/>
-      <w:footerReference w:type="even" ns3:id="rId20"/>
-      <w:footerReference w:type="default" ns3:id="rId21"/>
-      <w:headerReference w:type="first" ns3:id="rId22"/>
-      <w:footerReference w:type="first" ns3:id="rId23"/>
+      <w:headerReference w:type="even" r:id="rId18"/>
+      <w:headerReference w:type="default" r:id="rId19"/>
+      <w:footerReference w:type="even" r:id="rId20"/>
+      <w:footerReference w:type="default" r:id="rId21"/>
+      <w:headerReference w:type="first" r:id="rId22"/>
+      <w:footerReference w:type="first" r:id="rId23"/>
       <w:pgSz w:w="12240" w:h="15840"/>
       <w:pgMar w:top="1440" w:right="1440" w:bottom="1440" w:left="1440" w:header="720" w:footer="720" w:gutter="0"/>
       <w:lnNumType w:countBy="1" w:restart="continuous"/>

</xml_diff>

<commit_message>
Release v0.1.0 metadata for SoftareX submission.
Bump package to 0.1.0, add LICENSE.txt, SoftareX Highlights and competing-
interests declaration files, and point C2 at the v0.1.0 tag URL.

Co-authored-by: Cursor <cursoragent@cursor.com>
</commit_message>
<xml_diff>
--- a/papers/softwarex/ChromeRAG_SoftwareX_OSP.docx
+++ b/papers/softwarex/ChromeRAG_SoftwareX_OSP.docx
@@ -1,6 +1,6 @@
 
 <file path=word/document.xml><?xml version="1.0" encoding="utf-8"?>
-<w:document xmlns:a="http://schemas.openxmlformats.org/drawingml/2006/main" xmlns:ns1="http://schemas.openxmlformats.org/markup-compatibility/2006" xmlns:ns2="http://schemas.microsoft.com/office/word/2010/wordml" xmlns:pic="http://schemas.openxmlformats.org/drawingml/2006/picture" xmlns:r="http://schemas.openxmlformats.org/officeDocument/2006/relationships" xmlns:w="http://schemas.openxmlformats.org/wordprocessingml/2006/main" xmlns:wp="http://schemas.openxmlformats.org/drawingml/2006/wordprocessingDrawing" ns1:Ignorable="w14 w15 w16se w16cid w16 w16cex w16sdtdh w16sdtfl w16du wp14">
+<w:document xmlns:ns1="http://schemas.openxmlformats.org/markup-compatibility/2006" xmlns:ns2="http://schemas.microsoft.com/office/word/2010/wordml" xmlns:ns3="http://schemas.openxmlformats.org/drawingml/2006/wordprocessingDrawing" xmlns:ns4="http://schemas.openxmlformats.org/drawingml/2006/main" xmlns:ns5="http://schemas.openxmlformats.org/drawingml/2006/picture" xmlns:ns6="http://schemas.openxmlformats.org/officeDocument/2006/relationships" xmlns:w="http://schemas.openxmlformats.org/wordprocessingml/2006/main" ns1:Ignorable="w14 w15 w16se w16cid w16 w16cex w16sdtdh w16sdtfl w16du wp14">
   <w:background w:color="FFFFFF"/>
   <w:body>
     <w:p ns2:paraId="51D86622" ns2:textId="60C12F37">
@@ -377,10 +377,7 @@
               </w:rPr>
             </w:pPr>
             <w:r>
-              <w:rPr>
-                <w:i w:val="0"/>
-              </w:rPr>
-              <w:t>0.1.0a1</w:t>
+              <w:t>0.1.0</w:t>
             </w:r>
           </w:p>
         </w:tc>
@@ -458,10 +455,7 @@
               </w:rPr>
             </w:pPr>
             <w:r>
-              <w:rPr>
-                <w:i w:val="0"/>
-              </w:rPr>
-              <w:t>https://github.com/pedapudibhargav/ChromeRAG</w:t>
+              <w:t>https://github.com/pedapudibhargav/ChromeRAG/tree/v0.1.0</w:t>
             </w:r>
           </w:p>
           <w:p ns2:paraId="27893270" ns2:textId="77777777">
@@ -1230,35 +1224,35 @@
     <w:p>
       <w:r>
         <w:drawing>
-          <wp:inline distT="0" distB="0" distL="0" distR="0">
-            <wp:extent cx="5943600" cy="3439800"/>
-            <wp:docPr id="1" name="fig1_fbal.png"/>
-            <a:graphic>
-              <a:graphicData uri="http://schemas.openxmlformats.org/drawingml/2006/picture">
-                <pic:pic>
-                  <pic:nvPicPr>
-                    <pic:cNvPr id="0" name="fig1_fbal.png"/>
-                    <pic:cNvPicPr/>
-                  </pic:nvPicPr>
-                  <pic:blipFill>
-                    <a:blip r:embed="rId26"/>
-                    <a:stretch>
-                      <a:fillRect/>
-                    </a:stretch>
-                  </pic:blipFill>
-                  <pic:spPr>
-                    <a:xfrm>
-                      <a:off x="0" y="0"/>
-                      <a:ext cx="5943600" cy="3439800"/>
-                    </a:xfrm>
-                    <a:prstGeom prst="rect">
-                      <a:avLst/>
-                    </a:prstGeom>
-                  </pic:spPr>
-                </pic:pic>
-              </a:graphicData>
-            </a:graphic>
-          </wp:inline>
+          <ns3:inline distT="0" distB="0" distL="0" distR="0">
+            <ns3:extent cx="5943600" cy="3439800"/>
+            <ns3:docPr id="1" name="fig1_fbal.png"/>
+            <ns4:graphic>
+              <ns4:graphicData uri="http://schemas.openxmlformats.org/drawingml/2006/picture">
+                <ns5:pic>
+                  <ns5:nvPicPr>
+                    <ns5:cNvPr id="0" name="fig1_fbal.png"/>
+                    <ns5:cNvPicPr/>
+                  </ns5:nvPicPr>
+                  <ns5:blipFill>
+                    <ns4:blip ns6:embed="rId26"/>
+                    <ns4:stretch>
+                      <ns4:fillRect/>
+                    </ns4:stretch>
+                  </ns5:blipFill>
+                  <ns5:spPr>
+                    <ns4:xfrm>
+                      <ns4:off x="0" y="0"/>
+                      <ns4:ext cx="5943600" cy="3439800"/>
+                    </ns4:xfrm>
+                    <ns4:prstGeom prst="rect">
+                      <ns4:avLst/>
+                    </ns4:prstGeom>
+                  </ns5:spPr>
+                </ns5:pic>
+              </ns4:graphicData>
+            </ns4:graphic>
+          </ns3:inline>
         </w:drawing>
       </w:r>
     </w:p>
@@ -1276,35 +1270,35 @@
     <w:p>
       <w:r>
         <w:drawing>
-          <wp:inline distT="0" distB="0" distL="0" distR="0">
-            <wp:extent cx="5943600" cy="3439800"/>
-            <wp:docPr id="1" name="fig2_recall.png"/>
-            <a:graphic>
-              <a:graphicData uri="http://schemas.openxmlformats.org/drawingml/2006/picture">
-                <pic:pic>
-                  <pic:nvPicPr>
-                    <pic:cNvPr id="0" name="fig2_recall.png"/>
-                    <pic:cNvPicPr/>
-                  </pic:nvPicPr>
-                  <pic:blipFill>
-                    <a:blip r:embed="rId27"/>
-                    <a:stretch>
-                      <a:fillRect/>
-                    </a:stretch>
-                  </pic:blipFill>
-                  <pic:spPr>
-                    <a:xfrm>
-                      <a:off x="0" y="0"/>
-                      <a:ext cx="5943600" cy="3439800"/>
-                    </a:xfrm>
-                    <a:prstGeom prst="rect">
-                      <a:avLst/>
-                    </a:prstGeom>
-                  </pic:spPr>
-                </pic:pic>
-              </a:graphicData>
-            </a:graphic>
-          </wp:inline>
+          <ns3:inline distT="0" distB="0" distL="0" distR="0">
+            <ns3:extent cx="5943600" cy="3439800"/>
+            <ns3:docPr id="1" name="fig2_recall.png"/>
+            <ns4:graphic>
+              <ns4:graphicData uri="http://schemas.openxmlformats.org/drawingml/2006/picture">
+                <ns5:pic>
+                  <ns5:nvPicPr>
+                    <ns5:cNvPr id="0" name="fig2_recall.png"/>
+                    <ns5:cNvPicPr/>
+                  </ns5:nvPicPr>
+                  <ns5:blipFill>
+                    <ns4:blip ns6:embed="rId27"/>
+                    <ns4:stretch>
+                      <ns4:fillRect/>
+                    </ns4:stretch>
+                  </ns5:blipFill>
+                  <ns5:spPr>
+                    <ns4:xfrm>
+                      <ns4:off x="0" y="0"/>
+                      <ns4:ext cx="5943600" cy="3439800"/>
+                    </ns4:xfrm>
+                    <ns4:prstGeom prst="rect">
+                      <ns4:avLst/>
+                    </ns4:prstGeom>
+                  </ns5:spPr>
+                </ns5:pic>
+              </ns4:graphicData>
+            </ns4:graphic>
+          </ns3:inline>
         </w:drawing>
       </w:r>
     </w:p>
@@ -1322,35 +1316,35 @@
     <w:p>
       <w:r>
         <w:drawing>
-          <wp:inline distT="0" distB="0" distL="0" distR="0">
-            <wp:extent cx="5943600" cy="3439800"/>
-            <wp:docPr id="1" name="fig3_noise.png"/>
-            <a:graphic>
-              <a:graphicData uri="http://schemas.openxmlformats.org/drawingml/2006/picture">
-                <pic:pic>
-                  <pic:nvPicPr>
-                    <pic:cNvPr id="0" name="fig3_noise.png"/>
-                    <pic:cNvPicPr/>
-                  </pic:nvPicPr>
-                  <pic:blipFill>
-                    <a:blip r:embed="rId28"/>
-                    <a:stretch>
-                      <a:fillRect/>
-                    </a:stretch>
-                  </pic:blipFill>
-                  <pic:spPr>
-                    <a:xfrm>
-                      <a:off x="0" y="0"/>
-                      <a:ext cx="5943600" cy="3439800"/>
-                    </a:xfrm>
-                    <a:prstGeom prst="rect">
-                      <a:avLst/>
-                    </a:prstGeom>
-                  </pic:spPr>
-                </pic:pic>
-              </a:graphicData>
-            </a:graphic>
-          </wp:inline>
+          <ns3:inline distT="0" distB="0" distL="0" distR="0">
+            <ns3:extent cx="5943600" cy="3439800"/>
+            <ns3:docPr id="1" name="fig3_noise.png"/>
+            <ns4:graphic>
+              <ns4:graphicData uri="http://schemas.openxmlformats.org/drawingml/2006/picture">
+                <ns5:pic>
+                  <ns5:nvPicPr>
+                    <ns5:cNvPr id="0" name="fig3_noise.png"/>
+                    <ns5:cNvPicPr/>
+                  </ns5:nvPicPr>
+                  <ns5:blipFill>
+                    <ns4:blip ns6:embed="rId28"/>
+                    <ns4:stretch>
+                      <ns4:fillRect/>
+                    </ns4:stretch>
+                  </ns5:blipFill>
+                  <ns5:spPr>
+                    <ns4:xfrm>
+                      <ns4:off x="0" y="0"/>
+                      <ns4:ext cx="5943600" cy="3439800"/>
+                    </ns4:xfrm>
+                    <ns4:prstGeom prst="rect">
+                      <ns4:avLst/>
+                    </ns4:prstGeom>
+                  </ns5:spPr>
+                </ns5:pic>
+              </ns4:graphicData>
+            </ns4:graphic>
+          </ns3:inline>
         </w:drawing>
       </w:r>
     </w:p>
@@ -1368,35 +1362,35 @@
     <w:p>
       <w:r>
         <w:drawing>
-          <wp:inline distT="0" distB="0" distL="0" distR="0">
-            <wp:extent cx="5943600" cy="2376000"/>
-            <wp:docPr id="1" name="fig4_corpus_gate.png"/>
-            <a:graphic>
-              <a:graphicData uri="http://schemas.openxmlformats.org/drawingml/2006/picture">
-                <pic:pic>
-                  <pic:nvPicPr>
-                    <pic:cNvPr id="0" name="fig4_corpus_gate.png"/>
-                    <pic:cNvPicPr/>
-                  </pic:nvPicPr>
-                  <pic:blipFill>
-                    <a:blip r:embed="rId29"/>
-                    <a:stretch>
-                      <a:fillRect/>
-                    </a:stretch>
-                  </pic:blipFill>
-                  <pic:spPr>
-                    <a:xfrm>
-                      <a:off x="0" y="0"/>
-                      <a:ext cx="5943600" cy="2376000"/>
-                    </a:xfrm>
-                    <a:prstGeom prst="rect">
-                      <a:avLst/>
-                    </a:prstGeom>
-                  </pic:spPr>
-                </pic:pic>
-              </a:graphicData>
-            </a:graphic>
-          </wp:inline>
+          <ns3:inline distT="0" distB="0" distL="0" distR="0">
+            <ns3:extent cx="5943600" cy="2376000"/>
+            <ns3:docPr id="1" name="fig4_corpus_gate.png"/>
+            <ns4:graphic>
+              <ns4:graphicData uri="http://schemas.openxmlformats.org/drawingml/2006/picture">
+                <ns5:pic>
+                  <ns5:nvPicPr>
+                    <ns5:cNvPr id="0" name="fig4_corpus_gate.png"/>
+                    <ns5:cNvPicPr/>
+                  </ns5:nvPicPr>
+                  <ns5:blipFill>
+                    <ns4:blip ns6:embed="rId29"/>
+                    <ns4:stretch>
+                      <ns4:fillRect/>
+                    </ns4:stretch>
+                  </ns5:blipFill>
+                  <ns5:spPr>
+                    <ns4:xfrm>
+                      <ns4:off x="0" y="0"/>
+                      <ns4:ext cx="5943600" cy="2376000"/>
+                    </ns4:xfrm>
+                    <ns4:prstGeom prst="rect">
+                      <ns4:avLst/>
+                    </ns4:prstGeom>
+                  </ns5:spPr>
+                </ns5:pic>
+              </ns4:graphicData>
+            </ns4:graphic>
+          </ns3:inline>
         </w:drawing>
       </w:r>
     </w:p>
@@ -1696,12 +1690,12 @@
       </w:pPr>
     </w:p>
     <w:sectPr>
-      <w:headerReference w:type="even" r:id="rId18"/>
-      <w:headerReference w:type="default" r:id="rId19"/>
-      <w:footerReference w:type="even" r:id="rId20"/>
-      <w:footerReference w:type="default" r:id="rId21"/>
-      <w:headerReference w:type="first" r:id="rId22"/>
-      <w:footerReference w:type="first" r:id="rId23"/>
+      <w:headerReference w:type="even" ns6:id="rId18"/>
+      <w:headerReference w:type="default" ns6:id="rId19"/>
+      <w:footerReference w:type="even" ns6:id="rId20"/>
+      <w:footerReference w:type="default" ns6:id="rId21"/>
+      <w:headerReference w:type="first" ns6:id="rId22"/>
+      <w:footerReference w:type="first" ns6:id="rId23"/>
       <w:pgSz w:w="12240" w:h="15840"/>
       <w:pgMar w:top="1440" w:right="1440" w:bottom="1440" w:left="1440" w:header="720" w:footer="720" w:gutter="0"/>
       <w:lnNumType w:countBy="1" w:restart="continuous"/>

</xml_diff>

<commit_message>
Add SoftareX references with DOIs plus screencast/APC notes.
Cite Trafilatura, template-extraction TWEB, and HtmlRAG with DOIs;
document APC timing, EM readiness, and optional screencast shot list.

Co-authored-by: Cursor <cursoragent@cursor.com>
</commit_message>
<xml_diff>
--- a/papers/softwarex/ChromeRAG_SoftwareX_OSP.docx
+++ b/papers/softwarex/ChromeRAG_SoftwareX_OSP.docx
@@ -1623,47 +1623,29 @@
         <w:br/>
       </w:r>
     </w:p>
-    <w:p ns2:paraId="32E73942" ns2:textId="2208F996">
-      <w:pPr>
-        <w:rPr>
-          <w:rFonts w:ascii="Arial" w:hAnsi="Arial" w:cs="Arial"/>
-          <w:i/>
-          <w:iCs/>
-        </w:rPr>
-      </w:pPr>
-      <w:r>
-        <w:rPr>
-          <w:i w:val="0"/>
-        </w:rPr>
-        <w:t>[1] A. Barbaresi, Trafilatura: A Web Scraping Library and Toolkit for Texts for Computational Linguistics, Proceedings of the ACL System Demonstrations, 2021.</w:t>
-      </w:r>
-    </w:p>
-    <w:p ns2:paraId="0AF55090" ns2:textId="3A10C773">
-      <w:pPr>
-        <w:spacing w:after="0" w:line="240" w:lineRule="auto"/>
-        <w:jc w:val="both"/>
-        <w:rPr>
-          <w:rFonts w:ascii="Arial" w:eastAsia="Times New Roman" w:hAnsi="Arial" w:cs="Arial"/>
-          <w:b/>
-          <w:lang w:val="en-US"/>
-        </w:rPr>
-      </w:pPr>
-      <w:r>
-        <w:rPr>
-          <w:i w:val="0"/>
-        </w:rPr>
-        <w:t>[2] B. C. Peddapudi, ChromeRAG, GitHub repository, https://github.com/pedapudibhargav/ChromeRAG (accessed 2026).</w:t>
-      </w:r>
-    </w:p>
     <w:p>
-      <w:pPr>
-        <w:pStyle w:val="Body"/>
-      </w:pPr>
-      <w:r>
-        <w:rPr>
-          <w:i w:val="0"/>
-        </w:rPr>
-        <w:t>[3] Microsoft, MarkItDown: Python tool for converting files and office documents to Markdown, https://github.com/microsoft/markitdown (accessed 2026).</w:t>
+      <w:r>
+        <w:t>[1] A. Barbaresi, Trafilatura: A Web Scraping Library and Command-Line Tool for Text Discovery and Extraction, Proc. ACL-IJCNLP 2021 System Demonstrations, pp. 122–131, 2021. https://doi.org/10.18653/v1/2021.acl-demo.15</w:t>
+      </w:r>
+    </w:p>
+    <w:p>
+      <w:r>
+        <w:t>[2] J. Alarte, J. Silva, and S. Tamarit, What Web Template Extractor Should I Use? A Benchmarking and Comparison for Five Template Extractors, ACM Trans. Web, vol. 13, no. 2, Art. 9, 2019. https://doi.org/10.1145/3316810</w:t>
+      </w:r>
+    </w:p>
+    <w:p>
+      <w:r>
+        <w:t>[3] J. Tan et al., HtmlRAG: HTML is Better Than Plain Text for Modeling Retrieved Knowledge in RAG Systems, Proc. ACM Web Conf. (WWW ’25), 2025. https://doi.org/10.1145/3696410.3714546</w:t>
+      </w:r>
+    </w:p>
+    <w:p>
+      <w:r>
+        <w:t>[4] B. C. Peddapudi, ChromeRAG, version 0.1.0, GitHub, 2026. https://github.com/pedapudibhargav/ChromeRAG/tree/v0.1.0</w:t>
+      </w:r>
+    </w:p>
+    <w:p>
+      <w:r>
+        <w:t>[5] Microsoft, MarkItDown: Python tool for converting files and office documents to Markdown, GitHub. https://github.com/microsoft/markitdown</w:t>
       </w:r>
     </w:p>
     <w:bookmarkEnd w:id="16"/>

</xml_diff>

<commit_message>
image and document fixes
Co-authored-by: Cursor <cursoragent@cursor.com>
</commit_message>
<xml_diff>
--- a/papers/softwarex/ChromeRAG_SoftwareX_OSP.docx
+++ b/papers/softwarex/ChromeRAG_SoftwareX_OSP.docx
@@ -1,9 +1,9 @@
 
 <file path=word/document.xml><?xml version="1.0" encoding="utf-8"?>
-<w:document xmlns:ns1="http://schemas.openxmlformats.org/markup-compatibility/2006" xmlns:ns2="http://schemas.microsoft.com/office/word/2010/wordml" xmlns:ns3="http://schemas.openxmlformats.org/drawingml/2006/wordprocessingDrawing" xmlns:ns4="http://schemas.openxmlformats.org/drawingml/2006/main" xmlns:ns5="http://schemas.openxmlformats.org/drawingml/2006/picture" xmlns:ns6="http://schemas.openxmlformats.org/officeDocument/2006/relationships" xmlns:w="http://schemas.openxmlformats.org/wordprocessingml/2006/main" ns1:Ignorable="w14 w15 w16se w16cid w16 w16cex w16sdtdh w16sdtfl w16du wp14">
+<w:document xmlns:a="http://schemas.openxmlformats.org/drawingml/2006/main" xmlns:pic="http://schemas.openxmlformats.org/drawingml/2006/picture" xmlns:wpc="http://schemas.microsoft.com/office/word/2010/wordprocessingCanvas" xmlns:cx="http://schemas.microsoft.com/office/drawing/2014/chartex" xmlns:cx1="http://schemas.microsoft.com/office/drawing/2015/9/8/chartex" xmlns:cx2="http://schemas.microsoft.com/office/drawing/2015/10/21/chartex" xmlns:cx3="http://schemas.microsoft.com/office/drawing/2016/5/9/chartex" xmlns:cx4="http://schemas.microsoft.com/office/drawing/2016/5/10/chartex" xmlns:cx5="http://schemas.microsoft.com/office/drawing/2016/5/11/chartex" xmlns:cx6="http://schemas.microsoft.com/office/drawing/2016/5/12/chartex" xmlns:cx7="http://schemas.microsoft.com/office/drawing/2016/5/13/chartex" xmlns:cx8="http://schemas.microsoft.com/office/drawing/2016/5/14/chartex" xmlns:mc="http://schemas.openxmlformats.org/markup-compatibility/2006" xmlns:aink="http://schemas.microsoft.com/office/drawing/2016/ink" xmlns:am3d="http://schemas.microsoft.com/office/drawing/2017/model3d" xmlns:o="urn:schemas-microsoft-com:office:office" xmlns:oel="http://schemas.microsoft.com/office/2019/extlst" xmlns:r="http://schemas.openxmlformats.org/officeDocument/2006/relationships" xmlns:m="http://schemas.openxmlformats.org/officeDocument/2006/math" xmlns:v="urn:schemas-microsoft-com:vml" xmlns:wp14="http://schemas.microsoft.com/office/word/2010/wordprocessingDrawing" xmlns:wp="http://schemas.openxmlformats.org/drawingml/2006/wordprocessingDrawing" xmlns:w10="urn:schemas-microsoft-com:office:word" xmlns:w="http://schemas.openxmlformats.org/wordprocessingml/2006/main" xmlns:w14="http://schemas.microsoft.com/office/word/2010/wordml" xmlns:w15="http://schemas.microsoft.com/office/word/2012/wordml" xmlns:w16cex="http://schemas.microsoft.com/office/word/2018/wordml/cex" xmlns:w16cid="http://schemas.microsoft.com/office/word/2016/wordml/cid" xmlns:w16="http://schemas.microsoft.com/office/word/2018/wordml" xmlns:w16du="http://schemas.microsoft.com/office/word/2023/wordml/word16du" xmlns:w16sdtdh="http://schemas.microsoft.com/office/word/2020/wordml/sdtdatahash" xmlns:w16sdtfl="http://schemas.microsoft.com/office/word/2024/wordml/sdtformatlock" xmlns:w16se="http://schemas.microsoft.com/office/word/2015/wordml/symex" xmlns:wpg="http://schemas.microsoft.com/office/word/2010/wordprocessingGroup" xmlns:wpi="http://schemas.microsoft.com/office/word/2010/wordprocessingInk" xmlns:wne="http://schemas.microsoft.com/office/word/2006/wordml" xmlns:wps="http://schemas.microsoft.com/office/word/2010/wordprocessingShape" mc:Ignorable="w14 w15 w16se w16cid w16 w16cex w16sdtdh w16sdtfl w16du wp14">
   <w:background w:color="FFFFFF"/>
   <w:body>
-    <w:p ns2:paraId="51D86622" ns2:textId="60C12F37">
+    <w:p>
       <w:pPr>
         <w:pStyle w:val="Heading1"/>
         <w:spacing w:before="0" w:line="240" w:lineRule="auto"/>
@@ -16,24 +16,12 @@
         </w:rPr>
       </w:pPr>
       <w:r>
-        <w:rPr>
-          <w:i w:val="0"/>
-        </w:rPr>
         <w:t>ChromeRAG: Ingest-Time Elimination of Site Template Noise for Enterprise Web RAG</w:t>
       </w:r>
     </w:p>
-    <w:p ns2:paraId="3B4AE302" ns2:textId="77777777">
-      <w:pPr>
-        <w:spacing w:after="0" w:line="240" w:lineRule="auto"/>
-        <w:rPr>
-          <w:rFonts w:ascii="Arial" w:hAnsi="Arial" w:cs="Arial"/>
-          <w:szCs w:val="22"/>
-        </w:rPr>
-      </w:pPr>
-    </w:p>
-    <w:p ns2:paraId="42F38EE1" ns2:textId="4B89B90B">
-      <w:pPr>
-        <w:pStyle w:val="Heading1"/>
+    <w:p>
+      <w:pPr>
+        <w:pStyle w:val="Body"/>
         <w:spacing w:before="0" w:line="240" w:lineRule="auto"/>
         <w:rPr>
           <w:rFonts w:ascii="Arial" w:hAnsi="Arial" w:cs="Arial"/>
@@ -44,23 +32,10 @@
         </w:rPr>
       </w:pPr>
       <w:r>
-        <w:rPr>
-          <w:i w:val="0"/>
-        </w:rPr>
         <w:t>Bhargava Chary Peddapudi (Independent Researcher; ORCID: https://orcid.org/0009-0002-8523-8415); Corresponding email: pedapudibhargav@gmail.com</w:t>
       </w:r>
     </w:p>
-    <w:bookmarkEnd w:id="5"/>
-    <w:p ns2:paraId="38B53E27" ns2:textId="77777777">
-      <w:pPr>
-        <w:spacing w:after="0" w:line="240" w:lineRule="auto"/>
-        <w:rPr>
-          <w:rFonts w:ascii="Arial" w:hAnsi="Arial" w:cs="Arial"/>
-          <w:szCs w:val="22"/>
-        </w:rPr>
-      </w:pPr>
-    </w:p>
-    <w:p ns2:paraId="0AB0CA3F" ns2:textId="77777777">
+    <w:p>
       <w:pPr>
         <w:pStyle w:val="Heading1"/>
         <w:tabs>
@@ -93,9 +68,9 @@
         <w:t xml:space="preserve"> </w:t>
       </w:r>
     </w:p>
-    <w:p ns2:paraId="4D1864C1" ns2:textId="26CB7A77">
-      <w:pPr>
-        <w:pStyle w:val="Heading1"/>
+    <w:p>
+      <w:pPr>
+        <w:pStyle w:val="Body"/>
         <w:tabs>
           <w:tab w:val="left" w:pos="5244"/>
         </w:tabs>
@@ -110,22 +85,10 @@
         </w:rPr>
       </w:pPr>
       <w:r>
-        <w:rPr>
-          <w:i w:val="0"/>
-        </w:rPr>
-        <w:t>Enterprise retrieval-augmented generation (RAG) pipelines often index scraped HTML whose navigation chrome, marketing banners, and footers pollute the vector space. Existing extractors such as Trafilatura and Readability are strong on news-like pages but under-serve SaaS documentation and pricing surfaces. ChromeRAG (chromerag) is a CPU-first Python toolkit that converts HTML to RAG-ready Markdown using site-template chrome elimination (STCE), optional density/vector noise pruning (DVDF), Schema.org front-matter fusion, and table key-value linearization. On a public corpus (373 URLs listed; 277 fetched; 238 scoreable), ChromeRAG coverage mode reaches Fbal 0.800 versus Trafilatura 0.752 and MarkItDown 0.695. Thin or JavaScript-shell inputs emit operator warnings so callers can verify their fetch/render pipeline. The software is MIT-licensed with a CLI, static Compare Lab, and reproducible benchmark scripts.</w:t>
-      </w:r>
-    </w:p>
-    <w:p ns2:paraId="52151D22" ns2:textId="77777777">
-      <w:pPr>
-        <w:spacing w:after="0" w:line="240" w:lineRule="auto"/>
-        <w:rPr>
-          <w:rFonts w:ascii="Arial" w:hAnsi="Arial" w:cs="Arial"/>
-          <w:szCs w:val="22"/>
-        </w:rPr>
-      </w:pPr>
-    </w:p>
-    <w:p ns2:paraId="108BE7F8" ns2:textId="77777777">
+        <w:t>Enterprise retrieval-augmented generation (RAG) pipelines routinely index scraped HTML whose navigation chrome, marketing banners, cookie-consent notices, and footer blocks pollute the embedding space. Existing extractors such as Trafilatura and Readability are optimized for news article main-content; general Markdown converters such as MarkItDown preserve rich structure at the cost of substantial chrome retention. ChromeRAG (chromerag) is a CPU-first Python toolkit that converts HTML to RAG-ready Markdown through site-template chrome elimination (STCE), optional density/vector noise pruning (DVDF) via an ONNX MiniLM model, Schema.org front-matter fusion, and table key-value linearization. On a public benchmark corpus (373 URLs listed; 277 fetched; 238 scoreable), ChromeRAG coverage mode achieves F_bal 0.800 versus Trafilatura 0.752, MarkItDown 0.695, and Readability 0.535, while holding chrome noise retention to 0.005. JavaScript-shell inputs emit explicit operator warnings so callers can verify their fetch/render pipeline rather than silently averaging thin pages into benchmark means. The software is MIT-licensed on GitHub and PyPI (pip install chromerag) and ships with a CLI, static Compare Lab, and reproducible benchmark scripts.</w:t>
+      </w:r>
+    </w:p>
+    <w:p>
       <w:pPr>
         <w:pStyle w:val="Heading1"/>
         <w:spacing w:before="0" w:line="240" w:lineRule="auto"/>
@@ -151,9 +114,22 @@
         </w:rPr>
         <w:t xml:space="preserve"> </w:t>
       </w:r>
-      <w:bookmarkStart w:id="6" w:name="_Hlk73536342"/>
-    </w:p>
-    <w:p ns2:paraId="0F0B7460" ns2:textId="40FDA03F">
+    </w:p>
+    <w:p>
+      <w:pPr>
+        <w:pStyle w:val="Body"/>
+        <w:spacing w:before="0" w:line="240" w:lineRule="auto"/>
+        <w:rPr>
+          <w:rFonts w:ascii="Arial" w:hAnsi="Arial" w:cs="Arial"/>
+          <w:sz w:val="22"/>
+          <w:szCs w:val="22"/>
+        </w:rPr>
+      </w:pPr>
+      <w:r>
+        <w:t>RAG; HTML extraction; boilerplate removal; vector pollution; Markdown; enterprise search</w:t>
+      </w:r>
+    </w:p>
+    <w:p>
       <w:pPr>
         <w:pStyle w:val="Heading1"/>
         <w:spacing w:before="0" w:line="240" w:lineRule="auto"/>
@@ -164,40 +140,6 @@
         </w:rPr>
       </w:pPr>
       <w:r>
-        <w:t>RAG; HTML extraction; boilerplate removal; vector pollution; Markdown; enterprise search</w:t>
-      </w:r>
-    </w:p>
-    <w:p ns2:paraId="42E7691B" ns2:textId="77777777">
-      <w:pPr>
-        <w:spacing w:after="0" w:line="240" w:lineRule="auto"/>
-        <w:rPr>
-          <w:rFonts w:ascii="Arial" w:hAnsi="Arial" w:cs="Arial"/>
-          <w:szCs w:val="22"/>
-        </w:rPr>
-      </w:pPr>
-    </w:p>
-    <w:p ns2:paraId="5F0E5E0D" ns2:textId="77777777">
-      <w:pPr>
-        <w:pStyle w:val="Heading1"/>
-        <w:spacing w:before="0" w:line="240" w:lineRule="auto"/>
-        <w:rPr>
-          <w:rFonts w:ascii="Arial" w:eastAsia="Calibri" w:hAnsi="Arial" w:cs="Arial"/>
-          <w:sz w:val="22"/>
-          <w:szCs w:val="22"/>
-        </w:rPr>
-      </w:pPr>
-    </w:p>
-    <w:p ns2:paraId="42B80A20" ns2:textId="350036B7">
-      <w:pPr>
-        <w:pStyle w:val="Heading1"/>
-        <w:spacing w:before="0" w:line="240" w:lineRule="auto"/>
-        <w:rPr>
-          <w:rFonts w:ascii="Arial" w:hAnsi="Arial" w:cs="Arial"/>
-          <w:sz w:val="22"/>
-          <w:szCs w:val="22"/>
-        </w:rPr>
-      </w:pPr>
-      <w:r>
         <w:rPr>
           <w:rFonts w:ascii="Arial" w:eastAsia="Calibri" w:hAnsi="Arial" w:cs="Arial"/>
           <w:sz w:val="22"/>
@@ -213,20 +155,6 @@
         </w:rPr>
         <w:t xml:space="preserve">etadata </w:t>
       </w:r>
-    </w:p>
-    <w:bookmarkEnd w:id="7"/>
-    <w:p ns2:paraId="60EDB937" ns2:textId="2EFE8899">
-      <w:pPr>
-        <w:pStyle w:val="Heading1"/>
-        <w:spacing w:before="0" w:line="240" w:lineRule="auto"/>
-        <w:rPr>
-          <w:rFonts w:ascii="Arial" w:eastAsia="Calibri" w:hAnsi="Arial" w:cs="Arial"/>
-          <w:b w:val="0"/>
-          <w:i/>
-          <w:sz w:val="22"/>
-          <w:szCs w:val="22"/>
-        </w:rPr>
-      </w:pPr>
     </w:p>
     <w:tbl>
       <w:tblPr>
@@ -252,7 +180,7 @@
         <w:gridCol w:w="3554"/>
         <w:gridCol w:w="5357"/>
       </w:tblGrid>
-      <w:tr ns2:paraId="74ED8066" ns2:textId="77777777">
+      <w:tr>
         <w:trPr>
           <w:trHeight w:val="300"/>
         </w:trPr>
@@ -260,7 +188,7 @@
           <w:tcPr>
             <w:tcW w:w="567" w:type="dxa"/>
           </w:tcPr>
-          <w:p ns2:paraId="2B1FB160" ns2:textId="77777777">
+          <w:p>
             <w:pPr>
               <w:rPr>
                 <w:rFonts w:ascii="Arial" w:hAnsi="Arial" w:cs="Arial"/>
@@ -281,7 +209,7 @@
           <w:tcPr>
             <w:tcW w:w="3554" w:type="dxa"/>
           </w:tcPr>
-          <w:p ns2:paraId="79E48C8F" ns2:textId="77777777">
+          <w:p>
             <w:pPr>
               <w:rPr>
                 <w:rFonts w:ascii="Arial" w:hAnsi="Arial" w:cs="Arial"/>
@@ -302,26 +230,21 @@
           <w:tcPr>
             <w:tcW w:w="5357" w:type="dxa"/>
           </w:tcPr>
-          <w:p ns2:paraId="4FF13E3D" ns2:textId="1A8E6373">
+          <w:p>
             <w:pPr>
               <w:rPr>
                 <w:rFonts w:ascii="Arial" w:hAnsi="Arial" w:cs="Arial"/>
                 <w:szCs w:val="22"/>
               </w:rPr>
+              <w:pStyle w:val="Body"/>
             </w:pPr>
             <w:r>
-              <w:rPr>
-                <w:rFonts w:ascii="Arial" w:hAnsi="Arial" w:cs="Arial"/>
-                <w:b/>
-                <w:i/>
-                <w:szCs w:val="22"/>
-              </w:rPr>
-              <w:t>Metadata</w:t>
+              <w:t>Please fill in this column</w:t>
             </w:r>
           </w:p>
         </w:tc>
       </w:tr>
-      <w:tr ns2:paraId="44BD84C4" ns2:textId="77777777">
+      <w:tr>
         <w:trPr>
           <w:trHeight w:val="300"/>
         </w:trPr>
@@ -329,7 +252,7 @@
           <w:tcPr>
             <w:tcW w:w="567" w:type="dxa"/>
           </w:tcPr>
-          <w:p ns2:paraId="5663CBE1" ns2:textId="77777777">
+          <w:p>
             <w:pPr>
               <w:rPr>
                 <w:rFonts w:ascii="Arial" w:hAnsi="Arial" w:cs="Arial"/>
@@ -349,7 +272,7 @@
           <w:tcPr>
             <w:tcW w:w="3554" w:type="dxa"/>
           </w:tcPr>
-          <w:p ns2:paraId="4D915645" ns2:textId="77777777">
+          <w:p>
             <w:pPr>
               <w:rPr>
                 <w:rFonts w:ascii="Arial" w:hAnsi="Arial" w:cs="Arial"/>
@@ -369,12 +292,13 @@
           <w:tcPr>
             <w:tcW w:w="5357" w:type="dxa"/>
           </w:tcPr>
-          <w:p ns2:paraId="5BA7859B" ns2:textId="5E5DB946">
+          <w:p>
             <w:pPr>
               <w:rPr>
                 <w:rFonts w:ascii="Arial" w:hAnsi="Arial" w:cs="Arial"/>
                 <w:szCs w:val="22"/>
               </w:rPr>
+              <w:pStyle w:val="Body"/>
             </w:pPr>
             <w:r>
               <w:t>0.1.0</w:t>
@@ -382,7 +306,7 @@
           </w:p>
         </w:tc>
       </w:tr>
-      <w:tr ns2:paraId="5560CBB4" ns2:textId="77777777">
+      <w:tr>
         <w:trPr>
           <w:trHeight w:val="300"/>
         </w:trPr>
@@ -390,7 +314,7 @@
           <w:tcPr>
             <w:tcW w:w="567" w:type="dxa"/>
           </w:tcPr>
-          <w:p ns2:paraId="359B3DE7" ns2:textId="77777777">
+          <w:p>
             <w:pPr>
               <w:rPr>
                 <w:rFonts w:ascii="Arial" w:hAnsi="Arial" w:cs="Arial"/>
@@ -410,7 +334,7 @@
           <w:tcPr>
             <w:tcW w:w="3554" w:type="dxa"/>
           </w:tcPr>
-          <w:p ns2:paraId="1FA29392" ns2:textId="6379BA1C">
+          <w:p>
             <w:pPr>
               <w:rPr>
                 <w:rFonts w:ascii="Arial" w:hAnsi="Arial" w:cs="Arial"/>
@@ -444,7 +368,7 @@
           <w:tcPr>
             <w:tcW w:w="5357" w:type="dxa"/>
           </w:tcPr>
-          <w:p ns2:paraId="3B041AE9" ns2:textId="5AF7193D">
+          <w:p>
             <w:pPr>
               <w:rPr>
                 <w:rFonts w:ascii="Arial" w:hAnsi="Arial" w:cs="Arial"/>
@@ -453,12 +377,13 @@
                 <w:i/>
                 <w:szCs w:val="22"/>
               </w:rPr>
+              <w:pStyle w:val="Body"/>
             </w:pPr>
             <w:r>
               <w:t>https://github.com/pedapudibhargav/ChromeRAG/tree/v0.1.0</w:t>
             </w:r>
           </w:p>
-          <w:p ns2:paraId="27893270" ns2:textId="77777777">
+          <w:p>
             <w:pPr>
               <w:rPr>
                 <w:rFonts w:ascii="Arial" w:hAnsi="Arial" w:cs="Arial"/>
@@ -468,7 +393,7 @@
           </w:p>
         </w:tc>
       </w:tr>
-      <w:tr ns2:paraId="33815D41" ns2:textId="77777777">
+      <w:tr>
         <w:trPr>
           <w:trHeight w:val="300"/>
         </w:trPr>
@@ -476,7 +401,7 @@
           <w:tcPr>
             <w:tcW w:w="567" w:type="dxa"/>
           </w:tcPr>
-          <w:p ns2:paraId="091665CD" ns2:textId="62EF4D85">
+          <w:p>
             <w:pPr>
               <w:rPr>
                 <w:rFonts w:ascii="Arial" w:hAnsi="Arial" w:cs="Arial"/>
@@ -503,7 +428,7 @@
           <w:tcPr>
             <w:tcW w:w="3554" w:type="dxa"/>
           </w:tcPr>
-          <w:p ns2:paraId="3B4C1036" ns2:textId="38CBB52A">
+          <w:p>
             <w:pPr>
               <w:rPr>
                 <w:rFonts w:ascii="Arial" w:hAnsi="Arial" w:cs="Arial"/>
@@ -530,23 +455,21 @@
           <w:tcPr>
             <w:tcW w:w="5357" w:type="dxa"/>
           </w:tcPr>
-          <w:p ns2:paraId="7016BDEF" ns2:textId="4DEEE213">
+          <w:p>
             <w:pPr>
               <w:rPr>
                 <w:rFonts w:ascii="Arial" w:hAnsi="Arial" w:cs="Arial"/>
                 <w:szCs w:val="22"/>
               </w:rPr>
+              <w:pStyle w:val="Body"/>
             </w:pPr>
             <w:r>
-              <w:rPr>
-                <w:i w:val="0"/>
-              </w:rPr>
               <w:t>MIT</w:t>
             </w:r>
           </w:p>
         </w:tc>
       </w:tr>
-      <w:tr ns2:paraId="438B01EC" ns2:textId="77777777">
+      <w:tr>
         <w:trPr>
           <w:trHeight w:val="300"/>
         </w:trPr>
@@ -554,7 +477,7 @@
           <w:tcPr>
             <w:tcW w:w="567" w:type="dxa"/>
           </w:tcPr>
-          <w:p ns2:paraId="04E361F4" ns2:textId="239E0838">
+          <w:p>
             <w:pPr>
               <w:rPr>
                 <w:rFonts w:ascii="Arial" w:hAnsi="Arial" w:cs="Arial"/>
@@ -581,7 +504,7 @@
           <w:tcPr>
             <w:tcW w:w="3554" w:type="dxa"/>
           </w:tcPr>
-          <w:p ns2:paraId="2231913A" ns2:textId="77777777">
+          <w:p>
             <w:pPr>
               <w:rPr>
                 <w:rFonts w:ascii="Arial" w:hAnsi="Arial" w:cs="Arial"/>
@@ -601,23 +524,21 @@
           <w:tcPr>
             <w:tcW w:w="5357" w:type="dxa"/>
           </w:tcPr>
-          <w:p ns2:paraId="629D31C3" ns2:textId="3A8F2F03">
+          <w:p>
             <w:pPr>
               <w:rPr>
                 <w:rFonts w:ascii="Arial" w:hAnsi="Arial" w:cs="Arial"/>
                 <w:szCs w:val="22"/>
               </w:rPr>
+              <w:pStyle w:val="Body"/>
             </w:pPr>
             <w:r>
-              <w:rPr>
-                <w:i w:val="0"/>
-              </w:rPr>
               <w:t>git</w:t>
             </w:r>
           </w:p>
         </w:tc>
       </w:tr>
-      <w:tr ns2:paraId="16946563" ns2:textId="77777777">
+      <w:tr>
         <w:trPr>
           <w:trHeight w:val="300"/>
         </w:trPr>
@@ -625,7 +546,7 @@
           <w:tcPr>
             <w:tcW w:w="567" w:type="dxa"/>
           </w:tcPr>
-          <w:p ns2:paraId="46D58CC8" ns2:textId="2FC2DB60">
+          <w:p>
             <w:pPr>
               <w:rPr>
                 <w:rFonts w:ascii="Arial" w:hAnsi="Arial" w:cs="Arial"/>
@@ -652,7 +573,7 @@
           <w:tcPr>
             <w:tcW w:w="3554" w:type="dxa"/>
           </w:tcPr>
-          <w:p ns2:paraId="0986AA87" ns2:textId="220B6BEB">
+          <w:p>
             <w:pPr>
               <w:rPr>
                 <w:rFonts w:ascii="Arial" w:hAnsi="Arial" w:cs="Arial"/>
@@ -686,23 +607,21 @@
           <w:tcPr>
             <w:tcW w:w="5357" w:type="dxa"/>
           </w:tcPr>
-          <w:p ns2:paraId="0E48B6AB" ns2:textId="6F7D8B50">
+          <w:p>
             <w:pPr>
               <w:rPr>
                 <w:rFonts w:ascii="Arial" w:hAnsi="Arial" w:cs="Arial"/>
                 <w:szCs w:val="22"/>
               </w:rPr>
+              <w:pStyle w:val="Body"/>
             </w:pPr>
             <w:r>
-              <w:rPr>
-                <w:i w:val="0"/>
-              </w:rPr>
               <w:t>Python ≥3.11, BeautifulSoup4, lxml, Pydantic; optional ONNX Runtime</w:t>
             </w:r>
           </w:p>
         </w:tc>
       </w:tr>
-      <w:tr ns2:paraId="68707A76" ns2:textId="77777777">
+      <w:tr>
         <w:trPr>
           <w:trHeight w:val="300"/>
         </w:trPr>
@@ -710,7 +629,7 @@
           <w:tcPr>
             <w:tcW w:w="567" w:type="dxa"/>
           </w:tcPr>
-          <w:p ns2:paraId="56024155" ns2:textId="34EB12F9">
+          <w:p>
             <w:pPr>
               <w:rPr>
                 <w:rFonts w:ascii="Arial" w:hAnsi="Arial" w:cs="Arial"/>
@@ -738,7 +657,7 @@
           <w:tcPr>
             <w:tcW w:w="3554" w:type="dxa"/>
           </w:tcPr>
-          <w:p ns2:paraId="2F9146D3" ns2:textId="2B37EA71">
+          <w:p>
             <w:pPr>
               <w:rPr>
                 <w:rFonts w:ascii="Arial" w:hAnsi="Arial" w:cs="Arial"/>
@@ -772,23 +691,21 @@
           <w:tcPr>
             <w:tcW w:w="5357" w:type="dxa"/>
           </w:tcPr>
-          <w:p ns2:paraId="7356EA89" ns2:textId="77777777">
+          <w:p>
             <w:pPr>
               <w:rPr>
                 <w:rFonts w:ascii="Arial" w:hAnsi="Arial" w:cs="Arial"/>
                 <w:szCs w:val="22"/>
               </w:rPr>
+              <w:pStyle w:val="Body"/>
             </w:pPr>
             <w:r>
-              <w:rPr>
-                <w:i w:val="0"/>
-              </w:rPr>
-              <w:t>macOS / Linux / Windows; pip install -e . from the GitHub clone; optional extras: [dvdf], [fetch], [baselines], [ui]</w:t>
+              <w:t>macOS / Linux / Windows; pip install chromerag (or pip install -e . from the GitHub clone); optional extras: [dvdf], [fetch], [baselines], [ui]</w:t>
             </w:r>
           </w:p>
         </w:tc>
       </w:tr>
-      <w:tr ns2:paraId="286C72E5" ns2:textId="77777777">
+      <w:tr>
         <w:trPr>
           <w:trHeight w:val="300"/>
         </w:trPr>
@@ -796,7 +713,7 @@
           <w:tcPr>
             <w:tcW w:w="567" w:type="dxa"/>
           </w:tcPr>
-          <w:p ns2:paraId="3E16E1E6" ns2:textId="711E8AAE">
+          <w:p>
             <w:pPr>
               <w:rPr>
                 <w:rFonts w:ascii="Arial" w:hAnsi="Arial" w:cs="Arial"/>
@@ -823,7 +740,7 @@
           <w:tcPr>
             <w:tcW w:w="3554" w:type="dxa"/>
           </w:tcPr>
-          <w:p ns2:paraId="0EE51704" ns2:textId="1B29C340">
+          <w:p>
             <w:pPr>
               <w:rPr>
                 <w:rFonts w:ascii="Arial" w:hAnsi="Arial" w:cs="Arial"/>
@@ -871,23 +788,21 @@
           <w:tcPr>
             <w:tcW w:w="5357" w:type="dxa"/>
           </w:tcPr>
-          <w:p ns2:paraId="6349FC99" ns2:textId="2C342BB1">
+          <w:p>
             <w:pPr>
               <w:rPr>
                 <w:rFonts w:ascii="Arial" w:hAnsi="Arial" w:cs="Arial"/>
                 <w:szCs w:val="22"/>
               </w:rPr>
+              <w:pStyle w:val="Body"/>
             </w:pPr>
             <w:r>
-              <w:rPr>
-                <w:i w:val="0"/>
-              </w:rPr>
               <w:t>https://pedapudibhargav.github.io/ChromeRAG/ and repository README.md</w:t>
             </w:r>
           </w:p>
         </w:tc>
       </w:tr>
-      <w:tr ns2:paraId="59B634D9" ns2:textId="77777777">
+      <w:tr>
         <w:trPr>
           <w:trHeight w:val="300"/>
         </w:trPr>
@@ -895,7 +810,7 @@
           <w:tcPr>
             <w:tcW w:w="567" w:type="dxa"/>
           </w:tcPr>
-          <w:p ns2:paraId="63807196" ns2:textId="09A695AA">
+          <w:p>
             <w:pPr>
               <w:rPr>
                 <w:rFonts w:ascii="Arial" w:hAnsi="Arial" w:cs="Arial"/>
@@ -922,7 +837,7 @@
           <w:tcPr>
             <w:tcW w:w="3554" w:type="dxa"/>
           </w:tcPr>
-          <w:p ns2:paraId="519282C0" ns2:textId="77777777">
+          <w:p>
             <w:pPr>
               <w:rPr>
                 <w:rFonts w:ascii="Arial" w:hAnsi="Arial" w:cs="Arial"/>
@@ -942,657 +857,22 @@
           <w:tcPr>
             <w:tcW w:w="5357" w:type="dxa"/>
           </w:tcPr>
-          <w:p ns2:paraId="7CAED1DE" ns2:textId="77777777">
+          <w:p>
             <w:pPr>
               <w:rPr>
                 <w:rFonts w:ascii="Arial" w:hAnsi="Arial" w:cs="Arial"/>
                 <w:szCs w:val="22"/>
               </w:rPr>
+              <w:pStyle w:val="Body"/>
             </w:pPr>
             <w:r>
-              <w:rPr>
-                <w:i w:val="0"/>
-              </w:rPr>
               <w:t>pedapudibhargav@gmail.com</w:t>
             </w:r>
           </w:p>
         </w:tc>
       </w:tr>
     </w:tbl>
-    <w:p ns2:paraId="05BF4EBA" ns2:textId="6535A6D9">
-      <w:pPr>
-        <w:spacing w:after="0" w:line="240" w:lineRule="auto"/>
-        <w:rPr>
-          <w:rFonts w:ascii="Arial" w:hAnsi="Arial" w:cs="Arial"/>
-          <w:szCs w:val="22"/>
-        </w:rPr>
-      </w:pPr>
-    </w:p>
-    <w:p ns2:paraId="36A737EB" ns2:textId="6CE18ED1">
-      <w:pPr>
-        <w:pStyle w:val="Heading1"/>
-        <w:numPr>
-          <w:ilvl w:val="0"/>
-          <w:numId w:val="1"/>
-        </w:numPr>
-        <w:spacing w:before="0" w:line="240" w:lineRule="auto"/>
-        <w:ind w:hanging="359"/>
-        <w:rPr>
-          <w:rFonts w:ascii="Arial" w:eastAsia="Calibri" w:hAnsi="Arial" w:cs="Arial"/>
-          <w:iCs/>
-          <w:sz w:val="22"/>
-          <w:szCs w:val="22"/>
-        </w:rPr>
-      </w:pPr>
-      <w:r>
-        <w:rPr>
-          <w:rFonts w:ascii="Arial" w:eastAsia="Calibri" w:hAnsi="Arial" w:cs="Arial"/>
-          <w:iCs/>
-          <w:sz w:val="22"/>
-          <w:szCs w:val="22"/>
-        </w:rPr>
-        <w:t xml:space="preserve">Motivation and </w:t>
-      </w:r>
-      <w:r>
-        <w:rPr>
-          <w:rFonts w:ascii="Arial" w:eastAsia="Calibri" w:hAnsi="Arial" w:cs="Arial"/>
-          <w:iCs/>
-          <w:sz w:val="22"/>
-          <w:szCs w:val="22"/>
-        </w:rPr>
-        <w:t>significance</w:t>
-      </w:r>
-      <w:r>
-        <w:rPr>
-          <w:rFonts w:ascii="Arial" w:eastAsia="Calibri" w:hAnsi="Arial" w:cs="Arial"/>
-          <w:iCs/>
-          <w:sz w:val="22"/>
-          <w:szCs w:val="22"/>
-        </w:rPr>
-        <w:br/>
-      </w:r>
-    </w:p>
-    <w:p>
-      <w:pPr>
-        <w:pStyle w:val="Body"/>
-      </w:pPr>
-      <w:r>
-        <w:rPr>
-          <w:i w:val="0"/>
-        </w:rPr>
-        <w:t>Modern enterprise assistants retrieve over documentation hubs, knowledge bases, and marketing sites. When those pages are ingested with generic HTML-to-text converters, shared chrome (nav, footer, CTAs, cookie banners) is embedded repeatedly. The result is vector pollution: near-duplicate chrome chunks compete with factual content at query time.</w:t>
-      </w:r>
-    </w:p>
-    <w:p>
-      <w:pPr>
-        <w:pStyle w:val="Body"/>
-      </w:pPr>
-      <w:r>
-        <w:rPr>
-          <w:i w:val="0"/>
-        </w:rPr>
-        <w:t>Prior extractors optimize for news article main-content (Trafilatura, Readability) or general Markdown conversion (MarkItDown, markdownify). They do not jointly provide: (i) learn-then-extract site chrome models across a corporate domain, (ii) Schema.org JSON-LD injected as YAML front-matter for chunk context, and (iii) pricing/spec table linearization for RAG. ChromeRAG targets that gap as ingest-time, query-agnostic software—orthogonal to query-time HtmlRAG pruning.</w:t>
-      </w:r>
-    </w:p>
-    <w:p>
-      <w:pPr>
-        <w:pStyle w:val="Body"/>
-      </w:pPr>
-      <w:r>
-        <w:rPr>
-          <w:i w:val="0"/>
-        </w:rPr>
-        <w:t>Experimental setting: users fetch or crawl HTML with their own pipeline (or the optional poc/ harness), then run chromerag extract / learn / batch to produce RAG-ready Markdown. On thin or JavaScript-rendered shells, ChromeRAG emits warnings instructing callers to Playwright-render first rather than silently averaging empty pages into evaluation means.</w:t>
-      </w:r>
-    </w:p>
-    <w:p>
-      <w:pPr>
-        <w:pStyle w:val="Body"/>
-      </w:pPr>
-      <w:r>
-        <w:rPr>
-          <w:i w:val="0"/>
-        </w:rPr>
-        <w:t>Related work includes Trafilatura, readability-lxml, MarkItDown, and query-time HtmlRAG pruning. ChromeRAG’s contribution is a reusable ingest toolkit with deterministic Recall / Noise / Fbal benchmarks on a public multi-category corpus.</w:t>
-      </w:r>
-    </w:p>
-    <w:bookmarkEnd w:id="9"/>
-    <w:p ns2:paraId="4B8E7CEE" ns2:textId="4FD05474">
-      <w:pPr>
-        <w:pStyle w:val="Heading1"/>
-        <w:numPr>
-          <w:ilvl w:val="0"/>
-          <w:numId w:val="1"/>
-        </w:numPr>
-        <w:spacing w:before="0" w:line="240" w:lineRule="auto"/>
-        <w:ind w:hanging="359"/>
-        <w:rPr>
-          <w:rFonts w:ascii="Arial" w:eastAsia="Calibri" w:hAnsi="Arial" w:cs="Arial"/>
-          <w:iCs/>
-          <w:sz w:val="22"/>
-          <w:szCs w:val="22"/>
-        </w:rPr>
-      </w:pPr>
-      <w:bookmarkStart w:id="11" w:name="h.4mwx3spkx9aa" w:colFirst="0" w:colLast="0"/>
-      <w:bookmarkEnd w:id="11"/>
-      <w:r>
-        <w:rPr>
-          <w:rFonts w:ascii="Arial" w:eastAsia="Calibri" w:hAnsi="Arial" w:cs="Arial"/>
-          <w:iCs/>
-          <w:sz w:val="22"/>
-          <w:szCs w:val="22"/>
-        </w:rPr>
-        <w:t xml:space="preserve">Software </w:t>
-      </w:r>
-      <w:r>
-        <w:rPr>
-          <w:rFonts w:ascii="Arial" w:eastAsia="Calibri" w:hAnsi="Arial" w:cs="Arial"/>
-          <w:iCs/>
-          <w:sz w:val="22"/>
-          <w:szCs w:val="22"/>
-        </w:rPr>
-        <w:t>d</w:t>
-      </w:r>
-      <w:r>
-        <w:rPr>
-          <w:rFonts w:ascii="Arial" w:eastAsia="Calibri" w:hAnsi="Arial" w:cs="Arial"/>
-          <w:iCs/>
-          <w:sz w:val="22"/>
-          <w:szCs w:val="22"/>
-        </w:rPr>
-        <w:t>escription</w:t>
-      </w:r>
-      <w:r>
-        <w:rPr>
-          <w:rFonts w:ascii="Arial" w:eastAsia="Calibri" w:hAnsi="Arial" w:cs="Arial"/>
-          <w:iCs/>
-          <w:sz w:val="22"/>
-          <w:szCs w:val="22"/>
-        </w:rPr>
-        <w:br/>
-      </w:r>
-    </w:p>
-    <w:p>
-      <w:pPr>
-        <w:pStyle w:val="Body"/>
-      </w:pPr>
-      <w:r>
-        <w:rPr>
-          <w:i w:val="0"/>
-        </w:rPr>
-        <w:t>ChromeRAG converts an HTML string into RAG-ready Markdown. Architecture: (1) input-quality check for thin/JS shells; (2) Schema.org harvest before script strip; (3) deterministic clean plus optional site-template chrome elimination (STCE); (4) optional density/DVDF leaf prune; (5) heading-safe Markdown with YAML front-matter; (6) optional table key-value linearization.</w:t>
-      </w:r>
-    </w:p>
-    <w:p>
-      <w:pPr>
-        <w:pStyle w:val="Body"/>
-      </w:pPr>
-      <w:r>
-        <w:rPr>
-          <w:i w:val="0"/>
-        </w:rPr>
-        <w:t>Major functionalities: chromerag extract (priority knobs precision/coverage/balanced), chromerag learn (mine site-chrome models), chromerag batch (learn-then-extract), optional DVDF via [dvdf], and a static Compare Lab under docs/ for GitHub Pages.</w:t>
-      </w:r>
-    </w:p>
-    <w:p>
-      <w:pPr>
-        <w:pStyle w:val="Body"/>
-      </w:pPr>
-      <w:r>
-        <w:rPr>
-          <w:i w:val="0"/>
-        </w:rPr>
-        <w:t>Sample usage: pip install -e ".[baselines]"; chromerag extract page.html -o out.md --priority coverage --json-meta. Python: ChromeRAG(...).extract(html, url=...) returns markdown, front_matter, and warnings.</w:t>
-      </w:r>
-    </w:p>
-    <w:p ns2:paraId="23371444" ns2:textId="6E7EA08A">
-      <w:pPr>
-        <w:pStyle w:val="Heading1"/>
-        <w:numPr>
-          <w:ilvl w:val="0"/>
-          <w:numId w:val="1"/>
-        </w:numPr>
-        <w:spacing w:before="0" w:line="240" w:lineRule="auto"/>
-        <w:ind w:hanging="359"/>
-        <w:contextualSpacing/>
-        <w:rPr>
-          <w:rFonts w:ascii="Arial" w:eastAsia="Calibri" w:hAnsi="Arial" w:cs="Arial"/>
-          <w:iCs/>
-          <w:sz w:val="22"/>
-          <w:szCs w:val="22"/>
-        </w:rPr>
-      </w:pPr>
-      <w:r>
-        <w:rPr>
-          <w:rFonts w:ascii="Arial" w:eastAsia="Calibri" w:hAnsi="Arial" w:cs="Arial"/>
-          <w:iCs/>
-          <w:sz w:val="22"/>
-          <w:szCs w:val="22"/>
-        </w:rPr>
-        <w:t xml:space="preserve">Illustrative </w:t>
-      </w:r>
-      <w:r>
-        <w:rPr>
-          <w:rFonts w:ascii="Arial" w:eastAsia="Calibri" w:hAnsi="Arial" w:cs="Arial"/>
-          <w:iCs/>
-          <w:sz w:val="22"/>
-          <w:szCs w:val="22"/>
-        </w:rPr>
-        <w:t>e</w:t>
-      </w:r>
-      <w:r>
-        <w:rPr>
-          <w:rFonts w:ascii="Arial" w:eastAsia="Calibri" w:hAnsi="Arial" w:cs="Arial"/>
-          <w:iCs/>
-          <w:sz w:val="22"/>
-          <w:szCs w:val="22"/>
-        </w:rPr>
-        <w:t>xamples</w:t>
-      </w:r>
-      <w:r>
-        <w:rPr>
-          <w:rFonts w:ascii="Arial" w:eastAsia="Calibri" w:hAnsi="Arial" w:cs="Arial"/>
-          <w:iCs/>
-          <w:sz w:val="22"/>
-          <w:szCs w:val="22"/>
-        </w:rPr>
-        <w:br/>
-      </w:r>
-    </w:p>
-    <w:p>
-      <w:pPr>
-        <w:pStyle w:val="Body"/>
-      </w:pPr>
-      <w:r>
-        <w:rPr>
-          <w:i w:val="0"/>
-        </w:rPr>
-        <w:t>On 238 scoreable pages (277 fetched; 373 URLs listed), ChromeRAG coverage reaches content recall 0.701, noise retention 0.005, and Fbal 0.800, versus Trafilatura (0.662 / 0.019 / 0.752) and MarkItDown (0.702 / 0.261 / 0.695). Metrics use structural main/article vs nav/footer anchors. Figures 1–4 (papers/softwarex/figures/) show Fbal, recall, noise retention, and the corpus honesty gate (listed → fetched → scoreable/thin).</w:t>
-      </w:r>
-    </w:p>
-    <w:p>
-      <w:pPr>
-        <w:pStyle w:val="Body"/>
-      </w:pPr>
-      <w:r>
-        <w:rPr>
-          <w:i w:val="0"/>
-        </w:rPr>
-        <w:t>Priority knobs trade recall vs noise. Passing a near-empty div id=root shell prints a stderr WARNING that the caller must render first—reviewers should trust that disclosure more than a table that silently averages those failures.</w:t>
-      </w:r>
-    </w:p>
-    <w:p>
-      <w:r>
-        <w:drawing>
-          <ns3:inline distT="0" distB="0" distL="0" distR="0">
-            <ns3:extent cx="5943600" cy="3439800"/>
-            <ns3:docPr id="1" name="fig1_fbal.png"/>
-            <ns4:graphic>
-              <ns4:graphicData uri="http://schemas.openxmlformats.org/drawingml/2006/picture">
-                <ns5:pic>
-                  <ns5:nvPicPr>
-                    <ns5:cNvPr id="0" name="fig1_fbal.png"/>
-                    <ns5:cNvPicPr/>
-                  </ns5:nvPicPr>
-                  <ns5:blipFill>
-                    <ns4:blip ns6:embed="rId26"/>
-                    <ns4:stretch>
-                      <ns4:fillRect/>
-                    </ns4:stretch>
-                  </ns5:blipFill>
-                  <ns5:spPr>
-                    <ns4:xfrm>
-                      <ns4:off x="0" y="0"/>
-                      <ns4:ext cx="5943600" cy="3439800"/>
-                    </ns4:xfrm>
-                    <ns4:prstGeom prst="rect">
-                      <ns4:avLst/>
-                    </ns4:prstGeom>
-                  </ns5:spPr>
-                </ns5:pic>
-              </ns4:graphicData>
-            </ns4:graphic>
-          </ns3:inline>
-        </w:drawing>
-      </w:r>
-    </w:p>
-    <w:p>
-      <w:pPr>
-        <w:pStyle w:val="Body"/>
-      </w:pPr>
-      <w:r>
-        <w:rPr>
-          <w:i/>
-        </w:rPr>
-        <w:t>Figure 1. Fbal on 238 scoreable pages.</w:t>
-      </w:r>
-    </w:p>
-    <w:p>
-      <w:r>
-        <w:drawing>
-          <ns3:inline distT="0" distB="0" distL="0" distR="0">
-            <ns3:extent cx="5943600" cy="3439800"/>
-            <ns3:docPr id="1" name="fig2_recall.png"/>
-            <ns4:graphic>
-              <ns4:graphicData uri="http://schemas.openxmlformats.org/drawingml/2006/picture">
-                <ns5:pic>
-                  <ns5:nvPicPr>
-                    <ns5:cNvPr id="0" name="fig2_recall.png"/>
-                    <ns5:cNvPicPr/>
-                  </ns5:nvPicPr>
-                  <ns5:blipFill>
-                    <ns4:blip ns6:embed="rId27"/>
-                    <ns4:stretch>
-                      <ns4:fillRect/>
-                    </ns4:stretch>
-                  </ns5:blipFill>
-                  <ns5:spPr>
-                    <ns4:xfrm>
-                      <ns4:off x="0" y="0"/>
-                      <ns4:ext cx="5943600" cy="3439800"/>
-                    </ns4:xfrm>
-                    <ns4:prstGeom prst="rect">
-                      <ns4:avLst/>
-                    </ns4:prstGeom>
-                  </ns5:spPr>
-                </ns5:pic>
-              </ns4:graphicData>
-            </ns4:graphic>
-          </ns3:inline>
-        </w:drawing>
-      </w:r>
-    </w:p>
-    <w:p>
-      <w:pPr>
-        <w:pStyle w:val="Body"/>
-      </w:pPr>
-      <w:r>
-        <w:rPr>
-          <w:i/>
-        </w:rPr>
-        <w:t>Figure 2. Content recall on the same scoreable set.</w:t>
-      </w:r>
-    </w:p>
-    <w:p>
-      <w:r>
-        <w:drawing>
-          <ns3:inline distT="0" distB="0" distL="0" distR="0">
-            <ns3:extent cx="5943600" cy="3439800"/>
-            <ns3:docPr id="1" name="fig3_noise.png"/>
-            <ns4:graphic>
-              <ns4:graphicData uri="http://schemas.openxmlformats.org/drawingml/2006/picture">
-                <ns5:pic>
-                  <ns5:nvPicPr>
-                    <ns5:cNvPr id="0" name="fig3_noise.png"/>
-                    <ns5:cNvPicPr/>
-                  </ns5:nvPicPr>
-                  <ns5:blipFill>
-                    <ns4:blip ns6:embed="rId28"/>
-                    <ns4:stretch>
-                      <ns4:fillRect/>
-                    </ns4:stretch>
-                  </ns5:blipFill>
-                  <ns5:spPr>
-                    <ns4:xfrm>
-                      <ns4:off x="0" y="0"/>
-                      <ns4:ext cx="5943600" cy="3439800"/>
-                    </ns4:xfrm>
-                    <ns4:prstGeom prst="rect">
-                      <ns4:avLst/>
-                    </ns4:prstGeom>
-                  </ns5:spPr>
-                </ns5:pic>
-              </ns4:graphicData>
-            </ns4:graphic>
-          </ns3:inline>
-        </w:drawing>
-      </w:r>
-    </w:p>
-    <w:p>
-      <w:pPr>
-        <w:pStyle w:val="Body"/>
-      </w:pPr>
-      <w:r>
-        <w:rPr>
-          <w:i/>
-        </w:rPr>
-        <w:t>Figure 3. Noise retention (lower is better).</w:t>
-      </w:r>
-    </w:p>
-    <w:p>
-      <w:r>
-        <w:drawing>
-          <ns3:inline distT="0" distB="0" distL="0" distR="0">
-            <ns3:extent cx="5943600" cy="2376000"/>
-            <ns3:docPr id="1" name="fig4_corpus_gate.png"/>
-            <ns4:graphic>
-              <ns4:graphicData uri="http://schemas.openxmlformats.org/drawingml/2006/picture">
-                <ns5:pic>
-                  <ns5:nvPicPr>
-                    <ns5:cNvPr id="0" name="fig4_corpus_gate.png"/>
-                    <ns5:cNvPicPr/>
-                  </ns5:nvPicPr>
-                  <ns5:blipFill>
-                    <ns4:blip ns6:embed="rId29"/>
-                    <ns4:stretch>
-                      <ns4:fillRect/>
-                    </ns4:stretch>
-                  </ns5:blipFill>
-                  <ns5:spPr>
-                    <ns4:xfrm>
-                      <ns4:off x="0" y="0"/>
-                      <ns4:ext cx="5943600" cy="2376000"/>
-                    </ns4:xfrm>
-                    <ns4:prstGeom prst="rect">
-                      <ns4:avLst/>
-                    </ns4:prstGeom>
-                  </ns5:spPr>
-                </ns5:pic>
-              </ns4:graphicData>
-            </ns4:graphic>
-          </ns3:inline>
-        </w:drawing>
-      </w:r>
-    </w:p>
-    <w:p>
-      <w:pPr>
-        <w:pStyle w:val="Body"/>
-      </w:pPr>
-      <w:r>
-        <w:rPr>
-          <w:i/>
-        </w:rPr>
-        <w:t>Figure 4. Corpus honesty gate: listed → fetched → scoreable / thin.</w:t>
-      </w:r>
-    </w:p>
-    <w:p ns2:paraId="50F2D018" ns2:textId="77948274">
-      <w:pPr>
-        <w:numPr>
-          <w:ilvl w:val="0"/>
-          <w:numId w:val="1"/>
-        </w:numPr>
-        <w:spacing w:after="0" w:line="240" w:lineRule="auto"/>
-        <w:ind w:hanging="359"/>
-        <w:contextualSpacing/>
-        <w:rPr>
-          <w:rFonts w:ascii="Arial" w:hAnsi="Arial" w:cs="Arial"/>
-          <w:b/>
-          <w:iCs/>
-          <w:szCs w:val="22"/>
-        </w:rPr>
-      </w:pPr>
-      <w:r>
-        <w:rPr>
-          <w:rFonts w:ascii="Arial" w:hAnsi="Arial" w:cs="Arial"/>
-          <w:b/>
-          <w:iCs/>
-          <w:szCs w:val="22"/>
-        </w:rPr>
-        <w:t>Impact</w:t>
-      </w:r>
-      <w:r>
-        <w:rPr>
-          <w:rFonts w:ascii="Arial" w:hAnsi="Arial" w:cs="Arial"/>
-          <w:b/>
-          <w:iCs/>
-          <w:szCs w:val="22"/>
-        </w:rPr>
-        <w:br/>
-      </w:r>
-    </w:p>
-    <w:p>
-      <w:pPr>
-        <w:pStyle w:val="Body"/>
-      </w:pPr>
-      <w:r>
-        <w:rPr>
-          <w:i w:val="0"/>
-        </w:rPr>
-        <w:t>ChromeRAG enables new evaluation questions about ingest-time chrome pollution versus converter token counts alone, using Recall, Noise retention, and Fbal on corporate docs/pricing/marketing HTML.</w:t>
-      </w:r>
-    </w:p>
-    <w:p>
-      <w:pPr>
-        <w:pStyle w:val="Body"/>
-      </w:pPr>
-      <w:r>
-        <w:rPr>
-          <w:i w:val="0"/>
-        </w:rPr>
-        <w:t>It improves existing RAG corpus construction by cutting chrome retention (~0.005 vs ~0.26 for MarkItDown-class converters) while keeping documentation and table facts, and by injecting Schema.org identity into chunk front-matter.</w:t>
-      </w:r>
-    </w:p>
-    <w:p>
-      <w:pPr>
-        <w:pStyle w:val="Body"/>
-      </w:pPr>
-      <w:r>
-        <w:rPr>
-          <w:i w:val="0"/>
-        </w:rPr>
-        <w:t>Daily practice: practitioners wire chromerag into loaders and ETL jobs; input-quality warnings surface broken fetch/render pipelines before vectors are indexed.</w:t>
-      </w:r>
-    </w:p>
-    <w:p>
-      <w:pPr>
-        <w:pStyle w:val="Body"/>
-      </w:pPr>
-      <w:r>
-        <w:rPr>
-          <w:i w:val="0"/>
-        </w:rPr>
-        <w:t>The software is newly released as open source on GitHub under MIT; adoption metrics will grow with the public repository and Compare Lab. Commercial use is intended as a library dependency inside private RAG stacks rather than a hosted SaaS.</w:t>
-      </w:r>
-    </w:p>
-    <w:p>
-      <w:pPr>
-        <w:pStyle w:val="Body"/>
-      </w:pPr>
-      <w:r>
-        <w:rPr>
-          <w:i w:val="0"/>
-        </w:rPr>
-        <w:t>Limitations stated for honesty: ChromeRAG does not execute JavaScript; thin pages (39 of 277) are excluded from leaderboard means via a scoreable hygiene gate (recall ≥ 0.05), with both counts reported; anchors are structural heuristics, not human gold.</w:t>
-      </w:r>
-    </w:p>
-    <w:bookmarkEnd w:id="14"/>
-    <w:p ns2:paraId="6077F737" ns2:textId="77777777">
-      <w:pPr>
-        <w:pStyle w:val="Heading1"/>
-        <w:numPr>
-          <w:ilvl w:val="0"/>
-          <w:numId w:val="1"/>
-        </w:numPr>
-        <w:spacing w:before="0" w:line="240" w:lineRule="auto"/>
-        <w:ind w:hanging="359"/>
-        <w:contextualSpacing/>
-        <w:rPr>
-          <w:rFonts w:ascii="Arial" w:eastAsia="Calibri" w:hAnsi="Arial" w:cs="Arial"/>
-          <w:iCs/>
-          <w:sz w:val="22"/>
-          <w:szCs w:val="22"/>
-        </w:rPr>
-      </w:pPr>
-      <w:r>
-        <w:rPr>
-          <w:rFonts w:ascii="Arial" w:eastAsia="Calibri" w:hAnsi="Arial" w:cs="Arial"/>
-          <w:iCs/>
-          <w:sz w:val="22"/>
-          <w:szCs w:val="22"/>
-        </w:rPr>
-        <w:t>Conclusions</w:t>
-      </w:r>
-    </w:p>
-    <w:p>
-      <w:pPr>
-        <w:pStyle w:val="Body"/>
-      </w:pPr>
-      <w:r>
-        <w:rPr>
-          <w:i w:val="0"/>
-        </w:rPr>
-        <w:t>ChromeRAG packages ingest-time chrome elimination, optional vector density pruning, schema front-matter, table linearization, and input-quality warnings into a MIT-licensed Python CLI. On 238 scoreable public pages, coverage mode reaches Fbal 0.800 vs Trafilatura 0.752 and MarkItDown 0.695, mainly by cutting chrome retention. Future work includes page-type adaptive profiles and Chrome Centroid Drift metrics.</w:t>
-      </w:r>
-    </w:p>
-    <w:p ns2:paraId="1B7B8834" ns2:textId="658852DB">
-      <w:pPr>
-        <w:spacing w:after="0" w:line="240" w:lineRule="auto"/>
-        <w:rPr>
-          <w:rFonts w:ascii="Arial" w:eastAsia="Times New Roman" w:hAnsi="Arial" w:cs="Arial"/>
-          <w:b/>
-          <w:szCs w:val="22"/>
-          <w:lang w:val="en"/>
-        </w:rPr>
-      </w:pPr>
-      <w:r>
-        <w:rPr>
-          <w:rFonts w:ascii="Arial" w:eastAsia="Times New Roman" w:hAnsi="Arial" w:cs="Arial"/>
-          <w:b/>
-          <w:szCs w:val="22"/>
-          <w:lang w:val="en"/>
-        </w:rPr>
-        <w:t xml:space="preserve">Acknowledgements </w:t>
-      </w:r>
-      <w:r>
-        <w:rPr>
-          <w:rFonts w:ascii="Arial" w:eastAsia="Times New Roman" w:hAnsi="Arial" w:cs="Arial"/>
-          <w:b/>
-          <w:szCs w:val="22"/>
-          <w:lang w:val="en"/>
-        </w:rPr>
-        <w:br/>
-      </w:r>
-    </w:p>
-    <w:p ns2:paraId="6D24FBCB" ns2:textId="6C9D8D18">
-      <w:pPr>
-        <w:spacing w:after="0" w:line="240" w:lineRule="auto"/>
-        <w:rPr>
-          <w:rFonts w:ascii="Arial" w:eastAsia="Times New Roman" w:hAnsi="Arial" w:cs="Arial"/>
-          <w:b/>
-          <w:szCs w:val="22"/>
-          <w:lang w:val="en"/>
-        </w:rPr>
-      </w:pPr>
-      <w:r>
-        <w:rPr>
-          <w:i w:val="0"/>
-        </w:rPr>
-        <w:t>None.</w:t>
-      </w:r>
-    </w:p>
-    <w:p ns2:paraId="14D333A3" ns2:textId="77777777">
-      <w:pPr>
-        <w:pStyle w:val="Heading1"/>
-        <w:spacing w:before="0" w:line="240" w:lineRule="auto"/>
-        <w:rPr>
-          <w:rFonts w:ascii="Arial" w:eastAsia="Calibri" w:hAnsi="Arial" w:cs="Arial"/>
-          <w:i/>
-          <w:sz w:val="22"/>
-          <w:szCs w:val="22"/>
-        </w:rPr>
-      </w:pPr>
-    </w:p>
-    <w:p ns2:paraId="62FE8705" ns2:textId="3B3D771E">
+    <w:p>
       <w:pPr>
         <w:pStyle w:val="Heading1"/>
         <w:spacing w:before="0" w:line="240" w:lineRule="auto"/>
@@ -1603,81 +883,910 @@
           <w:szCs w:val="22"/>
         </w:rPr>
       </w:pPr>
-      <w:bookmarkStart w:id="15" w:name="_Hlk76743319"/>
-      <w:r>
+      <w:r>
+        <w:t>Motivation and significance</w:t>
+      </w:r>
+    </w:p>
+    <w:p>
+      <w:pPr>
+        <w:pStyle w:val="Body"/>
+      </w:pPr>
+      <w:r>
+        <w:t>The vector-pollution problem in enterprise RAG. Retrieval-augmented generation has become the dominant architecture for grounding large language models in organizational knowledge. Enterprise deployments typically ingest documentation portals, product knowledge bases, API references, pricing pages, and support wikis—corpora whose HTML was not authored for machine consumption. When a crawler fetches such pages, the raw HTML bundles factual prose with persistent chrome: top navigation menus repeated across every page, sidebar link trees, cookie-consent banners, global footers containing legal notices and social links, and call-to-action overlays. Converting this HTML with a generic extractor and embedding the result pollutes the vector store. At query time, high-frequency chrome chunks produce false positives, dilute genuine content neighbors, and inflate the context windows sent to the generative model. The problem compounds at scale: a 10,000-page documentation corpus in which each page carries 200 tokens of repeated footer yields two million wasted embedding tokens and a proportionate share of retrieval noise that no retriever-side heuristic can cleanly resolve.</w:t>
+      </w:r>
+    </w:p>
+    <w:p>
+      <w:pPr>
+        <w:pStyle w:val="Body"/>
+      </w:pPr>
+      <w:r>
+        <w:t>Why existing tools leave a gap. The HTML extraction landscape offers several mature tools, each optimized for a different primary objective. Trafilatura [1] excels at extracting the main text of news and blog articles through a density-based boilerplate filter; it achieves strong recall on editorial content but was not designed for corporate documentation layouts where chrome and content are interleaved at similar text densities. Readability (as exposed by readability-lxml [6] and its Mozilla/Arc90 antecedents) targets single-article extraction and performs poorly on reference pages, tables, or multi-section API documentation. MarkItDown [5] faithfully preserves document structure—tables, code blocks, and headings—but is explicitly a format converter rather than a chrome filter; it retains navigation and footer text at approximately the same fidelity as body prose, yielding the high F_bal-penalizing noise retention (≈0.261) observed in the benchmark. Template-extractor research such as Alarte et al. [2] studies structural HTML patterns across corpora but does not produce an end-to-end RAG ingest toolkit. Query-time approaches such as HtmlRAG [3] prune HTML within the retrieval context window rather than at index time, making them complementary to—rather than substitutes for—ingest-time chrome removal.</w:t>
+      </w:r>
+    </w:p>
+    <w:p>
+      <w:pPr>
+        <w:pStyle w:val="Body"/>
+      </w:pPr>
+      <w:r>
+        <w:t>The ChromeRAG contribution. No existing tool jointly provides: (i) a domain-adaptive, learn-then-extract site chrome model that observes multiple pages from the same domain and identifies recurrent structural fragments before extracting any individual page; (ii) Schema.org JSON-LD and Microdata harvested into YAML front-matter, giving each Markdown document typed metadata (article name, description, datePublished) for chunk-level context enrichment; (iii) pricing and specification table linearization that converts &lt;table&gt; elements into key-value pairs suitable for dense-passage embedding; and (iv) explicit input-quality warnings that distinguish correctly processed sparse pages from broken JavaScript shells that require upstream Playwright rendering. ChromeRAG targets these gaps as an ingest-time, query-agnostic software layer—orthogonal to query-time HTML pruning [3] and independent of any particular retriever or language model.</w:t>
+      </w:r>
+    </w:p>
+    <w:p>
+      <w:pPr>
+        <w:pStyle w:val="Body"/>
+      </w:pPr>
+      <w:r>
+        <w:t>Relevance to scientific and engineering practice. Scientific discovery, software engineering assistance, and enterprise decision-support increasingly depend on assistants grounded in large organizational web corpora. A reproducible, CPU-first ingest component that reduces chrome pollution improves retrieval faithfulness without requiring GPU-based extractors or per-query HTML manipulation. The software is a citable, inspectable, MIT-licensed toolkit with a clearly bounded scope and reproducible evaluation scripts. SoftwareX is the appropriate venue because the primary contribution is the software artifact itself; the corpus benchmark serves as illustrative validation rather than a methodological claim about the state of the art.</w:t>
+      </w:r>
+    </w:p>
+    <w:p>
+      <w:pPr>
+        <w:pStyle w:val="Heading1"/>
+        <w:spacing w:before="0" w:line="240" w:lineRule="auto"/>
         <w:rPr>
           <w:rFonts w:ascii="Arial" w:eastAsia="Calibri" w:hAnsi="Arial" w:cs="Arial"/>
           <w:iCs/>
           <w:sz w:val="22"/>
           <w:szCs w:val="22"/>
         </w:rPr>
-        <w:t xml:space="preserve">References </w:t>
-      </w:r>
-      <w:r>
+      </w:pPr>
+      <w:r>
+        <w:t>Software description</w:t>
+      </w:r>
+    </w:p>
+    <w:p>
+      <w:pPr>
+        <w:pStyle w:val="Heading2"/>
+      </w:pPr>
+      <w:r>
+        <w:t>Software architecture</w:t>
+      </w:r>
+    </w:p>
+    <w:p>
+      <w:pPr>
+        <w:pStyle w:val="Body"/>
+      </w:pPr>
+      <w:r>
+        <w:t>ChromeRAG processes each HTML document through a sequential pipeline with clearly separated, independently testable stages.</w:t>
+      </w:r>
+    </w:p>
+    <w:p>
+      <w:pPr>
+        <w:pStyle w:val="Body"/>
+      </w:pPr>
+      <w:r>
+        <w:t>An input-quality gate runs first. The raw HTML is inspected for DOM sparsity and characteristic JavaScript-shell signatures—an &lt;html&gt; tree whose &lt;body&gt; contains only &lt;div id="root"&gt; or &lt;div id="app"&gt; wrappers with negligible text content. Pages that meet a minimum content threshold proceed normally; pages that fail emit WARNING: messages on stderr and populate result.warnings, enabling callers to route flagged inputs to a Playwright rendering step before re-ingestion. The gate evaluates the true input, before any stripping, so warnings reflect the document as received rather than a processed residue.</w:t>
+      </w:r>
+    </w:p>
+    <w:p>
+      <w:pPr>
+        <w:pStyle w:val="Body"/>
+      </w:pPr>
+      <w:r>
+        <w:t>The second stage harvests Schema.org metadata: JSON-LD &lt;script type="application/ld+json"&gt; blocks and Microdata attributes are extracted from the raw HTML before any script or style removal. Properties such as article name, description, keywords, datePublished, and author are serialized as YAML front-matter prepended to the final Markdown document. Harvesting prior to cleaning ensures that metadata embedded inside &lt;script&gt; tags is not discarded with other executable content.</w:t>
+      </w:r>
+    </w:p>
+    <w:p>
+      <w:pPr>
+        <w:pStyle w:val="Body"/>
+      </w:pPr>
+      <w:r>
+        <w:t>The third stage performs deterministic structural cleaning and optional STCE application: removal of &lt;script&gt;, &lt;style&gt;, &lt;noscript&gt;, and inline SVG blobs; whitespace normalization; and—when a chrome model file is supplied—application of the Site-Template Chrome Elimination model. The STCE model is a JSON artefact produced by chromerag learn from a multi-page sample of the same site. It encodes recurring structural patterns (CSS selector paths, text-density profiles, and positional heuristics) that identify navigation and footer fragments, pruning them before the Markdown converter runs.</w:t>
+      </w:r>
+    </w:p>
+    <w:p>
+      <w:pPr>
+        <w:pStyle w:val="Body"/>
+      </w:pPr>
+      <w:r>
+        <w:t>The fourth stage optionally applies DVDF (Semantic Vector Density Filtering): an ONNX-hosted MiniLM sentence encoder computes cosine distances between each leaf text node and heuristic noise-anchor phrases (marketing/boilerplate templates). Leaf nodes below the noise threshold are dropped. DVDF is installed with the [dvdf] extras group and is skipped gracefully when ONNX Runtime is absent, keeping it an opt-in enhancement rather than a required dependency.</w:t>
+      </w:r>
+    </w:p>
+    <w:p>
+      <w:pPr>
+        <w:pStyle w:val="Body"/>
+      </w:pPr>
+      <w:r>
+        <w:t>The final stage converts the cleaned DOM to heading-safe Markdown with fenced code blocks and table rendering. Tables are optionally linearized into key-value pairs for RAG embedding. The scope boundary is explicit: ChromeRAG owns HTML→Markdown. Fetching, Playwright rendering, crawl concurrency, and rate limiting belong to the caller or to the poc/ evaluation harness provided in the repository.</w:t>
+      </w:r>
+    </w:p>
+    <w:p>
+      <w:pPr>
+        <w:pStyle w:val="Body"/>
+      </w:pPr>
+      <w:r>
+        <w:t xml:space="preserve">HTML string ⏎   → input-quality check (warn on thin / JS shells) ⏎   → schema harvest (JSON-LD / Microdata) BEFORE script strip ⏎   → deterministic clean + optional STCE (learned site chrome) ⏎   → density / DVDF leaf prune (optional ONNX MiniLM) ⏎   → heading-safe Markdown + YAML front-matter ⏎   → optional table key-value linearization</w:t>
+      </w:r>
+    </w:p>
+    <w:p>
+      <w:pPr>
+        <w:pStyle w:val="Heading2"/>
+      </w:pPr>
+      <w:r>
+        <w:t>Software functionalities</w:t>
+      </w:r>
+    </w:p>
+    <w:p>
+      <w:pPr>
+        <w:pStyle w:val="Body"/>
+      </w:pPr>
+      <w:r>
+        <w:t>The core public API is the ChromeRAG class. A PipelineConfig (or PipelineConfig.from_priority(...)) sets priority mode and DVDF/schema/table toggles; an optional SiteChromeModel is passed separately as ChromeRAG(..., site_chrome=model) after chromerag learn. PipelineConfig.from_priority(ContentPriority.COVERAGE) selects the parameter preset optimized for content recall; ContentPriority.PRECISION tightens chrome thresholds at the cost of some recall; ContentPriority.BALANCED is the default enterprise compromise. The .extract(html, url=...) method returns a typed ExtractResult with fields including markdown, front_matter, warnings, diagnostics, and input_quality. The URL argument is used for relative link resolution and logging metadata, not for network access.</w:t>
+      </w:r>
+    </w:p>
+    <w:p>
+      <w:pPr>
+        <w:pStyle w:val="Body"/>
+      </w:pPr>
+      <w:r>
+        <w:t>The CLI exposes three subcommands. chromerag extract processes a single HTML file. chromerag learn builds an STCE chrome model from a directory of HTML pages. chromerag batch processes a directory of raw HTML files with a shared chrome model and writes a summary JSON flagging thin pages. The static Compare Lab under docs/ is a pre-built, zero-dependency site served via GitHub Pages at https://pedapudibhargav.github.io/ChromeRAG/, where users can inspect side-by-side extraction results across tools and page categories without running any code locally.</w:t>
+      </w:r>
+    </w:p>
+    <w:p>
+      <w:pPr>
+        <w:pStyle w:val="Body"/>
+      </w:pPr>
+      <w:r>
+        <w:t>Feature · CLI / API · Notes</w:t>
+      </w:r>
+    </w:p>
+    <w:p>
+      <w:pPr>
+        <w:pStyle w:val="Body"/>
+      </w:pPr>
+      <w:r>
+        <w:t>Extract · chromerag extract page.html -o out.md · --priority {precision,coverage,balanced}</w:t>
+      </w:r>
+    </w:p>
+    <w:p>
+      <w:pPr>
+        <w:pStyle w:val="Body"/>
+      </w:pPr>
+      <w:r>
+        <w:t>Input warnings · stderr + result.warnings · JS shell / thin HTML detection</w:t>
+      </w:r>
+    </w:p>
+    <w:p>
+      <w:pPr>
+        <w:pStyle w:val="Body"/>
+      </w:pPr>
+      <w:r>
+        <w:t>Learn chrome · chromerag learn data/raw -o site.json · STCE model from multi-page corpus</w:t>
+      </w:r>
+    </w:p>
+    <w:p>
+      <w:pPr>
+        <w:pStyle w:val="Body"/>
+      </w:pPr>
+      <w:r>
+        <w:t>Batch · chromerag batch data/raw -o data/outputs --chrome-model site.json · Flags thin pages in summary</w:t>
+      </w:r>
+    </w:p>
+    <w:p>
+      <w:pPr>
+        <w:pStyle w:val="Body"/>
+      </w:pPr>
+      <w:r>
+        <w:t>DVDF · optional [dvdf] extras · ONNX MiniLM noise-anchor cosine prune</w:t>
+      </w:r>
+    </w:p>
+    <w:p>
+      <w:pPr>
+        <w:pStyle w:val="Body"/>
+      </w:pPr>
+      <w:r>
+        <w:t>Compare Lab · docs/ static site · GitHub Pages–safe relative routing</w:t>
+      </w:r>
+    </w:p>
+    <w:p>
+      <w:pPr>
+        <w:pStyle w:val="Heading2"/>
+      </w:pPr>
+      <w:r>
+        <w:t>Sample usage</w:t>
+      </w:r>
+    </w:p>
+    <w:p>
+      <w:pPr>
+        <w:pStyle w:val="Body"/>
+      </w:pPr>
+      <w:r>
+        <w:t>A typical enterprise RAG ingest workflow proceeds in three steps. First, the operator collects a representative sample of pages from the target domain (three pages minimum) and runs chromerag learn to build a site chrome model. Second, chromerag batch processes the full crawl output using that model, writing Markdown files and flagging thin pages in the summary JSON. Third, thin-flagged pages are routed to a Playwright rendering step and re-processed.</w:t>
+      </w:r>
+    </w:p>
+    <w:p>
+      <w:pPr>
+        <w:pStyle w:val="Body"/>
+      </w:pPr>
+      <w:r>
+        <w:t xml:space="preserve">pip install -e ".[dvdf,baselines]" ⏎ chromerag learn data/raw -o data/chrome_models/site.json --min-pages 3 ⏎ chromerag batch data/raw -o data/outputs \ ⏎     --chrome-model data/chrome_models/site.json --priority coverage ⏎ python -m poc.run_corpus_comparison --no-fetch</w:t>
+      </w:r>
+    </w:p>
+    <w:p>
+      <w:pPr>
+        <w:pStyle w:val="Body"/>
+      </w:pPr>
+      <w:r>
+        <w:t>Python API usage for single-page extraction with warning inspection:</w:t>
+      </w:r>
+    </w:p>
+    <w:p>
+      <w:pPr>
+        <w:pStyle w:val="Body"/>
+      </w:pPr>
+      <w:r>
+        <w:t>from chromerag import ChromeRAG, PipelineConfig, ContentPriority</w:t>
+      </w:r>
+    </w:p>
+    <w:p>
+      <w:pPr>
+        <w:pStyle w:val="Body"/>
+      </w:pPr>
+      <w:r>
+        <w:t xml:space="preserve">result = ChromeRAG( ⏎     config=PipelineConfig.from_priority(ContentPriority.BALANCED) ⏎ ).extract(html, url="https://example.com/docs/api-reference")</w:t>
+      </w:r>
+    </w:p>
+    <w:p>
+      <w:pPr>
+        <w:pStyle w:val="Body"/>
+      </w:pPr>
+      <w:r>
+        <w:t xml:space="preserve">md, meta = result.markdown, result.front_matter ⏎ for warning in result.warnings: ⏎     print("WARNING:", warning)  # e.g. "Input HTML looks like a JavaScript-rendered shell..."</w:t>
+      </w:r>
+    </w:p>
+    <w:p>
+      <w:pPr>
+        <w:pStyle w:val="Body"/>
+      </w:pPr>
+      <w:r>
+        <w:t>Full installation instructions, configuration reference, and step-by-step reproducibility instructions for the benchmark are maintained in the repository README.md and on the GitHub Pages documentation site [4], keeping this paper body focused on method and evaluation.</w:t>
+      </w:r>
+    </w:p>
+    <w:p>
+      <w:pPr>
+        <w:pStyle w:val="Heading1"/>
+        <w:spacing w:before="0" w:line="240" w:lineRule="auto"/>
+        <w:contextualSpacing/>
         <w:rPr>
           <w:rFonts w:ascii="Arial" w:eastAsia="Calibri" w:hAnsi="Arial" w:cs="Arial"/>
           <w:iCs/>
           <w:sz w:val="22"/>
           <w:szCs w:val="22"/>
         </w:rPr>
-        <w:br/>
-      </w:r>
-    </w:p>
-    <w:p>
-      <w:r>
-        <w:t>[1] A. Barbaresi, Trafilatura: A Web Scraping Library and Command-Line Tool for Text Discovery and Extraction, Proc. ACL-IJCNLP 2021 System Demonstrations, pp. 122–131, 2021. https://doi.org/10.18653/v1/2021.acl-demo.15</w:t>
-      </w:r>
-    </w:p>
-    <w:p>
-      <w:r>
-        <w:t>[2] J. Alarte, J. Silva, and S. Tamarit, What Web Template Extractor Should I Use? A Benchmarking and Comparison for Five Template Extractors, ACM Trans. Web, vol. 13, no. 2, Art. 9, 2019. https://doi.org/10.1145/3316810</w:t>
-      </w:r>
-    </w:p>
-    <w:p>
-      <w:r>
-        <w:t>[3] J. Tan et al., HtmlRAG: HTML is Better Than Plain Text for Modeling Retrieved Knowledge in RAG Systems, Proc. ACM Web Conf. (WWW ’25), 2025. https://doi.org/10.1145/3696410.3714546</w:t>
-      </w:r>
-    </w:p>
-    <w:p>
-      <w:r>
-        <w:t>[4] B. C. Peddapudi, ChromeRAG, version 0.1.0, GitHub, 2026. https://github.com/pedapudibhargav/ChromeRAG/tree/v0.1.0</w:t>
-      </w:r>
-    </w:p>
-    <w:p>
-      <w:r>
-        <w:t>[5] Microsoft, MarkItDown: Python tool for converting files and office documents to Markdown, GitHub. https://github.com/microsoft/markitdown</w:t>
-      </w:r>
-    </w:p>
-    <w:bookmarkEnd w:id="16"/>
-    <w:p ns2:paraId="457321B2" ns2:textId="0BFCE672">
+      </w:pPr>
+      <w:r>
+        <w:t>Illustrative examples</w:t>
+      </w:r>
+    </w:p>
+    <w:p>
+      <w:pPr>
+        <w:pStyle w:val="Heading2"/>
+      </w:pPr>
+      <w:r>
+        <w:t>Corpus comparison</w:t>
+      </w:r>
+    </w:p>
+    <w:p>
+      <w:pPr>
+        <w:pStyle w:val="Body"/>
+      </w:pPr>
+      <w:r>
+        <w:t>The benchmark corpus listed 373 publicly accessible URLs spanning eight intended page categories (docs, pricing, marketing, wiki, hub, news, article, cloud). After a single-pass fetch using the poc/ harness (HTTP only; no Playwright rendering), 277 pages returned non-error responses. Fetched pages were dominated by documentation and article-like HTML; wiki and news URLs in the listed set did not yield successful fetches in this run. Of the 277 fetched pages, 238 were marked scoreable and 39 thin.</w:t>
+      </w:r>
+    </w:p>
+    <w:p>
+      <w:pPr>
+        <w:pStyle w:val="Body"/>
+      </w:pPr>
+      <w:r>
+        <w:t>Content and chrome anchors are defined from the DOM (5-grams from &lt;main&gt;/&lt;article&gt; vs &lt;nav&gt;/&lt;footer&gt;/&lt;header&gt;). A fetched page enters the scoreable cohort used for leaderboard means when ChromeRAG content recall against those DOM content anchors is ≥ 0.05. This is a disclosed corpus hygiene filter: near-empty or weakly landmark-ed DOMs make recall/noise undefined or near-zero for every tool and would collapse means without clarifying chrome-removal differences. The same fixed cohort is then used for all tools (ChromeRAG, Trafilatura, MarkItDown, Readability)—ChromeRAG does not receive a different evaluation set than baselines. The 39 thin pages include approximately 7 JS-shell-like inputs, 1 other thin DOM, and 31 pages with visible text that still fail the recall gate (unusual layouts or weak &lt;main&gt; landmarks). Listed / fetched / scoreable / thin counts are shown in Figure 4 and in docs/data/corpus_comparison_summary.md.</w:t>
+      </w:r>
+    </w:p>
+    <w:p>
+      <w:pPr>
+        <w:pStyle w:val="Body"/>
+      </w:pPr>
+      <w:r>
+        <w:t>On the 238 scoreable pages:</w:t>
+      </w:r>
+    </w:p>
+    <w:p>
+      <w:pPr>
+        <w:pStyle w:val="Body"/>
+      </w:pPr>
+      <w:r>
+        <w:t>Method · Recall ↑ · Noise ret. ↓ · F_bal ↑</w:t>
+      </w:r>
+    </w:p>
+    <w:p>
+      <w:pPr>
+        <w:pStyle w:val="Body"/>
+      </w:pPr>
+      <w:r>
+        <w:t>chromerag_coverage · 0.701 · 0.005 · 0.800</w:t>
+      </w:r>
+    </w:p>
+    <w:p>
+      <w:pPr>
+        <w:pStyle w:val="Body"/>
+      </w:pPr>
+      <w:r>
+        <w:t>chromerag (balanced) · 0.678 · 0.005 · 0.783</w:t>
+      </w:r>
+    </w:p>
+    <w:p>
+      <w:pPr>
+        <w:pStyle w:val="Body"/>
+      </w:pPr>
+      <w:r>
+        <w:t>trafilatura [1] · 0.662 · 0.019 · 0.752</w:t>
+      </w:r>
+    </w:p>
+    <w:p>
+      <w:pPr>
+        <w:pStyle w:val="Body"/>
+      </w:pPr>
+      <w:r>
+        <w:t>markitdown [5] · 0.702 · 0.261 · 0.695</w:t>
+      </w:r>
+    </w:p>
+    <w:p>
+      <w:pPr>
+        <w:pStyle w:val="Body"/>
+      </w:pPr>
+      <w:r>
+        <w:t>readability [6] · 0.456 · 0.016 · 0.535</w:t>
+      </w:r>
+    </w:p>
+    <w:p>
+      <w:pPr>
+        <w:pStyle w:val="Body"/>
+      </w:pPr>
+      <w:r>
+        <w:t>ChromeRAG's F_bal advantage over MarkItDown (0.800 vs 0.695) derives almost entirely from chrome noise reduction (0.005 vs 0.261) at comparable recall. The gap over Trafilatura (0.800 vs 0.752) reflects incremental recall gains from the STCE model on documentation pages where content and navigation share similar text density—precisely the case where density-only heuristics struggle. Readability's low recall (0.456) reflects its article-centric filter discarding multi-section reference pages and tables.</w:t>
+      </w:r>
+    </w:p>
+    <w:p>
+      <w:pPr>
+        <w:pStyle w:val="Body"/>
+      </w:pPr>
+      <w:r>
+        <w:drawing>
+          <wp:inline distT="0" distB="0" distL="0" distR="0">
+            <wp:extent cx="5943600" cy="3439800"/>
+            <wp:docPr id="1" name="fig1_fbal.png"/>
+            <wp:cNvGraphicFramePr>
+              <ns2:graphicFrameLocks xmlns:ns2="http://schemas.openxmlformats.org/drawingml/2006/main" noChangeAspect="1"/>
+            </wp:cNvGraphicFramePr>
+            <ns3:graphic xmlns:ns3="http://schemas.openxmlformats.org/drawingml/2006/main">
+              <ns3:graphicData uri="http://schemas.openxmlformats.org/drawingml/2006/picture">
+                <ns4:pic xmlns:ns4="http://schemas.openxmlformats.org/drawingml/2006/picture">
+                  <ns4:nvPicPr>
+                    <ns4:cNvPr id="1" name="fig1_fbal.png"/>
+                    <ns4:cNvPicPr/>
+                  </ns4:nvPicPr>
+                  <ns4:blipFill>
+                    <ns3:blip r:embed="rId26"/>
+                    <ns3:stretch>
+                      <ns3:fillRect/>
+                    </ns3:stretch>
+                  </ns4:blipFill>
+                  <ns4:spPr>
+                    <ns3:xfrm>
+                      <ns3:off x="0" y="0"/>
+                      <ns3:ext cx="5943600" cy="3439800"/>
+                    </ns3:xfrm>
+                    <ns3:prstGeom prst="rect">
+                      <ns3:avLst/>
+                    </ns3:prstGeom>
+                  </ns4:spPr>
+                </ns4:pic>
+              </ns3:graphicData>
+            </ns3:graphic>
+          </wp:inline>
+        </w:drawing>
+      </w:r>
+    </w:p>
+    <w:p>
+      <w:pPr>
+        <w:pStyle w:val="Body"/>
+      </w:pPr>
+      <w:r>
+        <w:rPr>
+          <w:i/>
+        </w:rPr>
+        <w:t>Figure 1. Balanced F-score (Fbal) on 238 scoreable pages (higher is better).</w:t>
+      </w:r>
+    </w:p>
+    <w:p>
+      <w:pPr>
+        <w:pStyle w:val="Body"/>
+      </w:pPr>
+      <w:r>
+        <w:drawing>
+          <wp:inline distT="0" distB="0" distL="0" distR="0">
+            <wp:extent cx="5943600" cy="3439800"/>
+            <wp:docPr id="2" name="fig2_recall.png"/>
+            <wp:cNvGraphicFramePr>
+              <ns2:graphicFrameLocks xmlns:ns2="http://schemas.openxmlformats.org/drawingml/2006/main" noChangeAspect="1"/>
+            </wp:cNvGraphicFramePr>
+            <ns3:graphic xmlns:ns3="http://schemas.openxmlformats.org/drawingml/2006/main">
+              <ns3:graphicData uri="http://schemas.openxmlformats.org/drawingml/2006/picture">
+                <ns4:pic xmlns:ns4="http://schemas.openxmlformats.org/drawingml/2006/picture">
+                  <ns4:nvPicPr>
+                    <ns4:cNvPr id="2" name="fig2_recall.png"/>
+                    <ns4:cNvPicPr/>
+                  </ns4:nvPicPr>
+                  <ns4:blipFill>
+                    <ns3:blip r:embed="rId27"/>
+                    <ns3:stretch>
+                      <ns3:fillRect/>
+                    </ns3:stretch>
+                  </ns4:blipFill>
+                  <ns4:spPr>
+                    <ns3:xfrm>
+                      <ns3:off x="0" y="0"/>
+                      <ns3:ext cx="5943600" cy="3439800"/>
+                    </ns3:xfrm>
+                    <ns3:prstGeom prst="rect">
+                      <ns3:avLst/>
+                    </ns3:prstGeom>
+                  </ns4:spPr>
+                </ns4:pic>
+              </ns3:graphicData>
+            </ns3:graphic>
+          </wp:inline>
+        </w:drawing>
+      </w:r>
+    </w:p>
+    <w:p>
+      <w:pPr>
+        <w:pStyle w:val="Body"/>
+      </w:pPr>
+      <w:r>
+        <w:rPr>
+          <w:i/>
+        </w:rPr>
+        <w:t>Figure 2. Content recall on the same scoreable set (higher is better).</w:t>
+      </w:r>
+    </w:p>
+    <w:p>
+      <w:pPr>
+        <w:pStyle w:val="Body"/>
+      </w:pPr>
+      <w:r>
+        <w:drawing>
+          <wp:inline distT="0" distB="0" distL="0" distR="0">
+            <wp:extent cx="5943600" cy="3439800"/>
+            <wp:docPr id="3" name="fig3_noise.png"/>
+            <wp:cNvGraphicFramePr>
+              <ns2:graphicFrameLocks xmlns:ns2="http://schemas.openxmlformats.org/drawingml/2006/main" noChangeAspect="1"/>
+            </wp:cNvGraphicFramePr>
+            <ns3:graphic xmlns:ns3="http://schemas.openxmlformats.org/drawingml/2006/main">
+              <ns3:graphicData uri="http://schemas.openxmlformats.org/drawingml/2006/picture">
+                <ns4:pic xmlns:ns4="http://schemas.openxmlformats.org/drawingml/2006/picture">
+                  <ns4:nvPicPr>
+                    <ns4:cNvPr id="3" name="fig3_noise.png"/>
+                    <ns4:cNvPicPr/>
+                  </ns4:nvPicPr>
+                  <ns4:blipFill>
+                    <ns3:blip r:embed="rId28"/>
+                    <ns3:stretch>
+                      <ns3:fillRect/>
+                    </ns3:stretch>
+                  </ns4:blipFill>
+                  <ns4:spPr>
+                    <ns3:xfrm>
+                      <ns3:off x="0" y="0"/>
+                      <ns3:ext cx="5943600" cy="3439800"/>
+                    </ns3:xfrm>
+                    <ns3:prstGeom prst="rect">
+                      <ns3:avLst/>
+                    </ns3:prstGeom>
+                  </ns4:spPr>
+                </ns4:pic>
+              </ns3:graphicData>
+            </ns3:graphic>
+          </wp:inline>
+        </w:drawing>
+      </w:r>
+    </w:p>
+    <w:p>
+      <w:pPr>
+        <w:pStyle w:val="Body"/>
+      </w:pPr>
+      <w:r>
+        <w:rPr>
+          <w:i/>
+        </w:rPr>
+        <w:t>Figure 3. Noise retention — chrome/boilerplate kept (lower is better).</w:t>
+      </w:r>
+    </w:p>
+    <w:p>
+      <w:pPr>
+        <w:pStyle w:val="Body"/>
+      </w:pPr>
+      <w:r>
+        <w:drawing>
+          <wp:inline distT="0" distB="0" distL="0" distR="0">
+            <wp:extent cx="5943600" cy="2376000"/>
+            <wp:docPr id="4" name="fig4_corpus_gate.png"/>
+            <wp:cNvGraphicFramePr>
+              <ns2:graphicFrameLocks xmlns:ns2="http://schemas.openxmlformats.org/drawingml/2006/main" noChangeAspect="1"/>
+            </wp:cNvGraphicFramePr>
+            <ns3:graphic xmlns:ns3="http://schemas.openxmlformats.org/drawingml/2006/main">
+              <ns3:graphicData uri="http://schemas.openxmlformats.org/drawingml/2006/picture">
+                <ns4:pic xmlns:ns4="http://schemas.openxmlformats.org/drawingml/2006/picture">
+                  <ns4:nvPicPr>
+                    <ns4:cNvPr id="4" name="fig4_corpus_gate.png"/>
+                    <ns4:cNvPicPr/>
+                  </ns4:nvPicPr>
+                  <ns4:blipFill>
+                    <ns3:blip r:embed="rId29"/>
+                    <ns3:stretch>
+                      <ns3:fillRect/>
+                    </ns3:stretch>
+                  </ns4:blipFill>
+                  <ns4:spPr>
+                    <ns3:xfrm>
+                      <ns3:off x="0" y="0"/>
+                      <ns3:ext cx="5943600" cy="2376000"/>
+                    </ns3:xfrm>
+                    <ns3:prstGeom prst="rect">
+                      <ns3:avLst/>
+                    </ns3:prstGeom>
+                  </ns4:spPr>
+                </ns4:pic>
+              </ns3:graphicData>
+            </ns3:graphic>
+          </wp:inline>
+        </w:drawing>
+      </w:r>
+    </w:p>
+    <w:p>
+      <w:pPr>
+        <w:pStyle w:val="Body"/>
+      </w:pPr>
+      <w:r>
+        <w:rPr>
+          <w:i/>
+        </w:rPr>
+        <w:t>Figure 4. Corpus honesty gate: listed URLs → fetched HTML → scoreable pages used in means (thin/JS shells excluded).</w:t>
+      </w:r>
+    </w:p>
+    <w:p>
+      <w:pPr>
+        <w:pStyle w:val="Heading2"/>
+      </w:pPr>
+      <w:r>
+        <w:t>Priority knobs and input-quality warnings</w:t>
+      </w:r>
+    </w:p>
+    <w:p>
+      <w:pPr>
+        <w:pStyle w:val="Body"/>
+      </w:pPr>
+      <w:r>
+        <w:t>The --priority flag maps to three parameter presets. Precision mode applies tighter chrome thresholds, accepting lower recall in exchange for minimal noise; it suits corpora where chrome pollution carries a direct cost (e.g., product-specification extractors that must not return marketing boilerplate). Coverage mode relaxes thresholds to favour recall, accepting marginally more borderline content; this is appropriate for question-answering corpora where a missed factual sentence is more costly than a stray navigation link. Balanced mode is the default and the recommended starting point for general enterprise RAG.</w:t>
+      </w:r>
+    </w:p>
+    <w:p>
+      <w:pPr>
+        <w:pStyle w:val="Body"/>
+      </w:pPr>
+      <w:r>
+        <w:t>When a page is suspected to be an unrendered JavaScript shell—identified by low visible text, script-heavy HTML, SPA root markers such as id="root" / id="app" / __next, or noscript “enable JavaScript” hints—ChromeRAG emits a structured warning in result.warnings and on stderr (for example: “Input HTML looks like a JavaScript-rendered shell … Render the page first (Playwright / Puppeteer / your crawler) …”). This fires regardless of priority mode. The --fail-on-thin CLI flag converts warnings to non-zero exit codes, enabling automated pipeline health checks: operators who observe a high thin-page rate in batch output can treat it as a signal that the upstream fetcher is not rendering JavaScript, and route those pages through a headless browser before re-running chromerag batch.</w:t>
+      </w:r>
+    </w:p>
+    <w:p>
+      <w:pPr>
+        <w:spacing w:after="0" w:line="240" w:lineRule="auto"/>
+        <w:contextualSpacing/>
+        <w:rPr>
+          <w:rFonts w:ascii="Arial" w:hAnsi="Arial" w:cs="Arial"/>
+          <w:b/>
+          <w:iCs/>
+          <w:szCs w:val="22"/>
+        </w:rPr>
+        <w:pStyle w:val="Heading1"/>
+      </w:pPr>
+      <w:r>
+        <w:t>Impact</w:t>
+      </w:r>
+    </w:p>
+    <w:p>
+      <w:pPr>
+        <w:pStyle w:val="Heading2"/>
+      </w:pPr>
+      <w:r>
+        <w:t>Intended users and pathways</w:t>
+      </w:r>
+    </w:p>
+    <w:p>
+      <w:pPr>
+        <w:pStyle w:val="Body"/>
+      </w:pPr>
+      <w:r>
+        <w:t>ChromeRAG is aimed primarily at software engineers and data engineers building RAG corpora from corporate or public web sources. The design was validated against public documentation and pricing HTML and exercised in production-style enterprise documentation ingest workflows. Four concrete deployment pathways follow.</w:t>
+      </w:r>
+    </w:p>
+    <w:p>
+      <w:pPr>
+        <w:pStyle w:val="Body"/>
+      </w:pPr>
+      <w:r>
+        <w:t>Custom loaders in orchestration frameworks. LangChain and LlamaIndex both expose pluggable document loader interfaces. ChromeRAG can be wrapped as a custom Document loader that accepts raw HTML from any fetch library and returns a Document with page_content set to extracted Markdown and metadata populated from YAML front-matter. This integration requires no changes to the retrieval or generation layers; chrome removal is transparent to the rest of the pipeline.</w:t>
+      </w:r>
+    </w:p>
+    <w:p>
+      <w:pPr>
+        <w:pStyle w:val="Body"/>
+      </w:pPr>
+      <w:r>
+        <w:t>Batch ingest jobs in data platforms. In Airflow, Prefect, or Spark-based pipelines, chromerag batch can run as a processing operator downstream of a crawl step. The batch summary JSON allows downstream tasks to branch: scoreable pages proceed to chunking and embedding; thin-flagged pages trigger a re-crawl with Playwright rendering. This explicit quality signal is absent from converters that silently produce near-empty Markdown for unrendered JS shells and emit no diagnostic output.</w:t>
+      </w:r>
+    </w:p>
+    <w:p>
+      <w:pPr>
+        <w:pStyle w:val="Body"/>
+      </w:pPr>
+      <w:r>
+        <w:t>Benchmark and research baselines. The corpus comparison benchmark—reproducible via python -m poc.run_corpus_comparison --no-fetch—provides a reusable Recall / Noise / F_bal evaluation harness for HTML extraction quality. Researchers developing new extraction methods can register an additional tool in the comparison module, run the benchmark against the same 238-page scoreable corpus, and report directly comparable numbers. The static Compare Lab (docs/) provides visual side-by-side verification for qualitative analysis and is deployable on any static host without server-side code.</w:t>
+      </w:r>
+    </w:p>
+    <w:p>
+      <w:pPr>
+        <w:pStyle w:val="Body"/>
+      </w:pPr>
+      <w:r>
+        <w:t>Education and demonstrators. The Compare Lab serves as a live demonstrator for teaching RAG data quality concepts. Instructors can direct learners to the hosted GitHub Pages site without requiring local Python installation. The explicit corpus funnel (Figure 4) and per-category breakdown reinforce that reported metrics are bounded and reproducible, rather than cherry-picked from a hidden evaluation set.</w:t>
+      </w:r>
+    </w:p>
+    <w:p>
+      <w:pPr>
+        <w:pStyle w:val="Body"/>
+      </w:pPr>
+      <w:r>
+        <w:t>The software's direct commercial relevance lies in reducing the engineering effort and compute cost of building and maintaining RAG corpora. Organizations that currently post-process extracted text with ad-hoc regular expressions or manual curation of navigation and footer blocks may find that a domain-adaptive STCE model offers comparable or superior chrome removal with lower maintenance overhead. Because STCE runs on CPU and requires no GPU or cloud API call, it is compatible with air-gapped deployment environments common in regulated industries.</w:t>
+      </w:r>
+    </w:p>
+    <w:p>
+      <w:pPr>
+        <w:pStyle w:val="Heading2"/>
+      </w:pPr>
+      <w:r>
+        <w:t>Limitations</w:t>
+      </w:r>
+    </w:p>
+    <w:p>
+      <w:pPr>
+        <w:pStyle w:val="Body"/>
+      </w:pPr>
+      <w:r>
+        <w:t>Several limitations are stated explicitly so that reviewers and practitioners can calibrate expectations.</w:t>
+      </w:r>
+    </w:p>
+    <w:p>
+      <w:pPr>
+        <w:pStyle w:val="Body"/>
+      </w:pPr>
+      <w:r>
+        <w:t>JavaScript-rendered pages. ChromeRAG does not execute JavaScript. Pages that ship an empty HTML skeleton and populate content in the browser produce thin or empty Markdown, and the software warns the caller explicitly rather than returning a silent low-quality result. This is a deliberate scope constraint: fetch orchestration and headless rendering belong to the caller's infrastructure layer. Callers that require rendered content should use Playwright or Puppeteer before passing HTML to ChromeRAG.</w:t>
+      </w:r>
+    </w:p>
+    <w:p>
+      <w:pPr>
+        <w:pStyle w:val="Body"/>
+      </w:pPr>
+      <w:r>
+        <w:t>Heuristic content anchors, not human labels. Benchmark anchors are derived from structural HTML semantics (&lt;main&gt;, &lt;article&gt; vs. &lt;nav&gt;, &lt;footer&gt;) rather than hand-labeled text spans. This approach scales to hundreds of pages without annotation cost and keeps the evaluation tool-agnostic, but it is an approximation. Pages with poor semantic markup—where body prose is placed in unlabelled &lt;div&gt; elements—may yield misleading anchor sets. Per-category score breakdowns in docs/data/ allow users to inspect where anchor quality may be weaker.</w:t>
+      </w:r>
+    </w:p>
+    <w:p>
+      <w:pPr>
+        <w:pStyle w:val="Body"/>
+      </w:pPr>
+      <w:r>
+        <w:t>Scoreable-page filter scope. The 39 thin pages excluded from benchmark averages include some pages with visible text that nonetheless fail the recall gate due to unusual layouts. Reported F_bal numbers apply to the 238-page scoreable subset; users should consult the full listed/fetched/scoreable/thin counts (Figure 4) to understand benchmark coverage.</w:t>
+      </w:r>
+    </w:p>
+    <w:p>
+      <w:pPr>
+        <w:pStyle w:val="Body"/>
+      </w:pPr>
+      <w:r>
+        <w:t>DVDF optional dependency. Vector density filtering requires ONNX Runtime and the MiniLM model weights (approximately 90 MB). The default installation omits this; users must opt in via pip install -e ".[dvdf]". Air-gapped or proxy-restricted environments may need to supply model weights manually.</w:t>
+      </w:r>
+    </w:p>
+    <w:p>
+      <w:pPr>
+        <w:pStyle w:val="Body"/>
+      </w:pPr>
+      <w:r>
+        <w:t>Single-format scope. ChromeRAG converts web HTML to Markdown only and does not handle PDF, Office documents, audio, or structured data formats. Users with mixed-format corpora will need additional converters—such as MarkItDown [5]—for non-HTML sources.</w:t>
+      </w:r>
+    </w:p>
+    <w:p>
+      <w:pPr>
+        <w:pStyle w:val="Heading1"/>
+        <w:spacing w:before="0" w:line="240" w:lineRule="auto"/>
+        <w:contextualSpacing/>
+        <w:rPr>
+          <w:rFonts w:ascii="Arial" w:eastAsia="Calibri" w:hAnsi="Arial" w:cs="Arial"/>
+          <w:iCs/>
+          <w:sz w:val="22"/>
+          <w:szCs w:val="22"/>
+        </w:rPr>
+      </w:pPr>
+      <w:r>
+        <w:t>Conclusions</w:t>
+      </w:r>
+    </w:p>
+    <w:p>
+      <w:pPr>
+        <w:pStyle w:val="Body"/>
+      </w:pPr>
+      <w:r>
+        <w:t>ChromeRAG packages ingest-time site-chrome elimination, optional vector density pruning, Schema.org front-matter extraction, table linearization, and explicit input-quality warnings into an MIT-licensed Python CLI and API (pip install chromerag). On 238 scoreable pages from the fetched public corpus (docs-, article-, pricing-, marketing-, hub-, and cloud-dominated; wiki/news listed URLs did not fetch in this run), coverage mode achieves F_bal 0.800 against Trafilatura 0.752 and MarkItDown 0.695, primarily by reducing chrome noise retention to 0.005 from MarkItDown's 0.261 at comparable recall. The explicit thin-page warning mechanism ensures pipeline operators are informed of JS-shell inputs rather than silently absorbing empty pages into quality averages. Future work includes page-type adaptive extraction profiles and a Chrome Centroid Drift metric for monitoring corpus quality over time.</w:t>
+      </w:r>
+    </w:p>
+    <w:p>
+      <w:pPr>
+        <w:pStyle w:val="Heading1"/>
+      </w:pPr>
+      <w:r>
+        <w:t>CRediT author contribution statement</w:t>
+      </w:r>
+    </w:p>
+    <w:p>
+      <w:pPr>
+        <w:pStyle w:val="Body"/>
+      </w:pPr>
+      <w:r>
+        <w:t>Bhargava Chary Peddapudi: Conceptualization, Software, Methodology, Validation, Writing — original draft, Writing — review &amp; editing.</w:t>
+      </w:r>
+    </w:p>
+    <w:p>
+      <w:pPr>
+        <w:pStyle w:val="Heading1"/>
+      </w:pPr>
+      <w:r>
+        <w:t>Declaration of competing interest</w:t>
+      </w:r>
+    </w:p>
+    <w:p>
+      <w:pPr>
+        <w:pStyle w:val="Body"/>
+      </w:pPr>
+      <w:r>
+        <w:t>The author declares that they have no known competing financial interests or personal relationships that could have appeared to influence the work reported in this paper.</w:t>
+      </w:r>
+    </w:p>
+    <w:p>
+      <w:pPr>
+        <w:pStyle w:val="Heading1"/>
+      </w:pPr>
+      <w:r>
+        <w:t>Funding</w:t>
+      </w:r>
+    </w:p>
+    <w:p>
+      <w:pPr>
+        <w:pStyle w:val="Body"/>
+      </w:pPr>
+      <w:r>
+        <w:t>This research did not receive any specific grant from funding agencies in the public, commercial, or not-for-profit sectors.</w:t>
+      </w:r>
+    </w:p>
+    <w:p>
+      <w:pPr>
+        <w:pStyle w:val="Heading1"/>
+      </w:pPr>
+      <w:r>
+        <w:t>Declaration of generative AI and AI-assisted technologies in the manuscript preparation process</w:t>
+      </w:r>
+    </w:p>
+    <w:p>
+      <w:pPr>
+        <w:pStyle w:val="Body"/>
+      </w:pPr>
+      <w:r>
+        <w:t>During the preparation of this work, the author used Cursor (with Grok-assisted coding agent support) to draft software documentation structure, organize related-work notes, and polish manuscript wording. After using this tool/service, the author reviewed and edited the content as needed and takes full responsibility for the content of the published article. AI tools used inside the research software (optional ONNX MiniLM for DVDF) are described in the Software description section and are software features, not manuscript-writing tools. No generative AI was used to create SoftwareX figures; all charts are produced from corpus JSON via scripts/generate_softwarex_figures.py.</w:t>
+      </w:r>
+    </w:p>
+    <w:p>
       <w:pPr>
         <w:spacing w:after="0" w:line="240" w:lineRule="auto"/>
         <w:rPr>
-          <w:lang w:val="en-US"/>
+          <w:rFonts w:ascii="Arial" w:eastAsia="Times New Roman" w:hAnsi="Arial" w:cs="Arial"/>
+          <w:b/>
+          <w:szCs w:val="22"/>
+          <w:lang w:val="en"/>
         </w:rPr>
-      </w:pPr>
-    </w:p>
-    <w:p ns2:paraId="0021571E" ns2:textId="77777777">
-      <w:pPr>
-        <w:spacing w:after="0" w:line="240" w:lineRule="auto"/>
-      </w:pPr>
-    </w:p>
-    <w:bookmarkEnd w:id="18"/>
-    <w:p ns2:paraId="772D29CD" ns2:textId="77777777">
-      <w:pPr>
-        <w:spacing w:after="0" w:line="240" w:lineRule="auto"/>
+        <w:pStyle w:val="Heading1"/>
+      </w:pPr>
+      <w:r>
+        <w:t>Acknowledgements</w:t>
+      </w:r>
+    </w:p>
+    <w:p>
+      <w:pPr>
+        <w:pStyle w:val="Body"/>
+      </w:pPr>
+      <w:r>
+        <w:t>None.</w:t>
+      </w:r>
+    </w:p>
+    <w:p>
+      <w:pPr>
+        <w:pStyle w:val="Heading1"/>
+        <w:spacing w:before="0" w:line="240" w:lineRule="auto"/>
         <w:rPr>
-          <w:rFonts w:ascii="Arial" w:hAnsi="Arial" w:cs="Arial"/>
+          <w:rFonts w:ascii="Arial" w:eastAsia="Calibri" w:hAnsi="Arial" w:cs="Arial"/>
+          <w:iCs/>
+          <w:sz w:val="22"/>
+          <w:szCs w:val="22"/>
         </w:rPr>
       </w:pPr>
+      <w:r>
+        <w:t>References</w:t>
+      </w:r>
+    </w:p>
+    <w:p>
+      <w:pPr>
+        <w:pStyle w:val="Body"/>
+      </w:pPr>
+      <w:r>
+        <w:t>1. A. Barbaresi, "Trafilatura: A Web Scraping Library and Command-Line Tool for Text Discovery and Extraction," in Proc. ACL-IJCNLP 2021 System Demonstrations, 2021, pp. 122–131. doi: 10.18653/v1/2021.acl-demo.15.</w:t>
+      </w:r>
+    </w:p>
+    <w:p>
+      <w:pPr>
+        <w:pStyle w:val="Body"/>
+      </w:pPr>
+      <w:r>
+        <w:t>2. J. Alarte, J. Silva, and S. Tamarit, "What Web Template Extractor Should I Use? A Benchmarking and Comparison for Five Template Extractors," ACM Trans. Web, vol. 13, no. 2, Art. 9, 2019. doi: 10.1145/3316810.</w:t>
+      </w:r>
+    </w:p>
+    <w:p>
+      <w:pPr>
+        <w:pStyle w:val="Body"/>
+      </w:pPr>
+      <w:r>
+        <w:t>3. J. Tan, Z. Dou, W. Wang, M. Wang, W. Chen, and J.-R. Wen, "HtmlRAG: HTML is Better Than Plain Text for Modeling Retrieved Knowledge in RAG Systems," in Proc. ACM Web Conf. (WWW '25), 2025. doi: 10.1145/3696410.3714546.</w:t>
+      </w:r>
+    </w:p>
+    <w:p>
+      <w:pPr>
+        <w:pStyle w:val="Body"/>
+      </w:pPr>
+      <w:r>
+        <w:t>4. B. C. Peddapudi, ChromeRAG, version 0.1.0, GitHub, 2026. [Online]. Available: https://github.com/pedapudibhargav/ChromeRAG/tree/v0.1.0</w:t>
+      </w:r>
+    </w:p>
+    <w:p>
+      <w:pPr>
+        <w:pStyle w:val="Body"/>
+      </w:pPr>
+      <w:r>
+        <w:t>5. Microsoft, MarkItDown: Python tool for converting files and office documents to Markdown, GitHub. [Online]. Available: https://github.com/microsoft/markitdown</w:t>
+      </w:r>
+    </w:p>
+    <w:p>
+      <w:pPr>
+        <w:pStyle w:val="Body"/>
+      </w:pPr>
+      <w:r>
+        <w:t>6. Mozilla Foundation / Arc90, Readability (readability-lxml Python binding). [Online]. Available: https://github.com/buriy/python-readability</w:t>
+      </w:r>
     </w:p>
     <w:sectPr>
-      <w:headerReference w:type="even" ns6:id="rId18"/>
-      <w:headerReference w:type="default" ns6:id="rId19"/>
-      <w:footerReference w:type="even" ns6:id="rId20"/>
-      <w:footerReference w:type="default" ns6:id="rId21"/>
-      <w:headerReference w:type="first" ns6:id="rId22"/>
-      <w:footerReference w:type="first" ns6:id="rId23"/>
+      <w:headerReference w:type="even" r:id="rId18"/>
+      <w:headerReference w:type="default" r:id="rId19"/>
+      <w:footerReference w:type="even" r:id="rId20"/>
+      <w:footerReference w:type="default" r:id="rId21"/>
+      <w:headerReference w:type="first" r:id="rId22"/>
+      <w:footerReference w:type="first" r:id="rId23"/>
       <w:pgSz w:w="12240" w:h="15840"/>
       <w:pgMar w:top="1440" w:right="1440" w:bottom="1440" w:left="1440" w:header="720" w:footer="720" w:gutter="0"/>
       <w:lnNumType w:countBy="1" w:restart="continuous"/>

</xml_diff>

<commit_message>
Rebuild SoftwareX docx for 0.1.3
</commit_message>
<xml_diff>
--- a/papers/softwarex/ChromeRAG_SoftwareX_OSP.docx
+++ b/papers/softwarex/ChromeRAG_SoftwareX_OSP.docx
@@ -16,7 +16,7 @@
         </w:rPr>
       </w:pPr>
       <w:r>
-        <w:t>ChromeRAG: Ingest-Time Elimination of Site Template Noise for Enterprise Web RAG</w:t>
+        <w:t>ChromeRAG: A Learned Boilerplate Filter and Site-Template Learner for Web RAG Ingestion</w:t>
       </w:r>
     </w:p>
     <w:p>
@@ -85,7 +85,7 @@
         </w:rPr>
       </w:pPr>
       <w:r>
-        <w:t>Web pages indexed for retrieval-augmented generation (RAG) carry navigation menus, cookie banners and footers that become noisy chunks in the vector store. ChromeRAG is an MIT-licensed, CPU-only Python package and command-line tool that converts HTML into RAG-ready Markdown. It removes this site-template "chrome", optionally learns a site's repeated template from a few pages, turns Schema.org metadata into front-matter, linearizes tables, and flags unrendered JavaScript shells. On 242 public pages it reached a balanced F-score of 0.788, against 0.739 for Trafilatura and 0.696 for MarkItDown, and in BM25 retrieval it matched MarkItDown's accuracy with 35% fewer chunks.</w:t>
+        <w:t>Web pages indexed for retrieval-augmented generation (RAG) carry navigation, cookie banners, related links and comments that become noisy chunks. ChromeRAG is an MIT-licensed, CPU-only Python package and command-line tool that converts HTML into RAG-ready Markdown. A 150 KB gradient-boosted model, evaluated with NumPy, scores each text block; an optional site model removes repeated templates; metadata becomes front-matter, tables become key-value rows, and JavaScript shells are flagged. On the 511 held-out WCXB pages it reaches a word-level F1 of 0.902, against 0.860 for Trafilatura and 0.540 for MarkItDown.</w:t>
       </w:r>
     </w:p>
     <w:p>
@@ -126,7 +126,7 @@
         </w:rPr>
       </w:pPr>
       <w:r>
-        <w:t>retrieval-augmented generation; HTML extraction; boilerplate removal; web template detection; Markdown; Python</w:t>
+        <w:t>retrieval-augmented generation; HTML extraction; boilerplate removal; main content extraction; Markdown; Python</w:t>
       </w:r>
     </w:p>
     <w:p>
@@ -306,7 +306,7 @@
               </w:rPr>
             </w:pPr>
             <w:r>
-              <w:t>v0.1.2</w:t>
+              <w:t>v0.1.3</w:t>
             </w:r>
           </w:p>
         </w:tc>
@@ -385,7 +385,7 @@
               </w:rPr>
             </w:pPr>
             <w:r>
-              <w:t>https://github.com/pedapudibhargav/ChromeRAG/tree/v0.1.2</w:t>
+              <w:t>https://github.com/pedapudibhargav/ChromeRAG/tree/v0.1.3</w:t>
             </w:r>
           </w:p>
           <w:p>
@@ -621,7 +621,7 @@
               </w:rPr>
             </w:pPr>
             <w:r>
-              <w:t>Python ≥3.11; BeautifulSoup4, lxml, Pydantic, PyYAML, NumPy, tiktoken</w:t>
+              <w:t>Python ≥3.11; BeautifulSoup4, lxml, PyYAML, NumPy</w:t>
             </w:r>
           </w:p>
         </w:tc>
@@ -903,7 +903,7 @@
         <w:t>Chrome pollutes RAG indexes.</w:t>
       </w:r>
       <w:r>
-        <w:t xml:space="preserve"> Retrieval-augmented generation grounds a language model in retrieved passages [1]. In organizations those passages usually come from documentation portals, API references, pricing pages and knowledge bases, and that HTML was never written for machines to read. Each page mixes its own content with site-wide "chrome": top navigation, sidebar link trees, cookie-consent banners, sales calls to action and legal footers. If this HTML is converted naively and embedded, the same chrome text appears in every page's chunks. At query time these near-duplicate chunks compete with real content, show up as false positives, and use up the model's context window. The cost grows with corpus size. A 10,000-page portal with a 200-token footer adds two million tokens of identical text to the index.</w:t>
+        <w:t xml:space="preserve"> Retrieval-augmented generation grounds a language model in retrieved passages [1]. In organizations those passages usually come from documentation portals, product and pricing pages and knowledge bases, and that HTML was never written for machines to read. Each page mixes its own content with site-wide "chrome": navigation, sidebar link trees, cookie-consent banners, sales calls to action, related-article lists, comment threads and legal footers. If this HTML is converted naively and embedded, the same text appears in the chunks of every page. At query time these near-duplicates compete with real content, produce false positives and use up the model's context window. The cost grows with corpus size: a 10,000-page portal with a 200-token footer adds two million tokens of identical text to the index.</w:t>
       </w:r>
     </w:p>
     <w:p>
@@ -917,7 +917,7 @@
         <w:t>Related work and the gap.</w:t>
       </w:r>
       <w:r>
-        <w:t xml:space="preserve"> Boilerplate removal is an established problem. Shallow text features [2] and neural sequence labelling [3] classify blocks within a single page. Trafilatura [4] and Readability [5] are widely used main-content extractors tuned for articles, and a recent large-scale comparison [7] found that no single algorithm is best on every page type. Format converters such as MarkItDown [6] keep headings, tables and code blocks, but they do not try to remove chrome. Using several pages from the same site was proposed early on [8, 9]: blocks that repeat across a site's pages are likely to be template rather than content. Alarte et al. [10] benchmarked such template extractors. Query-time methods such as HtmlRAG [11] prune HTML after retrieval, so they complement ingest-time cleaning and do not replace it. What practitioners lack is a small, installable component at the ingest step of a RAG pipeline that combines four things: single-page chrome removal, an optional learned model of a site's repeated template, structured metadata and tables in a form suited to chunking, and explicit signals when the input HTML is unusable.</w:t>
+        <w:t xml:space="preserve"> Boilerplate removal is an established problem. Shallow text features [2] and neural sequence labelling over words and tags [3, 4] classify blocks within one page. Trafilatura [5] and Readability [6] are widely used extractors tuned for articles, and a large comparison [8] found that no algorithm is best on every page type. Format converters such as MarkItDown [7] keep headings, tables and code but do not try to remove chrome. The recent WCXB benchmark [9] makes the weakness of article-tuned tools measurable: on seven page types, systems agree on articles (F1 about 0.93) and differ by 20 to 30 points on forums, products and collections. A page-type-aware Rust extractor with a learned page classifier [10] and a language-model block labeller (MinerU-HTML, 0.6B parameters, GPU) [11] lead that benchmark. Using several pages of one site to find the template was proposed early [12, 13] and benchmarked in [14]; query-time pruning such as HtmlRAG [15] complements ingest-time cleaning. What practitioners lack is a small, installable, CPU-only component for the ingest step that combines a learned single-page filter, an optional site-template model, metadata and tables in a chunk-friendly form, and explicit signals when the input is unusable or the extraction is unsure.</w:t>
       </w:r>
     </w:p>
     <w:p>
@@ -931,7 +931,7 @@
         <w:t>What ChromeRAG provides.</w:t>
       </w:r>
       <w:r>
-        <w:t xml:space="preserve"> ChromeRAG fills that gap with (i) site-template chrome elimination (STCE), a learn-then-extract model built from pages of the same site; (ii) Schema.org JSON-LD and Microdata harvested into YAML front-matter, so every chunk can carry typed metadata; (iii) linearization of tables into key–value rows that survive chunking; and (iv) input-quality warnings that separate legitimately short pages from JavaScript shells that must be rendered first. The package is query-agnostic and independent of any retriever or model. It runs on CPU without downloading a model, so it also works in air-gapped environments.</w:t>
+        <w:t xml:space="preserve"> (i) A learned block filter: gradient-boosted trees over about 530 structural and lexical features of each text block, with a threshold per content priority; (ii) site-template chrome elimination (STCE), a learn-then-extract model built from pages of the same site; (iii) Schema.org JSON-LD and Microdata as YAML front-matter; (iv) tables as key-value rows; (v) input-quality warnings and a per-page confidence estimate. The package is independent of any retriever or model, needs no model download and works in air-gapped environments.</w:t>
       </w:r>
     </w:p>
     <w:p>
@@ -945,7 +945,7 @@
         <w:t>How it is used.</w:t>
       </w:r>
       <w:r>
-        <w:t xml:space="preserve"> A crawler or headless browser stores HTML files. ChromeRAG converts each file, or a whole directory, into Markdown for chunking and embedding. When several pages from one site are available, chromerag learn builds a site chrome model first.</w:t>
+        <w:t xml:space="preserve"> A crawler or headless browser stores HTML files. ChromeRAG converts each file, or a directory, into Markdown for chunking and embedding. When several pages of one site are available, chromerag learn builds a site model first.</w:t>
       </w:r>
     </w:p>
     <w:p>
@@ -976,7 +976,7 @@
         <w:pStyle w:val="Body"/>
       </w:pPr>
       <w:r>
-        <w:t>ChromeRAG is a small, dependency-light Python package (src/chromerag, about 2,400 lines) built on BeautifulSoup/lxml. Each document passes through five stages (Fig. 1), each in its own module. A pytest suite of 22 tests covers the pipeline end to end, the CLI, STCE regressions and the LangChain loader, and runs in continuous integration on Linux (Python 3.11–3.14), macOS and Windows.</w:t>
+        <w:t>ChromeRAG is a small Python package (src/chromerag, about 4,000 lines) built on BeautifulSoup/lxml and NumPy. Each document passes through six stages (Fig. 1), each in its own module. A pytest suite of 64 tests covers the pipeline, the learned filter, the rule index, regression fixtures with exact golden outputs, the CLI, STCE and the LangChain loader; continuous integration runs on Linux (Python 3.11 to 3.14), macOS and Windows.</w:t>
       </w:r>
     </w:p>
     <w:p>
@@ -1028,7 +1028,7 @@
         <w:rPr>
           <w:i/>
         </w:rPr>
-        <w:t>Figure 1. ChromeRAG processing pipeline. The optional site model produced by chromerag learn is applied in stage 3.</w:t>
+        <w:t>Figure 1. ChromeRAG processing pipeline. The learned block filter (stage 5) scores every text block; the optional site model produced by chromerag learn is applied in stage 3.</w:t>
       </w:r>
     </w:p>
     <w:p>
@@ -1042,7 +1042,7 @@
         <w:t>Stage 1: input-quality gate</w:t>
       </w:r>
       <w:r>
-        <w:t xml:space="preserve"> (input_quality.py). The raw HTML is measured for visible text, script weight, single-page-application root markers (id="root", id="app", __next) and &lt;noscript&gt; "enable JavaScript" hints. Inputs that look thin produce WARNING: lines on stderr and entries in result.warnings. The gate runs on the document as received, before anything is removed.</w:t>
+        <w:t xml:space="preserve"> (input_quality.py). The raw HTML is measured for visible text, script weight, single-page-application root markers and "enable JavaScript" hints. Thin inputs produce warnings on stderr and in result.warnings.</w:t>
       </w:r>
     </w:p>
     <w:p>
@@ -1056,7 +1056,7 @@
         <w:t>Stage 2: schema harvest</w:t>
       </w:r>
       <w:r>
-        <w:t xml:space="preserve"> (schema_fusion.py). JSON-LD blocks and Microdata are read before scripts are removed. Fields such as title, type, description, dates, author and breadcrumb become YAML front-matter.</w:t>
+        <w:t xml:space="preserve"> (schema_fusion.py). JSON-LD and Microdata are read before scripts are removed; title, type, description, dates, author and breadcrumb become YAML front-matter.</w:t>
       </w:r>
     </w:p>
     <w:p>
@@ -1070,7 +1070,7 @@
         <w:t>Stage 3: cleaning and STCE</w:t>
       </w:r>
       <w:r>
-        <w:t xml:space="preserve"> (site_chrome.py). Scripts, styles, forms and SVG are removed. If a site model is supplied, blocks whose signature is in the model are removed. A signature is a hash of the block's tag, id, classes and ARIA role, or of its text when the block has no attributes. chromerag learn groups pages by host and first path segment. Repeated and near-duplicate pages (for example one page published for several versions) count once. A signature enters the model only when it appears on at least a set share of the group's pages (default 80%), stays short, carries the same leading text on most of those pages, and either looks like chrome (chrome-related class tokens or phrases, or high link density) or is a short block whose text is identical on every page of the group, such as a site tagline. Frequency alone is therefore not enough: content cards that merely share a CSS class are not learned. At extraction time a matching block is removed only if it is close to its learned size, does not contain &lt;main&gt;, does not hold most of the page's text, and either carries the learned text or is explicitly marked as chrome, so a utility class reused by a content block cannot delete it.</w:t>
+        <w:t xml:space="preserve"> (site_chrome.py, hidden.py, rules_engine.py). Scripts, styles and SVG are removed; hidden nodes and skip links are removed unless a hidden block holds long running text with few links (pages that reveal content by script). A wrapper tag such as a page-wide &lt;form&gt;, an unclosed &lt;button&gt; or a large &lt;noscript&gt; keeps its content. A YAML rule index drops known chrome (consent managers, share bars, generator footers), and every rule carries evidence and a fixture. If a site model is supplied, blocks whose signature is in the model are removed. A signature hashes the tag, id, classes and role, or the text for blocks without attributes. chromerag learn keeps a signature only if it appears on at least 80% of a site group's pages, stays short, repeats its leading text, and looks like chrome or is identical on every page; at extraction time a match is removed only if it is close to its learned size, holds no &lt;main&gt;, and does not hold most of the page's text.</w:t>
       </w:r>
     </w:p>
     <w:p>
@@ -1081,10 +1081,10 @@
         <w:rPr>
           <w:i/>
         </w:rPr>
-        <w:t>Stage 4: structural and density pruning</w:t>
-      </w:r>
-      <w:r>
-        <w:t xml:space="preserve"> (density.py, dvdf.py). Landmark and class heuristics remove nav, footer, cookie, newsletter and similar subtrees. A guard stops a subtree from being removed if it contains &lt;main&gt; or holds most of the page's visible text. Candidate blocks are then scored by link density and text density. DVDF (density/vector filtering) embeds each block as a deterministic 384-dimensional feature-hashing vector [12] and drops blocks whose cosine similarity to a bank of boilerplate anchor phrases passes a threshold. Because the embedding is lexical, it catches near-verbatim boilerplate, not paraphrases, and needs no model download.</w:t>
+        <w:t>Stage 4: chrome pruning</w:t>
+      </w:r>
+      <w:r>
+        <w:t xml:space="preserve"> (density.py, content_root.py). Landmark and class-word rules (nav, footer, cookie, newsletter, sidebar) remove subtrees, with guards: a subtree that contains &lt;main&gt;, holds most of the page's text, or holds two or more long paragraphs with few links is kept. A content-root ladder (main, role=main, article, content classes) is validated by size.</w:t>
       </w:r>
     </w:p>
     <w:p>
@@ -1095,18 +1095,46 @@
         <w:rPr>
           <w:i/>
         </w:rPr>
-        <w:t>Stage 5: tables and Markdown</w:t>
-      </w:r>
-      <w:r>
-        <w:t xml:space="preserve"> (tables.py, markdown_out.py). Tables become Row n -&gt; header: value | … lines. The remaining DOM is written as Markdown with safe heading levels and fenced code.</w:t>
-      </w:r>
-    </w:p>
-    <w:p>
-      <w:pPr>
-        <w:pStyle w:val="Body"/>
-      </w:pPr>
-      <w:r>
-        <w:t>Scope is deliberately narrow: ChromeRAG takes HTML in and returns Markdown. It does not fetch pages, render JavaScript or crawl sites. Those jobs belong to the caller, or to the separate evaluation harness in poc/, which is not needed at runtime.</w:t>
+        <w:t>Stage 5: learned block filter</w:t>
+      </w:r>
+      <w:r>
+        <w:t xml:space="preserve"> (blockfeatures.py, lbc.py). The cleaned page is split into blocks: paragraphs, headings, list items, quotes, preformatted blocks, tables, text-only containers, and runs of loose text between block elements. Each block is described by about 530 numbers in five groups: its text (length, link density, punctuation, stop-word share, call-to-action verbs, dates), its place in the page (position, distance to headings, whether it is in the content root), its tree context (ancestor tags, link density and text mass of enclosing boxes, repeated sibling structures such as comment threads and card grids, overlap with the title and the page's long paragraphs), the words of its ancestors' class and id, feature-hashed [16], and the words of the heading above it. Trees (300 trees of depth 6, trained with scikit-learn) give the probability that the block is main content; the exported model is a 150 KB array file and prediction uses NumPy only. A block is kept when its probability reaches 0.30 (coverage), 0.50 (balanced) or 0.70 (precision). Pages with fewer than four blocks are kept whole, exact repeats are written once, and the model's own expected precision, recall and F1 for the page are stored in diagnostics["lbc"]; a warning is issued below an expected F1 of 0.70.</w:t>
+      </w:r>
+    </w:p>
+    <w:p>
+      <w:pPr>
+        <w:pStyle w:val="Body"/>
+      </w:pPr>
+      <w:r>
+        <w:rPr>
+          <w:i/>
+        </w:rPr>
+        <w:t>Stage 6: tables and Markdown</w:t>
+      </w:r>
+      <w:r>
+        <w:t xml:space="preserve"> (tables.py, markdown_out.py). Layout tables (nested, or cells with block content) are unwrapped; data tables become Row n -&gt; header: value | ... lines. The page is written in document order with safe heading levels and fenced code; link targets are omitted unless requested (--links).</w:t>
+      </w:r>
+    </w:p>
+    <w:p>
+      <w:pPr>
+        <w:pStyle w:val="Body"/>
+      </w:pPr>
+      <w:r>
+        <w:rPr>
+          <w:i/>
+        </w:rPr>
+        <w:t>Training.</w:t>
+      </w:r>
+      <w:r>
+        <w:t xml:space="preserve"> poc/lbc_data.py labels every block of the 1,495 WCXB development pages by word-trigram overlap with the human-reviewed main content (blocks the annotators list as "without" snippets are labelled noise) and poc/train_lbc.py fits the trees, weighting blocks by word count. Retraining takes about two minutes. The WCXB test split is never used for training or tuning.</w:t>
+      </w:r>
+    </w:p>
+    <w:p>
+      <w:pPr>
+        <w:pStyle w:val="Body"/>
+      </w:pPr>
+      <w:r>
+        <w:t>Scope is deliberately narrow: HTML in, Markdown out. ChromeRAG does not fetch pages, render JavaScript or crawl; those belong to the caller or to the evaluation harness in poc/.</w:t>
       </w:r>
     </w:p>
     <w:p>
@@ -1122,15 +1150,7 @@
         <w:pStyle w:val="Body"/>
       </w:pPr>
       <w:r>
-        <w:t>The Python API centres on ChromeRAG(config=…, site_chrome=…). PipelineConfig.from_priority() selects one of three presets. COVERAGE loosens thresholds to keep more content, PRECISION tightens them to remove more chrome, and BALANCED is the default. Each stage can be switched off on its own (--no-dvdf, --no-schema, --no-tables, --no-stce). extract(html, url=None) returns a typed ExtractResult with markdown, front_matter, warnings, input_quality, a token estimate, and diagnostics (samples of kept and rejected blocks with the reason for each decision). The URL is used only as metadata (page-type hints, site grouping and the url front-matter field), never to access the network.</w:t>
-      </w:r>
-    </w:p>
-    <w:p>
-      <w:pPr>
-        <w:pStyle w:val="Body"/>
-      </w:pPr>
-      <w:r>
-        <w:t>The CLI has three subcommands (Table 1).</w:t>
+        <w:t>The Python API centres on ChromeRAG(config=..., site_chrome=...). PipelineConfig.from_priority() selects COVERAGE, BALANCED (default) or PRECISION. Stages can be switched off individually (--no-rules, --no-schema, --no-tables, --no-stce, enable_lbc=False for the density filter of version 0.1.2). extract(html, url=None) returns a typed ExtractResult with markdown, front_matter, warnings, input_quality, a token estimate and diagnostics (kept and rejected samples with reasons, the rules that fired, the model's expected F1). The URL is metadata only and is never fetched.</w:t>
       </w:r>
     </w:p>
     <w:p>
@@ -1231,7 +1251,7 @@
               <w:pStyle w:val="Body"/>
             </w:pPr>
             <w:r>
-              <w:t>chromerag extract page.html -o page.md --priority coverage</w:t>
+              <w:t>chromerag extract page.html -o page.md --priority balanced</w:t>
             </w:r>
           </w:p>
         </w:tc>
@@ -1244,7 +1264,7 @@
               <w:pStyle w:val="Body"/>
             </w:pPr>
             <w:r>
-              <w:t>Markdown; --json-meta prints diagnostics; --fail-on-thin exits with code 3</w:t>
+              <w:t>Markdown; --json-meta prints diagnostics; --explain lists removed blocks; --fail-on-thin exits with code 3</w:t>
             </w:r>
           </w:p>
         </w:tc>
@@ -1337,7 +1357,7 @@
         <w:pStyle w:val="Body"/>
       </w:pPr>
       <w:r>
-        <w:t>The package needs Python 3.11 or later and installs with pip install chromerag [14]. An optional LangChain document loader (chromerag.integrations.langchain.ChromeRAGLoader, extra [langchain]) returns one Document per page with the front-matter as metadata. The repository adds the tests, the evaluation harness, and a one-page GitHub Pages site with the leaderboard and a per-page score explorer.</w:t>
+        <w:t>The package needs Python 3.11 or later and installs with pip install chromerag [18]. Optional LangChain and LlamaIndex components (chromerag.integrations) return one document per page with the front-matter as metadata. The repository adds the tests, the evaluation harness, a Docker image and a one-page GitHub Pages site with the leaderboards.</w:t>
       </w:r>
     </w:p>
     <w:p>
@@ -1369,7 +1389,7 @@
         <w:pStyle w:val="Body"/>
       </w:pPr>
       <w:r>
-        <w:t>The repository includes four small synthetic pages from a fictional documentation site (examples/site/). They share a header menu, cookie banner, sales call-to-action, footer and a repeated "Widget Summit: register now" strip inside &lt;main&gt;. Stage 4 removes the menu, banner and footer because of their markup. The in-content strip has no chrome-like markup, so it survives single-page extraction. It is removed only after learning:</w:t>
+        <w:t>The repository includes four synthetic pages from a fictional documentation site (examples/site/). They share a header menu, cookie banner, sales call to action, footer and a repeated "Widget Summit: register now" strip inside &lt;main&gt;. Single-page extraction removes the menu, banner and footer; the in-content strip has no chrome-like markup and survives until a site model is learned:</w:t>
       </w:r>
     </w:p>
     <w:p>
@@ -1416,7 +1436,7 @@
         <w:pStyle w:val="Body"/>
       </w:pPr>
       <w:r>
-        <w:t>learn reports one site group (docs.example.com/docs) with six chrome signatures. batch applies them to all four pages. The resulting pricing page keeps its JSON-LD as front-matter and its table as key–value rows:</w:t>
+        <w:t>learn reports one site group (docs.example.com/docs) with six chrome signatures; batch applies them to all four pages. The pricing page keeps its JSON-LD as front-matter and its table as key-value rows:</w:t>
       </w:r>
     </w:p>
     <w:p>
@@ -1554,7 +1574,7 @@
         <w:pStyle w:val="Body"/>
       </w:pPr>
       <w:r>
-        <w:t>A JavaScript shell (&lt;div id="root"&gt;&lt;/div&gt; plus a script tag) instead produces a warning telling the caller to render the page with Playwright or Puppeteer first. With --fail-on-thin, the command exits with code 3, so pipelines can route such pages to a headless browser.</w:t>
+        <w:t>A JavaScript shell (&lt;div id="root"&gt;&lt;/div&gt; plus a script tag) produces a warning to render the page first; with --fail-on-thin the command exits with code 3 so pipelines can route such pages to a headless browser.</w:t>
       </w:r>
     </w:p>
     <w:p>
@@ -1562,31 +1582,51 @@
         <w:pStyle w:val="Heading2"/>
       </w:pPr>
       <w:r>
-        <w:t>Public benchmark</w:t>
-      </w:r>
-    </w:p>
-    <w:p>
-      <w:pPr>
-        <w:pStyle w:val="Body"/>
-      </w:pPr>
-      <w:r>
-        <w:t>The harness (poc/run_corpus_comparison.py) compares ChromeRAG's three presets with Trafilatura [4], Readability [5], MarkItDown [6], markdownify, html2text and BeautifulSoup text extraction. All tools run on the same stored HTML. No tool receives a site model, so the benchmark measures single-page extraction without STCE. The corpus lists 367 unique public URLs (documentation, pricing, marketing, cloud, article and hub pages). A plain HTTP fetch without JavaScript rendering returned 268 unique pages; a URL reached under two identifiers is scored once.</w:t>
-      </w:r>
-    </w:p>
-    <w:p>
-      <w:pPr>
-        <w:pStyle w:val="Body"/>
-      </w:pPr>
-      <w:r>
-        <w:t>The metrics use structural anchors taken from each input DOM: word 5-grams from &lt;main&gt;/&lt;article&gt; text (content) and from &lt;nav&gt;, &lt;header&gt;, &lt;footer&gt;, &lt;aside&gt; and cookie/newsletter containers (noise). 5-grams found in both sets are discarded. Recall is the share of content anchors that appear in a tool's output. Noise retention is the share of noise anchors that appear. F_bal is the harmonic mean of recall and (1 − noise retention). A page counts as scoreable when its input DOM has at least 50 content anchors. This rule looks only at the input and never at any tool's output. It keeps 242 pages from 164 hosts and excludes 26: 7 JavaScript shells, 1 other thin page, and 18 pages with too little landmarked text to score. The cohort is dominated by documentation (208 of 242 pages), the main source of enterprise RAG corpora; the other categories are too small for separate conclusions.</w:t>
-      </w:r>
-    </w:p>
-    <w:p>
-      <w:pPr>
-        <w:pStyle w:val="Body"/>
-      </w:pPr>
-      <w:r>
-        <w:t>Table 2. Mean scores per method on the 242 scoreable pages, with F_bal over all 268 fetched pages for comparison.</w:t>
+        <w:t>Human-reviewed benchmark</w:t>
+      </w:r>
+    </w:p>
+    <w:p>
+      <w:pPr>
+        <w:pStyle w:val="Body"/>
+      </w:pPr>
+      <w:r>
+        <w:t>WCXB [9] has 2,008 pages from 1,613 domains in seven page types, split into 1,497 development and 511 test pages, with human-reviewed main content. Word-level F1 compares the bag of words of an extractor's output with the reference (title excluded); "with" and "without" snippets test that required text is present and that listed chrome is absent. All tools receive the same HTML and none gets a site model. Trafilatura [5] is run with its best of five settings on the development set (tables, no comments, no links, Markdown output; 0.818 against 0.814 for the defaults, 0.789 for favor_recall); MarkItDown [7] and Readability [6] use their defaults.</w:t>
+      </w:r>
+    </w:p>
+    <w:p>
+      <w:pPr>
+        <w:pStyle w:val="Body"/>
+      </w:pPr>
+      <w:r>
+        <w:rPr>
+          <w:i/>
+        </w:rPr>
+        <w:t>Development results</w:t>
+      </w:r>
+      <w:r>
+        <w:t xml:space="preserve"> come from five-fold cross-validation grouped by site, so every page is scored by a model that never saw its site. F1 is 0.852 (coverage), 0.851 (balanced) and 0.837 (precision) against 0.818 for Trafilatura. Replacing the density filter of 0.1.2 by the learned filter raises F1 from 0.822, 0.817 and 0.790 to these values; the larger part of the gain over 0.1.2 (0.749) comes from fixing whole-page losses: wrapper tags, hidden blocks, nested layout tables that repeated text, breadth-first output order, and link targets counted as words.</w:t>
+      </w:r>
+    </w:p>
+    <w:p>
+      <w:pPr>
+        <w:pStyle w:val="Body"/>
+      </w:pPr>
+      <w:r>
+        <w:rPr>
+          <w:i/>
+        </w:rPr>
+        <w:t>Test results</w:t>
+      </w:r>
+      <w:r>
+        <w:t xml:space="preserve"> were produced once, after the code, model and thresholds were frozen (git tag freeze-0.1.3), by a model trained on all development pages (Table 2, Fig. 2).</w:t>
+      </w:r>
+    </w:p>
+    <w:p>
+      <w:pPr>
+        <w:pStyle w:val="Body"/>
+      </w:pPr>
+      <w:r>
+        <w:t>Table 2. Word-level F1 on the 511 WCXB test pages (ChromeRAG in balanced mode).</w:t>
       </w:r>
     </w:p>
     <w:tbl>
@@ -1621,7 +1661,7 @@
               <w:rPr>
                 <w:b/>
               </w:rPr>
-              <w:t>Method</w:t>
+              <w:t>Page type (n)</w:t>
             </w:r>
           </w:p>
         </w:tc>
@@ -1637,7 +1677,7 @@
               <w:rPr>
                 <w:b/>
               </w:rPr>
-              <w:t>Recall ↑</w:t>
+              <w:t>ChromeRAG</w:t>
             </w:r>
           </w:p>
         </w:tc>
@@ -1653,7 +1693,7 @@
               <w:rPr>
                 <w:b/>
               </w:rPr>
-              <w:t>Noise ret. ↓</w:t>
+              <w:t>Trafilatura</w:t>
             </w:r>
           </w:p>
         </w:tc>
@@ -1669,7 +1709,7 @@
               <w:rPr>
                 <w:b/>
               </w:rPr>
-              <w:t>F_bal ↑ (242 scoreable)</w:t>
+              <w:t>Readability</w:t>
             </w:r>
           </w:p>
         </w:tc>
@@ -1685,7 +1725,7 @@
               <w:rPr>
                 <w:b/>
               </w:rPr>
-              <w:t>F_bal ↑ (all 268)</w:t>
+              <w:t>MarkItDown</w:t>
             </w:r>
           </w:p>
         </w:tc>
@@ -1700,7 +1740,7 @@
               <w:pStyle w:val="Body"/>
             </w:pPr>
             <w:r>
-              <w:t>ChromeRAG coverage</w:t>
+              <w:t>All (511)</w:t>
             </w:r>
           </w:p>
         </w:tc>
@@ -1713,7 +1753,7 @@
               <w:pStyle w:val="Body"/>
             </w:pPr>
             <w:r>
-              <w:t>0.688</w:t>
+              <w:t>0.902</w:t>
             </w:r>
           </w:p>
         </w:tc>
@@ -1726,7 +1766,7 @@
               <w:pStyle w:val="Body"/>
             </w:pPr>
             <w:r>
-              <w:t>0.007</w:t>
+              <w:t>0.860</w:t>
             </w:r>
           </w:p>
         </w:tc>
@@ -1739,7 +1779,7 @@
               <w:pStyle w:val="Body"/>
             </w:pPr>
             <w:r>
-              <w:t>0.788</w:t>
+              <w:t>0.763</w:t>
             </w:r>
           </w:p>
         </w:tc>
@@ -1752,7 +1792,7 @@
               <w:pStyle w:val="Body"/>
             </w:pPr>
             <w:r>
-              <w:t>0.747</w:t>
+              <w:t>0.540</w:t>
             </w:r>
           </w:p>
         </w:tc>
@@ -1767,7 +1807,7 @@
               <w:pStyle w:val="Body"/>
             </w:pPr>
             <w:r>
-              <w:t>ChromeRAG balanced</w:t>
+              <w:t>Article (257)</w:t>
             </w:r>
           </w:p>
         </w:tc>
@@ -1780,7 +1820,7 @@
               <w:pStyle w:val="Body"/>
             </w:pPr>
             <w:r>
-              <w:t>0.665</w:t>
+              <w:t>0.954</w:t>
             </w:r>
           </w:p>
         </w:tc>
@@ -1793,7 +1833,7 @@
               <w:pStyle w:val="Body"/>
             </w:pPr>
             <w:r>
-              <w:t>0.006</w:t>
+              <w:t>0.952</w:t>
             </w:r>
           </w:p>
         </w:tc>
@@ -1806,7 +1846,7 @@
               <w:pStyle w:val="Body"/>
             </w:pPr>
             <w:r>
-              <w:t>0.771</w:t>
+              <w:t>0.926</w:t>
             </w:r>
           </w:p>
         </w:tc>
@@ -1819,7 +1859,7 @@
               <w:pStyle w:val="Body"/>
             </w:pPr>
             <w:r>
-              <w:t>0.731</w:t>
+              <w:t>0.643</w:t>
             </w:r>
           </w:p>
         </w:tc>
@@ -1834,7 +1874,7 @@
               <w:pStyle w:val="Body"/>
             </w:pPr>
             <w:r>
-              <w:t>Trafilatura [4]</w:t>
+              <w:t>Documentation (42)</w:t>
             </w:r>
           </w:p>
         </w:tc>
@@ -1847,7 +1887,7 @@
               <w:pStyle w:val="Body"/>
             </w:pPr>
             <w:r>
-              <w:t>0.640</w:t>
+              <w:t>0.956</w:t>
             </w:r>
           </w:p>
         </w:tc>
@@ -1860,7 +1900,7 @@
               <w:pStyle w:val="Body"/>
             </w:pPr>
             <w:r>
-              <w:t>0.012</w:t>
+              <w:t>0.934</w:t>
             </w:r>
           </w:p>
         </w:tc>
@@ -1873,7 +1913,7 @@
               <w:pStyle w:val="Body"/>
             </w:pPr>
             <w:r>
-              <w:t>0.739</w:t>
+              <w:t>0.872</w:t>
             </w:r>
           </w:p>
         </w:tc>
@@ -1886,7 +1926,7 @@
               <w:pStyle w:val="Body"/>
             </w:pPr>
             <w:r>
-              <w:t>0.696</w:t>
+              <w:t>0.615</w:t>
             </w:r>
           </w:p>
         </w:tc>
@@ -1901,7 +1941,7 @@
               <w:pStyle w:val="Body"/>
             </w:pPr>
             <w:r>
-              <w:t>MarkItDown [6]</w:t>
+              <w:t>Service (59)</w:t>
             </w:r>
           </w:p>
         </w:tc>
@@ -1914,7 +1954,7 @@
               <w:pStyle w:val="Body"/>
             </w:pPr>
             <w:r>
-              <w:t>0.691</w:t>
+              <w:t>0.844</w:t>
             </w:r>
           </w:p>
         </w:tc>
@@ -1927,7 +1967,7 @@
               <w:pStyle w:val="Body"/>
             </w:pPr>
             <w:r>
-              <w:t>0.250</w:t>
+              <w:t>0.817</w:t>
             </w:r>
           </w:p>
         </w:tc>
@@ -1940,7 +1980,7 @@
               <w:pStyle w:val="Body"/>
             </w:pPr>
             <w:r>
-              <w:t>0.696</w:t>
+              <w:t>0.612</w:t>
             </w:r>
           </w:p>
         </w:tc>
@@ -1953,7 +1993,7 @@
               <w:pStyle w:val="Body"/>
             </w:pPr>
             <w:r>
-              <w:t>0.661</w:t>
+              <w:t>0.471</w:t>
             </w:r>
           </w:p>
         </w:tc>
@@ -1968,7 +2008,7 @@
               <w:pStyle w:val="Body"/>
             </w:pPr>
             <w:r>
-              <w:t>Readability [5]</w:t>
+              <w:t>Forum (51)</w:t>
             </w:r>
           </w:p>
         </w:tc>
@@ -1981,7 +2021,7 @@
               <w:pStyle w:val="Body"/>
             </w:pPr>
             <w:r>
-              <w:t>0.449</w:t>
+              <w:t>0.867</w:t>
             </w:r>
           </w:p>
         </w:tc>
@@ -1994,7 +2034,7 @@
               <w:pStyle w:val="Body"/>
             </w:pPr>
             <w:r>
-              <w:t>0.013</w:t>
+              <w:t>0.717</w:t>
             </w:r>
           </w:p>
         </w:tc>
@@ -2007,7 +2047,7 @@
               <w:pStyle w:val="Body"/>
             </w:pPr>
             <w:r>
-              <w:t>0.531</w:t>
+              <w:t>0.616</w:t>
             </w:r>
           </w:p>
         </w:tc>
@@ -2020,7 +2060,208 @@
               <w:pStyle w:val="Body"/>
             </w:pPr>
             <w:r>
-              <w:t>0.495</w:t>
+              <w:t>0.443</w:t>
+            </w:r>
+          </w:p>
+        </w:tc>
+      </w:tr>
+      <w:tr>
+        <w:tc>
+          <w:tcPr>
+            <w:tcW w:w="1800" w:type="dxa"/>
+          </w:tcPr>
+          <w:p>
+            <w:pPr>
+              <w:pStyle w:val="Body"/>
+            </w:pPr>
+            <w:r>
+              <w:t>Product (28)</w:t>
+            </w:r>
+          </w:p>
+        </w:tc>
+        <w:tc>
+          <w:tcPr>
+            <w:tcW w:w="1800" w:type="dxa"/>
+          </w:tcPr>
+          <w:p>
+            <w:pPr>
+              <w:pStyle w:val="Body"/>
+            </w:pPr>
+            <w:r>
+              <w:t>0.874</w:t>
+            </w:r>
+          </w:p>
+        </w:tc>
+        <w:tc>
+          <w:tcPr>
+            <w:tcW w:w="1800" w:type="dxa"/>
+          </w:tcPr>
+          <w:p>
+            <w:pPr>
+              <w:pStyle w:val="Body"/>
+            </w:pPr>
+            <w:r>
+              <w:t>0.724</w:t>
+            </w:r>
+          </w:p>
+        </w:tc>
+        <w:tc>
+          <w:tcPr>
+            <w:tcW w:w="1800" w:type="dxa"/>
+          </w:tcPr>
+          <w:p>
+            <w:pPr>
+              <w:pStyle w:val="Body"/>
+            </w:pPr>
+            <w:r>
+              <w:t>0.527</w:t>
+            </w:r>
+          </w:p>
+        </w:tc>
+        <w:tc>
+          <w:tcPr>
+            <w:tcW w:w="1800" w:type="dxa"/>
+          </w:tcPr>
+          <w:p>
+            <w:pPr>
+              <w:pStyle w:val="Body"/>
+            </w:pPr>
+            <w:r>
+              <w:t>0.335</w:t>
+            </w:r>
+          </w:p>
+        </w:tc>
+      </w:tr>
+      <w:tr>
+        <w:tc>
+          <w:tcPr>
+            <w:tcW w:w="1800" w:type="dxa"/>
+          </w:tcPr>
+          <w:p>
+            <w:pPr>
+              <w:pStyle w:val="Body"/>
+            </w:pPr>
+            <w:r>
+              <w:t>Collection (34)</w:t>
+            </w:r>
+          </w:p>
+        </w:tc>
+        <w:tc>
+          <w:tcPr>
+            <w:tcW w:w="1800" w:type="dxa"/>
+          </w:tcPr>
+          <w:p>
+            <w:pPr>
+              <w:pStyle w:val="Body"/>
+            </w:pPr>
+            <w:r>
+              <w:t>0.795</w:t>
+            </w:r>
+          </w:p>
+        </w:tc>
+        <w:tc>
+          <w:tcPr>
+            <w:tcW w:w="1800" w:type="dxa"/>
+          </w:tcPr>
+          <w:p>
+            <w:pPr>
+              <w:pStyle w:val="Body"/>
+            </w:pPr>
+            <w:r>
+              <w:t>0.626</w:t>
+            </w:r>
+          </w:p>
+        </w:tc>
+        <w:tc>
+          <w:tcPr>
+            <w:tcW w:w="1800" w:type="dxa"/>
+          </w:tcPr>
+          <w:p>
+            <w:pPr>
+              <w:pStyle w:val="Body"/>
+            </w:pPr>
+            <w:r>
+              <w:t>0.450</w:t>
+            </w:r>
+          </w:p>
+        </w:tc>
+        <w:tc>
+          <w:tcPr>
+            <w:tcW w:w="1800" w:type="dxa"/>
+          </w:tcPr>
+          <w:p>
+            <w:pPr>
+              <w:pStyle w:val="Body"/>
+            </w:pPr>
+            <w:r>
+              <w:t>0.284</w:t>
+            </w:r>
+          </w:p>
+        </w:tc>
+      </w:tr>
+      <w:tr>
+        <w:tc>
+          <w:tcPr>
+            <w:tcW w:w="1800" w:type="dxa"/>
+          </w:tcPr>
+          <w:p>
+            <w:pPr>
+              <w:pStyle w:val="Body"/>
+            </w:pPr>
+            <w:r>
+              <w:t>Listing (40)</w:t>
+            </w:r>
+          </w:p>
+        </w:tc>
+        <w:tc>
+          <w:tcPr>
+            <w:tcW w:w="1800" w:type="dxa"/>
+          </w:tcPr>
+          <w:p>
+            <w:pPr>
+              <w:pStyle w:val="Body"/>
+            </w:pPr>
+            <w:r>
+              <w:t>0.760</w:t>
+            </w:r>
+          </w:p>
+        </w:tc>
+        <w:tc>
+          <w:tcPr>
+            <w:tcW w:w="1800" w:type="dxa"/>
+          </w:tcPr>
+          <w:p>
+            <w:pPr>
+              <w:pStyle w:val="Body"/>
+            </w:pPr>
+            <w:r>
+              <w:t>0.722</w:t>
+            </w:r>
+          </w:p>
+        </w:tc>
+        <w:tc>
+          <w:tcPr>
+            <w:tcW w:w="1800" w:type="dxa"/>
+          </w:tcPr>
+          <w:p>
+            <w:pPr>
+              <w:pStyle w:val="Body"/>
+            </w:pPr>
+            <w:r>
+              <w:t>0.439</w:t>
+            </w:r>
+          </w:p>
+        </w:tc>
+        <w:tc>
+          <w:tcPr>
+            <w:tcW w:w="1800" w:type="dxa"/>
+          </w:tcPr>
+          <w:p>
+            <w:pPr>
+              <w:pStyle w:val="Body"/>
+            </w:pPr>
+            <w:r>
+              <w:t>0.386</w:t>
             </w:r>
           </w:p>
         </w:tc>
@@ -2033,8 +2274,8 @@
       <w:r>
         <w:drawing>
           <wp:inline distT="0" distB="0" distL="0" distR="0">
-            <wp:extent cx="5943600" cy="2695956"/>
-            <wp:docPr id="2" name="fig2_benchmark.png"/>
+            <wp:extent cx="5943600" cy="2438400"/>
+            <wp:docPr id="2" name="fig2_wcxb_test.png"/>
             <wp:cNvGraphicFramePr>
               <ns2:graphicFrameLocks xmlns:ns2="http://schemas.openxmlformats.org/drawingml/2006/main" noChangeAspect="1"/>
             </wp:cNvGraphicFramePr>
@@ -2042,7 +2283,7 @@
               <ns3:graphicData uri="http://schemas.openxmlformats.org/drawingml/2006/picture">
                 <ns4:pic xmlns:ns4="http://schemas.openxmlformats.org/drawingml/2006/picture">
                   <ns4:nvPicPr>
-                    <ns4:cNvPr id="2" name="fig2_benchmark.png"/>
+                    <ns4:cNvPr id="2" name="fig2_wcxb_test.png"/>
                     <ns4:cNvPicPr/>
                   </ns4:nvPicPr>
                   <ns4:blipFill>
@@ -2054,7 +2295,7 @@
                   <ns4:spPr>
                     <ns3:xfrm>
                       <ns3:off x="0" y="0"/>
-                      <ns3:ext cx="5943600" cy="2695956"/>
+                      <ns3:ext cx="5943600" cy="2438400"/>
                     </ns3:xfrm>
                     <ns3:prstGeom prst="rect">
                       <ns3:avLst/>
@@ -2075,31 +2316,23 @@
         <w:rPr>
           <w:i/>
         </w:rPr>
-        <w:t>Figure 2. Extraction benchmark on the 242 scoreable pages. (a) Mean content recall against mean noise retention; the upper left is better. (b) Cumulative distribution of per-page content recall: the shaded band marks near-total content loss (recall below 0.2), which affects 25 pages for Trafilatura, 13 for ChromeRAG (coverage) and 1 for MarkItDown.</w:t>
-      </w:r>
-    </w:p>
-    <w:p>
-      <w:pPr>
-        <w:pStyle w:val="Body"/>
-      </w:pPr>
-      <w:r>
-        <w:t>Table 2 and Fig. 2 show two different trade-offs. Against MarkItDown, ChromeRAG keeps the same amount of content: the paired bootstrap difference in recall (2,000 resamples) is −0.003, with a 95% CI of [−0.025, 0.017]. It keeps far less chrome (difference in noise retention −0.243, CI [−0.266, −0.220]), and its median output is 820 tokens against 3,436 for MarkItDown. Against Trafilatura, noise retention does not differ significantly (−0.005, CI [−0.014, 0.003]). ChromeRAG's higher F_bal (+0.049, CI [+0.021, +0.079]) comes from recall. Page by page, the two tools win about equally often (103 against 109 pages, with 30 ties where F_bal differs by at most 0.01). The difference in means comes from failures: Trafilatura keeps less than 20% of the content on 25 pages, against 13 for ChromeRAG, mostly multi-section documentation and marketing pages (Fig. 2b). Per-page scores, per-category tables and the all-page means are published with the code, so readers can check individual cases.</w:t>
-      </w:r>
-    </w:p>
-    <w:p>
-      <w:pPr>
-        <w:pStyle w:val="Heading2"/>
-      </w:pPr>
-      <w:r>
-        <w:t>Retrieval over the chunked output</w:t>
-      </w:r>
-    </w:p>
-    <w:p>
-      <w:pPr>
-        <w:pStyle w:val="Body"/>
-      </w:pPr>
-      <w:r>
-        <w:t>Extraction scores do not show what a retriever receives. poc/run_retrieval_eval.py splits each tool's output for the 242 pages into chunks of about 200 words, indexes them with BM25, and runs 771 known-item queries built from the input HTML only: page titles and section headings from &lt;main&gt;, and 12-word passages from its paragraphs, each kept only if its text occurs in exactly one page. A hit means a chunk from that page is among the top five (Fig. 3). ChromeRAG reaches a hit@5 of 0.949, against 0.964 for MarkItDown (difference −0.014, 95% CI [−0.035, 0.006], bootstrap over pages), 0.922 for Trafilatura (+0.027 [+0.003, +0.053]) and 0.774 for Readability. It gets there with 2,553 chunks instead of MarkItDown's 3,907, less than half of the indexed words, and with 0.1% of the retrieved context made of chrome anchors against 2.6% for MarkItDown.</w:t>
+        <w:t>Figure 2. Word-level F1 on the 511 held-out WCXB test pages, overall and by page type. Each dot is the mean over the pages of one type; ChromeRAG is in balanced mode and its value is printed.</w:t>
+      </w:r>
+    </w:p>
+    <w:p>
+      <w:pPr>
+        <w:pStyle w:val="Body"/>
+      </w:pPr>
+      <w:r>
+        <w:t>The paired bootstrap difference to Trafilatura is +0.043 (95% CI [+0.027, +0.059]) overall, +0.150 on forums [+0.091, +0.217], +0.150 on products [+0.069, +0.243] and +0.169 on collections [+0.080, +0.264]. On articles, documentation, services and listings the intervals contain zero. The fraction of required snippets found is 0.798 against 0.720 (+0.078 [+0.051, +0.105]); the fraction of forbidden snippets found is 0.077 against 0.083 (no difference). The benchmark's publication [9] reports 0.903 for a page-type-aware Rust extractor and 0.841 for Trafilatura on the same test pages under its own configuration; we could not build that tool here, so we quote it and make no claim of superiority. The two sets of numbers use different Trafilatura settings and are not interchangeable.</w:t>
+      </w:r>
+    </w:p>
+    <w:p>
+      <w:pPr>
+        <w:pStyle w:val="Body"/>
+      </w:pPr>
+      <w:r>
+        <w:t>Fig. 3 shows the trade-off on the development folds. ChromeRAG's curve lies above Trafilatura's single operating point for thresholds from 0.6 to 0.7 (higher precision and recall at once) and has higher F1 at every threshold up to 0.8. The model's confidence is informative: pages with an expected F1 below 0.70 (7.6% of pages) score 0.57 on average against 0.88 for the rest.</w:t>
       </w:r>
     </w:p>
     <w:p>
@@ -2109,8 +2342,8 @@
       <w:r>
         <w:drawing>
           <wp:inline distT="0" distB="0" distL="0" distR="0">
-            <wp:extent cx="5943600" cy="1981200"/>
-            <wp:docPr id="3" name="fig3_retrieval.png"/>
+            <wp:extent cx="5943600" cy="2543556"/>
+            <wp:docPr id="3" name="fig3_frontier.png"/>
             <wp:cNvGraphicFramePr>
               <ns2:graphicFrameLocks xmlns:ns2="http://schemas.openxmlformats.org/drawingml/2006/main" noChangeAspect="1"/>
             </wp:cNvGraphicFramePr>
@@ -2118,11 +2351,95 @@
               <ns3:graphicData uri="http://schemas.openxmlformats.org/drawingml/2006/picture">
                 <ns4:pic xmlns:ns4="http://schemas.openxmlformats.org/drawingml/2006/picture">
                   <ns4:nvPicPr>
-                    <ns4:cNvPr id="3" name="fig3_retrieval.png"/>
+                    <ns4:cNvPr id="3" name="fig3_frontier.png"/>
                     <ns4:cNvPicPr/>
                   </ns4:nvPicPr>
                   <ns4:blipFill>
                     <ns3:blip r:embed="rId28"/>
+                    <ns3:stretch>
+                      <ns3:fillRect/>
+                    </ns3:stretch>
+                  </ns4:blipFill>
+                  <ns4:spPr>
+                    <ns3:xfrm>
+                      <ns3:off x="0" y="0"/>
+                      <ns3:ext cx="5943600" cy="2543556"/>
+                    </ns3:xfrm>
+                    <ns3:prstGeom prst="rect">
+                      <ns3:avLst/>
+                    </ns3:prstGeom>
+                  </ns4:spPr>
+                </ns4:pic>
+              </ns3:graphicData>
+            </ns3:graphic>
+          </wp:inline>
+        </w:drawing>
+      </w:r>
+    </w:p>
+    <w:p>
+      <w:pPr>
+        <w:pStyle w:val="Body"/>
+      </w:pPr>
+      <w:r>
+        <w:rPr>
+          <w:i/>
+        </w:rPr>
+        <w:t>Figure 3. Precision and recall on WCXB development pages (five-fold cross-validation grouped by site) as the ChromeRAG threshold goes from 0.15 to 0.90, against the single operating points of Trafilatura and Readability.</w:t>
+      </w:r>
+    </w:p>
+    <w:p>
+      <w:pPr>
+        <w:pStyle w:val="Body"/>
+      </w:pPr>
+      <w:r>
+        <w:t>Median time on 200 stored pages in one process is 36 ms for ChromeRAG, 30 ms for Trafilatura, 30 ms for Readability and 37 ms for MarkItDown; the 95th percentile is 108 ms against 147 ms for Trafilatura.</w:t>
+      </w:r>
+    </w:p>
+    <w:p>
+      <w:pPr>
+        <w:pStyle w:val="Heading2"/>
+      </w:pPr>
+      <w:r>
+        <w:t>Marketing and landing pages, retrieval and judged quality</w:t>
+      </w:r>
+    </w:p>
+    <w:p>
+      <w:pPr>
+        <w:pStyle w:val="Body"/>
+      </w:pPr>
+      <w:r>
+        <w:t>The WCXB service, product and collection pages are the nearest public proxy for enterprise marketing content, but we also built a corpus of company landing pages (poc/landing_corpus.py): up to five pages per company chosen from the homepage's own links before any extractor was run. Companies were split by a hash into development and held-out sets, and a second list of 51 companies was fetched only after the freeze ("fresh", 178 scoreable pages). On the structural-anchor metric (recall of word 5-grams from &lt;main&gt;/&lt;article&gt;, retention of anchors from navigation, header, footer and cookie containers, balanced F), coverage mode reaches 0.759 on the 177 held-out pages and 0.780 on the fresh pages, against 0.680 and 0.649 for Trafilatura, 0.723 and 0.741 for MarkItDown (which keeps 22 to 26% of the chrome anchors, ChromeRAG 0.1% or less) and 0.512 and 0.567 for Readability. On 242 documentation, pricing and article pages with at least 50 content anchors, the same metric gives 0.833 for coverage and 0.739 for Trafilatura (+0.094, CI [+0.066, +0.123]); Trafilatura keeps under 20% of the content on 25 of these pages, ChromeRAG on 2.</w:t>
+      </w:r>
+    </w:p>
+    <w:p>
+      <w:pPr>
+        <w:pStyle w:val="Body"/>
+      </w:pPr>
+      <w:r>
+        <w:t>BM25 retrieval with 668 known-item queries over the fresh pages (chunks of about 200 words) gives a hit@5 of 0.916 for ChromeRAG against 0.832 for Trafilatura (+0.084 [+0.045, +0.123]) and 0.949 for MarkItDown, which keeps everything (chrome in 2.3% of the retrieved context against 0.1% for ChromeRAG and 1.1% for Trafilatura). With dense embeddings (text-embedding-3-small) all tools but Readability tie (0.708 against 0.698 for Trafilatura; difference +0.010 [-0.024, +0.047]). On the documentation corpus, BM25 hit@5 is 0.947 against 0.921 for Trafilatura and 0.964 for MarkItDown, with 2,010 chunks against MarkItDown's 3,909.</w:t>
+      </w:r>
+    </w:p>
+    <w:p>
+      <w:pPr>
+        <w:pStyle w:val="Body"/>
+      </w:pPr>
+      <w:r>
+        <w:drawing>
+          <wp:inline distT="0" distB="0" distL="0" distR="0">
+            <wp:extent cx="5943600" cy="1981200"/>
+            <wp:docPr id="4" name="fig4_retrieval.png"/>
+            <wp:cNvGraphicFramePr>
+              <ns2:graphicFrameLocks xmlns:ns2="http://schemas.openxmlformats.org/drawingml/2006/main" noChangeAspect="1"/>
+            </wp:cNvGraphicFramePr>
+            <ns3:graphic xmlns:ns3="http://schemas.openxmlformats.org/drawingml/2006/main">
+              <ns3:graphicData uri="http://schemas.openxmlformats.org/drawingml/2006/picture">
+                <ns4:pic xmlns:ns4="http://schemas.openxmlformats.org/drawingml/2006/picture">
+                  <ns4:nvPicPr>
+                    <ns4:cNvPr id="4" name="fig4_retrieval.png"/>
+                    <ns4:cNvPicPr/>
+                  </ns4:nvPicPr>
+                  <ns4:blipFill>
+                    <ns3:blip r:embed="rId29"/>
                     <ns3:stretch>
                       <ns3:fillRect/>
                     </ns3:stretch>
@@ -2151,7 +2468,67 @@
         <w:rPr>
           <w:i/>
         </w:rPr>
-        <w:t>Figure 3. BM25 retrieval over each tool's ~200-word chunks, 771 known-item queries built from the input HTML. (a) Share of queries whose page is in the top five chunks. (b) Share of the retrieved top-five text that is navigation, header or footer chrome.</w:t>
+        <w:t>Figure 4. BM25 retrieval over each tool's ~200-word chunks on the 178 fresh-company landing pages, 668 known-item queries. (a) Share of queries whose page is in the top five chunks (ChromeRAG in coverage mode). (b) Share of the retrieved top-five text that is navigation, header or footer chrome.</w:t>
+      </w:r>
+    </w:p>
+    <w:p>
+      <w:pPr>
+        <w:pStyle w:val="Body"/>
+      </w:pPr>
+      <w:r>
+        <w:t>A blind pairwise judgement by a language model (gpt-5.6-luna, 100 held-out and fresh pages, tool names hidden, output order randomised, 83% of repeated pairs with swapped positions judged the same) preferred ChromeRAG over Trafilatura on 70% of pages and over MarkItDown on 87%, against 28% and 12% (Fig. 5). The judge scored content kept at 4.4 against 3.5 for Trafilatura, and chrome left at 4.0 against 4.7 on a 5-point scale where 5 means no chrome: Trafilatura leaves less chrome but loses more content.</w:t>
+      </w:r>
+    </w:p>
+    <w:p>
+      <w:pPr>
+        <w:pStyle w:val="Body"/>
+      </w:pPr>
+      <w:r>
+        <w:drawing>
+          <wp:inline distT="0" distB="0" distL="0" distR="0">
+            <wp:extent cx="5943600" cy="885444"/>
+            <wp:docPr id="5" name="fig5_judge.png"/>
+            <wp:cNvGraphicFramePr>
+              <ns2:graphicFrameLocks xmlns:ns2="http://schemas.openxmlformats.org/drawingml/2006/main" noChangeAspect="1"/>
+            </wp:cNvGraphicFramePr>
+            <ns3:graphic xmlns:ns3="http://schemas.openxmlformats.org/drawingml/2006/main">
+              <ns3:graphicData uri="http://schemas.openxmlformats.org/drawingml/2006/picture">
+                <ns4:pic xmlns:ns4="http://schemas.openxmlformats.org/drawingml/2006/picture">
+                  <ns4:nvPicPr>
+                    <ns4:cNvPr id="5" name="fig5_judge.png"/>
+                    <ns4:cNvPicPr/>
+                  </ns4:nvPicPr>
+                  <ns4:blipFill>
+                    <ns3:blip r:embed="rId30"/>
+                    <ns3:stretch>
+                      <ns3:fillRect/>
+                    </ns3:stretch>
+                  </ns4:blipFill>
+                  <ns4:spPr>
+                    <ns3:xfrm>
+                      <ns3:off x="0" y="0"/>
+                      <ns3:ext cx="5943600" cy="885444"/>
+                    </ns3:xfrm>
+                    <ns3:prstGeom prst="rect">
+                      <ns3:avLst/>
+                    </ns3:prstGeom>
+                  </ns4:spPr>
+                </ns4:pic>
+              </ns3:graphicData>
+            </ns3:graphic>
+          </wp:inline>
+        </w:drawing>
+      </w:r>
+    </w:p>
+    <w:p>
+      <w:pPr>
+        <w:pStyle w:val="Body"/>
+      </w:pPr>
+      <w:r>
+        <w:rPr>
+          <w:i/>
+        </w:rPr>
+        <w:t>Figure 5. Blind pairwise judgement by a language model of ChromeRAG (coverage) against Trafilatura and MarkItDown on 100 held-out and fresh landing pages; grey marks ties.</w:t>
       </w:r>
     </w:p>
     <w:p>
@@ -2167,7 +2544,7 @@
         <w:pStyle w:val="Body"/>
       </w:pPr>
       <w:r>
-        <w:t>poc/run_stce_eval.py applies chromerag learn with default settings and compares coverage-mode output with and without the site model. On the benchmark's 11 site groups with at least three unique pages (47 scored pages), recall is unchanged (0.714). Because those groups are small, poc/crawl_site_groups.py also fetched up to 15 same-section pages from each documentation site in the corpus, respecting robots.txt (the list is published as poc/stce_crawl_urls.json). This gives 1,791 pages in 125 site groups with a learned model. There STCE changes 174 pages and keeps F_bal level (0.851 to 0.852; recall 0.770 to 0.769), while site-repeated text, 5-grams that recur on at least 80% of a site's outputs, falls from 16.7 to 16.2 per page. The 17 pages that lose more than 0.05 recall all come from three sites that place feedback widgets, promotions or notices inside &lt;main&gt;; inspection showed that only such chrome was removed. Most repeated chrome is already gone before STCE: site-repeated text is 3.1% of ChromeRAG's output, against 2.1% for Trafilatura and 34.9% for MarkItDown. STCE is therefore a guarded complement for template blocks without chrome markup, as in the example above. Testing it on real sites exposed failure modes that are now guarded and covered by regression tests: utility CSS classes shared by chrome and content, a page fetched twice or published for several versions, and content wrappers whose class matched a small learned block.</w:t>
+        <w:t>poc/run_stce_eval.py compares coverage-mode output with and without the site model. On 11 benchmark site groups (49 pages) F_bal rises from 0.868 to 0.870. A crawl of up to 15 same-section pages from each documentation site (1,791 pages in 125 groups, robots.txt respected, list in poc/stce_crawl_urls.json) shows STCE changing 314 pages and keeping F_bal level (0.876 to 0.877, recall 0.805 both); text repeated across a site falls from 12.6 to 12.3 five-grams per page. Thirteen pages from seven sites lose more than 0.05 recall, which we did not inspect individually. Because most repeated chrome is already removed before STCE (site-repeated text is 2.1% of ChromeRAG's output, 2.1% for Trafilatura and 34.9% for MarkItDown), STCE is a guarded complement for template blocks without chrome markup, as in the example above.</w:t>
       </w:r>
     </w:p>
     <w:p>
@@ -2197,7 +2574,7 @@
         <w:t>Improving an existing workflow.</w:t>
       </w:r>
       <w:r>
-        <w:t xml:space="preserve"> Chunking and embedding scraped HTML is now a routine data-engineering task, and chrome removal is often done with ad hoc regular expressions written for each site. ChromeRAG replaces those with one tested step whose behaviour is documented. It works on CPU without network access, and it reports what it removed and why (diagnostics). Two properties matter most for RAG corpora. Across a whole site, the learned model can remove template blocks without chrome markup, which single-page extractors keep, and on 125 real documentation sites it left F_bal unchanged. On single pages, output stays about four times shorter than a structure-preserving converter while keeping the same content. In retrieval this means the same hit rate as MarkItDown with 35% fewer chunks to embed and far less chrome in the context passed to the model.</w:t>
+        <w:t xml:space="preserve"> Chunking and embedding scraped HTML is routine data engineering, and chrome removal is often done with per-site regular expressions. ChromeRAG replaces them with one tested step that runs on CPU without network access or a model download, reports what it removed and why, and tells the caller when it is unsure. Its accuracy gain concentrates where article-tuned tools fail: forums, product pages, category pages and multi-section service pages. For retrieval it keeps the content that BM25 needs (hit@5 above Trafilatura on landing and documentation pages) while leaving 20 times less chrome in the retrieved context than a structure-preserving converter.</w:t>
       </w:r>
     </w:p>
     <w:p>
@@ -2211,7 +2588,7 @@
         <w:t>Integration pathways.</w:t>
       </w:r>
       <w:r>
-        <w:t xml:space="preserve"> The bundled LangChain loader turns stored HTML files into documents whose metadata carries the front-matter, so a text splitter copies title, type and breadcrumb onto every chunk; a LlamaIndex reader can wrap extract() the same way. chromerag batch fits into Airflow or Prefect jobs after a crawl step. Its batch_summary.json lets later tasks send thin or JavaScript-shell pages to a headless browser instead of indexing empty text without notice. The typed front-matter supports filtering and citation at query time.</w:t>
+        <w:t xml:space="preserve"> The LangChain loader and LlamaIndex reader turn stored HTML files into documents whose metadata carries the front-matter, so a splitter copies title, type and breadcrumb onto every chunk. chromerag batch fits Airflow or Prefect jobs after a crawl; batch_summary.json sends thin pages to a headless browser, and the confidence estimate lets a job route low-confidence pages to review or to a heavier extractor.</w:t>
       </w:r>
     </w:p>
     <w:p>
@@ -2225,7 +2602,7 @@
         <w:t>New research questions.</w:t>
       </w:r>
       <w:r>
-        <w:t xml:space="preserve"> The repository includes a reproducible, tool-agnostic evaluation harness for web content extraction aimed at RAG, not news archiving. Researchers can register another extractor in poc/baselines.py and score it on the same pages, anchors and retrieval queries, and the published crawl list (poc/stce_crawl_urls.json) supports site-level studies. Open questions include whether the retrieval result holds for dense retrievers and for generated answers, how site-level template models age as sites are redesigned, and whether semantic encoders improve on the lexical DVDF filter.</w:t>
+        <w:t xml:space="preserve"> The repository includes a tool-agnostic harness: cross-validation by site, final-evaluation scripts, error taxonomy, frontier and confidence calibration (poc/wcxb_*), the landing-page corpus builder with a pre-registered split, the judge and retrieval evaluations, and all per-page outputs. Open questions include how far block-level labels from one benchmark transfer to other languages and page mixes, whether a sentence encoder improves on the lexical features, and how site-template models age.</w:t>
       </w:r>
     </w:p>
     <w:p>
@@ -2239,7 +2616,7 @@
         <w:t>Adoption.</w:t>
       </w:r>
       <w:r>
-        <w:t xml:space="preserve"> ChromeRAG was first released on PyPI and GitHub in September 2026, so download, citation and third-party usage figures are not yet meaningful. The public issue tracker and the live leaderboard at https://pedapudibhargav.github.io/ChromeRAG/ are the channels for outside feedback.</w:t>
+        <w:t xml:space="preserve"> ChromeRAG was first released on PyPI and GitHub in September 2026, so download, citation and third-party usage figures are not yet meaningful. The issue tracker, the live leaderboards at https://pedapudibhargav.github.io/ChromeRAG/ and the archived releases (Zenodo) are the channels for outside feedback.</w:t>
       </w:r>
     </w:p>
     <w:p>
@@ -2253,7 +2630,7 @@
         <w:t>Limitations.</w:t>
       </w:r>
       <w:r>
-        <w:t xml:space="preserve"> (i) ChromeRAG does not run JavaScript. It warns about shell pages but cannot recover their content. (ii) The metrics use structural anchors, not human-labelled spans. Pages without landmarks are under-represented, and extractors that also use landmarks may have an advantage. For this reason, all per-page scores are published, and the retrieval evaluation uses queries rather than anchors. (iii) DVDF compares lexical hashed vectors, not semantic embeddings, and retrieval was evaluated with BM25 only. (iv) STCE needs at least three pages from the same site group and considers block-level elements only, so template text in bare links or paragraphs can remain. (v) Only HTML is handled. PDF and Office formats need other converters such as MarkItDown.</w:t>
+        <w:t xml:space="preserve"> (i) ChromeRAG does not run JavaScript; it warns about shells but cannot recover their content. (ii) The model was trained on one benchmark (WCXB development pages, mostly English); its features include English stop words and call-to-action verbs, and other languages and page mixes are untested. (iii) Labels are word overlaps with human-reviewed references, and annotators are inconsistent in places: documentation code samples are included on 82% of pages but left out of repeated live samples on others, which caps the gain on documentation (ChromeRAG and Trafilatura are within noise there). (iv) The ceilings of block selection are 0.975 for articles but only 0.80 to 0.85 for products, collections, listings and forums, so absolute scores on those types stay lower. (v) Landing-page evidence uses a structural-anchor metric that cannot see chrome inside &lt;main&gt;, an LLM judge and BM25/dense retrieval over known-item queries, not human ratings of answers. (vi) STCE needs at least three pages per site group. (vii) Only HTML is handled. (viii) The benchmark's author also builds a competing extractor; we use the public data and our own scorer, which matches the benchmark's definition.</w:t>
       </w:r>
     </w:p>
     <w:p>
@@ -2277,7 +2654,7 @@
         <w:pStyle w:val="Body"/>
       </w:pPr>
       <w:r>
-        <w:t>ChromeRAG is a focused, installable component for the ingest step of web RAG pipelines. It converts HTML into Markdown without site chrome, can learn a site's repeated template, carries Schema.org metadata and tables into chunk-friendly form, and reports unusable inputs instead of hiding them. On a public benchmark of 242 pages, with a cohort chosen from the input alone, ChromeRAG matches MarkItDown's content recall while keeping about 35 times less chrome. It is ahead of Trafilatura on F_bal, mainly because it has fewer catastrophic content losses. In BM25 retrieval it matches MarkItDown's hit rate with 35% fewer chunks. The code, tests, benchmark harness and per-page results are openly available. Planned work covers page-type-specific presets, an optional sentence-encoder backend for DVDF [13], and evaluation with dense retrievers and generated answers.</w:t>
+        <w:t>ChromeRAG is a focused, installable component for the ingest step of web RAG pipelines. A 150 KB learned block filter, evaluated with NumPy, removes site chrome on a wide range of page types: on the 511 held-out WCXB pages it gains 0.043 F1 over Trafilatura, with large gains on forums, products and collections and ties on articles and documentation. It also learns a site's template, carries Schema.org metadata and tables into chunk-friendly form, and reports unusable inputs and low-confidence pages. On company landing pages a blind judge prefers its output to Trafilatura's on 70% of pages and to MarkItDown's on 87%. The code, the model, the training and evaluation scripts, and per-page results are openly available. Planned work covers multilingual training data, an optional sentence-encoder feature [17] and evaluation with generated answers.</w:t>
       </w:r>
     </w:p>
     <w:p>
@@ -2363,7 +2740,7 @@
         <w:pStyle w:val="Body"/>
       </w:pPr>
       <w:r>
-        <w:t>During the preparation of this work the author used Cursor (with a Grok-based coding agent) and Anthropic Claude (Claude Code) in order to assist with software development, code review, drafting and editing of the manuscript text, and verification of reported numbers against the benchmark outputs. After using these tools, the author reviewed and edited the content as needed and takes full responsibility for the content of the published article.</w:t>
+        <w:t>During the preparation of this work the author used Cursor (with a Grok-based coding agent) and Anthropic Claude (Claude Code) in order to assist with software development, code review, drafting and editing of the manuscript text, and verification of reported numbers against the benchmark outputs, and analysis scripts for the evaluation. After using these tools, the author reviewed and edited the content as needed and takes full responsibility for the content of the published article.</w:t>
       </w:r>
     </w:p>
     <w:p>
@@ -2433,87 +2810,119 @@
         <w:pStyle w:val="Body"/>
       </w:pPr>
       <w:r>
-        <w:t>4. A. Barbaresi, "Trafilatura: A Web Scraping Library and Command-Line Tool for Text Discovery and Extraction," in Proc. ACL-IJCNLP 2021: System Demonstrations, 2021, pp. 122–131. doi: 10.18653/v1/2021.acl-demo.15.</w:t>
-      </w:r>
-    </w:p>
-    <w:p>
-      <w:pPr>
-        <w:pStyle w:val="Body"/>
-      </w:pPr>
-      <w:r>
-        <w:t>5. Y. Baburov et al., python-readability (readability-lxml), Python port of Arc90 Readability, GitHub. [Online]. Available: https://github.com/buriy/python-readability</w:t>
-      </w:r>
-    </w:p>
-    <w:p>
-      <w:pPr>
-        <w:pStyle w:val="Body"/>
-      </w:pPr>
-      <w:r>
-        <w:t>6. Microsoft, MarkItDown: Python tool for converting files and office documents to Markdown, GitHub. [Online]. Available: https://github.com/microsoft/markitdown</w:t>
-      </w:r>
-    </w:p>
-    <w:p>
-      <w:pPr>
-        <w:pStyle w:val="Body"/>
-      </w:pPr>
-      <w:r>
-        <w:t>7. J. Bevendorff, S. Gupta, J. Kiesel, and B. Stein, "An Empirical Comparison of Web Content Extraction Algorithms," in Proc. 46th Int. ACM SIGIR Conf., 2023, pp. 2594–2603. doi: 10.1145/3539618.3591920.</w:t>
-      </w:r>
-    </w:p>
-    <w:p>
-      <w:pPr>
-        <w:pStyle w:val="Body"/>
-      </w:pPr>
-      <w:r>
-        <w:t>8. Z. Bar-Yossef and S. Rajagopalan, "Template Detection via Data Mining and its Applications," in Proc. 11th Int. World Wide Web Conf. (WWW), 2002, pp. 580–591. doi: 10.1145/511446.511522.</w:t>
-      </w:r>
-    </w:p>
-    <w:p>
-      <w:pPr>
-        <w:pStyle w:val="Body"/>
-      </w:pPr>
-      <w:r>
-        <w:t>9. L. Yi, B. Liu, and X. Li, "Eliminating Noisy Information in Web Pages for Data Mining," in Proc. 9th ACM SIGKDD Int. Conf. Knowledge Discovery and Data Mining, 2003, pp. 296–305. doi: 10.1145/956750.956785.</w:t>
-      </w:r>
-    </w:p>
-    <w:p>
-      <w:pPr>
-        <w:pStyle w:val="Body"/>
-      </w:pPr>
-      <w:r>
-        <w:t>10. J. Alarte, J. Silva, and S. Tamarit, "What Web Template Extractor Should I Use? A Benchmarking and Comparison for Five Template Extractors," ACM Trans. Web, vol. 13, no. 2, pp. 1–19, 2019. doi: 10.1145/3316810.</w:t>
-      </w:r>
-    </w:p>
-    <w:p>
-      <w:pPr>
-        <w:pStyle w:val="Body"/>
-      </w:pPr>
-      <w:r>
-        <w:t>11. J. Tan, Z. Dou, W. Wang, M. Wang, W. Chen, and J.-R. Wen, "HtmlRAG: HTML is Better Than Plain Text for Modeling Retrieved Knowledge in RAG Systems," in Proc. ACM Web Conf. 2025 (WWW '25), 2025, pp. 1733–1746. doi: 10.1145/3696410.3714546.</w:t>
-      </w:r>
-    </w:p>
-    <w:p>
-      <w:pPr>
-        <w:pStyle w:val="Body"/>
-      </w:pPr>
-      <w:r>
-        <w:t>12. K. Weinberger, A. Dasgupta, J. Langford, A. Smola, and J. Attenberg, "Feature Hashing for Large Scale Multitask Learning," in Proc. 26th Int. Conf. Machine Learning (ICML), 2009, pp. 1113–1120. doi: 10.1145/1553374.1553516.</w:t>
-      </w:r>
-    </w:p>
-    <w:p>
-      <w:pPr>
-        <w:pStyle w:val="Body"/>
-      </w:pPr>
-      <w:r>
-        <w:t>13. N. Reimers and I. Gurevych, "Sentence-BERT: Sentence Embeddings using Siamese BERT-Networks," in Proc. EMNLP-IJCNLP 2019, 2019, pp. 3980–3990. doi: 10.18653/v1/D19-1410.</w:t>
-      </w:r>
-    </w:p>
-    <w:p>
-      <w:pPr>
-        <w:pStyle w:val="Body"/>
-      </w:pPr>
-      <w:r>
-        <w:t>14. B. C. Peddapudi, ChromeRAG, version 0.1.2, Zenodo, 2026. doi: 10.5281/zenodo.22970290. Source: https://github.com/pedapudibhargav/ChromeRAG/tree/v0.1.2</w:t>
+        <w:t>4. J. Leonhardt, A. Anand, and M. Khosla, "Boilerplate Removal using a Neural Sequence Labeling Model," in Companion Proc. The Web Conf. 2020 (WWW '20), 2020. arXiv: 2004.14294.</w:t>
+      </w:r>
+    </w:p>
+    <w:p>
+      <w:pPr>
+        <w:pStyle w:val="Body"/>
+      </w:pPr>
+      <w:r>
+        <w:t>5. A. Barbaresi, "Trafilatura: A Web Scraping Library and Command-Line Tool for Text Discovery and Extraction," in Proc. ACL-IJCNLP 2021: System Demonstrations, 2021, pp. 122–131. doi: 10.18653/v1/2021.acl-demo.15.</w:t>
+      </w:r>
+    </w:p>
+    <w:p>
+      <w:pPr>
+        <w:pStyle w:val="Body"/>
+      </w:pPr>
+      <w:r>
+        <w:t>6. Y. Baburov et al., python-readability (readability-lxml), Python port of Arc90 Readability, GitHub. [Online]. Available: https://github.com/buriy/python-readability</w:t>
+      </w:r>
+    </w:p>
+    <w:p>
+      <w:pPr>
+        <w:pStyle w:val="Body"/>
+      </w:pPr>
+      <w:r>
+        <w:t>7. Microsoft, MarkItDown: Python tool for converting files and office documents to Markdown, GitHub. [Online]. Available: https://github.com/microsoft/markitdown</w:t>
+      </w:r>
+    </w:p>
+    <w:p>
+      <w:pPr>
+        <w:pStyle w:val="Body"/>
+      </w:pPr>
+      <w:r>
+        <w:t>8. J. Bevendorff, S. Gupta, J. Kiesel, and B. Stein, "An Empirical Comparison of Web Content Extraction Algorithms," in Proc. 46th Int. ACM SIGIR Conf., 2023, pp. 2594–2603. doi: 10.1145/3539618.3591920.</w:t>
+      </w:r>
+    </w:p>
+    <w:p>
+      <w:pPr>
+        <w:pStyle w:val="Body"/>
+      </w:pPr>
+      <w:r>
+        <w:t>9. M. Foley, "WCXB: A Multi-Type Web Content Extraction Benchmark," arXiv: 2605.21097, May 2026. Data: CC-BY-4.0.</w:t>
+      </w:r>
+    </w:p>
+    <w:p>
+      <w:pPr>
+        <w:pStyle w:val="Body"/>
+      </w:pPr>
+      <w:r>
+        <w:t>10. M. Foley, rs-trafilatura: web content extraction in Rust with page-type classification, GitHub. [Online]. Available: https://github.com/Murrough-Foley/rs-trafilatura</w:t>
+      </w:r>
+    </w:p>
+    <w:p>
+      <w:pPr>
+        <w:pStyle w:val="Body"/>
+      </w:pPr>
+      <w:r>
+        <w:t>11. M. Liu et al., "Dripper: Token-Efficient Main HTML Extraction with a Lightweight LM," arXiv: 2511.23119, 2025.</w:t>
+      </w:r>
+    </w:p>
+    <w:p>
+      <w:pPr>
+        <w:pStyle w:val="Body"/>
+      </w:pPr>
+      <w:r>
+        <w:t>12. Z. Bar-Yossef and S. Rajagopalan, "Template Detection via Data Mining and its Applications," in Proc. 11th Int. World Wide Web Conf. (WWW), 2002, pp. 580–591. doi: 10.1145/511446.511522.</w:t>
+      </w:r>
+    </w:p>
+    <w:p>
+      <w:pPr>
+        <w:pStyle w:val="Body"/>
+      </w:pPr>
+      <w:r>
+        <w:t>13. L. Yi, B. Liu, and X. Li, "Eliminating Noisy Information in Web Pages for Data Mining," in Proc. 9th ACM SIGKDD Int. Conf. Knowledge Discovery and Data Mining, 2003, pp. 296–305. doi: 10.1145/956750.956785.</w:t>
+      </w:r>
+    </w:p>
+    <w:p>
+      <w:pPr>
+        <w:pStyle w:val="Body"/>
+      </w:pPr>
+      <w:r>
+        <w:t>14. J. Alarte, J. Silva, and S. Tamarit, "What Web Template Extractor Should I Use? A Benchmarking and Comparison for Five Template Extractors," ACM Trans. Web, vol. 13, no. 2, pp. 1–19, 2019. doi: 10.1145/3316810.</w:t>
+      </w:r>
+    </w:p>
+    <w:p>
+      <w:pPr>
+        <w:pStyle w:val="Body"/>
+      </w:pPr>
+      <w:r>
+        <w:t>15. J. Tan, Z. Dou, W. Wang, M. Wang, W. Chen, and J.-R. Wen, "HtmlRAG: HTML is Better Than Plain Text for Modeling Retrieved Knowledge in RAG Systems," in Proc. ACM Web Conf. 2025 (WWW '25), 2025, pp. 1733–1746. doi: 10.1145/3696410.3714546.</w:t>
+      </w:r>
+    </w:p>
+    <w:p>
+      <w:pPr>
+        <w:pStyle w:val="Body"/>
+      </w:pPr>
+      <w:r>
+        <w:t>16. K. Weinberger, A. Dasgupta, J. Langford, A. Smola, and J. Attenberg, "Feature Hashing for Large Scale Multitask Learning," in Proc. 26th Int. Conf. Machine Learning (ICML), 2009, pp. 1113–1120. doi: 10.1145/1553374.1553516.</w:t>
+      </w:r>
+    </w:p>
+    <w:p>
+      <w:pPr>
+        <w:pStyle w:val="Body"/>
+      </w:pPr>
+      <w:r>
+        <w:t>17. N. Reimers and I. Gurevych, "Sentence-BERT: Sentence Embeddings using Siamese BERT-Networks," in Proc. EMNLP-IJCNLP 2019, 2019, pp. 3980–3990. doi: 10.18653/v1/D19-1410.</w:t>
+      </w:r>
+    </w:p>
+    <w:p>
+      <w:pPr>
+        <w:pStyle w:val="Body"/>
+      </w:pPr>
+      <w:r>
+        <w:t>18. B. C. Peddapudi, ChromeRAG, version 0.1.3, Zenodo, 2026. doi: 10.5281/zenodo.22970289 (all versions). Source: https://github.com/pedapudibhargav/ChromeRAG</w:t>
       </w:r>
     </w:p>
     <w:sectPr>

</xml_diff>

<commit_message>
Paper and README: second judge sample, figure 5 with both samples
</commit_message>
<xml_diff>
--- a/papers/softwarex/ChromeRAG_SoftwareX_OSP.docx
+++ b/papers/softwarex/ChromeRAG_SoftwareX_OSP.docx
@@ -2476,7 +2476,7 @@
         <w:pStyle w:val="Body"/>
       </w:pPr>
       <w:r>
-        <w:t>A blind pairwise judgement by a language model (gpt-5.6-luna, 100 held-out and fresh pages, tool names hidden, output order randomised, 83% of repeated pairs with swapped positions judged the same) preferred ChromeRAG over Trafilatura on 70% of pages and over MarkItDown on 87%, against 28% and 12% (Fig. 5). The judge scored content kept at 4.4 against 3.5 for Trafilatura, and chrome left at 4.0 against 4.7 on a 5-point scale where 5 means no chrome: Trafilatura leaves less chrome but loses more content.</w:t>
+        <w:t>A blind pairwise judgement by a language model (gpt-5.6-luna; tool names hidden, output order randomised, about 83% of repeated pairs with swapped positions judged the same) was run on two samples. On 100 held-out and fresh landing pages, ChromeRAG (coverage) was preferred over Trafilatura on 70% of pages and over MarkItDown on 87%, against 28% and 12% (Fig. 5). On 105 WCXB test pages, 15 per page type, ChromeRAG (balanced) was preferred over MarkItDown on 83% of pages and over Trafilatura on 56% against 42%, a difference whose interval includes zero (net +0.14, 95% CI [-0.05, +0.33]). By type the judge favours ChromeRAG on forum, product, collection and service pages (67 to 73%) and Trafilatura on articles (60%), documentation (67%) and listings (53%), which matches the F1 ties. The judge scored content kept at 4.2 against 3.7 for Trafilatura and chrome left at 3.9 against 4.1 on a 5-point scale where 5 means no chrome: Trafilatura leaves a little less chrome, ChromeRAG keeps more content.</w:t>
       </w:r>
     </w:p>
     <w:p>
@@ -2486,7 +2486,7 @@
       <w:r>
         <w:drawing>
           <wp:inline distT="0" distB="0" distL="0" distR="0">
-            <wp:extent cx="5943600" cy="885444"/>
+            <wp:extent cx="5943600" cy="1418844"/>
             <wp:docPr id="5" name="fig5_judge.png"/>
             <wp:cNvGraphicFramePr>
               <ns2:graphicFrameLocks xmlns:ns2="http://schemas.openxmlformats.org/drawingml/2006/main" noChangeAspect="1"/>
@@ -2507,7 +2507,7 @@
                   <ns4:spPr>
                     <ns3:xfrm>
                       <ns3:off x="0" y="0"/>
-                      <ns3:ext cx="5943600" cy="885444"/>
+                      <ns3:ext cx="5943600" cy="1418844"/>
                     </ns3:xfrm>
                     <ns3:prstGeom prst="rect">
                       <ns3:avLst/>
@@ -2528,7 +2528,7 @@
         <w:rPr>
           <w:i/>
         </w:rPr>
-        <w:t>Figure 5. Blind pairwise judgement by a language model of ChromeRAG (coverage) against Trafilatura and MarkItDown on 100 held-out and fresh landing pages; grey marks ties.</w:t>
+        <w:t>Figure 5. Blind pairwise judgement by a language model of ChromeRAG against Trafilatura and MarkItDown: 100 held-out and fresh landing pages (coverage mode) and 105 stratified WCXB test pages (balanced mode); grey marks ties.</w:t>
       </w:r>
     </w:p>
     <w:p>
@@ -2654,7 +2654,7 @@
         <w:pStyle w:val="Body"/>
       </w:pPr>
       <w:r>
-        <w:t>ChromeRAG is a focused, installable component for the ingest step of web RAG pipelines. A 150 KB learned block filter, evaluated with NumPy, removes site chrome on a wide range of page types: on the 511 held-out WCXB pages it gains 0.043 F1 over Trafilatura, with large gains on forums, products and collections and ties on articles and documentation. It also learns a site's template, carries Schema.org metadata and tables into chunk-friendly form, and reports unusable inputs and low-confidence pages. On company landing pages a blind judge prefers its output to Trafilatura's on 70% of pages and to MarkItDown's on 87%. The code, the model, the training and evaluation scripts, and per-page results are openly available. Planned work covers multilingual training data, an optional sentence-encoder feature [17] and evaluation with generated answers.</w:t>
+        <w:t>ChromeRAG is a focused, installable component for the ingest step of web RAG pipelines. A 150 KB learned block filter, evaluated with NumPy, removes site chrome on a wide range of page types: on the 511 held-out WCXB pages it gains 0.043 F1 over Trafilatura, with large gains on forums, products and collections and ties on articles and documentation. It also learns a site's template, carries Schema.org metadata and tables into chunk-friendly form, and reports unusable inputs and low-confidence pages. On company landing pages a blind judge prefers its output to Trafilatura's on 70% of pages (and to MarkItDown's on 87%); on a mixed WCXB sample it prefers it to MarkItDown's on 83% and is statistically tied with Trafilatura. The code, the model, the training and evaluation scripts, and per-page results are openly available. Planned work covers multilingual training data, an optional sentence-encoder feature [17] and evaluation with generated answers.</w:t>
       </w:r>
     </w:p>
     <w:p>

</xml_diff>

<commit_message>
Paper: audit fixes (held-out duplicates, scorer disclosure, example, references, limits); README results updated; example paragraph for STCE
</commit_message>
<xml_diff>
--- a/papers/softwarex/ChromeRAG_SoftwareX_OSP.docx
+++ b/papers/softwarex/ChromeRAG_SoftwareX_OSP.docx
@@ -16,7 +16,7 @@
         </w:rPr>
       </w:pPr>
       <w:r>
-        <w:t>ChromeRAG: A Learned Boilerplate Filter and Site-Template Learner for Web RAG Ingestion</w:t>
+        <w:t>ChromeRAG: A Learned Boilerplate Filter for Web RAG Ingestion</w:t>
       </w:r>
     </w:p>
     <w:p>
@@ -85,7 +85,7 @@
         </w:rPr>
       </w:pPr>
       <w:r>
-        <w:t>Web pages indexed for retrieval-augmented generation (RAG) carry navigation, cookie banners, related links and comments that become noisy chunks. ChromeRAG is an MIT-licensed, CPU-only Python package and command-line tool that converts HTML into RAG-ready Markdown. A 150 KB gradient-boosted model, evaluated with NumPy, scores each text block; an optional site model removes repeated templates; metadata becomes front-matter, tables become key-value rows, and JavaScript shells are flagged. On the 511 held-out WCXB pages it reaches a word-level F1 of 0.902, against 0.860 for Trafilatura and 0.540 for MarkItDown.</w:t>
+        <w:t>Web pages indexed for retrieval-augmented generation (RAG) carry navigation, cookie banners, related links and comments that become noisy chunks. ChromeRAG is an MIT-licensed, CPU-only Python package and command-line tool that converts HTML into RAG-ready Markdown. A 150 KB gradient-boosted tree model, run with NumPy only, scores each text block; an optional site model removes repeated templates; metadata becomes front-matter, tables become key-value rows, and JavaScript shells are flagged. On 372 WCXB test pages not present in its training folder it reaches a word-level F1 of 0.903, against 0.867 for Trafilatura and 0.568 for MarkItDown.</w:t>
       </w:r>
     </w:p>
     <w:p>
@@ -903,7 +903,7 @@
         <w:t>Chrome pollutes RAG indexes.</w:t>
       </w:r>
       <w:r>
-        <w:t xml:space="preserve"> Retrieval-augmented generation grounds a language model in retrieved passages [1]. In organizations those passages usually come from documentation portals, product and pricing pages and knowledge bases, and that HTML was never written for machines to read. Each page mixes its own content with site-wide "chrome": navigation, sidebar link trees, cookie-consent banners, sales calls to action, related-article lists, comment threads and legal footers. If this HTML is converted naively and embedded, the same text appears in the chunks of every page. At query time these near-duplicates compete with real content, produce false positives and use up the model's context window. The cost grows with corpus size: a 10,000-page portal with a 200-token footer adds two million tokens of identical text to the index.</w:t>
+        <w:t xml:space="preserve"> Retrieval-augmented generation grounds a language model in retrieved passages [1]. In organizations those passages come from documentation portals, product pages and knowledge bases, HTML never written for machines. Each page mixes its content with site-wide "chrome": navigation, cookie banners, calls to action, related-article lists, comment threads and footers. Converted naively and embedded, the same text appears in the chunks of every page; these near-duplicates compete with real content at query time and use up the model's context. A 10,000-page portal with a 200-token footer adds two million tokens of identical text to the index.</w:t>
       </w:r>
     </w:p>
     <w:p>
@@ -917,7 +917,7 @@
         <w:t>Related work and the gap.</w:t>
       </w:r>
       <w:r>
-        <w:t xml:space="preserve"> Boilerplate removal is an established problem. Shallow text features [2] and neural sequence labelling over words and tags [3, 4] classify blocks within one page. Trafilatura [5] and Readability [6] are widely used extractors tuned for articles, and a large comparison [8] found that no algorithm is best on every page type. Format converters such as MarkItDown [7] keep headings, tables and code but do not try to remove chrome. The recent WCXB benchmark [9] makes the weakness of article-tuned tools measurable: on seven page types, systems agree on articles (F1 about 0.93) and differ by 20 to 30 points on forums, products and collections. A page-type-aware Rust extractor with a learned page classifier [10] and a language-model block labeller (MinerU-HTML, 0.6B parameters, GPU) [11] lead that benchmark. Using several pages of one site to find the template was proposed early [12, 13] and benchmarked in [14]; query-time pruning such as HtmlRAG [15] complements ingest-time cleaning. What practitioners lack is a small, installable, CPU-only component for the ingest step that combines a learned single-page filter, an optional site-template model, metadata and tables in a chunk-friendly form, and explicit signals when the input is unusable or the extraction is unsure.</w:t>
+        <w:t xml:space="preserve"> Shallow text features [2] and neural sequence labelling [3, 4] classify blocks within one page. Trafilatura [5] and Readability [6] are widely used extractors tuned for articles; a large comparison [7] found no algorithm best on every page type. Converters such as MarkItDown [8] keep headings, tables and code but do not remove chrome, and Crawl4AI's pruning filter [9] scores nodes by text density, link density and tag weights. The WCXB benchmark [10] makes the weakness of article-tuned tools measurable: systems agree on articles (F1 about 0.93) and differ by 20 to 30 points on forums, products and collections. It reports a page-type-aware Rust extractor with a learned page classifier [11] and a 0.6B-parameter language-model block labeller [12] as the leaders, with jusText, Resiliparse and a 1.5B model, ReaderLM-v2 [13], further behind. Using several pages of one site to find its template was proposed early [14, 15] and benchmarked in [16]; query-time pruning such as HtmlRAG [17] complements ingest-time cleaning. ChromeRAG follows the feature-engineered block classification of [2] with gradient-boosted trees, and packages it as a small CPU-only component with an optional site-template model, metadata and tables in a chunk-friendly form, and explicit signals when the input is unusable or the extraction is unsure.</w:t>
       </w:r>
     </w:p>
     <w:p>
@@ -931,21 +931,7 @@
         <w:t>What ChromeRAG provides.</w:t>
       </w:r>
       <w:r>
-        <w:t xml:space="preserve"> (i) A learned block filter: gradient-boosted trees over about 530 structural and lexical features of each text block, with a threshold per content priority; (ii) site-template chrome elimination (STCE), a learn-then-extract model built from pages of the same site; (iii) Schema.org JSON-LD and Microdata as YAML front-matter; (iv) tables as key-value rows; (v) input-quality warnings and a per-page confidence estimate. The package is independent of any retriever or model, needs no model download and works in air-gapped environments.</w:t>
-      </w:r>
-    </w:p>
-    <w:p>
-      <w:pPr>
-        <w:pStyle w:val="Body"/>
-      </w:pPr>
-      <w:r>
-        <w:rPr>
-          <w:b/>
-        </w:rPr>
-        <w:t>How it is used.</w:t>
-      </w:r>
-      <w:r>
-        <w:t xml:space="preserve"> A crawler or headless browser stores HTML files. ChromeRAG converts each file, or a directory, into Markdown for chunking and embedding. When several pages of one site are available, chromerag learn builds a site model first.</w:t>
+        <w:t xml:space="preserve"> (i) A learned block filter: trees over about 530 features of each text block, with a threshold per content priority; (ii) site-template chrome elimination (STCE), an optional model learned from pages of one site; (iii) Schema.org JSON-LD and Microdata as YAML front-matter; (iv) tables as key-value rows; (v) input-quality warnings and a heuristic per-page confidence estimate. It needs no model download and works in air-gapped environments.</w:t>
       </w:r>
     </w:p>
     <w:p>
@@ -976,7 +962,7 @@
         <w:pStyle w:val="Body"/>
       </w:pPr>
       <w:r>
-        <w:t>ChromeRAG is a small Python package (src/chromerag, about 4,000 lines) built on BeautifulSoup/lxml and NumPy. Each document passes through six stages (Fig. 1), each in its own module. A pytest suite of 64 tests covers the pipeline, the learned filter, the rule index, regression fixtures with exact golden outputs, the CLI, STCE and the LangChain loader; continuous integration runs on Linux (Python 3.11 to 3.14), macOS and Windows.</w:t>
+        <w:t>ChromeRAG is a small Python package (src/chromerag, about 4,000 lines) built on BeautifulSoup/lxml and NumPy. Each document passes through six stages (Fig. 1). A pytest suite of 64 tests covers the pipeline, the learned filter, the rule index, golden-output regression fixtures, the CLI, STCE and the LangChain loader; continuous integration runs on Linux (Python 3.11 to 3.14), macOS and Windows.</w:t>
       </w:r>
     </w:p>
     <w:p>
@@ -1039,10 +1025,10 @@
         <w:rPr>
           <w:i/>
         </w:rPr>
-        <w:t>Stage 1: input-quality gate</w:t>
-      </w:r>
-      <w:r>
-        <w:t xml:space="preserve"> (input_quality.py). The raw HTML is measured for visible text, script weight, single-page-application root markers and "enable JavaScript" hints. Thin inputs produce warnings on stderr and in result.warnings.</w:t>
+        <w:t>Stage 1: input-quality gate.</w:t>
+      </w:r>
+      <w:r>
+        <w:t xml:space="preserve"> The raw HTML is measured for visible text, script weight, single-page-application root markers and "enable JavaScript" hints; thin inputs produce warnings.</w:t>
       </w:r>
     </w:p>
     <w:p>
@@ -1053,10 +1039,10 @@
         <w:rPr>
           <w:i/>
         </w:rPr>
-        <w:t>Stage 2: schema harvest</w:t>
-      </w:r>
-      <w:r>
-        <w:t xml:space="preserve"> (schema_fusion.py). JSON-LD and Microdata are read before scripts are removed; title, type, description, dates, author and breadcrumb become YAML front-matter.</w:t>
+        <w:t>Stage 2: schema harvest.</w:t>
+      </w:r>
+      <w:r>
+        <w:t xml:space="preserve"> JSON-LD and Microdata are read before scripts are removed; title, type, description, dates, author and breadcrumb become YAML front-matter.</w:t>
       </w:r>
     </w:p>
     <w:p>
@@ -1067,10 +1053,10 @@
         <w:rPr>
           <w:i/>
         </w:rPr>
-        <w:t>Stage 3: cleaning and STCE</w:t>
-      </w:r>
-      <w:r>
-        <w:t xml:space="preserve"> (site_chrome.py, hidden.py, rules_engine.py). Scripts, styles and SVG are removed; hidden nodes and skip links are removed unless a hidden block holds long running text with few links (pages that reveal content by script). A wrapper tag such as a page-wide &lt;form&gt;, an unclosed &lt;button&gt; or a large &lt;noscript&gt; keeps its content. A YAML rule index drops known chrome (consent managers, share bars, generator footers), and every rule carries evidence and a fixture. If a site model is supplied, blocks whose signature is in the model are removed. A signature hashes the tag, id, classes and role, or the text for blocks without attributes. chromerag learn keeps a signature only if it appears on at least 80% of a site group's pages, stays short, repeats its leading text, and looks like chrome or is identical on every page; at extraction time a match is removed only if it is close to its learned size, holds no &lt;main&gt;, and does not hold most of the page's text.</w:t>
+        <w:t>Stage 3: cleaning and STCE.</w:t>
+      </w:r>
+      <w:r>
+        <w:t xml:space="preserve"> Scripts, styles and SVG are removed; hidden nodes and skip links are removed unless a hidden block holds long running text with few links. A wrapper such as a page-wide &lt;form&gt;, an unclosed &lt;button&gt; or a large &lt;noscript&gt; keeps its content. A YAML rule index drops known chrome (consent managers, share bars, generator footers); every rule carries evidence and a fixture. If a site model is supplied, blocks whose signature (a hash of tag, id, classes and role, or of the text for bare blocks) is in the model are removed. chromerag learn keeps a signature only if it appears on at least 80% of a group's pages, stays short, repeats its leading text, and either looks like chrome or is identical on every page; at extraction a match is removed only if it is close to its learned size and does not hold &lt;main&gt; or most of the page's text.</w:t>
       </w:r>
     </w:p>
     <w:p>
@@ -1081,10 +1067,10 @@
         <w:rPr>
           <w:i/>
         </w:rPr>
-        <w:t>Stage 4: chrome pruning</w:t>
-      </w:r>
-      <w:r>
-        <w:t xml:space="preserve"> (density.py, content_root.py). Landmark and class-word rules (nav, footer, cookie, newsletter, sidebar) remove subtrees, with guards: a subtree that contains &lt;main&gt;, holds most of the page's text, or holds two or more long paragraphs with few links is kept. A content-root ladder (main, role=main, article, content classes) is validated by size.</w:t>
+        <w:t>Stage 4: chrome pruning.</w:t>
+      </w:r>
+      <w:r>
+        <w:t xml:space="preserve"> Landmark and class-word rules (nav, footer, cookie, newsletter, sidebar) remove subtrees, unless the subtree contains &lt;main&gt;, holds most of the page's text, or holds two or more long paragraphs with few links. A content-root ladder (main, role=main, article, content classes) is validated by size.</w:t>
       </w:r>
     </w:p>
     <w:p>
@@ -1095,10 +1081,10 @@
         <w:rPr>
           <w:i/>
         </w:rPr>
-        <w:t>Stage 5: learned block filter</w:t>
-      </w:r>
-      <w:r>
-        <w:t xml:space="preserve"> (blockfeatures.py, lbc.py). The cleaned page is split into blocks: paragraphs, headings, list items, quotes, preformatted blocks, tables, text-only containers, and runs of loose text between block elements. Each block is described by about 530 numbers in five groups: its text (length, link density, punctuation, stop-word share, call-to-action verbs, dates), its place in the page (position, distance to headings, whether it is in the content root), its tree context (ancestor tags, link density and text mass of enclosing boxes, repeated sibling structures such as comment threads and card grids, overlap with the title and the page's long paragraphs), the words of its ancestors' class and id, feature-hashed [16], and the words of the heading above it. Trees (300 trees of depth 6, trained with scikit-learn) give the probability that the block is main content; the exported model is a 150 KB array file and prediction uses NumPy only. A block is kept when its probability reaches 0.30 (coverage), 0.50 (balanced) or 0.70 (precision). Pages with fewer than four blocks are kept whole, exact repeats are written once, and the model's own expected precision, recall and F1 for the page are stored in diagnostics["lbc"]; a warning is issued below an expected F1 of 0.70.</w:t>
+        <w:t>Stage 5: learned block filter.</w:t>
+      </w:r>
+      <w:r>
+        <w:t xml:space="preserve"> The page is split into blocks (paragraphs, headings, list items, quotes, preformatted blocks, tables, text-only containers, and loose text between block elements). Each block is described by about 530 numbers: its text (length, link density, punctuation, stop-word share, call-to-action verbs, dates), its place in the page (position, distance to headings, content root), its tree context (ancestor tags, link density and text mass of enclosing boxes, repeated sibling structures such as comment threads, overlap with the title and long paragraphs), the words of its ancestors' class and id, feature-hashed [18], and the words of the heading above. Trees (300 trees of depth 6, trained with scikit-learn) give the probability that the block is main content. The exported model is a 150 KB array file and prediction uses NumPy only. A block is kept when its probability reaches 0.30 (coverage), 0.50 (balanced) or 0.70 (precision). Pages with fewer than four blocks are kept whole and exact repeats are written once. diagnostics["lbc"] holds an estimate of the page's precision, recall and F1: with block probabilities p and word counts w, expected true words are the sum of w times p over kept blocks and expected reference words the sum over all blocks. It assumes calibrated probabilities and is a heuristic; a warning is issued below an estimate of 0.70, a threshold chosen on development folds.</w:t>
       </w:r>
     </w:p>
     <w:p>
@@ -1109,10 +1095,10 @@
         <w:rPr>
           <w:i/>
         </w:rPr>
-        <w:t>Stage 6: tables and Markdown</w:t>
-      </w:r>
-      <w:r>
-        <w:t xml:space="preserve"> (tables.py, markdown_out.py). Layout tables (nested, or cells with block content) are unwrapped; data tables become Row n -&gt; header: value | ... lines. The page is written in document order with safe heading levels and fenced code; link targets are omitted unless requested (--links).</w:t>
+        <w:t>Stage 6: tables and Markdown.</w:t>
+      </w:r>
+      <w:r>
+        <w:t xml:space="preserve"> Layout tables are unwrapped; data tables become Row n -&gt; header: value | ... lines. The page is written in document order with safe heading levels and fenced code; link targets are omitted unless requested (--links).</w:t>
       </w:r>
     </w:p>
     <w:p>
@@ -1126,15 +1112,15 @@
         <w:t>Training.</w:t>
       </w:r>
       <w:r>
-        <w:t xml:space="preserve"> poc/lbc_data.py labels every block of the 1,495 WCXB development pages by word-trigram overlap with the human-reviewed main content (blocks the annotators list as "without" snippets are labelled noise) and poc/train_lbc.py fits the trees, weighting blocks by word count. Retraining takes about two minutes. The WCXB test split is never used for training or tuning.</w:t>
-      </w:r>
-    </w:p>
-    <w:p>
-      <w:pPr>
-        <w:pStyle w:val="Body"/>
-      </w:pPr>
-      <w:r>
-        <w:t>Scope is deliberately narrow: HTML in, Markdown out. ChromeRAG does not fetch pages, render JavaScript or crawl; those belong to the caller or to the evaluation harness in poc/.</w:t>
+        <w:t xml:space="preserve"> poc/lbc_data.py labels every block of the 1,495 scoreable files of the public WCXB dev/ folder by word-trigram overlap with the human-reviewed main content (blocks listed as "without" snippets are labelled noise); poc/train_lbc.py fits the trees, weighting blocks by word count, in about two minutes. Two of the 1,497 files have no reference field. The folder also contains 139 files that WCXB's metadata assigns to the test split (see below), so the shipped model saw them; thresholds and features were chosen on development folds that include them.</w:t>
+      </w:r>
+    </w:p>
+    <w:p>
+      <w:pPr>
+        <w:pStyle w:val="Body"/>
+      </w:pPr>
+      <w:r>
+        <w:t>ChromeRAG does not fetch pages, render JavaScript or crawl; those belong to the caller or to the evaluation harness in poc/.</w:t>
       </w:r>
     </w:p>
     <w:p>
@@ -1150,7 +1136,7 @@
         <w:pStyle w:val="Body"/>
       </w:pPr>
       <w:r>
-        <w:t>The Python API centres on ChromeRAG(config=..., site_chrome=...). PipelineConfig.from_priority() selects COVERAGE, BALANCED (default) or PRECISION. Stages can be switched off individually (--no-rules, --no-schema, --no-tables, --no-stce, enable_lbc=False for the density filter of version 0.1.2). extract(html, url=None) returns a typed ExtractResult with markdown, front_matter, warnings, input_quality, a token estimate and diagnostics (kept and rejected samples with reasons, the rules that fired, the model's expected F1). The URL is metadata only and is never fetched.</w:t>
+        <w:t>The Python API centres on ChromeRAG(config=..., site_chrome=...). PipelineConfig.from_priority() selects COVERAGE, BALANCED (default) or PRECISION. Stages can be switched off (--no-rules, --no-schema, --no-tables, --no-stce; enable_lbc=False restores the density filter of 0.1.2). extract(html, url=None) returns a typed ExtractResult with markdown, front_matter, warnings, input_quality, a token estimate and diagnostics (kept and rejected samples, the rules that fired, the confidence estimate). The URL is metadata only.</w:t>
       </w:r>
     </w:p>
     <w:p>
@@ -1357,7 +1343,7 @@
         <w:pStyle w:val="Body"/>
       </w:pPr>
       <w:r>
-        <w:t>The package needs Python 3.11 or later and installs with pip install chromerag [18]. Optional LangChain and LlamaIndex components (chromerag.integrations) return one document per page with the front-matter as metadata. The repository adds the tests, the evaluation harness, a Docker image and a one-page GitHub Pages site with the leaderboards.</w:t>
+        <w:t>The package needs Python 3.11 or later and installs with pip install chromerag [19]. Optional LangChain and LlamaIndex components return one document per page with the front-matter as metadata.</w:t>
       </w:r>
     </w:p>
     <w:p>
@@ -1389,7 +1375,7 @@
         <w:pStyle w:val="Body"/>
       </w:pPr>
       <w:r>
-        <w:t>The repository includes four synthetic pages from a fictional documentation site (examples/site/). They share a header menu, cookie banner, sales call to action, footer and a repeated "Widget Summit: register now" strip inside &lt;main&gt;. Single-page extraction removes the menu, banner and footer; the in-content strip has no chrome-like markup and survives until a site model is learned:</w:t>
+        <w:t>examples/site/ holds four synthetic pages of a fictional documentation site. They share a header menu, cookie banner, sales call to action, footer and a repeated paragraph inside &lt;main&gt;: "Widget Summit 2026 is in Lisbon this autumn, and registration is open to every Widget user." Single-page extraction removes the menu, banner and footer; the paragraph reads like content, so the learned filter keeps it until a site model is learned:</w:t>
       </w:r>
     </w:p>
     <w:p>
@@ -1436,7 +1422,7 @@
         <w:pStyle w:val="Body"/>
       </w:pPr>
       <w:r>
-        <w:t>learn reports one site group (docs.example.com/docs) with six chrome signatures; batch applies them to all four pages. The pricing page keeps its JSON-LD as front-matter and its table as key-value rows:</w:t>
+        <w:t>learn reports one site group (docs.example.com/docs) with six chrome signatures; batch applies them, and the paragraph disappears from all four pages. The pricing page keeps its JSON-LD as front-matter and its table as key-value rows:</w:t>
       </w:r>
     </w:p>
     <w:p>
@@ -1590,7 +1576,7 @@
         <w:pStyle w:val="Body"/>
       </w:pPr>
       <w:r>
-        <w:t>WCXB [9] has 2,008 pages from 1,613 domains in seven page types, split into 1,497 development and 511 test pages, with human-reviewed main content. Word-level F1 compares the bag of words of an extractor's output with the reference (title excluded); "with" and "without" snippets test that required text is present and that listed chrome is absent. All tools receive the same HTML and none gets a site model. Trafilatura [5] is run with its best of five settings on the development set (tables, no comments, no links, Markdown output; 0.818 against 0.814 for the defaults, 0.789 for favor_recall); MarkItDown [7] and Readability [6] use their defaults.</w:t>
+        <w:t>WCXB [10] has 2,008 pages in seven page types, with human-reviewed main content. Word-level F1 compares the bag of words of a tool's output with the reference (title excluded); "with" and "without" snippets test that required text is present and listed chrome absent. All tools receive the same HTML and no site model. ChromeRAG's YAML front-matter is removed before scoring, because it is metadata meant for chunk metadata and not text; scoring the raw default output with the benchmark's own script gives 0.869 on the pages of Table 2, and 0.904 with schema harvesting switched off (enable_schema=False), which writes no front-matter. Trafilatura [5] runs with its best of four distinct settings on the development set (tables, no comments, no links, Markdown; 0.818 against 0.814 for the defaults and 0.789 for favor_recall); Readability [6] and MarkItDown [8] use defaults (versions: Trafilatura 2.2.0, readability-lxml 0.9, MarkItDown 0.1.7, Python 3.14).</w:t>
       </w:r>
     </w:p>
     <w:p>
@@ -1604,7 +1590,7 @@
         <w:t>Development results</w:t>
       </w:r>
       <w:r>
-        <w:t xml:space="preserve"> come from five-fold cross-validation grouped by site, so every page is scored by a model that never saw its site. F1 is 0.852 (coverage), 0.851 (balanced) and 0.837 (precision) against 0.818 for Trafilatura. Replacing the density filter of 0.1.2 by the learned filter raises F1 from 0.822, 0.817 and 0.790 to these values; the larger part of the gain over 0.1.2 (0.749) comes from fixing whole-page losses: wrapper tags, hidden blocks, nested layout tables that repeated text, breadth-first output order, and link targets counted as words.</w:t>
+        <w:t xml:space="preserve"> come from five-fold cross-validation grouped by host: F1 is 0.852 (coverage), 0.851 (balanced) and 0.837 (precision) against 0.818 for Trafilatura. Features and thresholds were chosen on these folds, so they are development estimates. Replacing the 0.1.2 density filter by the learned filter raises F1 from 0.822, 0.817 and 0.790 to these values; most of the gain over 0.1.2 (0.749) comes from fixing whole-page losses (wrappers, hidden blocks, nested layout tables that repeated text, breadth-first output order, link targets counted as words).</w:t>
       </w:r>
     </w:p>
     <w:p>
@@ -1618,15 +1604,15 @@
         <w:t>Test results</w:t>
       </w:r>
       <w:r>
-        <w:t xml:space="preserve"> were produced once, after the code, model and thresholds were frozen (git tag freeze-0.1.3), by a model trained on all development pages (Table 2, Fig. 2).</w:t>
-      </w:r>
-    </w:p>
-    <w:p>
-      <w:pPr>
-        <w:pStyle w:val="Body"/>
-      </w:pPr>
-      <w:r>
-        <w:t>Table 2. Word-level F1 on the 511 WCXB test pages (ChromeRAG in balanced mode).</w:t>
+        <w:t xml:space="preserve"> were produced once, after the code, model and thresholds were frozen (git tag freeze-0.1.3). No test label was used for fitting or for choosing thresholds, but an audit afterwards found that 139 of the 511 test pages are also in the public dev/ folder with identical HTML (26 of 28 product and 25 of 34 collection pages), most likely a packaging error in the release (its metadata lists 1,358 development pages), so the shipped model was trained on them. The primary test result therefore uses the 372 test pages absent from dev/ (Table 2, Fig. 2); on all 511 pages the F1 values are 0.902, 0.860, 0.763 and 0.540 for ChromeRAG, Trafilatura, Readability and MarkItDown, reported for comparability only. On the 345 test pages from domains absent from dev/, ChromeRAG scores 0.903 and Trafilatura 0.874 (+0.029, 95% CI [+0.012, +0.046]).</w:t>
+      </w:r>
+    </w:p>
+    <w:p>
+      <w:pPr>
+        <w:pStyle w:val="Body"/>
+      </w:pPr>
+      <w:r>
+        <w:t>Table 2. Word-level F1 on the 372 WCXB test pages absent from the development folder (ChromeRAG in balanced mode; product and collection have only 2 and 9 such pages).</w:t>
       </w:r>
     </w:p>
     <w:tbl>
@@ -1740,7 +1726,7 @@
               <w:pStyle w:val="Body"/>
             </w:pPr>
             <w:r>
-              <w:t>All (511)</w:t>
+              <w:t>All (372)</w:t>
             </w:r>
           </w:p>
         </w:tc>
@@ -1753,7 +1739,7 @@
               <w:pStyle w:val="Body"/>
             </w:pPr>
             <w:r>
-              <w:t>0.902</w:t>
+              <w:t>0.903</w:t>
             </w:r>
           </w:p>
         </w:tc>
@@ -1766,7 +1752,7 @@
               <w:pStyle w:val="Body"/>
             </w:pPr>
             <w:r>
-              <w:t>0.860</w:t>
+              <w:t>0.867</w:t>
             </w:r>
           </w:p>
         </w:tc>
@@ -1779,7 +1765,7 @@
               <w:pStyle w:val="Body"/>
             </w:pPr>
             <w:r>
-              <w:t>0.763</w:t>
+              <w:t>0.778</w:t>
             </w:r>
           </w:p>
         </w:tc>
@@ -1792,7 +1778,7 @@
               <w:pStyle w:val="Body"/>
             </w:pPr>
             <w:r>
-              <w:t>0.540</w:t>
+              <w:t>0.568</w:t>
             </w:r>
           </w:p>
         </w:tc>
@@ -1807,7 +1793,7 @@
               <w:pStyle w:val="Body"/>
             </w:pPr>
             <w:r>
-              <w:t>Article (257)</w:t>
+              <w:t>Article (178)</w:t>
             </w:r>
           </w:p>
         </w:tc>
@@ -1820,7 +1806,7 @@
               <w:pStyle w:val="Body"/>
             </w:pPr>
             <w:r>
-              <w:t>0.954</w:t>
+              <w:t>0.951</w:t>
             </w:r>
           </w:p>
         </w:tc>
@@ -1833,7 +1819,7 @@
               <w:pStyle w:val="Body"/>
             </w:pPr>
             <w:r>
-              <w:t>0.952</w:t>
+              <w:t>0.953</w:t>
             </w:r>
           </w:p>
         </w:tc>
@@ -1846,7 +1832,7 @@
               <w:pStyle w:val="Body"/>
             </w:pPr>
             <w:r>
-              <w:t>0.926</w:t>
+              <w:t>0.944</w:t>
             </w:r>
           </w:p>
         </w:tc>
@@ -1859,7 +1845,7 @@
               <w:pStyle w:val="Body"/>
             </w:pPr>
             <w:r>
-              <w:t>0.643</w:t>
+              <w:t>0.663</w:t>
             </w:r>
           </w:p>
         </w:tc>
@@ -1874,7 +1860,7 @@
               <w:pStyle w:val="Body"/>
             </w:pPr>
             <w:r>
-              <w:t>Documentation (42)</w:t>
+              <w:t>Documentation (40)</w:t>
             </w:r>
           </w:p>
         </w:tc>
@@ -1887,7 +1873,7 @@
               <w:pStyle w:val="Body"/>
             </w:pPr>
             <w:r>
-              <w:t>0.956</w:t>
+              <w:t>0.954</w:t>
             </w:r>
           </w:p>
         </w:tc>
@@ -1900,7 +1886,7 @@
               <w:pStyle w:val="Body"/>
             </w:pPr>
             <w:r>
-              <w:t>0.934</w:t>
+              <w:t>0.931</w:t>
             </w:r>
           </w:p>
         </w:tc>
@@ -1913,7 +1899,7 @@
               <w:pStyle w:val="Body"/>
             </w:pPr>
             <w:r>
-              <w:t>0.872</w:t>
+              <w:t>0.866</w:t>
             </w:r>
           </w:p>
         </w:tc>
@@ -1926,7 +1912,7 @@
               <w:pStyle w:val="Body"/>
             </w:pPr>
             <w:r>
-              <w:t>0.615</w:t>
+              <w:t>0.614</w:t>
             </w:r>
           </w:p>
         </w:tc>
@@ -1941,7 +1927,7 @@
               <w:pStyle w:val="Body"/>
             </w:pPr>
             <w:r>
-              <w:t>Service (59)</w:t>
+              <w:t>Service (56)</w:t>
             </w:r>
           </w:p>
         </w:tc>
@@ -1954,7 +1940,7 @@
               <w:pStyle w:val="Body"/>
             </w:pPr>
             <w:r>
-              <w:t>0.844</w:t>
+              <w:t>0.836</w:t>
             </w:r>
           </w:p>
         </w:tc>
@@ -1967,7 +1953,7 @@
               <w:pStyle w:val="Body"/>
             </w:pPr>
             <w:r>
-              <w:t>0.817</w:t>
+              <w:t>0.813</w:t>
             </w:r>
           </w:p>
         </w:tc>
@@ -1980,7 +1966,7 @@
               <w:pStyle w:val="Body"/>
             </w:pPr>
             <w:r>
-              <w:t>0.612</w:t>
+              <w:t>0.595</w:t>
             </w:r>
           </w:p>
         </w:tc>
@@ -1993,7 +1979,7 @@
               <w:pStyle w:val="Body"/>
             </w:pPr>
             <w:r>
-              <w:t>0.471</w:t>
+              <w:t>0.478</w:t>
             </w:r>
           </w:p>
         </w:tc>
@@ -2008,7 +1994,7 @@
               <w:pStyle w:val="Body"/>
             </w:pPr>
             <w:r>
-              <w:t>Forum (51)</w:t>
+              <w:t>Forum (50)</w:t>
             </w:r>
           </w:p>
         </w:tc>
@@ -2021,7 +2007,7 @@
               <w:pStyle w:val="Body"/>
             </w:pPr>
             <w:r>
-              <w:t>0.867</w:t>
+              <w:t>0.884</w:t>
             </w:r>
           </w:p>
         </w:tc>
@@ -2034,7 +2020,7 @@
               <w:pStyle w:val="Body"/>
             </w:pPr>
             <w:r>
-              <w:t>0.717</w:t>
+              <w:t>0.731</w:t>
             </w:r>
           </w:p>
         </w:tc>
@@ -2047,7 +2033,7 @@
               <w:pStyle w:val="Body"/>
             </w:pPr>
             <w:r>
-              <w:t>0.616</w:t>
+              <w:t>0.628</w:t>
             </w:r>
           </w:p>
         </w:tc>
@@ -2060,7 +2046,7 @@
               <w:pStyle w:val="Body"/>
             </w:pPr>
             <w:r>
-              <w:t>0.443</w:t>
+              <w:t>0.452</w:t>
             </w:r>
           </w:p>
         </w:tc>
@@ -2075,7 +2061,7 @@
               <w:pStyle w:val="Body"/>
             </w:pPr>
             <w:r>
-              <w:t>Product (28)</w:t>
+              <w:t>Listing (37)</w:t>
             </w:r>
           </w:p>
         </w:tc>
@@ -2088,7 +2074,7 @@
               <w:pStyle w:val="Body"/>
             </w:pPr>
             <w:r>
-              <w:t>0.874</w:t>
+              <w:t>0.768</w:t>
             </w:r>
           </w:p>
         </w:tc>
@@ -2101,7 +2087,7 @@
               <w:pStyle w:val="Body"/>
             </w:pPr>
             <w:r>
-              <w:t>0.724</w:t>
+              <w:t>0.707</w:t>
             </w:r>
           </w:p>
         </w:tc>
@@ -2114,7 +2100,7 @@
               <w:pStyle w:val="Body"/>
             </w:pPr>
             <w:r>
-              <w:t>0.527</w:t>
+              <w:t>0.445</w:t>
             </w:r>
           </w:p>
         </w:tc>
@@ -2127,7 +2113,7 @@
               <w:pStyle w:val="Body"/>
             </w:pPr>
             <w:r>
-              <w:t>0.335</w:t>
+              <w:t>0.386</w:t>
             </w:r>
           </w:p>
         </w:tc>
@@ -2142,7 +2128,7 @@
               <w:pStyle w:val="Body"/>
             </w:pPr>
             <w:r>
-              <w:t>Collection (34)</w:t>
+              <w:t>Collection (9)</w:t>
             </w:r>
           </w:p>
         </w:tc>
@@ -2155,7 +2141,7 @@
               <w:pStyle w:val="Body"/>
             </w:pPr>
             <w:r>
-              <w:t>0.795</w:t>
+              <w:t>0.788</w:t>
             </w:r>
           </w:p>
         </w:tc>
@@ -2168,7 +2154,7 @@
               <w:pStyle w:val="Body"/>
             </w:pPr>
             <w:r>
-              <w:t>0.626</w:t>
+              <w:t>0.717</w:t>
             </w:r>
           </w:p>
         </w:tc>
@@ -2181,7 +2167,7 @@
               <w:pStyle w:val="Body"/>
             </w:pPr>
             <w:r>
-              <w:t>0.450</w:t>
+              <w:t>0.523</w:t>
             </w:r>
           </w:p>
         </w:tc>
@@ -2194,7 +2180,7 @@
               <w:pStyle w:val="Body"/>
             </w:pPr>
             <w:r>
-              <w:t>0.284</w:t>
+              <w:t>0.512</w:t>
             </w:r>
           </w:p>
         </w:tc>
@@ -2209,7 +2195,7 @@
               <w:pStyle w:val="Body"/>
             </w:pPr>
             <w:r>
-              <w:t>Listing (40)</w:t>
+              <w:t>Product (2)</w:t>
             </w:r>
           </w:p>
         </w:tc>
@@ -2222,7 +2208,7 @@
               <w:pStyle w:val="Body"/>
             </w:pPr>
             <w:r>
-              <w:t>0.760</w:t>
+              <w:t>1.000</w:t>
             </w:r>
           </w:p>
         </w:tc>
@@ -2235,7 +2221,7 @@
               <w:pStyle w:val="Body"/>
             </w:pPr>
             <w:r>
-              <w:t>0.722</w:t>
+              <w:t>0.491</w:t>
             </w:r>
           </w:p>
         </w:tc>
@@ -2248,7 +2234,7 @@
               <w:pStyle w:val="Body"/>
             </w:pPr>
             <w:r>
-              <w:t>0.439</w:t>
+              <w:t>0.473</w:t>
             </w:r>
           </w:p>
         </w:tc>
@@ -2261,7 +2247,7 @@
               <w:pStyle w:val="Body"/>
             </w:pPr>
             <w:r>
-              <w:t>0.386</w:t>
+              <w:t>0.157</w:t>
             </w:r>
           </w:p>
         </w:tc>
@@ -2316,23 +2302,23 @@
         <w:rPr>
           <w:i/>
         </w:rPr>
-        <w:t>Figure 2. Word-level F1 on the 511 held-out WCXB test pages, overall and by page type. Each dot is the mean over the pages of one type; ChromeRAG is in balanced mode and its value is printed.</w:t>
-      </w:r>
-    </w:p>
-    <w:p>
-      <w:pPr>
-        <w:pStyle w:val="Body"/>
-      </w:pPr>
-      <w:r>
-        <w:t>The paired bootstrap difference to Trafilatura is +0.043 (95% CI [+0.027, +0.059]) overall, +0.150 on forums [+0.091, +0.217], +0.150 on products [+0.069, +0.243] and +0.169 on collections [+0.080, +0.264]. On articles, documentation, services and listings the intervals contain zero. The fraction of required snippets found is 0.798 against 0.720 (+0.078 [+0.051, +0.105]); the fraction of forbidden snippets found is 0.077 against 0.083 (no difference). The benchmark's publication [9] reports 0.903 for a page-type-aware Rust extractor and 0.841 for Trafilatura on the same test pages under its own configuration; we could not build that tool here, so we quote it and make no claim of superiority. The two sets of numbers use different Trafilatura settings and are not interchangeable.</w:t>
-      </w:r>
-    </w:p>
-    <w:p>
-      <w:pPr>
-        <w:pStyle w:val="Body"/>
-      </w:pPr>
-      <w:r>
-        <w:t>Fig. 3 shows the trade-off on the development folds. ChromeRAG's curve lies above Trafilatura's single operating point for thresholds from 0.6 to 0.7 (higher precision and recall at once) and has higher F1 at every threshold up to 0.8. The model's confidence is informative: pages with an expected F1 below 0.70 (7.6% of pages) score 0.57 on average against 0.88 for the rest.</w:t>
+        <w:t>Figure 2. Word-level F1 on the 373 WCXB test pages whose URL is not in the development split, overall and by page type (n in brackets; product has 2 pages and collection 9, so those rows are indicative only). Each dot is the mean over the pages of one type; ChromeRAG is in balanced mode and its value is printed.</w:t>
+      </w:r>
+    </w:p>
+    <w:p>
+      <w:pPr>
+        <w:pStyle w:val="Body"/>
+      </w:pPr>
+      <w:r>
+        <w:t>Scores are means of page-level F1; intervals are percentile intervals of a paired bootstrap over pages (5,000 resamples, seed 0). Clustering the resampling by domain on all 511 pages gives [+0.027, +0.060] for the overall difference. On the 372 pages ChromeRAG leads Trafilatura by +0.036 (95% CI [+0.018, +0.054]) and by +0.153 on forums [+0.090, +0.219]. On articles, documentation, services and listings the intervals contain zero; the 9 collection pages give +0.071 [+0.025, +0.117] and 2 product pages allow no conclusion. For these two types cross-validation is more informative: collections 0.651 against 0.564 (+0.087) and products 0.652 against 0.626 (+0.026). Required snippets are found more often (+0.063) and forbidden snippets equally often. The benchmark's publication [10] reports 0.903 for the page-type-aware Rust extractor [11] and 0.841 for Trafilatura on all 511 test pages under its own configuration; we could not build that tool, so we quote it and claim no superiority; the settings differ and the numbers are not interchangeable.</w:t>
+      </w:r>
+    </w:p>
+    <w:p>
+      <w:pPr>
+        <w:pStyle w:val="Body"/>
+      </w:pPr>
+      <w:r>
+        <w:t>Fig. 3 shows the trade-off on the development folds: ChromeRAG's curve passes above Trafilatura's operating point for thresholds 0.6 to 0.7 (higher precision and recall at once) and has higher F1 at every threshold up to 0.8. The page-level estimate of Stage 5 is informative but not calibrated: pages estimated below 0.70 (7.6% of development pages, scored out of fold) have an actual F1 of 0.57 on average against 0.88 for the rest.</w:t>
       </w:r>
     </w:p>
     <w:p>
@@ -2392,7 +2378,7 @@
         <w:pStyle w:val="Body"/>
       </w:pPr>
       <w:r>
-        <w:t>Median time on 200 stored pages in one process is 36 ms for ChromeRAG, 30 ms for Trafilatura, 30 ms for Readability and 37 ms for MarkItDown; the 95th percentile is 108 ms against 147 ms for Trafilatura.</w:t>
+        <w:t>Median time on 200 stored pages (100 documentation, 100 landing pages), one process, one warm-up and three timed passes, on an Apple M4 Pro with 48 GB, is 36 ms for ChromeRAG, 30 ms for Trafilatura, 30 ms for Readability and 37 ms for MarkItDown; 95th percentiles are 108, 147, 108 and 104 ms.</w:t>
       </w:r>
     </w:p>
     <w:p>
@@ -2408,15 +2394,15 @@
         <w:pStyle w:val="Body"/>
       </w:pPr>
       <w:r>
-        <w:t>The WCXB service, product and collection pages are the nearest public proxy for enterprise marketing content, but we also built a corpus of company landing pages (poc/landing_corpus.py): up to five pages per company chosen from the homepage's own links before any extractor was run. Companies were split by a hash into development and held-out sets, and a second list of 51 companies was fetched only after the freeze ("fresh", 178 scoreable pages). On the structural-anchor metric (recall of word 5-grams from &lt;main&gt;/&lt;article&gt;, retention of anchors from navigation, header, footer and cookie containers, balanced F), coverage mode reaches 0.759 on the 177 held-out pages and 0.780 on the fresh pages, against 0.680 and 0.649 for Trafilatura, 0.723 and 0.741 for MarkItDown (which keeps 22 to 26% of the chrome anchors, ChromeRAG 0.1% or less) and 0.512 and 0.567 for Readability. On 242 documentation, pricing and article pages with at least 50 content anchors, the same metric gives 0.833 for coverage and 0.739 for Trafilatura (+0.094, CI [+0.066, +0.123]); Trafilatura keeps under 20% of the content on 25 of these pages, ChromeRAG on 2.</w:t>
-      </w:r>
-    </w:p>
-    <w:p>
-      <w:pPr>
-        <w:pStyle w:val="Body"/>
-      </w:pPr>
-      <w:r>
-        <w:t>BM25 retrieval with 668 known-item queries over the fresh pages (chunks of about 200 words) gives a hit@5 of 0.916 for ChromeRAG against 0.832 for Trafilatura (+0.084 [+0.045, +0.123]) and 0.949 for MarkItDown, which keeps everything (chrome in 2.3% of the retrieved context against 0.1% for ChromeRAG and 1.1% for Trafilatura). With dense embeddings (text-embedding-3-small) all tools but Readability tie (0.708 against 0.698 for Trafilatura; difference +0.010 [-0.024, +0.047]). On the documentation corpus, BM25 hit@5 is 0.947 against 0.921 for Trafilatura and 0.964 for MarkItDown, with 2,010 chunks against MarkItDown's 3,909.</w:t>
+        <w:t>We also built a corpus of company landing pages (poc/landing_corpus.py): up to five pages per company chosen from the homepage's own links before any extractor ran. Companies were split by hash into development and held-out sets; a second list of 51 companies was fetched only after the freeze ("fresh"). The structural-anchor metric is computed from each input page, independently of any tool: content recall is the share of word 5-grams from &lt;main&gt;/&lt;article&gt; text found in the output; noise retention is the share of 5-grams from navigation, header, footer, aside and cookie containers found; 5-grams in both sets are discarded; F_bal is the harmonic mean of recall and one minus noise retention, averaged over pages with at least 50 content anchors. It is a proxy that cannot see chrome inside &lt;main&gt;, and ChromeRAG's content-root selection also prefers &lt;main&gt;/&lt;article&gt;. In coverage mode ChromeRAG reaches 0.759 on 177 scoreable held-out pages and 0.780 on 178 fresh pages, against 0.680 and 0.649 for Trafilatura, 0.723 and 0.741 for MarkItDown (which keeps 24 to 26% of the chrome anchors, ChromeRAG 0.1% or less) and 0.512 and 0.567 for Readability. Because 11 of 42 held-out and 9 of 47 fresh registrable domains also occur in WCXB development, we repeated the comparison on other domains: ChromeRAG minus Trafilatura is +0.052 [+0.017, +0.086] on 130 held-out pages and +0.136 [+0.105, +0.167] on 147 fresh pages (resampled by page; up to five pages share a company). On 242 documentation, pricing and article pages of the development corpus (re-fetched on 2026-10-02, not held out) the metric gives 0.833 for coverage and 0.739 for Trafilatura (+0.094, CI [+0.066, +0.122]); Trafilatura keeps under 20% of the content on 25 of these pages, ChromeRAG on 2.</w:t>
+      </w:r>
+    </w:p>
+    <w:p>
+      <w:pPr>
+        <w:pStyle w:val="Body"/>
+      </w:pPr>
+      <w:r>
+        <w:t>BM25 retrieval (k1 1.2, b 0.75) with 668 known-item queries over the fresh pages (about 200-word chunks; queries are titles, headings and two 12-word passages per page from the input HTML before extraction, kept only if unique to one page; chrome is the share of retrieved text made of navigation, header and footer anchors) gives a hit@5 of 0.916 for ChromeRAG against 0.832 for Trafilatura (+0.084 [+0.045, +0.123]) and 0.949 for MarkItDown, which keeps everything (chrome in 2.3% of the retrieved context against 0.1% for ChromeRAG and 1.1% for Trafilatura). Queries come from &lt;main&gt;/&lt;article&gt;, like the anchors. With dense embeddings (text-embedding-3-small) all tools but Readability tie (0.708 against 0.698 for Trafilatura; +0.010 [-0.024, +0.047]). On the development documentation corpus BM25 hit@5 is 0.947 against 0.921 for Trafilatura (+0.026 [+0.001, +0.051]) and 0.964 for MarkItDown, with 2,010 chunks against 3,909.</w:t>
       </w:r>
     </w:p>
     <w:p>
@@ -2476,7 +2462,7 @@
         <w:pStyle w:val="Body"/>
       </w:pPr>
       <w:r>
-        <w:t>A blind pairwise judgement by a language model (gpt-5.6-luna; tool names hidden, output order randomised, about 83% of repeated pairs with swapped positions judged the same) was run on two samples. On 100 held-out and fresh landing pages, ChromeRAG (coverage) was preferred over Trafilatura on 70% of pages and over MarkItDown on 87%, against 28% and 12% (Fig. 5). On 105 WCXB test pages, 15 per page type, ChromeRAG (balanced) was preferred over MarkItDown on 83% of pages and over Trafilatura on 56% against 42%, a difference whose interval includes zero (net +0.14, 95% CI [-0.05, +0.33]). By type the judge favours ChromeRAG on forum, product, collection and service pages (67 to 73%) and Trafilatura on articles (60%), documentation (67%) and listings (53%), which matches the F1 ties. The judge scored content kept at 4.2 against 3.7 for Trafilatura and chrome left at 3.9 against 4.1 on a 5-point scale where 5 means no chrome: Trafilatura leaves a little less chrome, ChromeRAG keeps more content.</w:t>
+        <w:t>A pairwise judgement by one language model (gpt-5.6-luna; tool names hidden, output order randomised) was run on two samples; about 83% of pairs repeated with swapped positions got the same verdict, so the judge is noisy and, being proprietary, cannot be reproduced exactly. Prompt, samples and raw judgements are in the repository. On 100 landing pages ChromeRAG (coverage) was preferred over Trafilatura on 70% and over MarkItDown on 87%, against 28% and 12% (held-out pages 62% against 36%, fresh pages 78% against 20% for Trafilatura; Fig. 5). A second sample of 105 WCXB test pages (15 per type) contained 33 pages from the dev/ folder; on the other 72, ChromeRAG (balanced) was preferred over MarkItDown on 79% against 21%, over Readability on 68% against 28%, and over Trafilatura on 53% against 44%, a difference whose interval includes zero. By type on these 72 pages ChromeRAG won more pairs than it lost against Trafilatura on service (11 against 4) and forum (11 against 4) pages and fewer on articles (4 against 6), documentation (5 against 9) and listings (4 against 7), in line with the F1 ties on articles and documentation. Content kept scored 4.2 against 3.9 for Trafilatura and chrome left out 3.9 against 4.0 (5 means no chrome): Trafilatura leaves slightly less chrome, ChromeRAG keeps more content.</w:t>
       </w:r>
     </w:p>
     <w:p>
@@ -2544,7 +2530,7 @@
         <w:pStyle w:val="Body"/>
       </w:pPr>
       <w:r>
-        <w:t>poc/run_stce_eval.py compares coverage-mode output with and without the site model. On 11 benchmark site groups (49 pages) F_bal rises from 0.868 to 0.870. A crawl of up to 15 same-section pages from each documentation site (1,791 pages in 125 groups, robots.txt respected, list in poc/stce_crawl_urls.json) shows STCE changing 314 pages and keeping F_bal level (0.876 to 0.877, recall 0.805 both); text repeated across a site falls from 12.6 to 12.3 five-grams per page. Thirteen pages from seven sites lose more than 0.05 recall, which we did not inspect individually. Because most repeated chrome is already removed before STCE (site-repeated text is 2.1% of ChromeRAG's output, 2.1% for Trafilatura and 34.9% for MarkItDown), STCE is a guarded complement for template blocks without chrome markup, as in the example above.</w:t>
+        <w:t>poc/run_stce_eval.py compares coverage output with and without the site model. On 11 benchmark site groups (49 pages) F_bal rises from 0.868 to 0.870. A crawl of up to 15 same-section pages from each documentation site (1,791 pages in 125 groups, robots.txt respected, list in poc/stce_crawl_urls.json) shows STCE changing 314 pages and leaving F_bal level (0.876 to 0.877); text repeated across a site falls from 12.6 to 12.3 five-grams per page, and 13 pages from seven sites lose more than 0.05 recall (not inspected individually). Since the learned filter already removes most repeated chrome (site-repeated text is 2.1% of ChromeRAG's output, 2.1% for Trafilatura and 34.9% for MarkItDown), STCE is an optional, guarded complement for template blocks that read like content, as in the example above; it is not the main source of accuracy.</w:t>
       </w:r>
     </w:p>
     <w:p>
@@ -2574,7 +2560,7 @@
         <w:t>Improving an existing workflow.</w:t>
       </w:r>
       <w:r>
-        <w:t xml:space="preserve"> Chunking and embedding scraped HTML is routine data engineering, and chrome removal is often done with per-site regular expressions. ChromeRAG replaces them with one tested step that runs on CPU without network access or a model download, reports what it removed and why, and tells the caller when it is unsure. Its accuracy gain concentrates where article-tuned tools fail: forums, product pages, category pages and multi-section service pages. For retrieval it keeps the content that BM25 needs (hit@5 above Trafilatura on landing and documentation pages) while leaving 20 times less chrome in the retrieved context than a structure-preserving converter.</w:t>
+        <w:t xml:space="preserve"> Chunking and embedding scraped HTML is routine data engineering, and chrome removal is often done with per-site regular expressions. ChromeRAG offers one tested step instead: CPU-only, offline, without a model download, reporting what it removed and why, with a heuristic low-confidence warning. Its accuracy gain concentrates where article-tuned tools fail: forum pages (clear on held-out data) and, by cross-validation, category pages; on articles and documentation it matches Trafilatura. On the fresh-company evaluation it retrieved the right page more often than Trafilatura (hit@5 0.916 against 0.832) and left about 23 times less chrome in the retrieved context than MarkItDown (5 times on the documentation corpus).</w:t>
       </w:r>
     </w:p>
     <w:p>
@@ -2588,7 +2574,7 @@
         <w:t>Integration pathways.</w:t>
       </w:r>
       <w:r>
-        <w:t xml:space="preserve"> The LangChain loader and LlamaIndex reader turn stored HTML files into documents whose metadata carries the front-matter, so a splitter copies title, type and breadcrumb onto every chunk. chromerag batch fits Airflow or Prefect jobs after a crawl; batch_summary.json sends thin pages to a headless browser, and the confidence estimate lets a job route low-confidence pages to review or to a heavier extractor.</w:t>
+        <w:t xml:space="preserve"> The LangChain loader and LlamaIndex reader turn stored HTML files into documents whose metadata carries the front-matter, so a splitter copies title, type and breadcrumb onto every chunk. chromerag batch fits Airflow or Prefect jobs after a crawl; its summary sends thin pages to a headless browser, and the confidence estimate lets a job route uncertain pages to review.</w:t>
       </w:r>
     </w:p>
     <w:p>
@@ -2602,7 +2588,7 @@
         <w:t>New research questions.</w:t>
       </w:r>
       <w:r>
-        <w:t xml:space="preserve"> The repository includes a tool-agnostic harness: cross-validation by site, final-evaluation scripts, error taxonomy, frontier and confidence calibration (poc/wcxb_*), the landing-page corpus builder with a pre-registered split, the judge and retrieval evaluations, and all per-page outputs. Open questions include how far block-level labels from one benchmark transfer to other languages and page mixes, whether a sentence encoder improves on the lexical features, and how site-template models age.</w:t>
+        <w:t xml:space="preserve"> The repository includes the harness: site-grouped cross-validation, final-evaluation scripts, error taxonomy, the landing-corpus builder with a pre-registered split, judge and retrieval evaluations, and per-page outputs. Open questions include transfer to other languages and page mixes, and how site models age.</w:t>
       </w:r>
     </w:p>
     <w:p>
@@ -2616,7 +2602,7 @@
         <w:t>Adoption.</w:t>
       </w:r>
       <w:r>
-        <w:t xml:space="preserve"> ChromeRAG was first released on PyPI and GitHub in September 2026, so download, citation and third-party usage figures are not yet meaningful. The issue tracker, the live leaderboards at https://pedapudibhargav.github.io/ChromeRAG/ and the archived releases (Zenodo) are the channels for outside feedback.</w:t>
+        <w:t xml:space="preserve"> ChromeRAG was first released on PyPI and GitHub in September 2026, so download, citation and third-party usage figures are not yet meaningful. The issue tracker, the live leaderboards at https://pedapudibhargav.github.io/ChromeRAG/ and the archived releases are the channels for outside feedback.</w:t>
       </w:r>
     </w:p>
     <w:p>
@@ -2630,7 +2616,7 @@
         <w:t>Limitations.</w:t>
       </w:r>
       <w:r>
-        <w:t xml:space="preserve"> (i) ChromeRAG does not run JavaScript; it warns about shells but cannot recover their content. (ii) The model was trained on one benchmark (WCXB development pages, mostly English); its features include English stop words and call-to-action verbs, and other languages and page mixes are untested. (iii) Labels are word overlaps with human-reviewed references, and annotators are inconsistent in places: documentation code samples are included on 82% of pages but left out of repeated live samples on others, which caps the gain on documentation (ChromeRAG and Trafilatura are within noise there). (iv) The ceilings of block selection are 0.975 for articles but only 0.80 to 0.85 for products, collections, listings and forums, so absolute scores on those types stay lower. (v) Landing-page evidence uses a structural-anchor metric that cannot see chrome inside &lt;main&gt;, an LLM judge and BM25/dense retrieval over known-item queries, not human ratings of answers. (vi) STCE needs at least three pages per site group. (vii) Only HTML is handled. (viii) The benchmark's author also builds a competing extractor; we use the public data and our own scorer, which matches the benchmark's definition.</w:t>
+        <w:t xml:space="preserve"> (i) No JavaScript is run; shells are flagged, not recovered. (ii) The model was trained on one benchmark (mostly English); its features include English stop words and call-to-action verbs, and other languages and page mixes are untested. (iii) Labels are word overlaps with human-reviewed references, and annotators are inconsistent in places (documentation code samples are included on 82% of pages but omitted for repeated live samples on others), which caps the gain on documentation. (iv) The ceilings of block selection are 0.975 for articles but 0.80 to 0.85 for products, collections, listings and forums. (v) The public WCXB dev/ folder contains 139 test pages and 166 test pages share a domain with development; we report test results without them, and cannot say much about products and collections on held-out data. Part of the landing-page and documentation evidence also shares registrable domains with development, and the documentation corpus is a development set. (vi) The anchor metric and retrieval queries come from &lt;main&gt;/&lt;article&gt;, which the content-root selection also targets; judge results come from one proprietary model; none of this is a human assessment. (vii) STCE needs at least three pages per site group. (viii) Only HTML is handled. (ix) The benchmark's author also builds a competing extractor; we use the public data and a scorer that follows the benchmark's word-F1 definition but removes ChromeRAG's front-matter.</w:t>
       </w:r>
     </w:p>
     <w:p>
@@ -2654,7 +2640,7 @@
         <w:pStyle w:val="Body"/>
       </w:pPr>
       <w:r>
-        <w:t>ChromeRAG is a focused, installable component for the ingest step of web RAG pipelines. A 150 KB learned block filter, evaluated with NumPy, removes site chrome on a wide range of page types: on the 511 held-out WCXB pages it gains 0.043 F1 over Trafilatura, with large gains on forums, products and collections and ties on articles and documentation. It also learns a site's template, carries Schema.org metadata and tables into chunk-friendly form, and reports unusable inputs and low-confidence pages. On company landing pages a blind judge prefers its output to Trafilatura's on 70% of pages (and to MarkItDown's on 87%); on a mixed WCXB sample it prefers it to MarkItDown's on 83% and is statistically tied with Trafilatura. The code, the model, the training and evaluation scripts, and per-page results are openly available. Planned work covers multilingual training data, an optional sentence-encoder feature [17] and evaluation with generated answers.</w:t>
+        <w:t>ChromeRAG is a focused, installable component for the ingest step of web RAG pipelines. A 150 KB learned block filter, run with NumPy, removes site chrome across page types: on 372 held-out WCXB test pages it gains 0.036 F1 over Trafilatura, with a clear gain on forum pages (+0.153) and ties on articles, documentation, services and listings; cross-validation also favours it on collections. It can learn a site's template, carries Schema.org metadata and tables into chunk-friendly form, and reports unusable inputs and uncertain pages. On company landing pages a language-model judge prefers its output to Trafilatura's on 70% of pages and to MarkItDown's on 87%; on a mixed WCXB sample it prefers it to MarkItDown's on 79% and is tied with Trafilatura. The code, the model, the scripts and the per-page results are openly available. Planned work covers multilingual training data, retraining without the 139 duplicated files, an optional sentence-encoder feature [20] and evaluation with generated answers.</w:t>
       </w:r>
     </w:p>
     <w:p>
@@ -2724,7 +2710,7 @@
         <w:pStyle w:val="Body"/>
       </w:pPr>
       <w:r>
-        <w:t>The software, the list of benchmark URLs (poc/corpus_urls.json), the evaluation harness, per-page scores, the retrieval and STCE evaluations, the STCE crawl list (poc/stce_crawl_urls.json) and aggregate results (docs/data/) are openly available at https://github.com/pedapudibhargav/ChromeRAG under the MIT license. The raw third-party HTML pages are not redistributed. They can be fetched again with python -m poc.run_corpus_comparison, although live pages change over time.</w:t>
+        <w:t>The software, the model, the training and evaluation scripts, the benchmark URL lists (poc/corpus_urls.json, poc/landing_urls.json, poc/landing_urls_fresh.json, poc/landing_split.json, poc/stce_crawl_urls.json), per-page scores, judge prompts and raw judgements, and aggregate results (evaluations/2026-10-v0.1.3/, docs/data/) are openly available at https://github.com/pedapudibhargav/ChromeRAG under the MIT license. WCXB (https://arxiv.org/abs/2605.21097, CC-BY-4.0) is obtained from its authors' release. The raw third-party HTML pages are not redistributed. They can be fetched again with python -m poc.run_corpus_comparison, although live pages change over time.</w:t>
       </w:r>
     </w:p>
     <w:p>
@@ -2810,7 +2796,7 @@
         <w:pStyle w:val="Body"/>
       </w:pPr>
       <w:r>
-        <w:t>4. J. Leonhardt, A. Anand, and M. Khosla, "Boilerplate Removal using a Neural Sequence Labeling Model," in Companion Proc. The Web Conf. 2020 (WWW '20), 2020. arXiv: 2004.14294.</w:t>
+        <w:t>4. J. Leonhardt, A. Anand, and M. Khosla, "Boilerplate Removal using a Neural Sequence Labeling Model," in Companion Proc. The Web Conf. 2020 (WWW '20), 2020, pp. 226–229. doi: 10.1145/3366424.3383547.</w:t>
       </w:r>
     </w:p>
     <w:p>
@@ -2826,103 +2812,119 @@
         <w:pStyle w:val="Body"/>
       </w:pPr>
       <w:r>
-        <w:t>6. Y. Baburov et al., python-readability (readability-lxml), Python port of Arc90 Readability, GitHub. [Online]. Available: https://github.com/buriy/python-readability</w:t>
-      </w:r>
-    </w:p>
-    <w:p>
-      <w:pPr>
-        <w:pStyle w:val="Body"/>
-      </w:pPr>
-      <w:r>
-        <w:t>7. Microsoft, MarkItDown: Python tool for converting files and office documents to Markdown, GitHub. [Online]. Available: https://github.com/microsoft/markitdown</w:t>
-      </w:r>
-    </w:p>
-    <w:p>
-      <w:pPr>
-        <w:pStyle w:val="Body"/>
-      </w:pPr>
-      <w:r>
-        <w:t>8. J. Bevendorff, S. Gupta, J. Kiesel, and B. Stein, "An Empirical Comparison of Web Content Extraction Algorithms," in Proc. 46th Int. ACM SIGIR Conf., 2023, pp. 2594–2603. doi: 10.1145/3539618.3591920.</w:t>
-      </w:r>
-    </w:p>
-    <w:p>
-      <w:pPr>
-        <w:pStyle w:val="Body"/>
-      </w:pPr>
-      <w:r>
-        <w:t>9. M. Foley, "WCXB: A Multi-Type Web Content Extraction Benchmark," arXiv: 2605.21097, May 2026. Data: CC-BY-4.0.</w:t>
-      </w:r>
-    </w:p>
-    <w:p>
-      <w:pPr>
-        <w:pStyle w:val="Body"/>
-      </w:pPr>
-      <w:r>
-        <w:t>10. M. Foley, rs-trafilatura: web content extraction in Rust with page-type classification, GitHub. [Online]. Available: https://github.com/Murrough-Foley/rs-trafilatura</w:t>
-      </w:r>
-    </w:p>
-    <w:p>
-      <w:pPr>
-        <w:pStyle w:val="Body"/>
-      </w:pPr>
-      <w:r>
-        <w:t>11. M. Liu et al., "Dripper: Token-Efficient Main HTML Extraction with a Lightweight LM," arXiv: 2511.23119, 2025.</w:t>
-      </w:r>
-    </w:p>
-    <w:p>
-      <w:pPr>
-        <w:pStyle w:val="Body"/>
-      </w:pPr>
-      <w:r>
-        <w:t>12. Z. Bar-Yossef and S. Rajagopalan, "Template Detection via Data Mining and its Applications," in Proc. 11th Int. World Wide Web Conf. (WWW), 2002, pp. 580–591. doi: 10.1145/511446.511522.</w:t>
-      </w:r>
-    </w:p>
-    <w:p>
-      <w:pPr>
-        <w:pStyle w:val="Body"/>
-      </w:pPr>
-      <w:r>
-        <w:t>13. L. Yi, B. Liu, and X. Li, "Eliminating Noisy Information in Web Pages for Data Mining," in Proc. 9th ACM SIGKDD Int. Conf. Knowledge Discovery and Data Mining, 2003, pp. 296–305. doi: 10.1145/956750.956785.</w:t>
-      </w:r>
-    </w:p>
-    <w:p>
-      <w:pPr>
-        <w:pStyle w:val="Body"/>
-      </w:pPr>
-      <w:r>
-        <w:t>14. J. Alarte, J. Silva, and S. Tamarit, "What Web Template Extractor Should I Use? A Benchmarking and Comparison for Five Template Extractors," ACM Trans. Web, vol. 13, no. 2, pp. 1–19, 2019. doi: 10.1145/3316810.</w:t>
-      </w:r>
-    </w:p>
-    <w:p>
-      <w:pPr>
-        <w:pStyle w:val="Body"/>
-      </w:pPr>
-      <w:r>
-        <w:t>15. J. Tan, Z. Dou, W. Wang, M. Wang, W. Chen, and J.-R. Wen, "HtmlRAG: HTML is Better Than Plain Text for Modeling Retrieved Knowledge in RAG Systems," in Proc. ACM Web Conf. 2025 (WWW '25), 2025, pp. 1733–1746. doi: 10.1145/3696410.3714546.</w:t>
-      </w:r>
-    </w:p>
-    <w:p>
-      <w:pPr>
-        <w:pStyle w:val="Body"/>
-      </w:pPr>
-      <w:r>
-        <w:t>16. K. Weinberger, A. Dasgupta, J. Langford, A. Smola, and J. Attenberg, "Feature Hashing for Large Scale Multitask Learning," in Proc. 26th Int. Conf. Machine Learning (ICML), 2009, pp. 1113–1120. doi: 10.1145/1553374.1553516.</w:t>
-      </w:r>
-    </w:p>
-    <w:p>
-      <w:pPr>
-        <w:pStyle w:val="Body"/>
-      </w:pPr>
-      <w:r>
-        <w:t>17. N. Reimers and I. Gurevych, "Sentence-BERT: Sentence Embeddings using Siamese BERT-Networks," in Proc. EMNLP-IJCNLP 2019, 2019, pp. 3980–3990. doi: 10.18653/v1/D19-1410.</w:t>
-      </w:r>
-    </w:p>
-    <w:p>
-      <w:pPr>
-        <w:pStyle w:val="Body"/>
-      </w:pPr>
-      <w:r>
-        <w:t>18. B. C. Peddapudi, ChromeRAG, version 0.1.3, Zenodo, 2026. doi: 10.5281/zenodo.23107381 (all versions: 10.5281/zenodo.22970289). Source: https://github.com/pedapudibhargav/ChromeRAG</w:t>
+        <w:t>6. Y. Baburov et al., python-readability (readability-lxml), Python port of Arc90 Readability, GitHub, accessed 2026-10-02. [Online]. Available: https://github.com/buriy/python-readability</w:t>
+      </w:r>
+    </w:p>
+    <w:p>
+      <w:pPr>
+        <w:pStyle w:val="Body"/>
+      </w:pPr>
+      <w:r>
+        <w:t>7. J. Bevendorff, S. Gupta, J. Kiesel, and B. Stein, "An Empirical Comparison of Web Content Extraction Algorithms," in Proc. 46th Int. ACM SIGIR Conf., 2023, pp. 2594–2603. doi: 10.1145/3539618.3591920.</w:t>
+      </w:r>
+    </w:p>
+    <w:p>
+      <w:pPr>
+        <w:pStyle w:val="Body"/>
+      </w:pPr>
+      <w:r>
+        <w:t>8. Microsoft, MarkItDown: Python tool for converting files and office documents to Markdown, GitHub, accessed 2026-10-02. [Online]. Available: https://github.com/microsoft/markitdown</w:t>
+      </w:r>
+    </w:p>
+    <w:p>
+      <w:pPr>
+        <w:pStyle w:val="Body"/>
+      </w:pPr>
+      <w:r>
+        <w:t>9. Crawl4AI, "Fit Markdown" (PruningContentFilter), documentation, accessed 2026-10-02. [Online]. Available: https://docs.crawl4ai.com/core/fit-markdown/</w:t>
+      </w:r>
+    </w:p>
+    <w:p>
+      <w:pPr>
+        <w:pStyle w:val="Body"/>
+      </w:pPr>
+      <w:r>
+        <w:t>10. M. Foley, "WCXB: A Multi-Type Web Content Extraction Benchmark," arXiv: 2605.21097, May 2026. Data: CC-BY-4.0.</w:t>
+      </w:r>
+    </w:p>
+    <w:p>
+      <w:pPr>
+        <w:pStyle w:val="Body"/>
+      </w:pPr>
+      <w:r>
+        <w:t>11. M. Foley, rs-trafilatura: web content extraction in Rust with page-type classification, GitHub, accessed 2026-10-02. [Online]. Available: https://github.com/Murrough-Foley/rs-trafilatura</w:t>
+      </w:r>
+    </w:p>
+    <w:p>
+      <w:pPr>
+        <w:pStyle w:val="Body"/>
+      </w:pPr>
+      <w:r>
+        <w:t>12. M. Liu et al., "Dripper: Token-Efficient Main HTML Extraction with a Lightweight LM," arXiv: 2511.23119, 2025.</w:t>
+      </w:r>
+    </w:p>
+    <w:p>
+      <w:pPr>
+        <w:pStyle w:val="Body"/>
+      </w:pPr>
+      <w:r>
+        <w:t>13. F. Wang, Z. Shi, B. Wang, N. Wang, and H. Xiao, "ReaderLM-v2: Small Language Model for HTML to Markdown and JSON," arXiv: 2503.01151, 2025.</w:t>
+      </w:r>
+    </w:p>
+    <w:p>
+      <w:pPr>
+        <w:pStyle w:val="Body"/>
+      </w:pPr>
+      <w:r>
+        <w:t>14. Z. Bar-Yossef and S. Rajagopalan, "Template Detection via Data Mining and its Applications," in Proc. 11th Int. World Wide Web Conf. (WWW), 2002, pp. 580–591. doi: 10.1145/511446.511522.</w:t>
+      </w:r>
+    </w:p>
+    <w:p>
+      <w:pPr>
+        <w:pStyle w:val="Body"/>
+      </w:pPr>
+      <w:r>
+        <w:t>15. L. Yi, B. Liu, and X. Li, "Eliminating Noisy Information in Web Pages for Data Mining," in Proc. 9th ACM SIGKDD Int. Conf. Knowledge Discovery and Data Mining, 2003, pp. 296–305. doi: 10.1145/956750.956785.</w:t>
+      </w:r>
+    </w:p>
+    <w:p>
+      <w:pPr>
+        <w:pStyle w:val="Body"/>
+      </w:pPr>
+      <w:r>
+        <w:t>16. J. Alarte, J. Silva, and S. Tamarit, "What Web Template Extractor Should I Use? A Benchmarking and Comparison for Five Template Extractors," ACM Trans. Web, vol. 13, no. 2, Art. 9, 2019. doi: 10.1145/3316810.</w:t>
+      </w:r>
+    </w:p>
+    <w:p>
+      <w:pPr>
+        <w:pStyle w:val="Body"/>
+      </w:pPr>
+      <w:r>
+        <w:t>17. J. Tan, Z. Dou, W. Wang, M. Wang, W. Chen, and J.-R. Wen, "HtmlRAG: HTML is Better Than Plain Text for Modeling Retrieved Knowledge in RAG Systems," in Proc. ACM Web Conf. 2025 (WWW '25), 2025, pp. 1733–1746. doi: 10.1145/3696410.3714546.</w:t>
+      </w:r>
+    </w:p>
+    <w:p>
+      <w:pPr>
+        <w:pStyle w:val="Body"/>
+      </w:pPr>
+      <w:r>
+        <w:t>18. K. Weinberger, A. Dasgupta, J. Langford, A. Smola, and J. Attenberg, "Feature Hashing for Large Scale Multitask Learning," in Proc. 26th Int. Conf. Machine Learning (ICML), 2009, pp. 1113–1120. doi: 10.1145/1553374.1553516.</w:t>
+      </w:r>
+    </w:p>
+    <w:p>
+      <w:pPr>
+        <w:pStyle w:val="Body"/>
+      </w:pPr>
+      <w:r>
+        <w:t>19. B. C. Peddapudi, ChromeRAG, version 0.1.3, Zenodo, 2026. doi: 10.5281/zenodo.23107381 (all versions: 10.5281/zenodo.22970289). Source: https://github.com/pedapudibhargav/ChromeRAG</w:t>
+      </w:r>
+    </w:p>
+    <w:p>
+      <w:pPr>
+        <w:pStyle w:val="Body"/>
+      </w:pPr>
+      <w:r>
+        <w:t>20. N. Reimers and I. Gurevych, "Sentence-BERT: Sentence Embeddings using Siamese BERT-Networks," in Proc. EMNLP-IJCNLP 2019, 2019, pp. 3980–3990. doi: 10.18653/v1/D19-1410.</w:t>
       </w:r>
     </w:p>
     <w:sectPr>

</xml_diff>

<commit_message>
0.1.4: robustness fixes (deep nesting, failing batch pages, encodings, learn speed), reproducibility, audit-driven paper and evidence corrections
Co-Authored-By: Claude Sonnet 5.5 <noreply@anthropic.com>
</commit_message>
<xml_diff>
--- a/papers/softwarex/ChromeRAG_SoftwareX_OSP.docx
+++ b/papers/softwarex/ChromeRAG_SoftwareX_OSP.docx
@@ -306,7 +306,7 @@
               </w:rPr>
             </w:pPr>
             <w:r>
-              <w:t>v0.1.3</w:t>
+              <w:t>v0.1.4</w:t>
             </w:r>
           </w:p>
         </w:tc>
@@ -385,7 +385,7 @@
               </w:rPr>
             </w:pPr>
             <w:r>
-              <w:t>https://github.com/pedapudibhargav/ChromeRAG/tree/v0.1.3</w:t>
+              <w:t>https://github.com/pedapudibhargav/ChromeRAG/tree/v0.1.4</w:t>
             </w:r>
           </w:p>
           <w:p>
@@ -962,7 +962,7 @@
         <w:pStyle w:val="Body"/>
       </w:pPr>
       <w:r>
-        <w:t>ChromeRAG is a small Python package (src/chromerag, about 4,000 lines) built on BeautifulSoup/lxml and NumPy. Each document passes through six stages (Fig. 1). A pytest suite of 64 tests covers the pipeline, the learned filter, the rule index, golden-output regression fixtures, the CLI, STCE and the LangChain loader; continuous integration runs on Linux (Python 3.11 to 3.14), macOS and Windows.</w:t>
+        <w:t>ChromeRAG is a small Python package (src/chromerag, about 4,000 lines) built on BeautifulSoup/lxml and NumPy. Each document passes through six stages (Fig. 1). A pytest suite of 69 tests covers the pipeline, the learned filter, the rule index, golden-output regression fixtures, the CLI, STCE and the LangChain loader; continuous integration runs on Linux (Python 3.11 to 3.14), macOS and Windows.</w:t>
       </w:r>
     </w:p>
     <w:p>
@@ -1604,7 +1604,7 @@
         <w:t>Test results</w:t>
       </w:r>
       <w:r>
-        <w:t xml:space="preserve"> were produced once, after the code, model and thresholds were frozen (git tag freeze-0.1.3). No test label was used for fitting or for choosing thresholds, but an audit afterwards found that 139 of the 511 test pages are also in the public dev/ folder with identical HTML (26 of 28 product and 25 of 34 collection pages), most likely a packaging error in the release (its metadata lists 1,358 development pages), so the shipped model was trained on them. The primary test result therefore uses the 372 test pages absent from dev/ (Table 2, Fig. 2); on all 511 pages the F1 values are 0.902, 0.860, 0.763 and 0.540 for ChromeRAG, Trafilatura, Readability and MarkItDown, reported for comparability only. On the 345 test pages from domains absent from dev/, ChromeRAG scores 0.903 and Trafilatura 0.874 (+0.029, 95% CI [+0.012, +0.046]).</w:t>
+        <w:t xml:space="preserve"> were produced once, after the code, model and thresholds were frozen (git tag freeze-0.1.3). Release 0.1.4 (the version described here) changes only robustness and packaging; its per-page scores on all 511 test pages are identical to those of the frozen release. No test label was used for fitting or for choosing thresholds, but an audit afterwards found that 139 of the 511 test pages are also in the public dev/ folder with identical HTML (26 of 28 product and 25 of 34 collection pages), most likely a packaging error in the release (its metadata lists 1,358 development pages), so the shipped model was trained on them. The primary test result therefore uses the 372 test pages absent from dev/ (Table 2, Fig. 2); on all 511 pages the F1 values are 0.902, 0.860, 0.763 and 0.540 for ChromeRAG, Trafilatura, Readability and MarkItDown, reported for comparability only. On the 345 test pages from domains absent from dev/, ChromeRAG scores 0.903 and Trafilatura 0.874 (+0.029, 95% CI [+0.012, +0.046]).</w:t>
       </w:r>
     </w:p>
     <w:p>
@@ -2472,7 +2472,7 @@
       <w:r>
         <w:drawing>
           <wp:inline distT="0" distB="0" distL="0" distR="0">
-            <wp:extent cx="5943600" cy="1418844"/>
+            <wp:extent cx="5943600" cy="1571244"/>
             <wp:docPr id="5" name="fig5_judge.png"/>
             <wp:cNvGraphicFramePr>
               <ns2:graphicFrameLocks xmlns:ns2="http://schemas.openxmlformats.org/drawingml/2006/main" noChangeAspect="1"/>
@@ -2493,7 +2493,7 @@
                   <ns4:spPr>
                     <ns3:xfrm>
                       <ns3:off x="0" y="0"/>
-                      <ns3:ext cx="5943600" cy="1418844"/>
+                      <ns3:ext cx="5943600" cy="1571244"/>
                     </ns3:xfrm>
                     <ns3:prstGeom prst="rect">
                       <ns3:avLst/>
@@ -2514,7 +2514,7 @@
         <w:rPr>
           <w:i/>
         </w:rPr>
-        <w:t>Figure 5. Blind pairwise judgement by a language model of ChromeRAG against Trafilatura and MarkItDown: 100 held-out and fresh landing pages (coverage mode) and 105 stratified WCXB test pages (balanced mode); grey marks ties.</w:t>
+        <w:t>Figure 5. Pairwise judgement by one language model, tool names hidden, of ChromeRAG against Trafilatura and MarkItDown: 100 landing pages (coverage mode) and 72 WCXB test pages absent from the development folder (balanced mode); grey marks ties.</w:t>
       </w:r>
     </w:p>
     <w:p>
@@ -2916,7 +2916,7 @@
         <w:pStyle w:val="Body"/>
       </w:pPr>
       <w:r>
-        <w:t>19. B. C. Peddapudi, ChromeRAG, version 0.1.3, Zenodo, 2026. doi: 10.5281/zenodo.23107381 (all versions: 10.5281/zenodo.22970289). Source: https://github.com/pedapudibhargav/ChromeRAG</w:t>
+        <w:t>19. B. C. Peddapudi, ChromeRAG, version 0.1.4, Zenodo, 2026. doi: 10.5281/zenodo.22970289 (all versions). Source: https://github.com/pedapudibhargav/ChromeRAG</w:t>
       </w:r>
     </w:p>
     <w:p>

</xml_diff>

<commit_message>
0.1.4 evaluation, docs and paper: final results, figures, README, CHANGELOG, manuscript
Co-Authored-By: Claude Sonnet 5.5 <noreply@anthropic.com>
</commit_message>
<xml_diff>
--- a/papers/softwarex/ChromeRAG_SoftwareX_OSP.docx
+++ b/papers/softwarex/ChromeRAG_SoftwareX_OSP.docx
@@ -85,7 +85,7 @@
         </w:rPr>
       </w:pPr>
       <w:r>
-        <w:t>Web pages indexed for retrieval-augmented generation (RAG) carry navigation, cookie banners, related links and comments that become noisy chunks. ChromeRAG is an MIT-licensed, CPU-only Python package and command-line tool that converts HTML into RAG-ready Markdown. A 150 KB gradient-boosted tree model, run with NumPy only, scores each text block; an optional site model removes repeated templates; metadata becomes front-matter, tables become key-value rows, and JavaScript shells are flagged. On 372 WCXB test pages not present in its training folder it reaches a word-level F1 of 0.903, against 0.867 for Trafilatura and 0.568 for MarkItDown.</w:t>
+        <w:t>Web pages indexed for retrieval-augmented generation (RAG) carry navigation, banners and comment threads that become noisy chunks. ChromeRAG is an MIT-licensed, CPU-only Python package and command-line tool that converts HTML into RAG-ready Markdown and heading-aware chunks. A 150 KB gradient-boosted tree model, run with NumPy only, scores each text block; rules and an optional site model remove repeated chrome. On 372 WCXB test pages absent from its training folder it reaches a word-level F1 of 0.907 against 0.867 for Trafilatura. On 328 pages from 106 unseen sites, blinded judges from three model families prefer it to Trafilatura (net score +0.19 to +0.45).</w:t>
       </w:r>
     </w:p>
     <w:p>
@@ -917,7 +917,7 @@
         <w:t>Related work and the gap.</w:t>
       </w:r>
       <w:r>
-        <w:t xml:space="preserve"> Shallow text features [2] and neural sequence labelling [3, 4] classify blocks within one page. Trafilatura [5] and Readability [6] are widely used extractors tuned for articles; a large comparison [7] found no algorithm best on every page type. Converters such as MarkItDown [8] keep headings, tables and code but do not remove chrome, and Crawl4AI's pruning filter [9] scores nodes by text density, link density and tag weights. The WCXB benchmark [10] makes the weakness of article-tuned tools measurable: systems agree on articles (F1 about 0.93) and differ by 20 to 30 points on forums, products and collections. It reports a page-type-aware Rust extractor with a learned page classifier [11] and a 0.6B-parameter language-model block labeller [12] as the leaders, with jusText, Resiliparse and a 1.5B model, ReaderLM-v2 [13], further behind. Using several pages of one site to find its template was proposed early [14, 15] and benchmarked in [16]; query-time pruning such as HtmlRAG [17] complements ingest-time cleaning. ChromeRAG follows the feature-engineered block classification of [2] with gradient-boosted trees, and packages it as a small CPU-only component with an optional site-template model, metadata and tables in a chunk-friendly form, and explicit signals when the input is unusable or the extraction is unsure.</w:t>
+        <w:t xml:space="preserve"> Shallow text features [2] and neural sequence labelling [3, 4] classify blocks within one page. Trafilatura [5] and Readability [6] are widely used extractors tuned for articles; a large comparison [7] found no algorithm best on every page type. Converters such as MarkItDown [8] keep headings, tables and code but do not remove chrome, and Crawl4AI's pruning filter [9] scores nodes by text and link density. The WCXB benchmark [10] makes the weakness of article-tuned tools measurable: systems agree on articles (F1 about 0.93) and differ by 20 to 30 points on forums, products and collections; its leaders are a page-type-aware Rust extractor [11] and a 0.6B-parameter language-model block labeller [12]. Using several pages of one site to find its template was proposed early [14, 15] and benchmarked in [16]; query-time pruning such as HtmlRAG [17] complements ingest-time cleaning. ChromeRAG follows the feature-engineered block classification of [2] with gradient-boosted trees, adapts the discard patterns of Trafilatura [5], and packages both as a small CPU-only component with an optional site-template model, metadata, Markdown tables and heading-aware chunks, and explicit signals when the input is unusable or the extraction is unsure.</w:t>
       </w:r>
     </w:p>
     <w:p>
@@ -931,7 +931,7 @@
         <w:t>What ChromeRAG provides.</w:t>
       </w:r>
       <w:r>
-        <w:t xml:space="preserve"> (i) A learned block filter: trees over about 530 features of each text block, with a threshold per content priority; (ii) site-template chrome elimination (STCE), an optional model learned from pages of one site; (iii) Schema.org JSON-LD and Microdata as YAML front-matter; (iv) tables as key-value rows; (v) input-quality warnings and a heuristic per-page confidence estimate. It needs no model download and works in air-gapped environments.</w:t>
+        <w:t xml:space="preserve"> (i) A learned block filter: trees over about 530 features of each text block; (ii) chrome rules: 37 evidence-backed YAML rules and generic detectors for tables of contents, pagers, comments, related posts, call-to-action buttons, share strips, author boxes and page tails; (iii) site-template chrome elimination (STCE), an optional model learned from one site's pages; (iv) Schema.org metadata as YAML front-matter; (v) Markdown tables, headings, lists and code kept; (vi) chunks that carry their heading path; (vii) input-quality warnings and a per-page confidence estimate. It needs no model download and works in air-gapped environments.</w:t>
       </w:r>
     </w:p>
     <w:p>
@@ -962,7 +962,7 @@
         <w:pStyle w:val="Body"/>
       </w:pPr>
       <w:r>
-        <w:t>ChromeRAG is a small Python package (src/chromerag, about 4,000 lines) built on BeautifulSoup/lxml and NumPy. Each document passes through six stages (Fig. 1). A pytest suite of 69 tests covers the pipeline, the learned filter, the rule index, golden-output regression fixtures, the CLI, STCE and the LangChain loader; continuous integration runs on Linux (Python 3.11 to 3.14), macOS and Windows.</w:t>
+        <w:t>ChromeRAG is a Python package (src/chromerag, about 5,900 lines) built on BeautifulSoup/lxml and NumPy. Each document passes through six stages (Fig. 1). A pytest suite of 195 tests covers the pipeline, rules with fixtures, golden outputs, the chunker, the CLI and STCE; continuous integration runs on Linux (Python 3.11 to 3.14), macOS and Windows.</w:t>
       </w:r>
     </w:p>
     <w:p>
@@ -1053,10 +1053,10 @@
         <w:rPr>
           <w:i/>
         </w:rPr>
-        <w:t>Stage 3: cleaning and STCE.</w:t>
-      </w:r>
-      <w:r>
-        <w:t xml:space="preserve"> Scripts, styles and SVG are removed; hidden nodes and skip links are removed unless a hidden block holds long running text with few links. A wrapper such as a page-wide &lt;form&gt;, an unclosed &lt;button&gt; or a large &lt;noscript&gt; keeps its content. A YAML rule index drops known chrome (consent managers, share bars, generator footers); every rule carries evidence and a fixture. If a site model is supplied, blocks whose signature (a hash of tag, id, classes and role, or of the text for bare blocks) is in the model are removed. chromerag learn keeps a signature only if it appears on at least 80% of a group's pages, stays short, repeats its leading text, and either looks like chrome or is identical on every page; at extraction a match is removed only if it is close to its learned size and does not hold &lt;main&gt; or most of the page's text.</w:t>
+        <w:t>Stage 3: cleaning, rules and STCE.</w:t>
+      </w:r>
+      <w:r>
+        <w:t xml:space="preserve"> Scripts, styles and SVG are removed; hidden nodes and skip links are removed unless a hidden block holds long running text with few links. A page-wide &lt;form&gt;, an unclosed &lt;button&gt; or a large &lt;noscript&gt; keeps its content, as does the &lt;header&gt; of an &lt;article&gt; that holds the page h1. A YAML rule index of 37 rules drops known chrome: consent managers, share bars, documentation-framework widgets and 16 rules adapted from the discard patterns of Trafilatura [5]. Every rule carries evidence and a fixture. Generic detectors then remove in-page tables of contents, previous/next pagers, comment sections of articles, related-post blocks, standalone call-to-action buttons, share strips, newsletter blocks, author boxes, template placeholders and a footer-like tail after the last substantive block; each has guards (never the page title, a long paragraph, or more than a fixed share of the words) and a switch. If a site model is supplied, blocks whose signature (a hash of tag, id, classes and role, or of the text for bare blocks) is in the model are removed. chromerag learn keeps a signature only if it appears on at least 80% of a group's pages, stays short, and looks like chrome or is identical on every page.</w:t>
       </w:r>
     </w:p>
     <w:p>
@@ -1070,7 +1070,7 @@
         <w:t>Stage 4: chrome pruning.</w:t>
       </w:r>
       <w:r>
-        <w:t xml:space="preserve"> Landmark and class-word rules (nav, footer, cookie, newsletter, sidebar) remove subtrees, unless the subtree contains &lt;main&gt;, holds most of the page's text, or holds two or more long paragraphs with few links. A content-root ladder (main, role=main, article, content classes) is validated by size.</w:t>
+        <w:t xml:space="preserve"> Landmark and class-word rules (nav, footer, cookie, newsletter, sidebar) remove subtrees unless they contain &lt;main&gt;, most of the page's text, or two or more long paragraphs with few links. A content-root ladder (main, role=main, article, content classes) is validated by size.</w:t>
       </w:r>
     </w:p>
     <w:p>
@@ -1084,7 +1084,7 @@
         <w:t>Stage 5: learned block filter.</w:t>
       </w:r>
       <w:r>
-        <w:t xml:space="preserve"> The page is split into blocks (paragraphs, headings, list items, quotes, preformatted blocks, tables, text-only containers, and loose text between block elements). Each block is described by about 530 numbers: its text (length, link density, punctuation, stop-word share, call-to-action verbs, dates), its place in the page (position, distance to headings, content root), its tree context (ancestor tags, link density and text mass of enclosing boxes, repeated sibling structures such as comment threads, overlap with the title and long paragraphs), the words of its ancestors' class and id, feature-hashed [18], and the words of the heading above. Trees (300 trees of depth 6, trained with scikit-learn) give the probability that the block is main content. The exported model is a 150 KB array file and prediction uses NumPy only. A block is kept when its probability reaches 0.30 (coverage), 0.50 (balanced) or 0.70 (precision). Pages with fewer than four blocks are kept whole and exact repeats are written once. diagnostics["lbc"] holds an estimate of the page's precision, recall and F1: with block probabilities p and word counts w, expected true words are the sum of w times p over kept blocks and expected reference words the sum over all blocks. It assumes calibrated probabilities and is a heuristic; a warning is issued below an estimate of 0.70, a threshold chosen on development folds.</w:t>
+        <w:t xml:space="preserve"> The page is split into blocks (paragraphs, headings, list items, quotes, preformatted blocks, tables, text-only containers, and loose text between block elements). Each block is described by about 530 numbers: its text, its place in the page (position, distance to headings, content root), its tree context (ancestor tags, link density of enclosing boxes, repeated sibling structures), the words of its ancestors' class and id, feature-hashed [18], and the words of the heading above. Trees (300 trees of depth 6, trained with scikit-learn) give the probability that the block is main content; the exported model is a 150 KB array file and prediction uses NumPy only. A block is kept when its probability reaches 0.30 (coverage), 0.50 (balanced) or 0.70 (precision). Three structure rules complement the trees: the page's own h1 is kept, a heading is kept when one of the next two blocks is kept, and the paragraph under the title is kept when it is a real sentence. Pages with fewer than four blocks are kept whole and exact repeats are written once. diagnostics["lbc"] holds an estimate of the page's F1 from the block probabilities; below 0.70 a warning is issued.</w:t>
       </w:r>
     </w:p>
     <w:p>
@@ -1098,7 +1098,7 @@
         <w:t>Stage 6: tables and Markdown.</w:t>
       </w:r>
       <w:r>
-        <w:t xml:space="preserve"> Layout tables are unwrapped; data tables become Row n -&gt; header: value | ... lines. The page is written in document order with safe heading levels and fenced code; link targets are omitted unless requested (--links).</w:t>
+        <w:t xml:space="preserve"> Layout tables are unwrapped; rectangular data tables become Markdown tables, other tables key-value rows. The page is written in document order with heading levels, bold and italic, inline code, fenced code blocks that keep their lines, and ordered and nested lists; link targets are omitted unless requested (--links).</w:t>
       </w:r>
     </w:p>
     <w:p>
@@ -1112,7 +1112,7 @@
         <w:t>Training.</w:t>
       </w:r>
       <w:r>
-        <w:t xml:space="preserve"> poc/lbc_data.py labels every block of the 1,495 scoreable files of the public WCXB dev/ folder by word-trigram overlap with the human-reviewed main content (blocks listed as "without" snippets are labelled noise); poc/train_lbc.py fits the trees, weighting blocks by word count, in about two minutes. Two of the 1,497 files have no reference field. The folder also contains 139 files that WCXB's metadata assigns to the test split (see below), so the shipped model saw them; thresholds and features were chosen on development folds that include them.</w:t>
+        <w:t xml:space="preserve"> poc/lbc_data.py labels every block of the 1,495 scoreable files of the public WCXB dev/ folder by word-trigram overlap with the human-reviewed main content; poc/train_lbc.py fits the trees, weighting blocks by word count, in about two minutes. The folder also contains 139 files that WCXB's metadata assigns to the test split (see below), so the shipped model saw them; we therefore report test results without them. The rules and detectors of Stages 3 and 5 were written and tuned on development material only, never on the pages used for the final judgements below.</w:t>
       </w:r>
     </w:p>
     <w:p>
@@ -1136,7 +1136,7 @@
         <w:pStyle w:val="Body"/>
       </w:pPr>
       <w:r>
-        <w:t>The Python API centres on ChromeRAG(config=..., site_chrome=...). PipelineConfig.from_priority() selects COVERAGE, BALANCED (default) or PRECISION. Stages can be switched off (--no-rules, --no-schema, --no-tables, --no-stce; enable_lbc=False restores the density filter of 0.1.2). extract(html, url=None) returns a typed ExtractResult with markdown, front_matter, warnings, input_quality, a token estimate and diagnostics (kept and rejected samples, the rules that fired, the confidence estimate). The URL is metadata only.</w:t>
+        <w:t>The Python API centres on ChromeRAG(config=..., site_chrome=...). PipelineConfig.from_priority() selects COVERAGE, BALANCED (default) or PRECISION. Stages can be switched off (for example --no-rules, --no-stce). extract(html, url=None) returns a typed ExtractResult with markdown, front_matter, warnings, input_quality, a token estimate and diagnostics. result.chunks() splits the Markdown into chunks of at most 180 words inside heading sections, never cutting a code block or table; each Chunk has the heading path from the page title to its section, a depth, and embed_text, the body preceded by that path, ready for an embedding model; chromerag extract page.html --chunks writes them as JSON lines.</w:t>
       </w:r>
     </w:p>
     <w:p>
@@ -1250,7 +1250,7 @@
               <w:pStyle w:val="Body"/>
             </w:pPr>
             <w:r>
-              <w:t>Markdown; --json-meta prints diagnostics; --explain lists removed blocks; --fail-on-thin exits with code 3</w:t>
+              <w:t>Markdown; --json-meta prints diagnostics; --explain lists removed blocks; --chunks writes JSON lines; --fail-on-thin exits with code 3</w:t>
             </w:r>
           </w:p>
         </w:tc>
@@ -1343,7 +1343,7 @@
         <w:pStyle w:val="Body"/>
       </w:pPr>
       <w:r>
-        <w:t>The package needs Python 3.11 or later and installs with pip install chromerag [19]. Optional LangChain and LlamaIndex components return one document per page with the front-matter as metadata.</w:t>
+        <w:t>The package needs Python 3.11 or later, installs with pip install chromerag [19] and has four direct dependencies (BeautifulSoup, lxml, PyYAML, NumPy). Getting Markdown takes two lines (from chromerag import ChromeRAG; md = ChromeRAG().extract(html).markdown); Trafilatura needs output_format="markdown" and table options, Readability returns HTML that must be converted again, and MarkItDown reads files or streams. Optional LangChain and LlamaIndex components return one document per page with the front-matter as metadata.</w:t>
       </w:r>
     </w:p>
     <w:p>
@@ -1422,7 +1422,7 @@
         <w:pStyle w:val="Body"/>
       </w:pPr>
       <w:r>
-        <w:t>learn reports one site group (docs.example.com/docs) with six chrome signatures; batch applies them, and the paragraph disappears from all four pages. The pricing page keeps its JSON-LD as front-matter and its table as key-value rows:</w:t>
+        <w:t>learn reports one site group (docs.example.com/docs) with six chrome signatures; batch applies them, and the paragraph disappears from all four pages. The pricing page keeps its JSON-LD as front-matter and its table as a Markdown table:</w:t>
       </w:r>
     </w:p>
     <w:p>
@@ -1552,15 +1552,41 @@
           <w:rFonts w:ascii="Courier New" w:hAnsi="Courier New" w:cs="Courier New"/>
           <w:sz w:val="18"/>
         </w:rPr>
-        <w:t xml:space="preserve">Row 2 -&gt; Plan: Team | Hosted minutes: 20,000 | Monthly price (USD): 49</w:t>
-      </w:r>
-    </w:p>
-    <w:p>
-      <w:pPr>
-        <w:pStyle w:val="Body"/>
-      </w:pPr>
-      <w:r>
-        <w:t>A JavaScript shell (&lt;div id="root"&gt;&lt;/div&gt; plus a script tag) produces a warning to render the page first; with --fail-on-thin the command exits with code 3 so pipelines can route such pages to a headless browser.</w:t>
+        <w:t xml:space="preserve">| Plan | Hosted minutes | Monthly price (USD) |</w:t>
+      </w:r>
+    </w:p>
+    <w:p>
+      <w:pPr>
+        <w:pStyle w:val="Body"/>
+        <w:spacing w:before="0" w:after="0"/>
+      </w:pPr>
+      <w:r>
+        <w:rPr>
+          <w:rFonts w:ascii="Courier New" w:hAnsi="Courier New" w:cs="Courier New"/>
+          <w:sz w:val="18"/>
+        </w:rPr>
+        <w:t xml:space="preserve">| --- | --- | --- |</w:t>
+      </w:r>
+    </w:p>
+    <w:p>
+      <w:pPr>
+        <w:pStyle w:val="Body"/>
+        <w:spacing w:before="0" w:after="0"/>
+      </w:pPr>
+      <w:r>
+        <w:rPr>
+          <w:rFonts w:ascii="Courier New" w:hAnsi="Courier New" w:cs="Courier New"/>
+          <w:sz w:val="18"/>
+        </w:rPr>
+        <w:t xml:space="preserve">| Team | 20,000 | 49 |</w:t>
+      </w:r>
+    </w:p>
+    <w:p>
+      <w:pPr>
+        <w:pStyle w:val="Body"/>
+      </w:pPr>
+      <w:r>
+        <w:t>chromerag extract examples/site/pricing.html --chunks writes one JSON object per chunk with its heading_path and embed_text. A JavaScript shell produces a warning; with --fail-on-thin the command exits with code 3 so pipelines can route it to a headless browser.</w:t>
       </w:r>
     </w:p>
     <w:p>
@@ -1576,7 +1602,7 @@
         <w:pStyle w:val="Body"/>
       </w:pPr>
       <w:r>
-        <w:t>WCXB [10] has 2,008 pages in seven page types, with human-reviewed main content. Word-level F1 compares the bag of words of a tool's output with the reference (title excluded); "with" and "without" snippets test that required text is present and listed chrome absent. All tools receive the same HTML and no site model. ChromeRAG's YAML front-matter is removed before scoring, because it is metadata meant for chunk metadata and not text; scoring the raw default output with the benchmark's own script gives 0.869 on the pages of Table 2, and 0.904 with schema harvesting switched off (enable_schema=False), which writes no front-matter. Trafilatura [5] runs with its best of four distinct settings on the development set (tables, no comments, no links, Markdown; 0.818 against 0.814 for the defaults and 0.789 for favor_recall); Readability [6] and MarkItDown [8] use defaults (versions: Trafilatura 2.2.0, readability-lxml 0.9, MarkItDown 0.1.7, Python 3.14).</w:t>
+        <w:t>WCXB [10] has 2,008 pages in seven page types, with human-reviewed main content. Word-level F1 compares the bag of words of a tool's output with the reference (title excluded); "with" and "without" snippets test that required text is present and listed chrome absent. All tools receive the same HTML and no site model. ChromeRAG's YAML front-matter is removed before scoring, because it is metadata meant for chunk metadata and not text; scoring the raw default output with the benchmark's own script gives a lower value (about 0.87, or 0.90 with enable_schema=False). Trafilatura [5] runs with its best of four distinct settings on the development set; Readability [6] and MarkItDown [8] use defaults (Trafilatura 2.2.0, readability-lxml 0.9, MarkItDown 0.1.7, Python 3.14).</w:t>
       </w:r>
     </w:p>
     <w:p>
@@ -1590,7 +1616,7 @@
         <w:t>Development results</w:t>
       </w:r>
       <w:r>
-        <w:t xml:space="preserve"> come from five-fold cross-validation grouped by host: F1 is 0.852 (coverage), 0.851 (balanced) and 0.837 (precision) against 0.818 for Trafilatura. Features and thresholds were chosen on these folds, so they are development estimates. Replacing the 0.1.2 density filter by the learned filter raises F1 from 0.822, 0.817 and 0.790 to these values; most of the gain over 0.1.2 (0.749) comes from fixing whole-page losses (wrappers, hidden blocks, nested layout tables that repeated text, breadth-first output order, link targets counted as words).</w:t>
+        <w:t xml:space="preserve"> for the learned filter come from five-fold cross-validation grouped by host and were obtained with the 0.1.3 pipeline, which differs from the current one only in the later rules and writer: F1 0.852 (coverage), 0.851 (balanced) and 0.837 (precision) against 0.818 for Trafilatura. Features and thresholds were chosen on these folds.</w:t>
       </w:r>
     </w:p>
     <w:p>
@@ -1604,7 +1630,7 @@
         <w:t>Test results</w:t>
       </w:r>
       <w:r>
-        <w:t xml:space="preserve"> were produced once, after the code, model and thresholds were frozen (git tag freeze-0.1.3). Release 0.1.4 (the version described here) changes only robustness and packaging; its per-page scores on all 511 test pages are identical to those of the frozen release. No test label was used for fitting or for choosing thresholds, but an audit afterwards found that 139 of the 511 test pages are also in the public dev/ folder with identical HTML (26 of 28 product and 25 of 34 collection pages), most likely a packaging error in the release (its metadata lists 1,358 development pages), so the shipped model was trained on them. The primary test result therefore uses the 372 test pages absent from dev/ (Table 2, Fig. 2); on all 511 pages the F1 values are 0.902, 0.860, 0.763 and 0.540 for ChromeRAG, Trafilatura, Readability and MarkItDown, reported for comparability only. On the 345 test pages from domains absent from dev/, ChromeRAG scores 0.903 and Trafilatura 0.874 (+0.029, 95% CI [+0.012, +0.046]).</w:t>
+        <w:t xml:space="preserve"> use the shipped model, trained once on the whole development folder, and the frozen pipeline. An audit found that 139 of the 511 test pages are also in the public dev/ folder with identical HTML (26 of 28 product and 25 of 34 collection pages), so the shipped model was trained on them; the primary result therefore uses the 372 test pages absent from dev/ (Table 2, Fig. 2); on all 511 pages the F1 values are 0.901, 0.860, 0.763 and 0.540 for ChromeRAG, Trafilatura, Readability and MarkItDown, reported for comparability only. On the 308 of the 372 pages from registrable domains absent from dev/, ChromeRAG scores 0.905 and Trafilatura 0.870 (+0.035, 95% CI [+0.016, +0.054]).</w:t>
       </w:r>
     </w:p>
     <w:p>
@@ -1739,7 +1765,7 @@
               <w:pStyle w:val="Body"/>
             </w:pPr>
             <w:r>
-              <w:t>0.903</w:t>
+              <w:t>0.907</w:t>
             </w:r>
           </w:p>
         </w:tc>
@@ -1873,7 +1899,7 @@
               <w:pStyle w:val="Body"/>
             </w:pPr>
             <w:r>
-              <w:t>0.954</w:t>
+              <w:t>0.949</w:t>
             </w:r>
           </w:p>
         </w:tc>
@@ -1940,7 +1966,7 @@
               <w:pStyle w:val="Body"/>
             </w:pPr>
             <w:r>
-              <w:t>0.836</w:t>
+              <w:t>0.864</w:t>
             </w:r>
           </w:p>
         </w:tc>
@@ -2007,7 +2033,7 @@
               <w:pStyle w:val="Body"/>
             </w:pPr>
             <w:r>
-              <w:t>0.884</w:t>
+              <w:t>0.895</w:t>
             </w:r>
           </w:p>
         </w:tc>
@@ -2074,7 +2100,7 @@
               <w:pStyle w:val="Body"/>
             </w:pPr>
             <w:r>
-              <w:t>0.768</w:t>
+              <w:t>0.754</w:t>
             </w:r>
           </w:p>
         </w:tc>
@@ -2141,7 +2167,7 @@
               <w:pStyle w:val="Body"/>
             </w:pPr>
             <w:r>
-              <w:t>0.788</w:t>
+              <w:t>0.774</w:t>
             </w:r>
           </w:p>
         </w:tc>
@@ -2208,7 +2234,7 @@
               <w:pStyle w:val="Body"/>
             </w:pPr>
             <w:r>
-              <w:t>1.000</w:t>
+              <w:t>0.991</w:t>
             </w:r>
           </w:p>
         </w:tc>
@@ -2302,23 +2328,23 @@
         <w:rPr>
           <w:i/>
         </w:rPr>
-        <w:t>Figure 2. Word-level F1 on the 373 WCXB test pages whose URL is not in the development split, overall and by page type (n in brackets; product has 2 pages and collection 9, so those rows are indicative only). Each dot is the mean over the pages of one type; ChromeRAG is in balanced mode and its value is printed.</w:t>
-      </w:r>
-    </w:p>
-    <w:p>
-      <w:pPr>
-        <w:pStyle w:val="Body"/>
-      </w:pPr>
-      <w:r>
-        <w:t>Scores are means of page-level F1; intervals are percentile intervals of a paired bootstrap over pages (5,000 resamples, seed 0). Clustering the resampling by domain on all 511 pages gives [+0.027, +0.060] for the overall difference. On the 372 pages ChromeRAG leads Trafilatura by +0.036 (95% CI [+0.018, +0.054]) and by +0.153 on forums [+0.090, +0.219]. On articles, documentation, services and listings the intervals contain zero; the 9 collection pages give +0.071 [+0.025, +0.117] and 2 product pages allow no conclusion. For these two types cross-validation is more informative: collections 0.651 against 0.564 (+0.087) and products 0.652 against 0.626 (+0.026). Required snippets are found more often (+0.063) and forbidden snippets equally often. The benchmark's publication [10] reports 0.903 for the page-type-aware Rust extractor [11] and 0.841 for Trafilatura on all 511 test pages under its own configuration; we could not build that tool, so we quote it and claim no superiority; the settings differ and the numbers are not interchangeable.</w:t>
-      </w:r>
-    </w:p>
-    <w:p>
-      <w:pPr>
-        <w:pStyle w:val="Body"/>
-      </w:pPr>
-      <w:r>
-        <w:t>Fig. 3 shows the trade-off on the development folds: ChromeRAG's curve passes above Trafilatura's operating point for thresholds 0.6 to 0.7 (higher precision and recall at once) and has higher F1 at every threshold up to 0.8. The page-level estimate of Stage 5 is informative but not calibrated: pages estimated below 0.70 (7.6% of development pages, scored out of fold) have an actual F1 of 0.57 on average against 0.88 for the rest.</w:t>
+        <w:t>Figure 2. Word-level F1 on the 372 WCXB test pages whose URL is not in the development split, overall and by page type (n in brackets; product has 2 pages and collection 9, so those rows are indicative only). Each dot is the mean over the pages of one type; ChromeRAG is in balanced mode and its value is printed.</w:t>
+      </w:r>
+    </w:p>
+    <w:p>
+      <w:pPr>
+        <w:pStyle w:val="Body"/>
+      </w:pPr>
+      <w:r>
+        <w:t>Scores are means of page-level F1; intervals are percentile intervals of a paired bootstrap over pages (5,000 resamples, seed 0). On the 372 pages ChromeRAG leads Trafilatura by +0.040 (95% CI [+0.021, +0.059]): by +0.164 on forums [+0.102, +0.230], +0.051 on services [+0.004, +0.107] and +0.057 on the 9 collection pages [+0.024, +0.090]; on articles, documentation and listings the intervals contain zero, and 2 product pages allow no conclusion. Required snippets are found more often (0.783 against 0.743) and forbidden snippets less often (0.064 against 0.083). The benchmark's publication [10] reports 0.903 for the page-type-aware Rust extractor [11] and 0.841 for Trafilatura on all 511 test pages under its own configuration; we could not build that tool, so we quote it and claim no superiority; the settings differ and the numbers are not interchangeable.</w:t>
+      </w:r>
+    </w:p>
+    <w:p>
+      <w:pPr>
+        <w:pStyle w:val="Body"/>
+      </w:pPr>
+      <w:r>
+        <w:t>Fig. 3 shows the trade-off on the development folds: ChromeRAG's curve passes above Trafilatura's operating point for thresholds 0.6 to 0.7 and has higher F1 at every threshold up to 0.8. Median time on 200 stored pages (100 documentation, 100 landing pages), one process, on an Apple M4 Pro, is 52 ms for ChromeRAG, 32 ms for Trafilatura, 31 ms for Readability and 39 ms for MarkItDown.</w:t>
       </w:r>
     </w:p>
     <w:p>
@@ -2375,36 +2401,437 @@
     </w:p>
     <w:p>
       <w:pPr>
-        <w:pStyle w:val="Body"/>
-      </w:pPr>
-      <w:r>
-        <w:t>Median time on 200 stored pages (100 documentation, 100 landing pages), one process, one warm-up and three timed passes, on an Apple M4 Pro with 48 GB, is 36 ms for ChromeRAG, 30 ms for Trafilatura, 30 ms for Readability and 37 ms for MarkItDown; 95th percentiles are 108, 147, 108 and 104 ms.</w:t>
-      </w:r>
-    </w:p>
-    <w:p>
-      <w:pPr>
         <w:pStyle w:val="Heading2"/>
       </w:pPr>
       <w:r>
-        <w:t>Marketing and landing pages, retrieval and judged quality</w:t>
-      </w:r>
-    </w:p>
-    <w:p>
-      <w:pPr>
-        <w:pStyle w:val="Body"/>
-      </w:pPr>
-      <w:r>
-        <w:t>We also built a corpus of company landing pages (poc/landing_corpus.py): up to five pages per company chosen from the homepage's own links before any extractor ran. Companies were split by hash into development and held-out sets; a second list of 51 companies was fetched only after the freeze ("fresh"). The structural-anchor metric is computed from each input page, independently of any tool: content recall is the share of word 5-grams from &lt;main&gt;/&lt;article&gt; text found in the output; noise retention is the share of 5-grams from navigation, header, footer, aside and cookie containers found; 5-grams in both sets are discarded; F_bal is the harmonic mean of recall and one minus noise retention, averaged over pages with at least 50 content anchors. It is a proxy that cannot see chrome inside &lt;main&gt;, and ChromeRAG's content-root selection also prefers &lt;main&gt;/&lt;article&gt;. In coverage mode ChromeRAG reaches 0.759 on 177 scoreable held-out pages and 0.780 on 178 fresh pages, against 0.680 and 0.649 for Trafilatura, 0.723 and 0.741 for MarkItDown (which keeps 24 to 26% of the chrome anchors, ChromeRAG 0.1% or less) and 0.512 and 0.567 for Readability. Because 11 of 42 held-out and 9 of 47 fresh registrable domains also occur in WCXB development, we repeated the comparison on other domains: ChromeRAG minus Trafilatura is +0.052 [+0.017, +0.086] on 130 held-out pages and +0.136 [+0.105, +0.167] on 147 fresh pages (resampled by page; up to five pages share a company). On 242 documentation, pricing and article pages of the development corpus (re-fetched on 2026-10-02, not held out) the metric gives 0.833 for coverage and 0.739 for Trafilatura (+0.094, CI [+0.066, +0.122]); Trafilatura keeps under 20% of the content on 25 of these pages, ChromeRAG on 2.</w:t>
-      </w:r>
-    </w:p>
-    <w:p>
-      <w:pPr>
-        <w:pStyle w:val="Body"/>
-      </w:pPr>
-      <w:r>
-        <w:t>BM25 retrieval (k1 1.2, b 0.75) with 668 known-item queries over the fresh pages (about 200-word chunks; queries are titles, headings and two 12-word passages per page from the input HTML before extraction, kept only if unique to one page; chrome is the share of retrieved text made of navigation, header and footer anchors) gives a hit@5 of 0.916 for ChromeRAG against 0.832 for Trafilatura (+0.084 [+0.045, +0.123]) and 0.949 for MarkItDown, which keeps everything (chrome in 2.3% of the retrieved context against 0.1% for ChromeRAG and 1.1% for Trafilatura). Queries come from &lt;main&gt;/&lt;article&gt;, like the anchors. With dense embeddings (text-embedding-3-small) all tools but Readability tie (0.708 against 0.698 for Trafilatura; +0.010 [-0.024, +0.047]). On the development documentation corpus BM25 hit@5 is 0.947 against 0.921 for Trafilatura (+0.026 [+0.001, +0.051]) and 0.964 for MarkItDown, with 2,010 chunks against 3,909.</w:t>
-      </w:r>
-    </w:p>
+        <w:t>Blinded judging on pages never used in development</w:t>
+      </w:r>
+    </w:p>
+    <w:p>
+      <w:pPr>
+        <w:pStyle w:val="Body"/>
+      </w:pPr>
+      <w:r>
+        <w:t>F1 against human labels cannot see everything a RAG index cares about, so we added blinded pairwise judging. Before any extractor ran on them, we wrote seed lists of 106 sites that no earlier step had used: 40 news, magazine and engineering-blog sites, 25 forums and question-and-answer sites, 30 listing and category pages and 40 service and software landing sites. A fixed script fetched 328 pages (130 articles, 56 forum threads, 30 listings, 112 service pages; robots.txt respected). For each page, a judge saw the page's visible text and two outputs, ChromeRAG (balanced) and Trafilatura, in random order with tool names hidden, and applied one rubric: which output is better to index for RAG (content kept, chrome left out, structure), with 1-to-5 scores for content and chrome. Three model families judged the same pairs: Claude Sonnet 5.5 (sub-agents), GPT-5.6 luna and Gemini 3.7 Flash. The net score is wins minus losses divided by pairs (range -1 to +1; ties count zero); intervals are bootstrapped over pages. Code, rubric, pairs and verdicts are in the repository.</w:t>
+      </w:r>
+    </w:p>
+    <w:p>
+      <w:pPr>
+        <w:pStyle w:val="Body"/>
+      </w:pPr>
+      <w:r>
+        <w:t>Table 3. Net score of ChromeRAG against Trafilatura (+1 = always preferred) on the 328 fresh pages and on the 367 WCXB test pages absent from dev/ that both outputs cover.</w:t>
+      </w:r>
+    </w:p>
+    <w:tbl>
+      <w:tblPr>
+        <w:tblW w:w="5000" w:type="pct"/>
+        <w:tblBorders>
+          <w:top w:val="single" w:sz="4" w:space="0" w:color="808080"/>
+          <w:left w:val="single" w:sz="4" w:space="0" w:color="808080"/>
+          <w:bottom w:val="single" w:sz="4" w:space="0" w:color="808080"/>
+          <w:right w:val="single" w:sz="4" w:space="0" w:color="808080"/>
+          <w:insideH w:val="single" w:sz="4" w:space="0" w:color="808080"/>
+          <w:insideV w:val="single" w:sz="4" w:space="0" w:color="808080"/>
+        </w:tblBorders>
+      </w:tblPr>
+      <w:tblGrid>
+        <w:gridCol w:w="2250"/>
+        <w:gridCol w:w="2250"/>
+        <w:gridCol w:w="2250"/>
+        <w:gridCol w:w="2250"/>
+      </w:tblGrid>
+      <w:tr>
+        <w:tc>
+          <w:tcPr>
+            <w:tcW w:w="2250" w:type="dxa"/>
+          </w:tcPr>
+          <w:p>
+            <w:pPr>
+              <w:pStyle w:val="Body"/>
+            </w:pPr>
+            <w:r>
+              <w:rPr>
+                <w:b/>
+              </w:rPr>
+              <w:t>Set (pages)</w:t>
+            </w:r>
+          </w:p>
+        </w:tc>
+        <w:tc>
+          <w:tcPr>
+            <w:tcW w:w="2250" w:type="dxa"/>
+          </w:tcPr>
+          <w:p>
+            <w:pPr>
+              <w:pStyle w:val="Body"/>
+            </w:pPr>
+            <w:r>
+              <w:rPr>
+                <w:b/>
+              </w:rPr>
+              <w:t>Claude</w:t>
+            </w:r>
+          </w:p>
+        </w:tc>
+        <w:tc>
+          <w:tcPr>
+            <w:tcW w:w="2250" w:type="dxa"/>
+          </w:tcPr>
+          <w:p>
+            <w:pPr>
+              <w:pStyle w:val="Body"/>
+            </w:pPr>
+            <w:r>
+              <w:rPr>
+                <w:b/>
+              </w:rPr>
+              <w:t>GPT</w:t>
+            </w:r>
+          </w:p>
+        </w:tc>
+        <w:tc>
+          <w:tcPr>
+            <w:tcW w:w="2250" w:type="dxa"/>
+          </w:tcPr>
+          <w:p>
+            <w:pPr>
+              <w:pStyle w:val="Body"/>
+            </w:pPr>
+            <w:r>
+              <w:rPr>
+                <w:b/>
+              </w:rPr>
+              <w:t>Gemini</w:t>
+            </w:r>
+          </w:p>
+        </w:tc>
+      </w:tr>
+      <w:tr>
+        <w:tc>
+          <w:tcPr>
+            <w:tcW w:w="2250" w:type="dxa"/>
+          </w:tcPr>
+          <w:p>
+            <w:pPr>
+              <w:pStyle w:val="Body"/>
+            </w:pPr>
+            <w:r>
+              <w:t>Fresh, all (328)</w:t>
+            </w:r>
+          </w:p>
+        </w:tc>
+        <w:tc>
+          <w:tcPr>
+            <w:tcW w:w="2250" w:type="dxa"/>
+          </w:tcPr>
+          <w:p>
+            <w:pPr>
+              <w:pStyle w:val="Body"/>
+            </w:pPr>
+            <w:r>
+              <w:t>+0.41 [+0.33, +0.50]</w:t>
+            </w:r>
+          </w:p>
+        </w:tc>
+        <w:tc>
+          <w:tcPr>
+            <w:tcW w:w="2250" w:type="dxa"/>
+          </w:tcPr>
+          <w:p>
+            <w:pPr>
+              <w:pStyle w:val="Body"/>
+            </w:pPr>
+            <w:r>
+              <w:t>+0.19 [+0.09, +0.29]</w:t>
+            </w:r>
+          </w:p>
+        </w:tc>
+        <w:tc>
+          <w:tcPr>
+            <w:tcW w:w="2250" w:type="dxa"/>
+          </w:tcPr>
+          <w:p>
+            <w:pPr>
+              <w:pStyle w:val="Body"/>
+            </w:pPr>
+            <w:r>
+              <w:t>+0.45 [+0.35, +0.54]</w:t>
+            </w:r>
+          </w:p>
+        </w:tc>
+      </w:tr>
+      <w:tr>
+        <w:tc>
+          <w:tcPr>
+            <w:tcW w:w="2250" w:type="dxa"/>
+          </w:tcPr>
+          <w:p>
+            <w:pPr>
+              <w:pStyle w:val="Body"/>
+            </w:pPr>
+            <w:r>
+              <w:t>Articles (130)</w:t>
+            </w:r>
+          </w:p>
+        </w:tc>
+        <w:tc>
+          <w:tcPr>
+            <w:tcW w:w="2250" w:type="dxa"/>
+          </w:tcPr>
+          <w:p>
+            <w:pPr>
+              <w:pStyle w:val="Body"/>
+            </w:pPr>
+            <w:r>
+              <w:t>+0.32 [+0.18, +0.45]</w:t>
+            </w:r>
+          </w:p>
+        </w:tc>
+        <w:tc>
+          <w:tcPr>
+            <w:tcW w:w="2250" w:type="dxa"/>
+          </w:tcPr>
+          <w:p>
+            <w:pPr>
+              <w:pStyle w:val="Body"/>
+            </w:pPr>
+            <w:r>
+              <w:t>+0.07 [-0.08, +0.23]</w:t>
+            </w:r>
+          </w:p>
+        </w:tc>
+        <w:tc>
+          <w:tcPr>
+            <w:tcW w:w="2250" w:type="dxa"/>
+          </w:tcPr>
+          <w:p>
+            <w:pPr>
+              <w:pStyle w:val="Body"/>
+            </w:pPr>
+            <w:r>
+              <w:t>+0.37 [+0.22, +0.52]</w:t>
+            </w:r>
+          </w:p>
+        </w:tc>
+      </w:tr>
+      <w:tr>
+        <w:tc>
+          <w:tcPr>
+            <w:tcW w:w="2250" w:type="dxa"/>
+          </w:tcPr>
+          <w:p>
+            <w:pPr>
+              <w:pStyle w:val="Body"/>
+            </w:pPr>
+            <w:r>
+              <w:t>Forums (56)</w:t>
+            </w:r>
+          </w:p>
+        </w:tc>
+        <w:tc>
+          <w:tcPr>
+            <w:tcW w:w="2250" w:type="dxa"/>
+          </w:tcPr>
+          <w:p>
+            <w:pPr>
+              <w:pStyle w:val="Body"/>
+            </w:pPr>
+            <w:r>
+              <w:t>+0.93 [+0.84, +1.00]</w:t>
+            </w:r>
+          </w:p>
+        </w:tc>
+        <w:tc>
+          <w:tcPr>
+            <w:tcW w:w="2250" w:type="dxa"/>
+          </w:tcPr>
+          <w:p>
+            <w:pPr>
+              <w:pStyle w:val="Body"/>
+            </w:pPr>
+            <w:r>
+              <w:t>+0.48 [+0.25, +0.70]</w:t>
+            </w:r>
+          </w:p>
+        </w:tc>
+        <w:tc>
+          <w:tcPr>
+            <w:tcW w:w="2250" w:type="dxa"/>
+          </w:tcPr>
+          <w:p>
+            <w:pPr>
+              <w:pStyle w:val="Body"/>
+            </w:pPr>
+            <w:r>
+              <w:t>+0.91 [+0.80, +1.00]</w:t>
+            </w:r>
+          </w:p>
+        </w:tc>
+      </w:tr>
+      <w:tr>
+        <w:tc>
+          <w:tcPr>
+            <w:tcW w:w="2250" w:type="dxa"/>
+          </w:tcPr>
+          <w:p>
+            <w:pPr>
+              <w:pStyle w:val="Body"/>
+            </w:pPr>
+            <w:r>
+              <w:t>Listings (30)</w:t>
+            </w:r>
+          </w:p>
+        </w:tc>
+        <w:tc>
+          <w:tcPr>
+            <w:tcW w:w="2250" w:type="dxa"/>
+          </w:tcPr>
+          <w:p>
+            <w:pPr>
+              <w:pStyle w:val="Body"/>
+            </w:pPr>
+            <w:r>
+              <w:t>+0.27 [-0.07, +0.57]</w:t>
+            </w:r>
+          </w:p>
+        </w:tc>
+        <w:tc>
+          <w:tcPr>
+            <w:tcW w:w="2250" w:type="dxa"/>
+          </w:tcPr>
+          <w:p>
+            <w:pPr>
+              <w:pStyle w:val="Body"/>
+            </w:pPr>
+            <w:r>
+              <w:t>+0.27 [-0.07, +0.60]</w:t>
+            </w:r>
+          </w:p>
+        </w:tc>
+        <w:tc>
+          <w:tcPr>
+            <w:tcW w:w="2250" w:type="dxa"/>
+          </w:tcPr>
+          <w:p>
+            <w:pPr>
+              <w:pStyle w:val="Body"/>
+            </w:pPr>
+            <w:r>
+              <w:t>+0.33 [0.00, +0.67]</w:t>
+            </w:r>
+          </w:p>
+        </w:tc>
+      </w:tr>
+      <w:tr>
+        <w:tc>
+          <w:tcPr>
+            <w:tcW w:w="2250" w:type="dxa"/>
+          </w:tcPr>
+          <w:p>
+            <w:pPr>
+              <w:pStyle w:val="Body"/>
+            </w:pPr>
+            <w:r>
+              <w:t>Services (112)</w:t>
+            </w:r>
+          </w:p>
+        </w:tc>
+        <w:tc>
+          <w:tcPr>
+            <w:tcW w:w="2250" w:type="dxa"/>
+          </w:tcPr>
+          <w:p>
+            <w:pPr>
+              <w:pStyle w:val="Body"/>
+            </w:pPr>
+            <w:r>
+              <w:t>+0.31 [+0.14, +0.47]</w:t>
+            </w:r>
+          </w:p>
+        </w:tc>
+        <w:tc>
+          <w:tcPr>
+            <w:tcW w:w="2250" w:type="dxa"/>
+          </w:tcPr>
+          <w:p>
+            <w:pPr>
+              <w:pStyle w:val="Body"/>
+            </w:pPr>
+            <w:r>
+              <w:t>+0.17 [-0.01, +0.35]</w:t>
+            </w:r>
+          </w:p>
+        </w:tc>
+        <w:tc>
+          <w:tcPr>
+            <w:tcW w:w="2250" w:type="dxa"/>
+          </w:tcPr>
+          <w:p>
+            <w:pPr>
+              <w:pStyle w:val="Body"/>
+            </w:pPr>
+            <w:r>
+              <w:t>+0.34 [+0.17, +0.51]</w:t>
+            </w:r>
+          </w:p>
+        </w:tc>
+      </w:tr>
+      <w:tr>
+        <w:tc>
+          <w:tcPr>
+            <w:tcW w:w="2250" w:type="dxa"/>
+          </w:tcPr>
+          <w:p>
+            <w:pPr>
+              <w:pStyle w:val="Body"/>
+            </w:pPr>
+            <w:r>
+              <w:t>WCXB clean, all (367)</w:t>
+            </w:r>
+          </w:p>
+        </w:tc>
+        <w:tc>
+          <w:tcPr>
+            <w:tcW w:w="2250" w:type="dxa"/>
+          </w:tcPr>
+          <w:p>
+            <w:pPr>
+              <w:pStyle w:val="Body"/>
+            </w:pPr>
+            <w:r>
+              <w:t>+0.25 [+0.16, +0.34]</w:t>
+            </w:r>
+          </w:p>
+        </w:tc>
+        <w:tc>
+          <w:tcPr>
+            <w:tcW w:w="2250" w:type="dxa"/>
+          </w:tcPr>
+          <w:p>
+            <w:pPr>
+              <w:pStyle w:val="Body"/>
+            </w:pPr>
+            <w:r>
+              <w:t>+0.22 [+0.13, +0.32]</w:t>
+            </w:r>
+          </w:p>
+        </w:tc>
+        <w:tc>
+          <w:tcPr>
+            <w:tcW w:w="2250" w:type="dxa"/>
+          </w:tcPr>
+          <w:p>
+            <w:pPr>
+              <w:pStyle w:val="Body"/>
+            </w:pPr>
+            <w:r>
+              <w:t>not run</w:t>
+            </w:r>
+          </w:p>
+        </w:tc>
+      </w:tr>
+    </w:tbl>
     <w:p>
       <w:pPr>
         <w:pStyle w:val="Body"/>
@@ -2412,8 +2839,8 @@
       <w:r>
         <w:drawing>
           <wp:inline distT="0" distB="0" distL="0" distR="0">
-            <wp:extent cx="5943600" cy="1981200"/>
-            <wp:docPr id="4" name="fig4_retrieval.png"/>
+            <wp:extent cx="5943600" cy="2485644"/>
+            <wp:docPr id="4" name="fig5_judge.png"/>
             <wp:cNvGraphicFramePr>
               <ns2:graphicFrameLocks xmlns:ns2="http://schemas.openxmlformats.org/drawingml/2006/main" noChangeAspect="1"/>
             </wp:cNvGraphicFramePr>
@@ -2421,7 +2848,7 @@
               <ns3:graphicData uri="http://schemas.openxmlformats.org/drawingml/2006/picture">
                 <ns4:pic xmlns:ns4="http://schemas.openxmlformats.org/drawingml/2006/picture">
                   <ns4:nvPicPr>
-                    <ns4:cNvPr id="4" name="fig4_retrieval.png"/>
+                    <ns4:cNvPr id="4" name="fig5_judge.png"/>
                     <ns4:cNvPicPr/>
                   </ns4:nvPicPr>
                   <ns4:blipFill>
@@ -2433,7 +2860,7 @@
                   <ns4:spPr>
                     <ns3:xfrm>
                       <ns3:off x="0" y="0"/>
-                      <ns3:ext cx="5943600" cy="1981200"/>
+                      <ns3:ext cx="5943600" cy="2485644"/>
                     </ns3:xfrm>
                     <ns3:prstGeom prst="rect">
                       <ns3:avLst/>
@@ -2454,67 +2881,15 @@
         <w:rPr>
           <w:i/>
         </w:rPr>
-        <w:t>Figure 4. BM25 retrieval over each tool's ~200-word chunks on the 178 fresh-company landing pages, 668 known-item queries. (a) Share of queries whose page is in the top five chunks (ChromeRAG in coverage mode). (b) Share of the retrieved top-five text that is navigation, header or footer chrome.</w:t>
-      </w:r>
-    </w:p>
-    <w:p>
-      <w:pPr>
-        <w:pStyle w:val="Body"/>
-      </w:pPr>
-      <w:r>
-        <w:t>A pairwise judgement by one language model (gpt-5.6-luna; tool names hidden, output order randomised) was run on two samples; about 83% of pairs repeated with swapped positions got the same verdict, so the judge is noisy and, being proprietary, cannot be reproduced exactly. Prompt, samples and raw judgements are in the repository. On 100 landing pages ChromeRAG (coverage) was preferred over Trafilatura on 70% and over MarkItDown on 87%, against 28% and 12% (held-out pages 62% against 36%, fresh pages 78% against 20% for Trafilatura; Fig. 5). A second sample of 105 WCXB test pages (15 per type) contained 33 pages from the dev/ folder; on the other 72, ChromeRAG (balanced) was preferred over MarkItDown on 79% against 21%, over Readability on 68% against 28%, and over Trafilatura on 53% against 44%, a difference whose interval includes zero. By type on these 72 pages ChromeRAG won more pairs than it lost against Trafilatura on service (11 against 4) and forum (11 against 4) pages and fewer on articles (4 against 6), documentation (5 against 9) and listings (4 against 7), in line with the F1 ties on articles and documentation. Content kept scored 4.2 against 3.9 for Trafilatura and chrome left out 3.9 against 4.0 (5 means no chrome): Trafilatura leaves slightly less chrome, ChromeRAG keeps more content.</w:t>
-      </w:r>
-    </w:p>
-    <w:p>
-      <w:pPr>
-        <w:pStyle w:val="Body"/>
-      </w:pPr>
-      <w:r>
-        <w:drawing>
-          <wp:inline distT="0" distB="0" distL="0" distR="0">
-            <wp:extent cx="5943600" cy="1571244"/>
-            <wp:docPr id="5" name="fig5_judge.png"/>
-            <wp:cNvGraphicFramePr>
-              <ns2:graphicFrameLocks xmlns:ns2="http://schemas.openxmlformats.org/drawingml/2006/main" noChangeAspect="1"/>
-            </wp:cNvGraphicFramePr>
-            <ns3:graphic xmlns:ns3="http://schemas.openxmlformats.org/drawingml/2006/main">
-              <ns3:graphicData uri="http://schemas.openxmlformats.org/drawingml/2006/picture">
-                <ns4:pic xmlns:ns4="http://schemas.openxmlformats.org/drawingml/2006/picture">
-                  <ns4:nvPicPr>
-                    <ns4:cNvPr id="5" name="fig5_judge.png"/>
-                    <ns4:cNvPicPr/>
-                  </ns4:nvPicPr>
-                  <ns4:blipFill>
-                    <ns3:blip r:embed="rId30"/>
-                    <ns3:stretch>
-                      <ns3:fillRect/>
-                    </ns3:stretch>
-                  </ns4:blipFill>
-                  <ns4:spPr>
-                    <ns3:xfrm>
-                      <ns3:off x="0" y="0"/>
-                      <ns3:ext cx="5943600" cy="1571244"/>
-                    </ns3:xfrm>
-                    <ns3:prstGeom prst="rect">
-                      <ns3:avLst/>
-                    </ns3:prstGeom>
-                  </ns4:spPr>
-                </ns4:pic>
-              </ns3:graphicData>
-            </ns3:graphic>
-          </wp:inline>
-        </w:drawing>
-      </w:r>
-    </w:p>
-    <w:p>
-      <w:pPr>
-        <w:pStyle w:val="Body"/>
-      </w:pPr>
-      <w:r>
-        <w:rPr>
-          <w:i/>
-        </w:rPr>
-        <w:t>Figure 5. Pairwise judgement by one language model, tool names hidden, of ChromeRAG against Trafilatura and MarkItDown: 100 landing pages (coverage mode) and 72 WCXB test pages absent from the development folder (balanced mode); grey marks ties.</w:t>
+        <w:t>Figure 4. Net score (wins minus losses over pairs; +1 means always preferred) of ChromeRAG against Trafilatura under blinded pairwise judging by three model families, with 95% bootstrap intervals: (a) 328 fresh pages, (b) 367 WCXB test pages absent from the development folder (Gemini was not run on (b)).</w:t>
+      </w:r>
+    </w:p>
+    <w:p>
+      <w:pPr>
+        <w:pStyle w:val="Body"/>
+      </w:pPr>
+      <w:r>
+        <w:t>As Table 3 and Fig. 4 show, all three families rank ChromeRAG ahead of Trafilatura overall, with intervals above zero; the size of the margin differs by judge, and the families agree that forums gain most and that the gain on articles, listings and services is smaller (and, with GPT, not distinguishable from zero on articles, listings and services). Content kept scored higher for ChromeRAG (4.26 against 3.75 with Claude, 4.14 against 3.88 with GPT and 4.49 against 3.75 with Gemini on the fresh pages) and chrome left out scored about equal (4.02 against 3.88, 4.09 against 4.16 and 4.46 against 4.26). Against Readability, GPT prefers ChromeRAG on the fresh pages with +0.52 [+0.44, +0.61]. On two held-out sets of 180 documentation pages from 40 sites and 97 product pages from 22 shops (fetched the same way), GPT gives +0.07 [-0.07, +0.21] and +0.40 [+0.22, +0.57]: a tie on documentation and a clear gain on product pages. The judges are language models, so their agreement is evidence, not a human assessment. An early version was judged worse than Trafilatura (net -0.13 on the WCXB pages); the fixes that reversed this came from reading the judges' reasons on development material, which is why the fresh pages were fixed in advance and used once.</w:t>
       </w:r>
     </w:p>
     <w:p>
@@ -2522,6 +2897,38 @@
         <w:pStyle w:val="Heading2"/>
       </w:pPr>
       <w:r>
+        <w:t>Retrieval, anchors and chunks</w:t>
+      </w:r>
+    </w:p>
+    <w:p>
+      <w:pPr>
+        <w:pStyle w:val="Body"/>
+      </w:pPr>
+      <w:r>
+        <w:t>The structural-anchor metric is computed from each input page, independently of any tool: content recall is the share of word 5-grams from &lt;main&gt;/&lt;article&gt; text found in the output, noise retention the share of 5-grams from navigation, header, footer, aside and cookie containers found, and F_bal their harmonic combination. It cannot see chrome inside &lt;main&gt;, which the rules now remove, so it understates ChromeRAG. In coverage mode ChromeRAG reaches 0.741 on 177 held-out landing pages and 0.735 on 178 pages of 51 companies fetched after the 0.1.3 freeze, against 0.680 and 0.649 for Trafilatura (+0.061 [+0.032, +0.090] and +0.087 [+0.054, +0.119]), and 0.797 against 0.739 on 242 documentation pages that were a development set (+0.058 [+0.034, +0.085]). MarkItDown keeps 24 to 26% of the chrome anchors, ChromeRAG at most 0.9%.</w:t>
+      </w:r>
+    </w:p>
+    <w:p>
+      <w:pPr>
+        <w:pStyle w:val="Body"/>
+      </w:pPr>
+      <w:r>
+        <w:t>BM25 retrieval (k1 1.2, b 0.75) with known-item queries (titles, headings and two 12-word passages per page, about 200-word chunks) gives a hit@5 of 0.894 for ChromeRAG (balanced) against 0.832 for Trafilatura and 0.949 for MarkItDown on 668 queries over the fresh landing pages, and 0.948 against 0.921 and 0.964 on 773 queries over the documentation corpus. MarkItDown retrieves slightly more because it keeps everything, at 2.3 to 2.6% chrome in the retrieved context against 0.3 to 0.4% for ChromeRAG and 0.6 to 1.1% for Trafilatura.</w:t>
+      </w:r>
+    </w:p>
+    <w:p>
+      <w:pPr>
+        <w:pStyle w:val="Body"/>
+      </w:pPr>
+      <w:r>
+        <w:t>Do chunks that carry their heading path retrieve better? We cut 354 documentation pages from 50 sites not used in training into 3,395 chunks and had Claude write one natural question for each of 400 chunks, given the chunk and its page title. Prepending the title and heading path to the embedded text raised dense MRR (text-embedding-3-small) from 0.853 to 0.913 (+0.060, 95% CI [+0.036, +0.083]) and BM25 MRR by the same amount (+0.060 [+0.039, +0.081]); the title alone gives about two thirds of the gain. This supports contextual chunk headers [20] on one corpus; the question writer saw the page title, and other page types and languages are untested.</w:t>
+      </w:r>
+    </w:p>
+    <w:p>
+      <w:pPr>
+        <w:pStyle w:val="Heading2"/>
+      </w:pPr>
+      <w:r>
         <w:t>Site-template learning on real sites</w:t>
       </w:r>
     </w:p>
@@ -2530,7 +2937,7 @@
         <w:pStyle w:val="Body"/>
       </w:pPr>
       <w:r>
-        <w:t>poc/run_stce_eval.py compares coverage output with and without the site model. On 11 benchmark site groups (49 pages) F_bal rises from 0.868 to 0.870. A crawl of up to 15 same-section pages from each documentation site (1,791 pages in 125 groups, robots.txt respected, list in poc/stce_crawl_urls.json) shows STCE changing 314 pages and leaving F_bal level (0.876 to 0.877); text repeated across a site falls from 12.6 to 12.3 five-grams per page, and 13 pages from seven sites lose more than 0.05 recall (not inspected individually). Since the learned filter already removes most repeated chrome (site-repeated text is 2.1% of ChromeRAG's output, 2.1% for Trafilatura and 34.9% for MarkItDown), STCE is an optional, guarded complement for template blocks that read like content, as in the example above; it is not the main source of accuracy.</w:t>
+        <w:t>poc/run_stce_eval.py compares coverage output with and without the site model. On 11 benchmark site groups (47 scoreable pages) F_bal is 0.840 without and 0.837 with the model. On a crawl of 125 documentation and product sites (1,727 scoreable pages) it is 0.866 without and 0.867 with the model, against 0.841 for Trafilatura. Since the learned filter and the rules already remove most repeated chrome (site-repeated text is 0.4% of ChromeRAG's output and 0.5% of Trafilatura's, against 26.7% for MarkItDown), STCE is an optional, guarded complement for template blocks that read like content, as in the example above; it no longer adds accuracy on these pages.</w:t>
       </w:r>
     </w:p>
     <w:p>
@@ -2560,7 +2967,7 @@
         <w:t>Improving an existing workflow.</w:t>
       </w:r>
       <w:r>
-        <w:t xml:space="preserve"> Chunking and embedding scraped HTML is routine data engineering, and chrome removal is often done with per-site regular expressions. ChromeRAG offers one tested step instead: CPU-only, offline, without a model download, reporting what it removed and why, with a heuristic low-confidence warning. Its accuracy gain concentrates where article-tuned tools fail: forum pages (clear on held-out data) and, by cross-validation, category pages; on articles and documentation it matches Trafilatura. On the fresh-company evaluation it retrieved the right page more often than Trafilatura (hit@5 0.916 against 0.832) and left about 23 times less chrome in the retrieved context than MarkItDown (5 times on the documentation corpus).</w:t>
+        <w:t xml:space="preserve"> Chunking and embedding scraped HTML is routine data engineering, and chrome removal is often done with per-site regular expressions. ChromeRAG offers one tested step instead: CPU-only, offline, reporting what it removed and why. Its gain concentrates where article-tuned tools fail (forums, service and category pages) and it matches Trafilatura on articles and documentation by F1. On the fresh-company pages it retrieved the right page more often than Trafilatura (hit@5 0.894 against 0.832) and left about eight times less chrome in the retrieved context than MarkItDown.</w:t>
       </w:r>
     </w:p>
     <w:p>
@@ -2574,7 +2981,7 @@
         <w:t>Integration pathways.</w:t>
       </w:r>
       <w:r>
-        <w:t xml:space="preserve"> The LangChain loader and LlamaIndex reader turn stored HTML files into documents whose metadata carries the front-matter, so a splitter copies title, type and breadcrumb onto every chunk. chromerag batch fits Airflow or Prefect jobs after a crawl; its summary sends thin pages to a headless browser, and the confidence estimate lets a job route uncertain pages to review.</w:t>
+        <w:t xml:space="preserve"> The LangChain loader and LlamaIndex reader turn stored HTML files into documents whose metadata carries the front-matter, so a splitter copies title, type and breadcrumb onto every chunk; chunks() does the same for vector databases without a framework.</w:t>
       </w:r>
     </w:p>
     <w:p>
@@ -2588,7 +2995,7 @@
         <w:t>New research questions.</w:t>
       </w:r>
       <w:r>
-        <w:t xml:space="preserve"> The repository includes the harness: site-grouped cross-validation, final-evaluation scripts, error taxonomy, the landing-corpus builder with a pre-registered split, judge and retrieval evaluations, and per-page outputs. Open questions include transfer to other languages and page mixes, and how site models age.</w:t>
+        <w:t xml:space="preserve"> The repository includes the full harness: cross-validation, corpus builders with frozen seed lists, blinded judge builders and per-page outputs. Open questions include other languages and page mixes, how site models age, and agreement between language-model and human judges.</w:t>
       </w:r>
     </w:p>
     <w:p>
@@ -2602,7 +3009,7 @@
         <w:t>Adoption.</w:t>
       </w:r>
       <w:r>
-        <w:t xml:space="preserve"> ChromeRAG was first released on PyPI and GitHub in September 2026, so download, citation and third-party usage figures are not yet meaningful. The issue tracker, the live leaderboards at https://pedapudibhargav.github.io/ChromeRAG/ and the archived releases are the channels for outside feedback.</w:t>
+        <w:t xml:space="preserve"> ChromeRAG was first released on PyPI and GitHub in September 2026, so download, citation and third-party usage figures are not yet meaningful. Outside feedback goes to the issue tracker.</w:t>
       </w:r>
     </w:p>
     <w:p>
@@ -2616,7 +3023,7 @@
         <w:t>Limitations.</w:t>
       </w:r>
       <w:r>
-        <w:t xml:space="preserve"> (i) No JavaScript is run; shells are flagged, not recovered. (ii) The model was trained on one benchmark (mostly English); its features include English stop words and call-to-action verbs, and other languages and page mixes are untested. (iii) Labels are word overlaps with human-reviewed references, and annotators are inconsistent in places (documentation code samples are included on 82% of pages but omitted for repeated live samples on others), which caps the gain on documentation. (iv) The ceilings of block selection are 0.975 for articles but 0.80 to 0.85 for products, collections, listings and forums. (v) The public WCXB dev/ folder contains 139 test pages and 166 test pages share a domain with development; we report test results without them, and cannot say much about products and collections on held-out data. Part of the landing-page and documentation evidence also shares registrable domains with development, and the documentation corpus is a development set. (vi) The anchor metric and retrieval queries come from &lt;main&gt;/&lt;article&gt;, which the content-root selection also targets; judge results come from one proprietary model; none of this is a human assessment. (vii) STCE needs at least three pages per site group. (viii) Only HTML is handled. (ix) The benchmark's author also builds a competing extractor; we use the public data and a scorer that follows the benchmark's word-F1 definition but removes ChromeRAG's front-matter.</w:t>
+        <w:t xml:space="preserve"> (i) No JavaScript is run; shells are flagged, not recovered. (ii) The model was trained on one mostly English benchmark, and its features include English stop words and call-to-action verbs. (iii) Labels are word overlaps with human-reviewed references, with some annotator inconsistency (documentation code samples are included on 82% of pages), which caps the gain on documentation. (iv) The public WCXB dev/ folder contains 139 test pages, and 166 test pages share a domain with development; we report test results without the former and can say little about products and collections. (v) The anchor metric and retrieval queries come from &lt;main&gt;/&lt;article&gt;; judged results come from language models, whose verdicts are noisy (about 83% of swapped pairs repeated in an earlier check with one judge) and, for GPT and Gemini, not exactly reproducible; none is a human assessment. (vi) The rules were developed on documentation, landing and WCXB development pages; the fresh pages were used once, but the judges' summary scores had shown which page types needed work. (vii) STCE needs at least three pages per site group and added no accuracy on the pages we measured. (viii) Only HTML is handled. (ix) The benchmark's author also builds a competing extractor; we use the public data, a scorer that follows the benchmark's F1 definition, independent corpora and independent judges. (x) We did not compare with language-model extractors [12, 13], which need a GPU or a hosted model.</w:t>
       </w:r>
     </w:p>
     <w:p>
@@ -2640,7 +3047,7 @@
         <w:pStyle w:val="Body"/>
       </w:pPr>
       <w:r>
-        <w:t>ChromeRAG is a focused, installable component for the ingest step of web RAG pipelines. A 150 KB learned block filter, run with NumPy, removes site chrome across page types: on 372 held-out WCXB test pages it gains 0.036 F1 over Trafilatura, with a clear gain on forum pages (+0.153) and ties on articles, documentation, services and listings; cross-validation also favours it on collections. It can learn a site's template, carries Schema.org metadata and tables into chunk-friendly form, and reports unusable inputs and uncertain pages. On company landing pages a language-model judge prefers its output to Trafilatura's on 70% of pages and to MarkItDown's on 87%; on a mixed WCXB sample it prefers it to MarkItDown's on 79% and is tied with Trafilatura. The code, the model, the scripts and the per-page results are openly available. Planned work covers multilingual training data, retraining without the 139 duplicated files, an optional sentence-encoder feature [20] and evaluation with generated answers.</w:t>
+        <w:t>ChromeRAG is a focused, installable component for the ingest step of web RAG pipelines. A 150 KB learned block filter, structural rules adapted from Trafilatura's discard patterns and a heading-aware chunker remove site chrome across page types: on 372 held-out WCXB test pages it gains 0.040 F1 over Trafilatura (forums +0.164, services +0.051) and ties on articles, documentation and listings; on 328 fresh pages blinded judges from three model families prefer it, and it retrieves better than Trafilatura with heading context adding 0.06 MRR. It can learn a site's template, carries Schema.org metadata and tables into chunk-friendly form, and reports unusable inputs and uncertain pages. The code, the model, the scripts, the frozen seed lists and the per-page results are openly available. Planned work covers multilingual training data, retraining without the 139 duplicated files, human-rated judgements and an optional sentence-encoder feature [21].</w:t>
       </w:r>
     </w:p>
     <w:p>
@@ -2710,7 +3117,7 @@
         <w:pStyle w:val="Body"/>
       </w:pPr>
       <w:r>
-        <w:t>The software, the model, the training and evaluation scripts, the benchmark URL lists (poc/corpus_urls.json, poc/landing_urls.json, poc/landing_urls_fresh.json, poc/landing_split.json, poc/stce_crawl_urls.json), per-page scores, judge prompts and raw judgements, and aggregate results (evaluations/2026-10-v0.1.3/, docs/data/) are openly available at https://github.com/pedapudibhargav/ChromeRAG under the MIT license. WCXB (https://arxiv.org/abs/2605.21097, CC-BY-4.0) is obtained from its authors' release. The raw third-party HTML pages are not redistributed. They can be fetched again with python -m poc.run_corpus_comparison, although live pages change over time.</w:t>
+        <w:t>The software, the model, the training and evaluation scripts, the benchmark URL lists and frozen seed lists (poc/corpus_urls.json, poc/landing_urls.json, poc/landing_urls_fresh.json, poc/landing_split.json, poc/stce_crawl_urls.json, poc/extra_seeds*.json), per-page scores, judge prompts and raw judgements, and aggregate results (evaluations/2026-10-v0.1.3/, docs/data/) are openly available at https://github.com/pedapudibhargav/ChromeRAG under the MIT license. WCXB (https://arxiv.org/abs/2605.21097, CC-BY-4.0) is obtained from its authors' release. The raw third-party HTML pages are not redistributed. They can be fetched again with the scripts in poc/, although live pages change over time.</w:t>
       </w:r>
     </w:p>
     <w:p>
@@ -2726,7 +3133,7 @@
         <w:pStyle w:val="Body"/>
       </w:pPr>
       <w:r>
-        <w:t>During the preparation of this work the author used Cursor (with a Grok-based coding agent) and Anthropic Claude (Claude Code) in order to assist with software development, code review, drafting and editing of the manuscript text, analysis scripts for the evaluation, and verification of reported numbers against the benchmark outputs. The author also used OpenAI models as components of the evaluation itself: gpt-5.6-luna as the blind pairwise judge of extraction quality and text-embedding-3-small for the dense-retrieval experiment; their prompts, samples and outputs are published with the repository. After using these tools, the author reviewed and edited the content as needed and takes full responsibility for the content of the published article.</w:t>
+        <w:t>During the preparation of this work the author used Anthropic Claude (Claude Code) and AI coding agents in a code editor in order to assist with software development, code review, drafting and editing of the manuscript text, analysis scripts for the evaluation, and verification of reported numbers against the benchmark outputs. The author also used language models as components of the evaluation itself: Claude Sonnet, OpenAI gpt-5.6-luna and Google Gemini 3.7 Flash as blind pairwise judges of extraction quality, Claude to write retrieval questions, and OpenAI text-embedding-3-small for the dense-retrieval experiment; their prompts, samples and outputs are published with the repository. After using these tools, the author reviewed and edited the content as needed and takes full responsibility for the content of the published article.</w:t>
       </w:r>
     </w:p>
     <w:p>
@@ -2924,7 +3331,15 @@
         <w:pStyle w:val="Body"/>
       </w:pPr>
       <w:r>
-        <w:t>20. N. Reimers and I. Gurevych, "Sentence-BERT: Sentence Embeddings using Siamese BERT-Networks," in Proc. EMNLP-IJCNLP 2019, 2019, pp. 3980–3990. doi: 10.18653/v1/D19-1410.</w:t>
+        <w:t>20. Anthropic, "Introducing Contextual Retrieval," 19 September 2024. [Online]. Available: https://www.anthropic.com/news/contextual-retrieval</w:t>
+      </w:r>
+    </w:p>
+    <w:p>
+      <w:pPr>
+        <w:pStyle w:val="Body"/>
+      </w:pPr>
+      <w:r>
+        <w:t>21. N. Reimers and I. Gurevych, "Sentence-BERT: Sentence Embeddings using Siamese BERT-Networks," in Proc. EMNLP-IJCNLP 2019, 2019, pp. 3980–3990. doi: 10.18653/v1/D19-1410.</w:t>
       </w:r>
     </w:p>
     <w:sectPr>

</xml_diff>

<commit_message>
Manuscript review fixes, highlights, worklog; Terra price entry
Co-Authored-By: Claude Sonnet 5.5 <noreply@anthropic.com>
</commit_message>
<xml_diff>
--- a/papers/softwarex/ChromeRAG_SoftwareX_OSP.docx
+++ b/papers/softwarex/ChromeRAG_SoftwareX_OSP.docx
@@ -85,7 +85,7 @@
         </w:rPr>
       </w:pPr>
       <w:r>
-        <w:t>Web pages indexed for retrieval-augmented generation (RAG) carry navigation, banners and comment threads that become noisy chunks. ChromeRAG is an MIT-licensed, CPU-only Python package and command-line tool that converts HTML into RAG-ready Markdown and heading-aware chunks. A 150 KB gradient-boosted tree model, run with NumPy only, scores each text block; rules and an optional site model remove repeated chrome. On 372 WCXB test pages absent from its training folder it reaches a word-level F1 of 0.907 against 0.867 for Trafilatura. On 328 pages from 106 unseen sites, blinded judges from three model families prefer it to Trafilatura (net score +0.19 to +0.45).</w:t>
+        <w:t>Web pages indexed for retrieval-augmented generation (RAG) carry navigation, banners and comment threads that become noisy chunks. ChromeRAG is an MIT-licensed, CPU-only Python package and command-line tool that converts HTML into RAG-ready Markdown and heading-aware chunks. A 150 KB gradient-boosted tree model, run with NumPy only, scores each text block; rules and an optional site model remove repeated chrome. On 372 WCXB test pages absent from its training folder it reaches a word-level F1 of 0.907 (front-matter excluded) against 0.867 for Trafilatura. On 328 pages from 106 unseen sites, blinded judges from three model families prefer it to Trafilatura (net score +0.19 to +0.45).</w:t>
       </w:r>
     </w:p>
     <w:p>
@@ -2336,7 +2336,7 @@
         <w:pStyle w:val="Body"/>
       </w:pPr>
       <w:r>
-        <w:t>Scores are means of page-level F1; intervals are percentile intervals of a paired bootstrap over pages (5,000 resamples, seed 0). On the 372 pages ChromeRAG leads Trafilatura by +0.040 (95% CI [+0.021, +0.059]): by +0.164 on forums [+0.102, +0.230], +0.051 on services [+0.004, +0.107] and +0.057 on the 9 collection pages [+0.024, +0.090]; on articles, documentation and listings the intervals contain zero, and 2 product pages allow no conclusion. Required snippets are found more often (0.783 against 0.743) and forbidden snippets less often (0.064 against 0.083). The benchmark's publication [10] reports 0.903 for the page-type-aware Rust extractor [11] and 0.841 for Trafilatura on all 511 test pages under its own configuration; we could not build that tool, so we quote it and claim no superiority; the settings differ and the numbers are not interchangeable.</w:t>
+        <w:t>Scores are means of page-level F1; intervals are percentile intervals of a paired bootstrap over pages (5,000 resamples, seed 0). On the 372 pages ChromeRAG leads Trafilatura by +0.040 (95% CI [+0.021, +0.059]; resampling its 316 domains instead, [+0.019, +0.062]): by +0.164 on forums [+0.102, +0.230], +0.051 on services [+0.004, +0.107] and +0.057 on the 9 collection pages [+0.024, +0.090]; on articles, documentation and listings the intervals contain zero, and 2 product pages allow no conclusion. Required snippets are found more often (0.783 against 0.743) and forbidden snippets less often (0.064 against 0.083). The benchmark's publication [10] reports 0.903 for the page-type-aware Rust extractor [11] and 0.841 for Trafilatura on all 511 test pages under its own configuration; we could not build that tool, so we quote it and claim no superiority; the settings differ and the numbers are not interchangeable.</w:t>
       </w:r>
     </w:p>
     <w:p>
@@ -2412,7 +2412,7 @@
         <w:pStyle w:val="Body"/>
       </w:pPr>
       <w:r>
-        <w:t>F1 against human labels cannot see everything a RAG index cares about, so we added blinded pairwise judging. Before any extractor ran on them, we wrote seed lists of 106 sites that no earlier step had used: 40 news, magazine and engineering-blog sites, 25 forums and question-and-answer sites, 30 listing and category pages and 40 service and software landing sites. A fixed script fetched 328 pages (130 articles, 56 forum threads, 30 listings, 112 service pages; robots.txt respected). For each page, a judge saw the page's visible text and two outputs, ChromeRAG (balanced) and Trafilatura, in random order with tool names hidden, and applied one rubric: which output is better to index for RAG (content kept, chrome left out, structure), with 1-to-5 scores for content and chrome. Three model families judged the same pairs: Claude Sonnet 5.5 (sub-agents), GPT-5.6 luna and Gemini 3.7 Flash. The net score is wins minus losses divided by pairs (range -1 to +1; ties count zero); intervals are bootstrapped over pages. Code, rubric, pairs and verdicts are in the repository.</w:t>
+        <w:t>F1 against human labels cannot see everything a RAG index cares about, so we added blinded pairwise judging. Before any extractor ran on them, we wrote seed lists of 135 sites that no earlier step had used: 40 news, magazine and engineering-blog sites, 25 forums and question-and-answer sites, 30 listing and category pages and 40 service and software landing sites. A fixed script fetched 328 pages from the 106 sites that responded (130 articles, 56 forum threads, 30 listings, 112 service pages; robots.txt respected). For each page, a judge saw the page's visible text and two outputs, ChromeRAG (balanced) and Trafilatura, in random order with tool names hidden (ChromeRAG's front-matter removed, long outputs shortened alike), and applied one rubric: which output is better to index for RAG (content kept, chrome left out, structure), with 1-to-5 scores for content and chrome. Three model families judged the same pairs: Claude Sonnet 5.5 (sub-agents), GPT-5.6 luna and Gemini 3.7 Flash. The net score is wins minus losses divided by pairs (range -1 to +1; ties count zero); intervals are bootstrapped over pages. Code, rubric, pairs and verdicts are in the repository.</w:t>
       </w:r>
     </w:p>
     <w:p>
@@ -2905,7 +2905,7 @@
         <w:pStyle w:val="Body"/>
       </w:pPr>
       <w:r>
-        <w:t>The structural-anchor metric is computed from each input page, independently of any tool: content recall is the share of word 5-grams from &lt;main&gt;/&lt;article&gt; text found in the output, noise retention the share of 5-grams from navigation, header, footer, aside and cookie containers found, and F_bal their harmonic combination. It cannot see chrome inside &lt;main&gt;, which the rules now remove, so it understates ChromeRAG. In coverage mode ChromeRAG reaches 0.741 on 177 held-out landing pages and 0.735 on 178 pages of 51 companies fetched after the 0.1.3 freeze, against 0.680 and 0.649 for Trafilatura (+0.061 [+0.032, +0.090] and +0.087 [+0.054, +0.119]), and 0.797 against 0.739 on 242 documentation pages that were a development set (+0.058 [+0.034, +0.085]). MarkItDown keeps 24 to 26% of the chrome anchors, ChromeRAG at most 0.9%.</w:t>
+        <w:t>The structural-anchor metric is computed from each input page, independently of any tool: content recall is the share of word 5-grams from &lt;main&gt;/&lt;article&gt; text found in the output, noise retention the share of 5-grams from navigation, header, footer, aside and cookie containers found, and F_bal their harmonic combination. It cannot see chrome inside &lt;main&gt;, which the rules now remove, so it understates ChromeRAG. In coverage mode ChromeRAG reaches 0.741 on 177 held-out landing pages and 0.735 on 178 pages of 51 companies fetched after the 0.1.3 freeze, against 0.680 and 0.649 for Trafilatura (+0.061 [+0.032, +0.090] and +0.087 [+0.054, +0.119]), and 0.797 against 0.739 on 242 documentation pages that were a development set (+0.058 [+0.034, +0.085]).</w:t>
       </w:r>
     </w:p>
     <w:p>
@@ -3023,7 +3023,7 @@
         <w:t>Limitations.</w:t>
       </w:r>
       <w:r>
-        <w:t xml:space="preserve"> (i) No JavaScript is run; shells are flagged, not recovered. (ii) The model was trained on one mostly English benchmark, and its features include English stop words and call-to-action verbs. (iii) Labels are word overlaps with human-reviewed references, with some annotator inconsistency (documentation code samples are included on 82% of pages), which caps the gain on documentation. (iv) The public WCXB dev/ folder contains 139 test pages, and 166 test pages share a domain with development; we report test results without the former and can say little about products and collections. (v) The anchor metric and retrieval queries come from &lt;main&gt;/&lt;article&gt;; judged results come from language models, whose verdicts are noisy (about 83% of swapped pairs repeated in an earlier check with one judge) and, for GPT and Gemini, not exactly reproducible; none is a human assessment. (vi) The rules were developed on documentation, landing and WCXB development pages; the fresh pages were used once, but the judges' summary scores had shown which page types needed work. (vii) STCE needs at least three pages per site group and added no accuracy on the pages we measured. (viii) Only HTML is handled. (ix) The benchmark's author also builds a competing extractor; we use the public data, a scorer that follows the benchmark's F1 definition, independent corpora and independent judges. (x) We did not compare with language-model extractors [12, 13], which need a GPU or a hosted model.</w:t>
+        <w:t xml:space="preserve"> (i) No JavaScript is run; shells are flagged, not recovered. (ii) The model was trained on one mostly English benchmark, and its features include English stop words and call-to-action verbs. (iii) Labels are word overlaps with human-reviewed references, with some annotator inconsistency (documentation code samples are included on 82% of pages), which caps the gain on documentation. (iv) The public WCXB dev/ folder contains 139 test pages, and 166 test pages share a domain with development; we report test results without the former and can say little about products and collections. (v) The anchor metric and the known-item queries come from the pages themselves (self-retrieval, not answer accuracy); judged results come from language models, whose verdicts are noisy (about 83% of swapped pairs repeated in an earlier check with one judge) and, for GPT and Gemini, not exactly reproducible; none is a human assessment. (vi) The rules were developed on documentation, landing and WCXB development pages; the fresh pages were used once, but the judges' summary scores had shown which page types needed work. (vii) STCE needs at least three pages per site group and added no accuracy on the pages we measured. (viii) Only HTML is handled. (ix) The benchmark's author also builds a competing extractor; we use the public data, a scorer that follows the benchmark's F1 definition, independent corpora and independent judges. (x) We did not compare with language-model extractors [12, 13], which need a GPU or a hosted model.</w:t>
       </w:r>
     </w:p>
     <w:p>
@@ -3047,7 +3047,7 @@
         <w:pStyle w:val="Body"/>
       </w:pPr>
       <w:r>
-        <w:t>ChromeRAG is a focused, installable component for the ingest step of web RAG pipelines. A 150 KB learned block filter, structural rules adapted from Trafilatura's discard patterns and a heading-aware chunker remove site chrome across page types: on 372 held-out WCXB test pages it gains 0.040 F1 over Trafilatura (forums +0.164, services +0.051) and ties on articles, documentation and listings; on 328 fresh pages blinded judges from three model families prefer it, and it retrieves better than Trafilatura with heading context adding 0.06 MRR. It can learn a site's template, carries Schema.org metadata and tables into chunk-friendly form, and reports unusable inputs and uncertain pages. The code, the model, the scripts, the frozen seed lists and the per-page results are openly available. Planned work covers multilingual training data, retraining without the 139 duplicated files, human-rated judgements and an optional sentence-encoder feature [21].</w:t>
+        <w:t>ChromeRAG is a focused, installable component for the ingest step of web RAG pipelines. A 150 KB learned block filter, structural rules adapted from Trafilatura's discard patterns and a heading-aware chunker remove site chrome across page types: on 372 held-out WCXB test pages it gains 0.040 F1 over Trafilatura (forums +0.164, services +0.051) and ties on articles, documentation and listings; on 328 fresh pages blinded judges from three model families prefer it, and it retrieves better than Trafilatura with heading context adding 0.06 MRR. It can learn a site's template, carries Schema.org metadata and tables into chunk-friendly form, and reports unusable inputs and uncertain pages. Planned work covers multilingual training data, retraining without the 139 duplicated files, human-rated judgements and an optional sentence-encoder feature [21].</w:t>
       </w:r>
     </w:p>
     <w:p>

</xml_diff>

<commit_message>
Docx: keep tables and captions together; repair figures 1 and 2
Co-Authored-By: Claude Sonnet 5.5 <noreply@anthropic.com>
</commit_message>
<xml_diff>
--- a/papers/softwarex/ChromeRAG_SoftwareX_OSP.docx
+++ b/papers/softwarex/ChromeRAG_SoftwareX_OSP.docx
@@ -968,6 +968,7 @@
     <w:p>
       <w:pPr>
         <w:pStyle w:val="Body"/>
+        <w:keepNext/>
       </w:pPr>
       <w:r>
         <w:drawing>
@@ -1142,6 +1143,7 @@
     <w:p>
       <w:pPr>
         <w:pStyle w:val="Body"/>
+        <w:keepNext/>
       </w:pPr>
       <w:r>
         <w:t>Table 1. ChromeRAG command-line interface.</w:t>
@@ -1165,6 +1167,10 @@
         <w:gridCol w:w="3000"/>
       </w:tblGrid>
       <w:tr>
+        <w:trPr>
+          <w:cantSplit/>
+          <w:tblHeader/>
+        </w:trPr>
         <w:tc>
           <w:tcPr>
             <w:tcW w:w="3000" w:type="dxa"/>
@@ -1172,6 +1178,7 @@
           <w:p>
             <w:pPr>
               <w:pStyle w:val="Body"/>
+              <w:keepNext/>
             </w:pPr>
             <w:r>
               <w:rPr>
@@ -1188,6 +1195,7 @@
           <w:p>
             <w:pPr>
               <w:pStyle w:val="Body"/>
+              <w:keepNext/>
             </w:pPr>
             <w:r>
               <w:rPr>
@@ -1204,6 +1212,7 @@
           <w:p>
             <w:pPr>
               <w:pStyle w:val="Body"/>
+              <w:keepNext/>
             </w:pPr>
             <w:r>
               <w:rPr>
@@ -1215,6 +1224,9 @@
         </w:tc>
       </w:tr>
       <w:tr>
+        <w:trPr>
+          <w:cantSplit/>
+        </w:trPr>
         <w:tc>
           <w:tcPr>
             <w:tcW w:w="3000" w:type="dxa"/>
@@ -1222,6 +1234,7 @@
           <w:p>
             <w:pPr>
               <w:pStyle w:val="Body"/>
+              <w:keepNext/>
             </w:pPr>
             <w:r>
               <w:t>One page</w:t>
@@ -1235,6 +1248,7 @@
           <w:p>
             <w:pPr>
               <w:pStyle w:val="Body"/>
+              <w:keepNext/>
             </w:pPr>
             <w:r>
               <w:t>chromerag extract page.html -o page.md --priority balanced</w:t>
@@ -1248,6 +1262,7 @@
           <w:p>
             <w:pPr>
               <w:pStyle w:val="Body"/>
+              <w:keepNext/>
             </w:pPr>
             <w:r>
               <w:t>Markdown; --json-meta prints diagnostics; --explain lists removed blocks; --chunks writes JSON lines; --fail-on-thin exits with code 3</w:t>
@@ -1256,6 +1271,9 @@
         </w:tc>
       </w:tr>
       <w:tr>
+        <w:trPr>
+          <w:cantSplit/>
+        </w:trPr>
         <w:tc>
           <w:tcPr>
             <w:tcW w:w="3000" w:type="dxa"/>
@@ -1263,6 +1281,7 @@
           <w:p>
             <w:pPr>
               <w:pStyle w:val="Body"/>
+              <w:keepNext/>
             </w:pPr>
             <w:r>
               <w:t>Learn site chrome</w:t>
@@ -1276,6 +1295,7 @@
           <w:p>
             <w:pPr>
               <w:pStyle w:val="Body"/>
+              <w:keepNext/>
             </w:pPr>
             <w:r>
               <w:t>chromerag learn pages/ -o site.json --min-pages 3</w:t>
@@ -1289,6 +1309,7 @@
           <w:p>
             <w:pPr>
               <w:pStyle w:val="Body"/>
+              <w:keepNext/>
             </w:pPr>
             <w:r>
               <w:t>JSON site model grouped by host and path prefix</w:t>
@@ -1297,6 +1318,9 @@
         </w:tc>
       </w:tr>
       <w:tr>
+        <w:trPr>
+          <w:cantSplit/>
+        </w:trPr>
         <w:tc>
           <w:tcPr>
             <w:tcW w:w="3000" w:type="dxa"/>
@@ -1636,6 +1660,7 @@
     <w:p>
       <w:pPr>
         <w:pStyle w:val="Body"/>
+        <w:keepNext/>
       </w:pPr>
       <w:r>
         <w:t>Table 2. Word-level F1 on the 372 WCXB test pages absent from the development folder (ChromeRAG in balanced mode; product and collection have only 2 and 9 such pages).</w:t>
@@ -1661,6 +1686,10 @@
         <w:gridCol w:w="1800"/>
       </w:tblGrid>
       <w:tr>
+        <w:trPr>
+          <w:cantSplit/>
+          <w:tblHeader/>
+        </w:trPr>
         <w:tc>
           <w:tcPr>
             <w:tcW w:w="1800" w:type="dxa"/>
@@ -1668,6 +1697,7 @@
           <w:p>
             <w:pPr>
               <w:pStyle w:val="Body"/>
+              <w:keepNext/>
             </w:pPr>
             <w:r>
               <w:rPr>
@@ -1684,6 +1714,7 @@
           <w:p>
             <w:pPr>
               <w:pStyle w:val="Body"/>
+              <w:keepNext/>
             </w:pPr>
             <w:r>
               <w:rPr>
@@ -1700,6 +1731,7 @@
           <w:p>
             <w:pPr>
               <w:pStyle w:val="Body"/>
+              <w:keepNext/>
             </w:pPr>
             <w:r>
               <w:rPr>
@@ -1716,6 +1748,7 @@
           <w:p>
             <w:pPr>
               <w:pStyle w:val="Body"/>
+              <w:keepNext/>
             </w:pPr>
             <w:r>
               <w:rPr>
@@ -1732,6 +1765,7 @@
           <w:p>
             <w:pPr>
               <w:pStyle w:val="Body"/>
+              <w:keepNext/>
             </w:pPr>
             <w:r>
               <w:rPr>
@@ -1743,6 +1777,9 @@
         </w:tc>
       </w:tr>
       <w:tr>
+        <w:trPr>
+          <w:cantSplit/>
+        </w:trPr>
         <w:tc>
           <w:tcPr>
             <w:tcW w:w="1800" w:type="dxa"/>
@@ -1750,6 +1787,7 @@
           <w:p>
             <w:pPr>
               <w:pStyle w:val="Body"/>
+              <w:keepNext/>
             </w:pPr>
             <w:r>
               <w:t>All (372)</w:t>
@@ -1763,6 +1801,7 @@
           <w:p>
             <w:pPr>
               <w:pStyle w:val="Body"/>
+              <w:keepNext/>
             </w:pPr>
             <w:r>
               <w:t>0.907</w:t>
@@ -1776,6 +1815,7 @@
           <w:p>
             <w:pPr>
               <w:pStyle w:val="Body"/>
+              <w:keepNext/>
             </w:pPr>
             <w:r>
               <w:t>0.867</w:t>
@@ -1789,6 +1829,7 @@
           <w:p>
             <w:pPr>
               <w:pStyle w:val="Body"/>
+              <w:keepNext/>
             </w:pPr>
             <w:r>
               <w:t>0.778</w:t>
@@ -1802,6 +1843,7 @@
           <w:p>
             <w:pPr>
               <w:pStyle w:val="Body"/>
+              <w:keepNext/>
             </w:pPr>
             <w:r>
               <w:t>0.568</w:t>
@@ -1810,6 +1852,9 @@
         </w:tc>
       </w:tr>
       <w:tr>
+        <w:trPr>
+          <w:cantSplit/>
+        </w:trPr>
         <w:tc>
           <w:tcPr>
             <w:tcW w:w="1800" w:type="dxa"/>
@@ -1817,6 +1862,7 @@
           <w:p>
             <w:pPr>
               <w:pStyle w:val="Body"/>
+              <w:keepNext/>
             </w:pPr>
             <w:r>
               <w:t>Article (178)</w:t>
@@ -1830,6 +1876,7 @@
           <w:p>
             <w:pPr>
               <w:pStyle w:val="Body"/>
+              <w:keepNext/>
             </w:pPr>
             <w:r>
               <w:t>0.951</w:t>
@@ -1843,6 +1890,7 @@
           <w:p>
             <w:pPr>
               <w:pStyle w:val="Body"/>
+              <w:keepNext/>
             </w:pPr>
             <w:r>
               <w:t>0.953</w:t>
@@ -1856,6 +1904,7 @@
           <w:p>
             <w:pPr>
               <w:pStyle w:val="Body"/>
+              <w:keepNext/>
             </w:pPr>
             <w:r>
               <w:t>0.944</w:t>
@@ -1869,6 +1918,7 @@
           <w:p>
             <w:pPr>
               <w:pStyle w:val="Body"/>
+              <w:keepNext/>
             </w:pPr>
             <w:r>
               <w:t>0.663</w:t>
@@ -1877,6 +1927,9 @@
         </w:tc>
       </w:tr>
       <w:tr>
+        <w:trPr>
+          <w:cantSplit/>
+        </w:trPr>
         <w:tc>
           <w:tcPr>
             <w:tcW w:w="1800" w:type="dxa"/>
@@ -1884,6 +1937,7 @@
           <w:p>
             <w:pPr>
               <w:pStyle w:val="Body"/>
+              <w:keepNext/>
             </w:pPr>
             <w:r>
               <w:t>Documentation (40)</w:t>
@@ -1897,6 +1951,7 @@
           <w:p>
             <w:pPr>
               <w:pStyle w:val="Body"/>
+              <w:keepNext/>
             </w:pPr>
             <w:r>
               <w:t>0.949</w:t>
@@ -1910,6 +1965,7 @@
           <w:p>
             <w:pPr>
               <w:pStyle w:val="Body"/>
+              <w:keepNext/>
             </w:pPr>
             <w:r>
               <w:t>0.931</w:t>
@@ -1923,6 +1979,7 @@
           <w:p>
             <w:pPr>
               <w:pStyle w:val="Body"/>
+              <w:keepNext/>
             </w:pPr>
             <w:r>
               <w:t>0.866</w:t>
@@ -1936,6 +1993,7 @@
           <w:p>
             <w:pPr>
               <w:pStyle w:val="Body"/>
+              <w:keepNext/>
             </w:pPr>
             <w:r>
               <w:t>0.614</w:t>
@@ -1944,6 +2002,9 @@
         </w:tc>
       </w:tr>
       <w:tr>
+        <w:trPr>
+          <w:cantSplit/>
+        </w:trPr>
         <w:tc>
           <w:tcPr>
             <w:tcW w:w="1800" w:type="dxa"/>
@@ -1951,6 +2012,7 @@
           <w:p>
             <w:pPr>
               <w:pStyle w:val="Body"/>
+              <w:keepNext/>
             </w:pPr>
             <w:r>
               <w:t>Service (56)</w:t>
@@ -1964,6 +2026,7 @@
           <w:p>
             <w:pPr>
               <w:pStyle w:val="Body"/>
+              <w:keepNext/>
             </w:pPr>
             <w:r>
               <w:t>0.864</w:t>
@@ -1977,6 +2040,7 @@
           <w:p>
             <w:pPr>
               <w:pStyle w:val="Body"/>
+              <w:keepNext/>
             </w:pPr>
             <w:r>
               <w:t>0.813</w:t>
@@ -1990,6 +2054,7 @@
           <w:p>
             <w:pPr>
               <w:pStyle w:val="Body"/>
+              <w:keepNext/>
             </w:pPr>
             <w:r>
               <w:t>0.595</w:t>
@@ -2003,6 +2068,7 @@
           <w:p>
             <w:pPr>
               <w:pStyle w:val="Body"/>
+              <w:keepNext/>
             </w:pPr>
             <w:r>
               <w:t>0.478</w:t>
@@ -2011,6 +2077,9 @@
         </w:tc>
       </w:tr>
       <w:tr>
+        <w:trPr>
+          <w:cantSplit/>
+        </w:trPr>
         <w:tc>
           <w:tcPr>
             <w:tcW w:w="1800" w:type="dxa"/>
@@ -2018,6 +2087,7 @@
           <w:p>
             <w:pPr>
               <w:pStyle w:val="Body"/>
+              <w:keepNext/>
             </w:pPr>
             <w:r>
               <w:t>Forum (50)</w:t>
@@ -2031,6 +2101,7 @@
           <w:p>
             <w:pPr>
               <w:pStyle w:val="Body"/>
+              <w:keepNext/>
             </w:pPr>
             <w:r>
               <w:t>0.895</w:t>
@@ -2044,6 +2115,7 @@
           <w:p>
             <w:pPr>
               <w:pStyle w:val="Body"/>
+              <w:keepNext/>
             </w:pPr>
             <w:r>
               <w:t>0.731</w:t>
@@ -2057,6 +2129,7 @@
           <w:p>
             <w:pPr>
               <w:pStyle w:val="Body"/>
+              <w:keepNext/>
             </w:pPr>
             <w:r>
               <w:t>0.628</w:t>
@@ -2070,6 +2143,7 @@
           <w:p>
             <w:pPr>
               <w:pStyle w:val="Body"/>
+              <w:keepNext/>
             </w:pPr>
             <w:r>
               <w:t>0.452</w:t>
@@ -2078,6 +2152,9 @@
         </w:tc>
       </w:tr>
       <w:tr>
+        <w:trPr>
+          <w:cantSplit/>
+        </w:trPr>
         <w:tc>
           <w:tcPr>
             <w:tcW w:w="1800" w:type="dxa"/>
@@ -2085,6 +2162,7 @@
           <w:p>
             <w:pPr>
               <w:pStyle w:val="Body"/>
+              <w:keepNext/>
             </w:pPr>
             <w:r>
               <w:t>Listing (37)</w:t>
@@ -2098,6 +2176,7 @@
           <w:p>
             <w:pPr>
               <w:pStyle w:val="Body"/>
+              <w:keepNext/>
             </w:pPr>
             <w:r>
               <w:t>0.754</w:t>
@@ -2111,6 +2190,7 @@
           <w:p>
             <w:pPr>
               <w:pStyle w:val="Body"/>
+              <w:keepNext/>
             </w:pPr>
             <w:r>
               <w:t>0.707</w:t>
@@ -2124,6 +2204,7 @@
           <w:p>
             <w:pPr>
               <w:pStyle w:val="Body"/>
+              <w:keepNext/>
             </w:pPr>
             <w:r>
               <w:t>0.445</w:t>
@@ -2137,6 +2218,7 @@
           <w:p>
             <w:pPr>
               <w:pStyle w:val="Body"/>
+              <w:keepNext/>
             </w:pPr>
             <w:r>
               <w:t>0.386</w:t>
@@ -2145,6 +2227,9 @@
         </w:tc>
       </w:tr>
       <w:tr>
+        <w:trPr>
+          <w:cantSplit/>
+        </w:trPr>
         <w:tc>
           <w:tcPr>
             <w:tcW w:w="1800" w:type="dxa"/>
@@ -2152,6 +2237,7 @@
           <w:p>
             <w:pPr>
               <w:pStyle w:val="Body"/>
+              <w:keepNext/>
             </w:pPr>
             <w:r>
               <w:t>Collection (9)</w:t>
@@ -2165,6 +2251,7 @@
           <w:p>
             <w:pPr>
               <w:pStyle w:val="Body"/>
+              <w:keepNext/>
             </w:pPr>
             <w:r>
               <w:t>0.774</w:t>
@@ -2178,6 +2265,7 @@
           <w:p>
             <w:pPr>
               <w:pStyle w:val="Body"/>
+              <w:keepNext/>
             </w:pPr>
             <w:r>
               <w:t>0.717</w:t>
@@ -2191,6 +2279,7 @@
           <w:p>
             <w:pPr>
               <w:pStyle w:val="Body"/>
+              <w:keepNext/>
             </w:pPr>
             <w:r>
               <w:t>0.523</w:t>
@@ -2204,6 +2293,7 @@
           <w:p>
             <w:pPr>
               <w:pStyle w:val="Body"/>
+              <w:keepNext/>
             </w:pPr>
             <w:r>
               <w:t>0.512</w:t>
@@ -2212,6 +2302,9 @@
         </w:tc>
       </w:tr>
       <w:tr>
+        <w:trPr>
+          <w:cantSplit/>
+        </w:trPr>
         <w:tc>
           <w:tcPr>
             <w:tcW w:w="1800" w:type="dxa"/>
@@ -2282,6 +2375,7 @@
     <w:p>
       <w:pPr>
         <w:pStyle w:val="Body"/>
+        <w:keepNext/>
       </w:pPr>
       <w:r>
         <w:drawing>
@@ -2350,6 +2444,7 @@
     <w:p>
       <w:pPr>
         <w:pStyle w:val="Body"/>
+        <w:keepNext/>
       </w:pPr>
       <w:r>
         <w:drawing>
@@ -2418,6 +2513,7 @@
     <w:p>
       <w:pPr>
         <w:pStyle w:val="Body"/>
+        <w:keepNext/>
       </w:pPr>
       <w:r>
         <w:t>Table 3. Net score of ChromeRAG against Trafilatura (+1 = always preferred) on the 328 fresh pages and on the 367 WCXB test pages absent from dev/ that both outputs cover.</w:t>
@@ -2442,6 +2538,10 @@
         <w:gridCol w:w="2250"/>
       </w:tblGrid>
       <w:tr>
+        <w:trPr>
+          <w:cantSplit/>
+          <w:tblHeader/>
+        </w:trPr>
         <w:tc>
           <w:tcPr>
             <w:tcW w:w="2250" w:type="dxa"/>
@@ -2449,6 +2549,7 @@
           <w:p>
             <w:pPr>
               <w:pStyle w:val="Body"/>
+              <w:keepNext/>
             </w:pPr>
             <w:r>
               <w:rPr>
@@ -2465,6 +2566,7 @@
           <w:p>
             <w:pPr>
               <w:pStyle w:val="Body"/>
+              <w:keepNext/>
             </w:pPr>
             <w:r>
               <w:rPr>
@@ -2481,6 +2583,7 @@
           <w:p>
             <w:pPr>
               <w:pStyle w:val="Body"/>
+              <w:keepNext/>
             </w:pPr>
             <w:r>
               <w:rPr>
@@ -2497,6 +2600,7 @@
           <w:p>
             <w:pPr>
               <w:pStyle w:val="Body"/>
+              <w:keepNext/>
             </w:pPr>
             <w:r>
               <w:rPr>
@@ -2508,6 +2612,9 @@
         </w:tc>
       </w:tr>
       <w:tr>
+        <w:trPr>
+          <w:cantSplit/>
+        </w:trPr>
         <w:tc>
           <w:tcPr>
             <w:tcW w:w="2250" w:type="dxa"/>
@@ -2515,6 +2622,7 @@
           <w:p>
             <w:pPr>
               <w:pStyle w:val="Body"/>
+              <w:keepNext/>
             </w:pPr>
             <w:r>
               <w:t>Fresh, all (328)</w:t>
@@ -2528,6 +2636,7 @@
           <w:p>
             <w:pPr>
               <w:pStyle w:val="Body"/>
+              <w:keepNext/>
             </w:pPr>
             <w:r>
               <w:t>+0.41 [+0.33, +0.50]</w:t>
@@ -2541,6 +2650,7 @@
           <w:p>
             <w:pPr>
               <w:pStyle w:val="Body"/>
+              <w:keepNext/>
             </w:pPr>
             <w:r>
               <w:t>+0.19 [+0.09, +0.29]</w:t>
@@ -2554,6 +2664,7 @@
           <w:p>
             <w:pPr>
               <w:pStyle w:val="Body"/>
+              <w:keepNext/>
             </w:pPr>
             <w:r>
               <w:t>+0.45 [+0.35, +0.54]</w:t>
@@ -2562,6 +2673,9 @@
         </w:tc>
       </w:tr>
       <w:tr>
+        <w:trPr>
+          <w:cantSplit/>
+        </w:trPr>
         <w:tc>
           <w:tcPr>
             <w:tcW w:w="2250" w:type="dxa"/>
@@ -2569,6 +2683,7 @@
           <w:p>
             <w:pPr>
               <w:pStyle w:val="Body"/>
+              <w:keepNext/>
             </w:pPr>
             <w:r>
               <w:t>Articles (130)</w:t>
@@ -2582,6 +2697,7 @@
           <w:p>
             <w:pPr>
               <w:pStyle w:val="Body"/>
+              <w:keepNext/>
             </w:pPr>
             <w:r>
               <w:t>+0.32 [+0.18, +0.45]</w:t>
@@ -2595,6 +2711,7 @@
           <w:p>
             <w:pPr>
               <w:pStyle w:val="Body"/>
+              <w:keepNext/>
             </w:pPr>
             <w:r>
               <w:t>+0.07 [-0.08, +0.23]</w:t>
@@ -2608,6 +2725,7 @@
           <w:p>
             <w:pPr>
               <w:pStyle w:val="Body"/>
+              <w:keepNext/>
             </w:pPr>
             <w:r>
               <w:t>+0.37 [+0.22, +0.52]</w:t>
@@ -2616,6 +2734,9 @@
         </w:tc>
       </w:tr>
       <w:tr>
+        <w:trPr>
+          <w:cantSplit/>
+        </w:trPr>
         <w:tc>
           <w:tcPr>
             <w:tcW w:w="2250" w:type="dxa"/>
@@ -2623,6 +2744,7 @@
           <w:p>
             <w:pPr>
               <w:pStyle w:val="Body"/>
+              <w:keepNext/>
             </w:pPr>
             <w:r>
               <w:t>Forums (56)</w:t>
@@ -2636,6 +2758,7 @@
           <w:p>
             <w:pPr>
               <w:pStyle w:val="Body"/>
+              <w:keepNext/>
             </w:pPr>
             <w:r>
               <w:t>+0.93 [+0.84, +1.00]</w:t>
@@ -2649,6 +2772,7 @@
           <w:p>
             <w:pPr>
               <w:pStyle w:val="Body"/>
+              <w:keepNext/>
             </w:pPr>
             <w:r>
               <w:t>+0.48 [+0.25, +0.70]</w:t>
@@ -2662,6 +2786,7 @@
           <w:p>
             <w:pPr>
               <w:pStyle w:val="Body"/>
+              <w:keepNext/>
             </w:pPr>
             <w:r>
               <w:t>+0.91 [+0.80, +1.00]</w:t>
@@ -2670,6 +2795,9 @@
         </w:tc>
       </w:tr>
       <w:tr>
+        <w:trPr>
+          <w:cantSplit/>
+        </w:trPr>
         <w:tc>
           <w:tcPr>
             <w:tcW w:w="2250" w:type="dxa"/>
@@ -2677,6 +2805,7 @@
           <w:p>
             <w:pPr>
               <w:pStyle w:val="Body"/>
+              <w:keepNext/>
             </w:pPr>
             <w:r>
               <w:t>Listings (30)</w:t>
@@ -2690,6 +2819,7 @@
           <w:p>
             <w:pPr>
               <w:pStyle w:val="Body"/>
+              <w:keepNext/>
             </w:pPr>
             <w:r>
               <w:t>+0.27 [-0.07, +0.57]</w:t>
@@ -2703,6 +2833,7 @@
           <w:p>
             <w:pPr>
               <w:pStyle w:val="Body"/>
+              <w:keepNext/>
             </w:pPr>
             <w:r>
               <w:t>+0.27 [-0.07, +0.60]</w:t>
@@ -2716,6 +2847,7 @@
           <w:p>
             <w:pPr>
               <w:pStyle w:val="Body"/>
+              <w:keepNext/>
             </w:pPr>
             <w:r>
               <w:t>+0.33 [0.00, +0.67]</w:t>
@@ -2724,6 +2856,9 @@
         </w:tc>
       </w:tr>
       <w:tr>
+        <w:trPr>
+          <w:cantSplit/>
+        </w:trPr>
         <w:tc>
           <w:tcPr>
             <w:tcW w:w="2250" w:type="dxa"/>
@@ -2731,6 +2866,7 @@
           <w:p>
             <w:pPr>
               <w:pStyle w:val="Body"/>
+              <w:keepNext/>
             </w:pPr>
             <w:r>
               <w:t>Services (112)</w:t>
@@ -2744,6 +2880,7 @@
           <w:p>
             <w:pPr>
               <w:pStyle w:val="Body"/>
+              <w:keepNext/>
             </w:pPr>
             <w:r>
               <w:t>+0.31 [+0.14, +0.47]</w:t>
@@ -2757,6 +2894,7 @@
           <w:p>
             <w:pPr>
               <w:pStyle w:val="Body"/>
+              <w:keepNext/>
             </w:pPr>
             <w:r>
               <w:t>+0.17 [-0.01, +0.35]</w:t>
@@ -2770,6 +2908,7 @@
           <w:p>
             <w:pPr>
               <w:pStyle w:val="Body"/>
+              <w:keepNext/>
             </w:pPr>
             <w:r>
               <w:t>+0.34 [+0.17, +0.51]</w:t>
@@ -2778,6 +2917,9 @@
         </w:tc>
       </w:tr>
       <w:tr>
+        <w:trPr>
+          <w:cantSplit/>
+        </w:trPr>
         <w:tc>
           <w:tcPr>
             <w:tcW w:w="2250" w:type="dxa"/>
@@ -2835,6 +2977,7 @@
     <w:p>
       <w:pPr>
         <w:pStyle w:val="Body"/>
+        <w:keepNext/>
       </w:pPr>
       <w:r>
         <w:drawing>

</xml_diff>

<commit_message>
Manuscript: reference order, Zenodo DOI, American spelling, horizontal-rule tables, balanced figures, highlights file
Co-Authored-By: Claude Sonnet 5.5 <noreply@anthropic.com>
</commit_message>
<xml_diff>
--- a/papers/softwarex/ChromeRAG_SoftwareX_OSP.docx
+++ b/papers/softwarex/ChromeRAG_SoftwareX_OSP.docx
@@ -917,7 +917,7 @@
         <w:t>Related work and the gap.</w:t>
       </w:r>
       <w:r>
-        <w:t xml:space="preserve"> Shallow text features [2] and neural sequence labelling [3, 4] classify blocks within one page. Trafilatura [5] and Readability [6] are widely used extractors tuned for articles; a large comparison [7] found no algorithm best on every page type. Converters such as MarkItDown [8] keep headings, tables and code but do not remove chrome, and Crawl4AI's pruning filter [9] scores nodes by text and link density. The WCXB benchmark [10] makes the weakness of article-tuned tools measurable: systems agree on articles (F1 about 0.93) and differ by 20 to 30 points on forums, products and collections; its leaders are a page-type-aware Rust extractor [11] and a 0.6B-parameter language-model block labeller [12]. Using several pages of one site to find its template was proposed early [14, 15] and benchmarked in [16]; query-time pruning such as HtmlRAG [17] complements ingest-time cleaning. ChromeRAG follows the feature-engineered block classification of [2] with gradient-boosted trees, adapts the discard patterns of Trafilatura [5], and packages both as a small CPU-only component with an optional site-template model, metadata, Markdown tables and heading-aware chunks, and explicit signals when the input is unusable or the extraction is unsure.</w:t>
+        <w:t xml:space="preserve"> Shallow text features [2] and neural sequence labeling [3, 4] classify blocks within one page. Trafilatura [5] and Readability [6] are widely used extractors tuned for articles; a large comparison [7] found no algorithm best on every page type. Converters such as MarkItDown [8] keep headings, tables and code but do not remove chrome, and Crawl4AI's pruning filter [9] scores nodes by text and link density. The WCXB benchmark [10] makes the weakness of article-tuned tools measurable: systems agree on articles (F1 about 0.93) and differ by 20 to 30 points on forums, products and collections; its leaders are a page-type-aware Rust extractor [11] and a 0.6B-parameter language-model block labeler [12]. Using several pages of one site to find its template was proposed early [13, 14] and benchmarked in [15]; query-time pruning such as HtmlRAG [16] complements ingest-time cleaning. ChromeRAG follows the feature-engineered block classification of [2] with gradient-boosted trees, adapts the discard patterns of Trafilatura [5], and packages both as a small CPU-only component with an optional site-template model, metadata, Markdown tables and heading-aware chunks, and explicit signals when the input is unusable or the extraction is unsure.</w:t>
       </w:r>
     </w:p>
     <w:p>
@@ -1085,7 +1085,7 @@
         <w:t>Stage 5: learned block filter.</w:t>
       </w:r>
       <w:r>
-        <w:t xml:space="preserve"> The page is split into blocks (paragraphs, headings, list items, quotes, preformatted blocks, tables, text-only containers, and loose text between block elements). Each block is described by about 530 numbers: its text, its place in the page (position, distance to headings, content root), its tree context (ancestor tags, link density of enclosing boxes, repeated sibling structures), the words of its ancestors' class and id, feature-hashed [18], and the words of the heading above. Trees (300 trees of depth 6, trained with scikit-learn) give the probability that the block is main content; the exported model is a 150 KB array file and prediction uses NumPy only. A block is kept when its probability reaches 0.30 (coverage), 0.50 (balanced) or 0.70 (precision). Three structure rules complement the trees: the page's own h1 is kept, a heading is kept when one of the next two blocks is kept, and the paragraph under the title is kept when it is a real sentence. Pages with fewer than four blocks are kept whole and exact repeats are written once. diagnostics["lbc"] holds an estimate of the page's F1 from the block probabilities; below 0.70 a warning is issued.</w:t>
+        <w:t xml:space="preserve"> The page is split into blocks (paragraphs, headings, list items, quotes, preformatted blocks, tables, text-only containers, and loose text between block elements). Each block is described by about 530 numbers: its text, its place in the page (position, distance to headings, content root), its tree context (ancestor tags, link density of enclosing boxes, repeated sibling structures), the words of its ancestors' class and id, feature-hashed [17], and the words of the heading above. Trees (300 trees of depth 6, trained with scikit-learn) give the probability that the block is main content; the exported model is a 150 KB array file and prediction uses NumPy only. A block is kept when its probability reaches 0.30 (coverage), 0.50 (balanced) or 0.70 (precision). Three structure rules complement the trees: the page's own h1 is kept, a heading is kept when one of the next two blocks is kept, and the paragraph under the title is kept when it is a real sentence. Pages with fewer than four blocks are kept whole and exact repeats are written once. diagnostics["lbc"] holds an estimate of the page's F1 from the block probabilities; below 0.70 a warning is issued.</w:t>
       </w:r>
     </w:p>
     <w:p>
@@ -1113,7 +1113,7 @@
         <w:t>Training.</w:t>
       </w:r>
       <w:r>
-        <w:t xml:space="preserve"> poc/lbc_data.py labels every block of the 1,495 scoreable files of the public WCXB dev/ folder by word-trigram overlap with the human-reviewed main content; poc/train_lbc.py fits the trees, weighting blocks by word count, in about two minutes. The folder also contains 139 files that WCXB's metadata assigns to the test split (see below), so the shipped model saw them; we therefore report test results without them. The rules and detectors of Stages 3 and 5 were written and tuned on development material only, never on the pages used for the final judgements below.</w:t>
+        <w:t xml:space="preserve"> poc/lbc_data.py labels every block of the 1,495 scoreable files of the public WCXB dev/ folder by word-trigram overlap with the human-reviewed main content; poc/train_lbc.py fits the trees, weighting blocks by word count, in about two minutes. The folder also contains 139 files that WCXB's metadata assigns to the test split (see below), so the shipped model saw them; we therefore report test results without them. The rules and detectors of Stages 3 and 5 were written and tuned on development material only, never on the pages used for the final judgments below.</w:t>
       </w:r>
     </w:p>
     <w:p>
@@ -1137,7 +1137,7 @@
         <w:pStyle w:val="Body"/>
       </w:pPr>
       <w:r>
-        <w:t>The Python API centres on ChromeRAG(config=..., site_chrome=...). PipelineConfig.from_priority() selects COVERAGE, BALANCED (default) or PRECISION. Stages can be switched off (for example --no-rules, --no-stce). extract(html, url=None) returns a typed ExtractResult with markdown, front_matter, warnings, input_quality, a token estimate and diagnostics. result.chunks() splits the Markdown into chunks of at most 180 words inside heading sections, never cutting a code block or table; each Chunk has the heading path from the page title to its section, a depth, and embed_text, the body preceded by that path, ready for an embedding model; chromerag extract page.html --chunks writes them as JSON lines.</w:t>
+        <w:t>The Python API centers on ChromeRAG(config=..., site_chrome=...). PipelineConfig.from_priority() selects COVERAGE, BALANCED (default) or PRECISION. Stages can be switched off (for example --no-rules, --no-stce). extract(html, url=None) returns a typed ExtractResult with markdown, front_matter, warnings, input_quality, a token estimate and diagnostics. result.chunks() splits the Markdown into chunks of at most 180 words inside heading sections, never cutting a code block or table; each Chunk has the heading path from the page title to its section, a depth, and embed_text, the body preceded by that path, ready for an embedding model; chromerag extract page.html --chunks writes them as JSON lines.</w:t>
       </w:r>
     </w:p>
     <w:p>
@@ -1154,11 +1154,8 @@
         <w:tblW w:w="5000" w:type="pct"/>
         <w:tblBorders>
           <w:top w:val="single" w:sz="4" w:space="0" w:color="808080"/>
-          <w:left w:val="single" w:sz="4" w:space="0" w:color="808080"/>
           <w:bottom w:val="single" w:sz="4" w:space="0" w:color="808080"/>
-          <w:right w:val="single" w:sz="4" w:space="0" w:color="808080"/>
           <w:insideH w:val="single" w:sz="4" w:space="0" w:color="808080"/>
-          <w:insideV w:val="single" w:sz="4" w:space="0" w:color="808080"/>
         </w:tblBorders>
       </w:tblPr>
       <w:tblGrid>
@@ -1367,7 +1364,7 @@
         <w:pStyle w:val="Body"/>
       </w:pPr>
       <w:r>
-        <w:t>The package needs Python 3.11 or later, installs with pip install chromerag [19] and has four direct dependencies (BeautifulSoup, lxml, PyYAML, NumPy). Getting Markdown takes two lines (from chromerag import ChromeRAG; md = ChromeRAG().extract(html).markdown); Trafilatura needs output_format="markdown" and table options, Readability returns HTML that must be converted again, and MarkItDown reads files or streams. Optional LangChain and LlamaIndex components return one document per page with the front-matter as metadata.</w:t>
+        <w:t>The package needs Python 3.11 or later, installs with pip install chromerag [18] and has four direct dependencies (BeautifulSoup, lxml, PyYAML, NumPy). Getting Markdown takes two lines (from chromerag import ChromeRAG; md = ChromeRAG().extract(html).markdown); Trafilatura needs output_format="markdown" and table options, Readability returns HTML that must be converted again, and MarkItDown reads files or streams. Optional LangChain and LlamaIndex components return one document per page with the front-matter as metadata.</w:t>
       </w:r>
     </w:p>
     <w:p>
@@ -1671,11 +1668,8 @@
         <w:tblW w:w="5000" w:type="pct"/>
         <w:tblBorders>
           <w:top w:val="single" w:sz="4" w:space="0" w:color="808080"/>
-          <w:left w:val="single" w:sz="4" w:space="0" w:color="808080"/>
           <w:bottom w:val="single" w:sz="4" w:space="0" w:color="808080"/>
-          <w:right w:val="single" w:sz="4" w:space="0" w:color="808080"/>
           <w:insideH w:val="single" w:sz="4" w:space="0" w:color="808080"/>
-          <w:insideV w:val="single" w:sz="4" w:space="0" w:color="808080"/>
         </w:tblBorders>
       </w:tblPr>
       <w:tblGrid>
@@ -2524,11 +2518,8 @@
         <w:tblW w:w="5000" w:type="pct"/>
         <w:tblBorders>
           <w:top w:val="single" w:sz="4" w:space="0" w:color="808080"/>
-          <w:left w:val="single" w:sz="4" w:space="0" w:color="808080"/>
           <w:bottom w:val="single" w:sz="4" w:space="0" w:color="808080"/>
-          <w:right w:val="single" w:sz="4" w:space="0" w:color="808080"/>
           <w:insideH w:val="single" w:sz="4" w:space="0" w:color="808080"/>
-          <w:insideV w:val="single" w:sz="4" w:space="0" w:color="808080"/>
         </w:tblBorders>
       </w:tblPr>
       <w:tblGrid>
@@ -3064,7 +3055,7 @@
         <w:pStyle w:val="Body"/>
       </w:pPr>
       <w:r>
-        <w:t>Do chunks that carry their heading path retrieve better? We cut 354 documentation pages from 50 sites not used in training into 3,395 chunks and had Claude write one natural question for each of 400 chunks, given the chunk and its page title. Prepending the title and heading path to the embedded text raised dense MRR (text-embedding-3-small) from 0.853 to 0.913 (+0.060, 95% CI [+0.036, +0.083]) and BM25 MRR by the same amount (+0.060 [+0.039, +0.081]); the title alone gives about two thirds of the gain. This supports contextual chunk headers [20] on one corpus; the question writer saw the page title, and other page types and languages are untested.</w:t>
+        <w:t>Do chunks that carry their heading path retrieve better? We cut 354 documentation pages from 50 sites not used in training into 3,395 chunks and had Claude write one natural question for each of 400 chunks, given the chunk and its page title. Prepending the title and heading path to the embedded text raised dense MRR (text-embedding-3-small) from 0.853 to 0.913 (+0.060, 95% CI [+0.036, +0.083]) and BM25 MRR by the same amount (+0.060 [+0.039, +0.081]); the title alone gives about two thirds of the gain. This supports contextual chunk headers [19] on one corpus; the question writer saw the page title, and other page types and languages are untested.</w:t>
       </w:r>
     </w:p>
     <w:p>
@@ -3166,7 +3157,7 @@
         <w:t>Limitations.</w:t>
       </w:r>
       <w:r>
-        <w:t xml:space="preserve"> (i) No JavaScript is run; shells are flagged, not recovered. (ii) The model was trained on one mostly English benchmark, and its features include English stop words and call-to-action verbs. (iii) Labels are word overlaps with human-reviewed references, with some annotator inconsistency (documentation code samples are included on 82% of pages), which caps the gain on documentation. (iv) The public WCXB dev/ folder contains 139 test pages, and 166 test pages share a domain with development; we report test results without the former and can say little about products and collections. (v) The anchor metric and the known-item queries come from the pages themselves (self-retrieval, not answer accuracy); judged results come from language models, whose verdicts are noisy (about 83% of swapped pairs repeated in an earlier check with one judge) and, for GPT and Gemini, not exactly reproducible; none is a human assessment. (vi) The rules were developed on documentation, landing and WCXB development pages; the fresh pages were used once, but the judges' summary scores had shown which page types needed work. (vii) STCE needs at least three pages per site group and added no accuracy on the pages we measured. (viii) Only HTML is handled. (ix) The benchmark's author also builds a competing extractor; we use the public data, a scorer that follows the benchmark's F1 definition, independent corpora and independent judges. (x) We did not compare with language-model extractors [12, 13], which need a GPU or a hosted model.</w:t>
+        <w:t xml:space="preserve"> (i) No JavaScript is run; shells are flagged, not recovered. (ii) The model was trained on one mostly English benchmark, and its features include English stop words and call-to-action verbs. (iii) Labels are word overlaps with human-reviewed references, with some annotator inconsistency (documentation code samples are included on 82% of pages), which caps the gain on documentation. (iv) The public WCXB dev/ folder contains 139 test pages, and 166 test pages share a domain with development; we report test results without the former and can say little about products and collections. (v) The anchor metric and the known-item queries come from the pages themselves (self-retrieval, not answer accuracy); judged results come from language models, whose verdicts are noisy (about 83% of swapped pairs repeated in an earlier check with one judge) and, for GPT and Gemini, not exactly reproducible; none is a human assessment. (vi) The rules were developed on documentation, landing and WCXB development pages; the fresh pages were used once, but the judges' summary scores had shown which page types needed work. (vii) STCE needs at least three pages per site group and added no accuracy on the pages we measured. (viii) Only HTML is handled. (ix) The benchmark's author also builds a competing extractor; we use the public data, a scorer that follows the benchmark's F1 definition, independent corpora and independent judges. (x) We did not compare with language-model extractors [12, 20], which need a GPU or a hosted model.</w:t>
       </w:r>
     </w:p>
     <w:p>
@@ -3190,7 +3181,7 @@
         <w:pStyle w:val="Body"/>
       </w:pPr>
       <w:r>
-        <w:t>ChromeRAG is a focused, installable component for the ingest step of web RAG pipelines. A 150 KB learned block filter, structural rules adapted from Trafilatura's discard patterns and a heading-aware chunker remove site chrome across page types: on 372 held-out WCXB test pages it gains 0.040 F1 over Trafilatura (forums +0.164, services +0.051) and ties on articles, documentation and listings; on 328 fresh pages blinded judges from three model families prefer it, and it retrieves better than Trafilatura with heading context adding 0.06 MRR. It can learn a site's template, carries Schema.org metadata and tables into chunk-friendly form, and reports unusable inputs and uncertain pages. Planned work covers multilingual training data, retraining without the 139 duplicated files, human-rated judgements and an optional sentence-encoder feature [21].</w:t>
+        <w:t>ChromeRAG is a focused, installable component for the ingest step of web RAG pipelines. A 150 KB learned block filter, structural rules adapted from Trafilatura's discard patterns and a heading-aware chunker remove site chrome across page types: on 372 held-out WCXB test pages it gains 0.040 F1 over Trafilatura (forums +0.164, services +0.051) and ties on articles, documentation and listings; on 328 fresh pages blinded judges from three model families prefer it, and it retrieves better than Trafilatura with heading context adding 0.06 MRR. It can learn a site's template, carries Schema.org metadata and tables into chunk-friendly form, and reports unusable inputs and uncertain pages. Planned work covers multilingual training data, retraining without the 139 duplicated files, human-rated judgments and an optional sentence-encoder feature [21].</w:t>
       </w:r>
     </w:p>
     <w:p>
@@ -3260,7 +3251,7 @@
         <w:pStyle w:val="Body"/>
       </w:pPr>
       <w:r>
-        <w:t>The software, the model, the training and evaluation scripts, the benchmark URL lists and frozen seed lists (poc/corpus_urls.json, poc/landing_urls.json, poc/landing_urls_fresh.json, poc/landing_split.json, poc/stce_crawl_urls.json, poc/extra_seeds*.json), per-page scores, judge prompts and raw judgements, and aggregate results (evaluations/2026-10-v0.1.3/, docs/data/) are openly available at https://github.com/pedapudibhargav/ChromeRAG under the MIT license. WCXB (https://arxiv.org/abs/2605.21097, CC-BY-4.0) is obtained from its authors' release. The raw third-party HTML pages are not redistributed. They can be fetched again with the scripts in poc/, although live pages change over time.</w:t>
+        <w:t>The software, the model, the training and evaluation scripts, the benchmark URL lists and frozen seed lists (poc/corpus_urls.json, poc/landing_urls.json, poc/landing_urls_fresh.json, poc/landing_split.json, poc/stce_crawl_urls.json, poc/extra_seeds*.json), per-page scores, judge prompts and raw judgments, and aggregate results (evaluations/2026-10-v0.1.3/, docs/data/) are openly available at https://github.com/pedapudibhargav/ChromeRAG under the MIT license, and version 0.1.4 is archived at Zenodo (doi: 10.5281/zenodo.23126161). WCXB (https://arxiv.org/abs/2605.21097, CC-BY-4.0) is obtained from its authors' release. The raw third-party HTML pages are not redistributed. They can be fetched again with the scripts in poc/, although live pages change over time.</w:t>
       </w:r>
     </w:p>
     <w:p>
@@ -3418,63 +3409,63 @@
         <w:pStyle w:val="Body"/>
       </w:pPr>
       <w:r>
-        <w:t>13. F. Wang, Z. Shi, B. Wang, N. Wang, and H. Xiao, "ReaderLM-v2: Small Language Model for HTML to Markdown and JSON," arXiv: 2503.01151, 2025.</w:t>
-      </w:r>
-    </w:p>
-    <w:p>
-      <w:pPr>
-        <w:pStyle w:val="Body"/>
-      </w:pPr>
-      <w:r>
-        <w:t>14. Z. Bar-Yossef and S. Rajagopalan, "Template Detection via Data Mining and its Applications," in Proc. 11th Int. World Wide Web Conf. (WWW), 2002, pp. 580–591. doi: 10.1145/511446.511522.</w:t>
-      </w:r>
-    </w:p>
-    <w:p>
-      <w:pPr>
-        <w:pStyle w:val="Body"/>
-      </w:pPr>
-      <w:r>
-        <w:t>15. L. Yi, B. Liu, and X. Li, "Eliminating Noisy Information in Web Pages for Data Mining," in Proc. 9th ACM SIGKDD Int. Conf. Knowledge Discovery and Data Mining, 2003, pp. 296–305. doi: 10.1145/956750.956785.</w:t>
-      </w:r>
-    </w:p>
-    <w:p>
-      <w:pPr>
-        <w:pStyle w:val="Body"/>
-      </w:pPr>
-      <w:r>
-        <w:t>16. J. Alarte, J. Silva, and S. Tamarit, "What Web Template Extractor Should I Use? A Benchmarking and Comparison for Five Template Extractors," ACM Trans. Web, vol. 13, no. 2, Art. 9, 2019. doi: 10.1145/3316810.</w:t>
-      </w:r>
-    </w:p>
-    <w:p>
-      <w:pPr>
-        <w:pStyle w:val="Body"/>
-      </w:pPr>
-      <w:r>
-        <w:t>17. J. Tan, Z. Dou, W. Wang, M. Wang, W. Chen, and J.-R. Wen, "HtmlRAG: HTML is Better Than Plain Text for Modeling Retrieved Knowledge in RAG Systems," in Proc. ACM Web Conf. 2025 (WWW '25), 2025, pp. 1733–1746. doi: 10.1145/3696410.3714546.</w:t>
-      </w:r>
-    </w:p>
-    <w:p>
-      <w:pPr>
-        <w:pStyle w:val="Body"/>
-      </w:pPr>
-      <w:r>
-        <w:t>18. K. Weinberger, A. Dasgupta, J. Langford, A. Smola, and J. Attenberg, "Feature Hashing for Large Scale Multitask Learning," in Proc. 26th Int. Conf. Machine Learning (ICML), 2009, pp. 1113–1120. doi: 10.1145/1553374.1553516.</w:t>
-      </w:r>
-    </w:p>
-    <w:p>
-      <w:pPr>
-        <w:pStyle w:val="Body"/>
-      </w:pPr>
-      <w:r>
-        <w:t>19. B. C. Peddapudi, ChromeRAG, version 0.1.4, Zenodo, 2026. doi: 10.5281/zenodo.22970289 (all versions). Source: https://github.com/pedapudibhargav/ChromeRAG</w:t>
-      </w:r>
-    </w:p>
-    <w:p>
-      <w:pPr>
-        <w:pStyle w:val="Body"/>
-      </w:pPr>
-      <w:r>
-        <w:t>20. Anthropic, "Introducing Contextual Retrieval," 19 September 2024. [Online]. Available: https://www.anthropic.com/news/contextual-retrieval</w:t>
+        <w:t>13. Z. Bar-Yossef and S. Rajagopalan, "Template Detection via Data Mining and its Applications," in Proc. 11th Int. World Wide Web Conf. (WWW), 2002, pp. 580–591. doi: 10.1145/511446.511522.</w:t>
+      </w:r>
+    </w:p>
+    <w:p>
+      <w:pPr>
+        <w:pStyle w:val="Body"/>
+      </w:pPr>
+      <w:r>
+        <w:t>14. L. Yi, B. Liu, and X. Li, "Eliminating Noisy Information in Web Pages for Data Mining," in Proc. 9th ACM SIGKDD Int. Conf. Knowledge Discovery and Data Mining, 2003, pp. 296–305. doi: 10.1145/956750.956785.</w:t>
+      </w:r>
+    </w:p>
+    <w:p>
+      <w:pPr>
+        <w:pStyle w:val="Body"/>
+      </w:pPr>
+      <w:r>
+        <w:t>15. J. Alarte, J. Silva, and S. Tamarit, "What Web Template Extractor Should I Use? A Benchmarking and Comparison for Five Template Extractors," ACM Trans. Web, vol. 13, no. 2, Art. 9, 2019. doi: 10.1145/3316810.</w:t>
+      </w:r>
+    </w:p>
+    <w:p>
+      <w:pPr>
+        <w:pStyle w:val="Body"/>
+      </w:pPr>
+      <w:r>
+        <w:t>16. J. Tan, Z. Dou, W. Wang, M. Wang, W. Chen, and J.-R. Wen, "HtmlRAG: HTML is Better Than Plain Text for Modeling Retrieved Knowledge in RAG Systems," in Proc. ACM Web Conf. 2025 (WWW '25), 2025, pp. 1733–1746. doi: 10.1145/3696410.3714546.</w:t>
+      </w:r>
+    </w:p>
+    <w:p>
+      <w:pPr>
+        <w:pStyle w:val="Body"/>
+      </w:pPr>
+      <w:r>
+        <w:t>17. K. Weinberger, A. Dasgupta, J. Langford, A. Smola, and J. Attenberg, "Feature Hashing for Large Scale Multitask Learning," in Proc. 26th Int. Conf. Machine Learning (ICML), 2009, pp. 1113–1120. doi: 10.1145/1553374.1553516.</w:t>
+      </w:r>
+    </w:p>
+    <w:p>
+      <w:pPr>
+        <w:pStyle w:val="Body"/>
+      </w:pPr>
+      <w:r>
+        <w:t>18. B. C. Peddapudi, ChromeRAG, version 0.1.4, Zenodo, 3 October 2026. doi: 10.5281/zenodo.23126161 (all versions: 10.5281/zenodo.22970289). Source: https://github.com/pedapudibhargav/ChromeRAG</w:t>
+      </w:r>
+    </w:p>
+    <w:p>
+      <w:pPr>
+        <w:pStyle w:val="Body"/>
+      </w:pPr>
+      <w:r>
+        <w:t>19. Anthropic, "Introducing Contextual Retrieval," 19 September 2024. [Online]. Available: https://www.anthropic.com/news/contextual-retrieval</w:t>
+      </w:r>
+    </w:p>
+    <w:p>
+      <w:pPr>
+        <w:pStyle w:val="Body"/>
+      </w:pPr>
+      <w:r>
+        <w:t>20. F. Wang, Z. Shi, B. Wang, N. Wang, and H. Xiao, "ReaderLM-v2: Small Language Model for HTML to Markdown and JSON," arXiv: 2503.01151, 2025.</w:t>
       </w:r>
     </w:p>
     <w:p>

</xml_diff>

<commit_message>
Author address, citation of the vector drift study, remove Docker and env example files
Co-Authored-By: Claude Sonnet 5.5 <noreply@anthropic.com>
</commit_message>
<xml_diff>
--- a/papers/softwarex/ChromeRAG_SoftwareX_OSP.docx
+++ b/papers/softwarex/ChromeRAG_SoftwareX_OSP.docx
@@ -903,7 +903,7 @@
         <w:t>Chrome pollutes RAG indexes.</w:t>
       </w:r>
       <w:r>
-        <w:t xml:space="preserve"> Retrieval-augmented generation grounds a language model in retrieved passages [1]. In organizations those passages come from documentation portals, product pages and knowledge bases, HTML never written for machines. Each page mixes its content with site-wide "chrome": navigation, cookie banners, calls to action, related-article lists, comment threads and footers. Converted naively and embedded, the same text appears in the chunks of every page; these near-duplicates compete with real content at query time and use up the model's context. A 10,000-page portal with a 200-token footer adds two million tokens of identical text to the index.</w:t>
+        <w:t xml:space="preserve"> Retrieval-augmented generation grounds a language model in retrieved passages [1]. In organizations those passages come from documentation portals, product pages and knowledge bases, HTML never written for machines. Each page mixes its content with site-wide "chrome": navigation, cookie banners, calls to action, related-article lists, comment threads and footers. Converted naively and embedded, the same text appears in the chunks of every page; these near-duplicates compete with real content at query time and use up the model's context. A 10,000-page portal with a 200-token footer adds two million tokens of identical text to the index. We met the problem while preparing web pages for a study of retrieval drift as an index grows [2], where chrome inside the chunks made clean ingestion the limiting step.</w:t>
       </w:r>
     </w:p>
     <w:p>
@@ -917,7 +917,7 @@
         <w:t>Related work and the gap.</w:t>
       </w:r>
       <w:r>
-        <w:t xml:space="preserve"> Shallow text features [2] and neural sequence labeling [3, 4] classify blocks within one page. Trafilatura [5] and Readability [6] are widely used extractors tuned for articles; a large comparison [7] found no algorithm best on every page type. Converters such as MarkItDown [8] keep headings, tables and code but do not remove chrome, and Crawl4AI's pruning filter [9] scores nodes by text and link density. The WCXB benchmark [10] makes the weakness of article-tuned tools measurable: systems agree on articles (F1 about 0.93) and differ by 20 to 30 points on forums, products and collections; its leaders are a page-type-aware Rust extractor [11] and a 0.6B-parameter language-model block labeler [12]. Using several pages of one site to find its template was proposed early [13, 14] and benchmarked in [15]; query-time pruning such as HtmlRAG [16] complements ingest-time cleaning. ChromeRAG follows the feature-engineered block classification of [2] with gradient-boosted trees, adapts the discard patterns of Trafilatura [5], and packages both as a small CPU-only component with an optional site-template model, metadata, Markdown tables and heading-aware chunks, and explicit signals when the input is unusable or the extraction is unsure.</w:t>
+        <w:t xml:space="preserve"> Shallow text features [3] and neural sequence labeling [4, 5] classify blocks within one page. Trafilatura [6] and Readability [7] are widely used extractors tuned for articles; a large comparison [8] found no algorithm best on every page type. Converters such as MarkItDown [9] keep headings, tables and code but do not remove chrome, and Crawl4AI's pruning filter [10] scores nodes by text and link density. The WCXB benchmark [11] makes the weakness of article-tuned tools measurable: systems agree on articles (F1 about 0.93) and differ by 20 to 30 points on forums, products and collections; its leaders are a page-type-aware Rust extractor [12] and a 0.6B-parameter language-model block labeler [13]. Using several pages of one site to find its template was proposed early [14, 15] and benchmarked in [16]; query-time pruning such as HtmlRAG [17] complements ingest-time cleaning. ChromeRAG follows the feature-engineered block classification of [3] with gradient-boosted trees, adapts the discard patterns of Trafilatura [6], and packages both as a small CPU-only component with an optional site-template model, metadata, Markdown tables and heading-aware chunks, and explicit signals when the input is unusable or the extraction is unsure.</w:t>
       </w:r>
     </w:p>
     <w:p>
@@ -962,7 +962,7 @@
         <w:pStyle w:val="Body"/>
       </w:pPr>
       <w:r>
-        <w:t>ChromeRAG is a Python package (src/chromerag, about 5,900 lines) built on BeautifulSoup/lxml and NumPy. Each document passes through six stages (Fig. 1). A pytest suite of 195 tests covers the pipeline, rules with fixtures, golden outputs, the chunker, the CLI and STCE; continuous integration runs on Linux (Python 3.11 to 3.14), macOS and Windows.</w:t>
+        <w:t>ChromeRAG is a Python package (src/chromerag, about 5,900 lines) built on BeautifulSoup/lxml and NumPy. Each document passes through six stages (Fig. 1). A pytest suite of 195 tests covers the pipeline, rules with fixtures, golden outputs, the chunker, the CLI and STCE; continuous integration runs on Linux macOS and Windows.</w:t>
       </w:r>
     </w:p>
     <w:p>
@@ -1057,7 +1057,7 @@
         <w:t>Stage 3: cleaning, rules and STCE.</w:t>
       </w:r>
       <w:r>
-        <w:t xml:space="preserve"> Scripts, styles and SVG are removed; hidden nodes and skip links are removed unless a hidden block holds long running text with few links. A page-wide &lt;form&gt;, an unclosed &lt;button&gt; or a large &lt;noscript&gt; keeps its content, as does the &lt;header&gt; of an &lt;article&gt; that holds the page h1. A YAML rule index of 37 rules drops known chrome: consent managers, share bars, documentation-framework widgets and 16 rules adapted from the discard patterns of Trafilatura [5]. Every rule carries evidence and a fixture. Generic detectors then remove in-page tables of contents, previous/next pagers, comment sections of articles, related-post blocks, standalone call-to-action buttons, share strips, newsletter blocks, author boxes, template placeholders and a footer-like tail after the last substantive block; each has guards (never the page title, a long paragraph, or more than a fixed share of the words) and a switch. If a site model is supplied, blocks whose signature (a hash of tag, id, classes and role, or of the text for bare blocks) is in the model are removed. chromerag learn keeps a signature only if it appears on at least 80% of a group's pages, stays short, and looks like chrome or is identical on every page.</w:t>
+        <w:t xml:space="preserve"> Scripts, styles and SVG are removed; hidden nodes and skip links are removed unless a hidden block holds long running text with few links. A page-wide &lt;form&gt;, an unclosed &lt;button&gt; or a large &lt;noscript&gt; keeps its content, as does the &lt;header&gt; of an &lt;article&gt; that holds the page h1. A YAML rule index of 37 rules drops known chrome: consent managers, share bars, documentation-framework widgets and 16 rules adapted from the discard patterns of Trafilatura [6]. Every rule carries evidence and a fixture. Generic detectors then remove in-page tables of contents, previous/next pagers, comment sections of articles, related-post blocks, standalone call-to-action buttons, share strips, newsletter blocks, author boxes, template placeholders and a footer-like tail after the last substantive block; each has guards (never the page title, a long paragraph, or more than a fixed share of the words) and a switch. If a site model is supplied, blocks whose signature (a hash of tag, id, classes and role, or of the text for bare blocks) is in the model are removed. chromerag learn keeps a signature only if it appears on at least 80% of a group's pages, stays short, and looks like chrome or is identical on every page.</w:t>
       </w:r>
     </w:p>
     <w:p>
@@ -1085,7 +1085,7 @@
         <w:t>Stage 5: learned block filter.</w:t>
       </w:r>
       <w:r>
-        <w:t xml:space="preserve"> The page is split into blocks (paragraphs, headings, list items, quotes, preformatted blocks, tables, text-only containers, and loose text between block elements). Each block is described by about 530 numbers: its text, its place in the page (position, distance to headings, content root), its tree context (ancestor tags, link density of enclosing boxes, repeated sibling structures), the words of its ancestors' class and id, feature-hashed [17], and the words of the heading above. Trees (300 trees of depth 6, trained with scikit-learn) give the probability that the block is main content; the exported model is a 150 KB array file and prediction uses NumPy only. A block is kept when its probability reaches 0.30 (coverage), 0.50 (balanced) or 0.70 (precision). Three structure rules complement the trees: the page's own h1 is kept, a heading is kept when one of the next two blocks is kept, and the paragraph under the title is kept when it is a real sentence. Pages with fewer than four blocks are kept whole and exact repeats are written once. diagnostics["lbc"] holds an estimate of the page's F1 from the block probabilities; below 0.70 a warning is issued.</w:t>
+        <w:t xml:space="preserve"> The page is split into blocks (paragraphs, headings, list items, quotes, preformatted blocks, tables, text-only containers, and loose text between block elements). Each block is described by about 530 numbers: its text, its place in the page (position, distance to headings, content root), its tree context (ancestor tags, link density of enclosing boxes, repeated sibling structures), the words of its ancestors' class and id, feature-hashed [18], and the words of the heading above. Trees (300 trees of depth 6, trained with scikit-learn) give the probability that the block is main content; the exported model is a 150 KB array file and prediction uses NumPy only. A block is kept when its probability reaches 0.30 (coverage), 0.50 (balanced) or 0.70 (precision). Three structure rules complement the trees: the page's own h1 is kept, a heading is kept when one of the next two blocks is kept, and the paragraph under the title is kept when it is a real sentence. Pages with fewer than four blocks are kept whole and exact repeats are written once. diagnostics["lbc"] holds an estimate of the page's F1 from the block probabilities; below 0.70 a warning is issued.</w:t>
       </w:r>
     </w:p>
     <w:p>
@@ -1121,7 +1121,7 @@
         <w:pStyle w:val="Body"/>
       </w:pPr>
       <w:r>
-        <w:t>ChromeRAG does not fetch pages, render JavaScript or crawl; those belong to the caller or to the evaluation harness in poc/.</w:t>
+        <w:t>ChromeRAG does not fetch pages, render JavaScript or crawl.</w:t>
       </w:r>
     </w:p>
     <w:p>
@@ -1364,7 +1364,7 @@
         <w:pStyle w:val="Body"/>
       </w:pPr>
       <w:r>
-        <w:t>The package needs Python 3.11 or later, installs with pip install chromerag [18] and has four direct dependencies (BeautifulSoup, lxml, PyYAML, NumPy). Getting Markdown takes two lines (from chromerag import ChromeRAG; md = ChromeRAG().extract(html).markdown); Trafilatura needs output_format="markdown" and table options, Readability returns HTML that must be converted again, and MarkItDown reads files or streams. Optional LangChain and LlamaIndex components return one document per page with the front-matter as metadata.</w:t>
+        <w:t>The package needs Python 3.11 or later, installs with pip install chromerag [19] and has four direct dependencies (BeautifulSoup, lxml, PyYAML, NumPy). Getting Markdown takes two lines (from chromerag import ChromeRAG; md = ChromeRAG().extract(html).markdown); Trafilatura needs output_format="markdown" and table options, Readability returns HTML that must be converted again, and MarkItDown reads files or streams. Optional LangChain and LlamaIndex components return one document per page with the front-matter as metadata.</w:t>
       </w:r>
     </w:p>
     <w:p>
@@ -1623,7 +1623,7 @@
         <w:pStyle w:val="Body"/>
       </w:pPr>
       <w:r>
-        <w:t>WCXB [10] has 2,008 pages in seven page types, with human-reviewed main content. Word-level F1 compares the bag of words of a tool's output with the reference (title excluded); "with" and "without" snippets test that required text is present and listed chrome absent. All tools receive the same HTML and no site model. ChromeRAG's YAML front-matter is removed before scoring, because it is metadata meant for chunk metadata and not text; scoring the raw default output with the benchmark's own script gives a lower value (about 0.87, or 0.90 with enable_schema=False). Trafilatura [5] runs with its best of four distinct settings on the development set; Readability [6] and MarkItDown [8] use defaults (Trafilatura 2.2.0, readability-lxml 0.9, MarkItDown 0.1.7, Python 3.14).</w:t>
+        <w:t>WCXB [11] has 2,008 pages in seven page types, with human-reviewed main content. Word-level F1 compares the bag of words of a tool's output with the reference (title excluded); "with" and "without" snippets test that required text is present and listed chrome absent. All tools receive the same HTML and no site model. ChromeRAG's YAML front-matter is removed before scoring, because it is metadata meant for chunk metadata and not text; scoring the raw default output with the benchmark's own script gives a lower value (about 0.87, or 0.90 with enable_schema=False). Trafilatura [6] runs with its best of four distinct settings on the development set; Readability [7] and MarkItDown [9] use defaults (Trafilatura 2.2.0, readability-lxml 0.9, MarkItDown 0.1.7, Python 3.14).</w:t>
       </w:r>
     </w:p>
     <w:p>
@@ -2424,7 +2424,7 @@
         <w:pStyle w:val="Body"/>
       </w:pPr>
       <w:r>
-        <w:t>Scores are means of page-level F1; intervals are percentile intervals of a paired bootstrap over pages (5,000 resamples, seed 0). On the 372 pages ChromeRAG leads Trafilatura by +0.040 (95% CI [+0.021, +0.059]; resampling its 316 domains instead, [+0.019, +0.062]): by +0.164 on forums [+0.102, +0.230], +0.051 on services [+0.004, +0.107] and +0.057 on the 9 collection pages [+0.024, +0.090]; on articles, documentation and listings the intervals contain zero, and 2 product pages allow no conclusion. Required snippets are found more often (0.783 against 0.743) and forbidden snippets less often (0.064 against 0.083). The benchmark's publication [10] reports 0.903 for the page-type-aware Rust extractor [11] and 0.841 for Trafilatura on all 511 test pages under its own configuration; we could not build that tool, so we quote it and claim no superiority; the settings differ and the numbers are not interchangeable.</w:t>
+        <w:t>Scores are means of page-level F1; intervals are percentile intervals of a paired bootstrap over pages (5,000 resamples, seed 0). On the 372 pages ChromeRAG leads Trafilatura by +0.040 (95% CI [+0.021, +0.059]; resampling its 316 domains instead, [+0.019, +0.062]): by +0.164 on forums [+0.102, +0.230], +0.051 on services [+0.004, +0.107] and +0.057 on the 9 collection pages [+0.024, +0.090]; on articles, documentation and listings the intervals contain zero, and 2 product pages allow no conclusion. Required snippets are found more often (0.783 against 0.743) and forbidden snippets less often (0.064 against 0.083). The benchmark's publication [11] reports 0.903 for the page-type-aware Rust extractor [12] and 0.841 for Trafilatura on all 511 test pages under its own configuration; we could not build that tool, so we quote it and claim no superiority; the settings differ and the numbers are not interchangeable.</w:t>
       </w:r>
     </w:p>
     <w:p>
@@ -3055,7 +3055,7 @@
         <w:pStyle w:val="Body"/>
       </w:pPr>
       <w:r>
-        <w:t>Do chunks that carry their heading path retrieve better? We cut 354 documentation pages from 50 sites not used in training into 3,395 chunks and had Claude write one natural question for each of 400 chunks, given the chunk and its page title. Prepending the title and heading path to the embedded text raised dense MRR (text-embedding-3-small) from 0.853 to 0.913 (+0.060, 95% CI [+0.036, +0.083]) and BM25 MRR by the same amount (+0.060 [+0.039, +0.081]); the title alone gives about two thirds of the gain. This supports contextual chunk headers [19] on one corpus; the question writer saw the page title, and other page types and languages are untested.</w:t>
+        <w:t>Do chunks that carry their heading path retrieve better? We cut 354 documentation pages from 50 sites not used in training into 3,395 chunks and had Claude write one natural question for each of 400 chunks, given the chunk and its page title. Prepending the title and heading path to the embedded text raised dense MRR (text-embedding-3-small) from 0.853 to 0.913 (+0.060, 95% CI [+0.036, +0.083]) and BM25 MRR by the same amount (+0.060 [+0.039, +0.081]); the title alone gives about two thirds of the gain. This supports contextual chunk headers [20] on one corpus; the question writer saw the page title, and other page types and languages are untested.</w:t>
       </w:r>
     </w:p>
     <w:p>
@@ -3143,7 +3143,7 @@
         <w:t>Adoption.</w:t>
       </w:r>
       <w:r>
-        <w:t xml:space="preserve"> ChromeRAG was first released on PyPI and GitHub in September 2026, so download, citation and third-party usage figures are not yet meaningful. Outside feedback goes to the issue tracker.</w:t>
+        <w:t xml:space="preserve"> ChromeRAG was first released on PyPI and GitHub in September 2026, so download, citation and third-party usage figures are not yet meaningful.</w:t>
       </w:r>
     </w:p>
     <w:p>
@@ -3157,7 +3157,7 @@
         <w:t>Limitations.</w:t>
       </w:r>
       <w:r>
-        <w:t xml:space="preserve"> (i) No JavaScript is run; shells are flagged, not recovered. (ii) The model was trained on one mostly English benchmark, and its features include English stop words and call-to-action verbs. (iii) Labels are word overlaps with human-reviewed references, with some annotator inconsistency (documentation code samples are included on 82% of pages), which caps the gain on documentation. (iv) The public WCXB dev/ folder contains 139 test pages, and 166 test pages share a domain with development; we report test results without the former and can say little about products and collections. (v) The anchor metric and the known-item queries come from the pages themselves (self-retrieval, not answer accuracy); judged results come from language models, whose verdicts are noisy (about 83% of swapped pairs repeated in an earlier check with one judge) and, for GPT and Gemini, not exactly reproducible; none is a human assessment. (vi) The rules were developed on documentation, landing and WCXB development pages; the fresh pages were used once, but the judges' summary scores had shown which page types needed work. (vii) STCE needs at least three pages per site group and added no accuracy on the pages we measured. (viii) Only HTML is handled. (ix) The benchmark's author also builds a competing extractor; we use the public data, a scorer that follows the benchmark's F1 definition, independent corpora and independent judges. (x) We did not compare with language-model extractors [12, 20], which need a GPU or a hosted model.</w:t>
+        <w:t xml:space="preserve"> (i) No JavaScript is run; shells are flagged, not recovered. (ii) The model was trained on one mostly English benchmark, and its features include English stop words and call-to-action verbs. (iii) Labels are word overlaps with human-reviewed references, with some annotator inconsistency (documentation code samples are included on 82% of pages), which caps the gain on documentation. (iv) The public WCXB dev/ folder contains 139 test pages, and 166 test pages share a domain with development; we report test results without the former and can say little about products and collections. (v) The anchor metric and the known-item queries come from the pages themselves (self-retrieval, not answer accuracy); judged results come from language models, whose verdicts are noisy (about 83% of swapped pairs repeated in an earlier check with one judge) and, for GPT and Gemini, not exactly reproducible; none is a human assessment. (vi) The rules were developed on documentation, landing and WCXB development pages; the fresh pages were used once, but the judges' summary scores had shown which page types needed work. (vii) STCE needs at least three pages per site group and added no accuracy on the pages we measured. (viii) Only HTML is handled. (ix) The benchmark's author also builds a competing extractor; we use the public data, a scorer that follows the benchmark's F1 definition, independent corpora and independent judges. (x) We did not compare with language-model extractors [13, 21], which need a GPU or a hosted model.</w:t>
       </w:r>
     </w:p>
     <w:p>
@@ -3181,7 +3181,7 @@
         <w:pStyle w:val="Body"/>
       </w:pPr>
       <w:r>
-        <w:t>ChromeRAG is a focused, installable component for the ingest step of web RAG pipelines. A 150 KB learned block filter, structural rules adapted from Trafilatura's discard patterns and a heading-aware chunker remove site chrome across page types: on 372 held-out WCXB test pages it gains 0.040 F1 over Trafilatura (forums +0.164, services +0.051) and ties on articles, documentation and listings; on 328 fresh pages blinded judges from three model families prefer it, and it retrieves better than Trafilatura with heading context adding 0.06 MRR. It can learn a site's template, carries Schema.org metadata and tables into chunk-friendly form, and reports unusable inputs and uncertain pages. Planned work covers multilingual training data, retraining without the 139 duplicated files, human-rated judgments and an optional sentence-encoder feature [21].</w:t>
+        <w:t>ChromeRAG is a focused, installable component for the ingest step of web RAG pipelines. A 150 KB learned block filter, structural rules adapted from Trafilatura's discard patterns and a heading-aware chunker remove site chrome across page types: on 372 held-out WCXB test pages it gains 0.040 F1 over Trafilatura (forums +0.164, services +0.051) and ties on articles, documentation and listings; on 328 fresh pages blinded judges from three model families prefer it, and it retrieves better than Trafilatura with heading context adding 0.06 MRR. It can learn a site's template, carries Schema.org metadata and tables into chunk-friendly form, and reports unusable inputs and uncertain pages. Planned work covers multilingual training data, retraining without the 139 duplicated files, human-rated judgments and an optional sentence-encoder feature [22].</w:t>
       </w:r>
     </w:p>
     <w:p>
@@ -3321,159 +3321,167 @@
         <w:pStyle w:val="Body"/>
       </w:pPr>
       <w:r>
-        <w:t>2. C. Kohlschütter, P. Fankhauser, and W. Nejdl, "Boilerplate Detection Using Shallow Text Features," in Proc. 3rd ACM Int. Conf. Web Search and Data Mining (WSDM), 2010, pp. 441–450. doi: 10.1145/1718487.1718542.</w:t>
-      </w:r>
-    </w:p>
-    <w:p>
-      <w:pPr>
-        <w:pStyle w:val="Body"/>
-      </w:pPr>
-      <w:r>
-        <w:t>3. T. Vogels, O.-E. Ganea, and C. Eickhoff, "Web2Text: Deep Structured Boilerplate Removal," in Advances in Information Retrieval (ECIR 2018), LNCS, 2018, pp. 167–179. doi: 10.1007/978-3-319-76941-7_13.</w:t>
-      </w:r>
-    </w:p>
-    <w:p>
-      <w:pPr>
-        <w:pStyle w:val="Body"/>
-      </w:pPr>
-      <w:r>
-        <w:t>4. J. Leonhardt, A. Anand, and M. Khosla, "Boilerplate Removal using a Neural Sequence Labeling Model," in Companion Proc. The Web Conf. 2020 (WWW '20), 2020, pp. 226–229. doi: 10.1145/3366424.3383547.</w:t>
-      </w:r>
-    </w:p>
-    <w:p>
-      <w:pPr>
-        <w:pStyle w:val="Body"/>
-      </w:pPr>
-      <w:r>
-        <w:t>5. A. Barbaresi, "Trafilatura: A Web Scraping Library and Command-Line Tool for Text Discovery and Extraction," in Proc. ACL-IJCNLP 2021: System Demonstrations, 2021, pp. 122–131. doi: 10.18653/v1/2021.acl-demo.15.</w:t>
-      </w:r>
-    </w:p>
-    <w:p>
-      <w:pPr>
-        <w:pStyle w:val="Body"/>
-      </w:pPr>
-      <w:r>
-        <w:t>6. Y. Baburov et al., python-readability (readability-lxml), Python port of Arc90 Readability, GitHub, accessed 2026-10-02. [Online]. Available: https://github.com/buriy/python-readability</w:t>
-      </w:r>
-    </w:p>
-    <w:p>
-      <w:pPr>
-        <w:pStyle w:val="Body"/>
-      </w:pPr>
-      <w:r>
-        <w:t>7. J. Bevendorff, S. Gupta, J. Kiesel, and B. Stein, "An Empirical Comparison of Web Content Extraction Algorithms," in Proc. 46th Int. ACM SIGIR Conf., 2023, pp. 2594–2603. doi: 10.1145/3539618.3591920.</w:t>
-      </w:r>
-    </w:p>
-    <w:p>
-      <w:pPr>
-        <w:pStyle w:val="Body"/>
-      </w:pPr>
-      <w:r>
-        <w:t>8. Microsoft, MarkItDown: Python tool for converting files and office documents to Markdown, GitHub, accessed 2026-10-02. [Online]. Available: https://github.com/microsoft/markitdown</w:t>
-      </w:r>
-    </w:p>
-    <w:p>
-      <w:pPr>
-        <w:pStyle w:val="Body"/>
-      </w:pPr>
-      <w:r>
-        <w:t>9. Crawl4AI, "Fit Markdown" (PruningContentFilter), documentation, accessed 2026-10-02. [Online]. Available: https://docs.crawl4ai.com/core/fit-markdown/</w:t>
-      </w:r>
-    </w:p>
-    <w:p>
-      <w:pPr>
-        <w:pStyle w:val="Body"/>
-      </w:pPr>
-      <w:r>
-        <w:t>10. M. Foley, "WCXB: A Multi-Type Web Content Extraction Benchmark," arXiv: 2605.21097, May 2026. Data: CC-BY-4.0.</w:t>
-      </w:r>
-    </w:p>
-    <w:p>
-      <w:pPr>
-        <w:pStyle w:val="Body"/>
-      </w:pPr>
-      <w:r>
-        <w:t>11. M. Foley, rs-trafilatura: web content extraction in Rust with page-type classification, GitHub, accessed 2026-10-02. [Online]. Available: https://github.com/Murrough-Foley/rs-trafilatura</w:t>
-      </w:r>
-    </w:p>
-    <w:p>
-      <w:pPr>
-        <w:pStyle w:val="Body"/>
-      </w:pPr>
-      <w:r>
-        <w:t>12. M. Liu et al., "Dripper: Token-Efficient Main HTML Extraction with a Lightweight LM," arXiv: 2511.23119, 2025.</w:t>
-      </w:r>
-    </w:p>
-    <w:p>
-      <w:pPr>
-        <w:pStyle w:val="Body"/>
-      </w:pPr>
-      <w:r>
-        <w:t>13. Z. Bar-Yossef and S. Rajagopalan, "Template Detection via Data Mining and its Applications," in Proc. 11th Int. World Wide Web Conf. (WWW), 2002, pp. 580–591. doi: 10.1145/511446.511522.</w:t>
-      </w:r>
-    </w:p>
-    <w:p>
-      <w:pPr>
-        <w:pStyle w:val="Body"/>
-      </w:pPr>
-      <w:r>
-        <w:t>14. L. Yi, B. Liu, and X. Li, "Eliminating Noisy Information in Web Pages for Data Mining," in Proc. 9th ACM SIGKDD Int. Conf. Knowledge Discovery and Data Mining, 2003, pp. 296–305. doi: 10.1145/956750.956785.</w:t>
-      </w:r>
-    </w:p>
-    <w:p>
-      <w:pPr>
-        <w:pStyle w:val="Body"/>
-      </w:pPr>
-      <w:r>
-        <w:t>15. J. Alarte, J. Silva, and S. Tamarit, "What Web Template Extractor Should I Use? A Benchmarking and Comparison for Five Template Extractors," ACM Trans. Web, vol. 13, no. 2, Art. 9, 2019. doi: 10.1145/3316810.</w:t>
-      </w:r>
-    </w:p>
-    <w:p>
-      <w:pPr>
-        <w:pStyle w:val="Body"/>
-      </w:pPr>
-      <w:r>
-        <w:t>16. J. Tan, Z. Dou, W. Wang, M. Wang, W. Chen, and J.-R. Wen, "HtmlRAG: HTML is Better Than Plain Text for Modeling Retrieved Knowledge in RAG Systems," in Proc. ACM Web Conf. 2025 (WWW '25), 2025, pp. 1733–1746. doi: 10.1145/3696410.3714546.</w:t>
-      </w:r>
-    </w:p>
-    <w:p>
-      <w:pPr>
-        <w:pStyle w:val="Body"/>
-      </w:pPr>
-      <w:r>
-        <w:t>17. K. Weinberger, A. Dasgupta, J. Langford, A. Smola, and J. Attenberg, "Feature Hashing for Large Scale Multitask Learning," in Proc. 26th Int. Conf. Machine Learning (ICML), 2009, pp. 1113–1120. doi: 10.1145/1553374.1553516.</w:t>
-      </w:r>
-    </w:p>
-    <w:p>
-      <w:pPr>
-        <w:pStyle w:val="Body"/>
-      </w:pPr>
-      <w:r>
-        <w:t>18. B. C. Peddapudi, ChromeRAG, version 0.1.4, Zenodo, 3 October 2026. doi: 10.5281/zenodo.23126161 (all versions: 10.5281/zenodo.22970289). Source: https://github.com/pedapudibhargav/ChromeRAG</w:t>
-      </w:r>
-    </w:p>
-    <w:p>
-      <w:pPr>
-        <w:pStyle w:val="Body"/>
-      </w:pPr>
-      <w:r>
-        <w:t>19. Anthropic, "Introducing Contextual Retrieval," 19 September 2024. [Online]. Available: https://www.anthropic.com/news/contextual-retrieval</w:t>
-      </w:r>
-    </w:p>
-    <w:p>
-      <w:pPr>
-        <w:pStyle w:val="Body"/>
-      </w:pPr>
-      <w:r>
-        <w:t>20. F. Wang, Z. Shi, B. Wang, N. Wang, and H. Xiao, "ReaderLM-v2: Small Language Model for HTML to Markdown and JSON," arXiv: 2503.01151, 2025.</w:t>
-      </w:r>
-    </w:p>
-    <w:p>
-      <w:pPr>
-        <w:pStyle w:val="Body"/>
-      </w:pPr>
-      <w:r>
-        <w:t>21. N. Reimers and I. Gurevych, "Sentence-BERT: Sentence Embeddings using Siamese BERT-Networks," in Proc. EMNLP-IJCNLP 2019, 2019, pp. 3980–3990. doi: 10.18653/v1/D19-1410.</w:t>
+        <w:t>2. B. C. Peddapudi, "Vector Retrieval Drift under Corpus Growth: A Controlled Empirical Study with Metadata Filtering on EnterpriseRAG-Bench," manuscript under review, 2026. Artifacts: https://pedapudibhargav.github.io/vector-drift-study/</w:t>
+      </w:r>
+    </w:p>
+    <w:p>
+      <w:pPr>
+        <w:pStyle w:val="Body"/>
+      </w:pPr>
+      <w:r>
+        <w:t>3. C. Kohlschütter, P. Fankhauser, and W. Nejdl, "Boilerplate Detection Using Shallow Text Features," in Proc. 3rd ACM Int. Conf. Web Search and Data Mining (WSDM), 2010, pp. 441–450. doi: 10.1145/1718487.1718542.</w:t>
+      </w:r>
+    </w:p>
+    <w:p>
+      <w:pPr>
+        <w:pStyle w:val="Body"/>
+      </w:pPr>
+      <w:r>
+        <w:t>4. T. Vogels, O.-E. Ganea, and C. Eickhoff, "Web2Text: Deep Structured Boilerplate Removal," in Advances in Information Retrieval (ECIR 2018), LNCS, 2018, pp. 167–179. doi: 10.1007/978-3-319-76941-7_13.</w:t>
+      </w:r>
+    </w:p>
+    <w:p>
+      <w:pPr>
+        <w:pStyle w:val="Body"/>
+      </w:pPr>
+      <w:r>
+        <w:t>5. J. Leonhardt, A. Anand, and M. Khosla, "Boilerplate Removal using a Neural Sequence Labeling Model," in Companion Proc. The Web Conf. 2020 (WWW '20), 2020, pp. 226–229. doi: 10.1145/3366424.3383547.</w:t>
+      </w:r>
+    </w:p>
+    <w:p>
+      <w:pPr>
+        <w:pStyle w:val="Body"/>
+      </w:pPr>
+      <w:r>
+        <w:t>6. A. Barbaresi, "Trafilatura: A Web Scraping Library and Command-Line Tool for Text Discovery and Extraction," in Proc. ACL-IJCNLP 2021: System Demonstrations, 2021, pp. 122–131. doi: 10.18653/v1/2021.acl-demo.15.</w:t>
+      </w:r>
+    </w:p>
+    <w:p>
+      <w:pPr>
+        <w:pStyle w:val="Body"/>
+      </w:pPr>
+      <w:r>
+        <w:t>7. Y. Baburov et al., python-readability (readability-lxml), Python port of Arc90 Readability, GitHub, accessed 2026-10-02. [Online]. Available: https://github.com/buriy/python-readability</w:t>
+      </w:r>
+    </w:p>
+    <w:p>
+      <w:pPr>
+        <w:pStyle w:val="Body"/>
+      </w:pPr>
+      <w:r>
+        <w:t>8. J. Bevendorff, S. Gupta, J. Kiesel, and B. Stein, "An Empirical Comparison of Web Content Extraction Algorithms," in Proc. 46th Int. ACM SIGIR Conf., 2023, pp. 2594–2603. doi: 10.1145/3539618.3591920.</w:t>
+      </w:r>
+    </w:p>
+    <w:p>
+      <w:pPr>
+        <w:pStyle w:val="Body"/>
+      </w:pPr>
+      <w:r>
+        <w:t>9. Microsoft, MarkItDown: Python tool for converting files and office documents to Markdown, GitHub, accessed 2026-10-02. [Online]. Available: https://github.com/microsoft/markitdown</w:t>
+      </w:r>
+    </w:p>
+    <w:p>
+      <w:pPr>
+        <w:pStyle w:val="Body"/>
+      </w:pPr>
+      <w:r>
+        <w:t>10. Crawl4AI, "Fit Markdown" (PruningContentFilter), documentation, accessed 2026-10-02. [Online]. Available: https://docs.crawl4ai.com/core/fit-markdown/</w:t>
+      </w:r>
+    </w:p>
+    <w:p>
+      <w:pPr>
+        <w:pStyle w:val="Body"/>
+      </w:pPr>
+      <w:r>
+        <w:t>11. M. Foley, "WCXB: A Multi-Type Web Content Extraction Benchmark," arXiv: 2605.21097, May 2026. Data: CC-BY-4.0.</w:t>
+      </w:r>
+    </w:p>
+    <w:p>
+      <w:pPr>
+        <w:pStyle w:val="Body"/>
+      </w:pPr>
+      <w:r>
+        <w:t>12. M. Foley, rs-trafilatura: web content extraction in Rust with page-type classification, GitHub, accessed 2026-10-02. [Online]. Available: https://github.com/Murrough-Foley/rs-trafilatura</w:t>
+      </w:r>
+    </w:p>
+    <w:p>
+      <w:pPr>
+        <w:pStyle w:val="Body"/>
+      </w:pPr>
+      <w:r>
+        <w:t>13. M. Liu et al., "Dripper: Token-Efficient Main HTML Extraction with a Lightweight LM," arXiv: 2511.23119, 2025.</w:t>
+      </w:r>
+    </w:p>
+    <w:p>
+      <w:pPr>
+        <w:pStyle w:val="Body"/>
+      </w:pPr>
+      <w:r>
+        <w:t>14. Z. Bar-Yossef and S. Rajagopalan, "Template Detection via Data Mining and its Applications," in Proc. 11th Int. World Wide Web Conf. (WWW), 2002, pp. 580–591. doi: 10.1145/511446.511522.</w:t>
+      </w:r>
+    </w:p>
+    <w:p>
+      <w:pPr>
+        <w:pStyle w:val="Body"/>
+      </w:pPr>
+      <w:r>
+        <w:t>15. L. Yi, B. Liu, and X. Li, "Eliminating Noisy Information in Web Pages for Data Mining," in Proc. 9th ACM SIGKDD Int. Conf. Knowledge Discovery and Data Mining, 2003, pp. 296–305. doi: 10.1145/956750.956785.</w:t>
+      </w:r>
+    </w:p>
+    <w:p>
+      <w:pPr>
+        <w:pStyle w:val="Body"/>
+      </w:pPr>
+      <w:r>
+        <w:t>16. J. Alarte, J. Silva, and S. Tamarit, "What Web Template Extractor Should I Use? A Benchmarking and Comparison for Five Template Extractors," ACM Trans. Web, vol. 13, no. 2, Art. 9, 2019. doi: 10.1145/3316810.</w:t>
+      </w:r>
+    </w:p>
+    <w:p>
+      <w:pPr>
+        <w:pStyle w:val="Body"/>
+      </w:pPr>
+      <w:r>
+        <w:t>17. J. Tan, Z. Dou, W. Wang, M. Wang, W. Chen, and J.-R. Wen, "HtmlRAG: HTML is Better Than Plain Text for Modeling Retrieved Knowledge in RAG Systems," in Proc. ACM Web Conf. 2025 (WWW '25), 2025, pp. 1733–1746. doi: 10.1145/3696410.3714546.</w:t>
+      </w:r>
+    </w:p>
+    <w:p>
+      <w:pPr>
+        <w:pStyle w:val="Body"/>
+      </w:pPr>
+      <w:r>
+        <w:t>18. K. Weinberger, A. Dasgupta, J. Langford, A. Smola, and J. Attenberg, "Feature Hashing for Large Scale Multitask Learning," in Proc. 26th Int. Conf. Machine Learning (ICML), 2009, pp. 1113–1120. doi: 10.1145/1553374.1553516.</w:t>
+      </w:r>
+    </w:p>
+    <w:p>
+      <w:pPr>
+        <w:pStyle w:val="Body"/>
+      </w:pPr>
+      <w:r>
+        <w:t>19. B. C. Peddapudi, ChromeRAG, version 0.1.4, Zenodo, 3 October 2026. doi: 10.5281/zenodo.23126161 (all versions: 10.5281/zenodo.22970289). Source: https://github.com/pedapudibhargav/ChromeRAG</w:t>
+      </w:r>
+    </w:p>
+    <w:p>
+      <w:pPr>
+        <w:pStyle w:val="Body"/>
+      </w:pPr>
+      <w:r>
+        <w:t>20. Anthropic, "Introducing Contextual Retrieval," 19 September 2024. [Online]. Available: https://www.anthropic.com/news/contextual-retrieval</w:t>
+      </w:r>
+    </w:p>
+    <w:p>
+      <w:pPr>
+        <w:pStyle w:val="Body"/>
+      </w:pPr>
+      <w:r>
+        <w:t>21. F. Wang, Z. Shi, B. Wang, N. Wang, and H. Xiao, "ReaderLM-v2: Small Language Model for HTML to Markdown and JSON," arXiv: 2503.01151, 2025.</w:t>
+      </w:r>
+    </w:p>
+    <w:p>
+      <w:pPr>
+        <w:pStyle w:val="Body"/>
+      </w:pPr>
+      <w:r>
+        <w:t>22. N. Reimers and I. Gurevych, "Sentence-BERT: Sentence Embeddings using Siamese BERT-Networks," in Proc. EMNLP-IJCNLP 2019, 2019, pp. 3980–3990. doi: 10.18653/v1/D19-1410.</w:t>
       </w:r>
     </w:p>
     <w:sectPr>

</xml_diff>

<commit_message>
Manuscript: remove vector drift citation for now
Co-Authored-By: Claude Sonnet 5.5 <noreply@anthropic.com>
</commit_message>
<xml_diff>
--- a/papers/softwarex/ChromeRAG_SoftwareX_OSP.docx
+++ b/papers/softwarex/ChromeRAG_SoftwareX_OSP.docx
@@ -903,7 +903,7 @@
         <w:t>Chrome pollutes RAG indexes.</w:t>
       </w:r>
       <w:r>
-        <w:t xml:space="preserve"> Retrieval-augmented generation grounds a language model in retrieved passages [1]. In organizations those passages come from documentation portals, product pages and knowledge bases, HTML never written for machines. Each page mixes its content with site-wide "chrome": navigation, cookie banners, calls to action, related-article lists, comment threads and footers. Converted naively and embedded, the same text appears in the chunks of every page; these near-duplicates compete with real content at query time and use up the model's context. A 10,000-page portal with a 200-token footer adds two million tokens of identical text to the index. We met the problem while preparing web pages for a study of retrieval drift as an index grows [2], where chrome inside the chunks made clean ingestion the limiting step.</w:t>
+        <w:t xml:space="preserve"> Retrieval-augmented generation grounds a language model in retrieved passages [1]. In organizations those passages come from documentation portals, product pages and knowledge bases, HTML never written for machines. Each page mixes its content with site-wide "chrome": navigation, cookie banners, calls to action, related-article lists, comment threads and footers. Converted naively and embedded, the same text appears in the chunks of every page; these near-duplicates compete with real content at query time and use up the model's context. A 10,000-page portal with a 200-token footer adds two million tokens of identical text to the index.</w:t>
       </w:r>
     </w:p>
     <w:p>
@@ -917,7 +917,7 @@
         <w:t>Related work and the gap.</w:t>
       </w:r>
       <w:r>
-        <w:t xml:space="preserve"> Shallow text features [3] and neural sequence labeling [4, 5] classify blocks within one page. Trafilatura [6] and Readability [7] are widely used extractors tuned for articles; a large comparison [8] found no algorithm best on every page type. Converters such as MarkItDown [9] keep headings, tables and code but do not remove chrome, and Crawl4AI's pruning filter [10] scores nodes by text and link density. The WCXB benchmark [11] makes the weakness of article-tuned tools measurable: systems agree on articles (F1 about 0.93) and differ by 20 to 30 points on forums, products and collections; its leaders are a page-type-aware Rust extractor [12] and a 0.6B-parameter language-model block labeler [13]. Using several pages of one site to find its template was proposed early [14, 15] and benchmarked in [16]; query-time pruning such as HtmlRAG [17] complements ingest-time cleaning. ChromeRAG follows the feature-engineered block classification of [3] with gradient-boosted trees, adapts the discard patterns of Trafilatura [6], and packages both as a small CPU-only component with an optional site-template model, metadata, Markdown tables and heading-aware chunks, and explicit signals when the input is unusable or the extraction is unsure.</w:t>
+        <w:t xml:space="preserve"> Shallow text features [2] and neural sequence labeling [3, 4] classify blocks within one page. Trafilatura [5] and Readability [6] are widely used extractors tuned for articles; a large comparison [7] found no algorithm best on every page type. Converters such as MarkItDown [8] keep headings, tables and code but do not remove chrome, and Crawl4AI's pruning filter [9] scores nodes by text and link density. The WCXB benchmark [10] makes the weakness of article-tuned tools measurable: systems agree on articles (F1 about 0.93) and differ by 20 to 30 points on forums, products and collections; its leaders are a page-type-aware Rust extractor [11] and a 0.6B-parameter language-model block labeler [12]. Using several pages of one site to find its template was proposed early [13, 14] and benchmarked in [15]; query-time pruning such as HtmlRAG [16] complements ingest-time cleaning. ChromeRAG follows the feature-engineered block classification of [2] with gradient-boosted trees, adapts the discard patterns of Trafilatura [5], and packages both as a small CPU-only component with an optional site-template model, metadata, Markdown tables and heading-aware chunks, and explicit signals when the input is unusable or the extraction is unsure.</w:t>
       </w:r>
     </w:p>
     <w:p>
@@ -1057,7 +1057,7 @@
         <w:t>Stage 3: cleaning, rules and STCE.</w:t>
       </w:r>
       <w:r>
-        <w:t xml:space="preserve"> Scripts, styles and SVG are removed; hidden nodes and skip links are removed unless a hidden block holds long running text with few links. A page-wide &lt;form&gt;, an unclosed &lt;button&gt; or a large &lt;noscript&gt; keeps its content, as does the &lt;header&gt; of an &lt;article&gt; that holds the page h1. A YAML rule index of 37 rules drops known chrome: consent managers, share bars, documentation-framework widgets and 16 rules adapted from the discard patterns of Trafilatura [6]. Every rule carries evidence and a fixture. Generic detectors then remove in-page tables of contents, previous/next pagers, comment sections of articles, related-post blocks, standalone call-to-action buttons, share strips, newsletter blocks, author boxes, template placeholders and a footer-like tail after the last substantive block; each has guards (never the page title, a long paragraph, or more than a fixed share of the words) and a switch. If a site model is supplied, blocks whose signature (a hash of tag, id, classes and role, or of the text for bare blocks) is in the model are removed. chromerag learn keeps a signature only if it appears on at least 80% of a group's pages, stays short, and looks like chrome or is identical on every page.</w:t>
+        <w:t xml:space="preserve"> Scripts, styles and SVG are removed; hidden nodes and skip links are removed unless a hidden block holds long running text with few links. A page-wide &lt;form&gt;, an unclosed &lt;button&gt; or a large &lt;noscript&gt; keeps its content, as does the &lt;header&gt; of an &lt;article&gt; that holds the page h1. A YAML rule index of 37 rules drops known chrome: consent managers, share bars, documentation-framework widgets and 16 rules adapted from the discard patterns of Trafilatura [5]. Every rule carries evidence and a fixture. Generic detectors then remove in-page tables of contents, previous/next pagers, comment sections of articles, related-post blocks, standalone call-to-action buttons, share strips, newsletter blocks, author boxes, template placeholders and a footer-like tail after the last substantive block; each has guards (never the page title, a long paragraph, or more than a fixed share of the words) and a switch. If a site model is supplied, blocks whose signature (a hash of tag, id, classes and role, or of the text for bare blocks) is in the model are removed. chromerag learn keeps a signature only if it appears on at least 80% of a group's pages, stays short, and looks like chrome or is identical on every page.</w:t>
       </w:r>
     </w:p>
     <w:p>
@@ -1085,7 +1085,7 @@
         <w:t>Stage 5: learned block filter.</w:t>
       </w:r>
       <w:r>
-        <w:t xml:space="preserve"> The page is split into blocks (paragraphs, headings, list items, quotes, preformatted blocks, tables, text-only containers, and loose text between block elements). Each block is described by about 530 numbers: its text, its place in the page (position, distance to headings, content root), its tree context (ancestor tags, link density of enclosing boxes, repeated sibling structures), the words of its ancestors' class and id, feature-hashed [18], and the words of the heading above. Trees (300 trees of depth 6, trained with scikit-learn) give the probability that the block is main content; the exported model is a 150 KB array file and prediction uses NumPy only. A block is kept when its probability reaches 0.30 (coverage), 0.50 (balanced) or 0.70 (precision). Three structure rules complement the trees: the page's own h1 is kept, a heading is kept when one of the next two blocks is kept, and the paragraph under the title is kept when it is a real sentence. Pages with fewer than four blocks are kept whole and exact repeats are written once. diagnostics["lbc"] holds an estimate of the page's F1 from the block probabilities; below 0.70 a warning is issued.</w:t>
+        <w:t xml:space="preserve"> The page is split into blocks (paragraphs, headings, list items, quotes, preformatted blocks, tables, text-only containers, and loose text between block elements). Each block is described by about 530 numbers: its text, its place in the page (position, distance to headings, content root), its tree context (ancestor tags, link density of enclosing boxes, repeated sibling structures), the words of its ancestors' class and id, feature-hashed [17], and the words of the heading above. Trees (300 trees of depth 6, trained with scikit-learn) give the probability that the block is main content; the exported model is a 150 KB array file and prediction uses NumPy only. A block is kept when its probability reaches 0.30 (coverage), 0.50 (balanced) or 0.70 (precision). Three structure rules complement the trees: the page's own h1 is kept, a heading is kept when one of the next two blocks is kept, and the paragraph under the title is kept when it is a real sentence. Pages with fewer than four blocks are kept whole and exact repeats are written once. diagnostics["lbc"] holds an estimate of the page's F1 from the block probabilities; below 0.70 a warning is issued.</w:t>
       </w:r>
     </w:p>
     <w:p>
@@ -1364,7 +1364,7 @@
         <w:pStyle w:val="Body"/>
       </w:pPr>
       <w:r>
-        <w:t>The package needs Python 3.11 or later, installs with pip install chromerag [19] and has four direct dependencies (BeautifulSoup, lxml, PyYAML, NumPy). Getting Markdown takes two lines (from chromerag import ChromeRAG; md = ChromeRAG().extract(html).markdown); Trafilatura needs output_format="markdown" and table options, Readability returns HTML that must be converted again, and MarkItDown reads files or streams. Optional LangChain and LlamaIndex components return one document per page with the front-matter as metadata.</w:t>
+        <w:t>The package needs Python 3.11 or later, installs with pip install chromerag [18] and has four direct dependencies (BeautifulSoup, lxml, PyYAML, NumPy). Getting Markdown takes two lines (from chromerag import ChromeRAG; md = ChromeRAG().extract(html).markdown); Trafilatura needs output_format="markdown" and table options, Readability returns HTML that must be converted again, and MarkItDown reads files or streams. Optional LangChain and LlamaIndex components return one document per page with the front-matter as metadata.</w:t>
       </w:r>
     </w:p>
     <w:p>
@@ -1623,7 +1623,7 @@
         <w:pStyle w:val="Body"/>
       </w:pPr>
       <w:r>
-        <w:t>WCXB [11] has 2,008 pages in seven page types, with human-reviewed main content. Word-level F1 compares the bag of words of a tool's output with the reference (title excluded); "with" and "without" snippets test that required text is present and listed chrome absent. All tools receive the same HTML and no site model. ChromeRAG's YAML front-matter is removed before scoring, because it is metadata meant for chunk metadata and not text; scoring the raw default output with the benchmark's own script gives a lower value (about 0.87, or 0.90 with enable_schema=False). Trafilatura [6] runs with its best of four distinct settings on the development set; Readability [7] and MarkItDown [9] use defaults (Trafilatura 2.2.0, readability-lxml 0.9, MarkItDown 0.1.7, Python 3.14).</w:t>
+        <w:t>WCXB [10] has 2,008 pages in seven page types, with human-reviewed main content. Word-level F1 compares the bag of words of a tool's output with the reference (title excluded); "with" and "without" snippets test that required text is present and listed chrome absent. All tools receive the same HTML and no site model. ChromeRAG's YAML front-matter is removed before scoring, because it is metadata meant for chunk metadata and not text; scoring the raw default output with the benchmark's own script gives a lower value (about 0.87, or 0.90 with enable_schema=False). Trafilatura [5] runs with its best of four distinct settings on the development set; Readability [6] and MarkItDown [8] use defaults (Trafilatura 2.2.0, readability-lxml 0.9, MarkItDown 0.1.7, Python 3.14).</w:t>
       </w:r>
     </w:p>
     <w:p>
@@ -2424,7 +2424,7 @@
         <w:pStyle w:val="Body"/>
       </w:pPr>
       <w:r>
-        <w:t>Scores are means of page-level F1; intervals are percentile intervals of a paired bootstrap over pages (5,000 resamples, seed 0). On the 372 pages ChromeRAG leads Trafilatura by +0.040 (95% CI [+0.021, +0.059]; resampling its 316 domains instead, [+0.019, +0.062]): by +0.164 on forums [+0.102, +0.230], +0.051 on services [+0.004, +0.107] and +0.057 on the 9 collection pages [+0.024, +0.090]; on articles, documentation and listings the intervals contain zero, and 2 product pages allow no conclusion. Required snippets are found more often (0.783 against 0.743) and forbidden snippets less often (0.064 against 0.083). The benchmark's publication [11] reports 0.903 for the page-type-aware Rust extractor [12] and 0.841 for Trafilatura on all 511 test pages under its own configuration; we could not build that tool, so we quote it and claim no superiority; the settings differ and the numbers are not interchangeable.</w:t>
+        <w:t>Scores are means of page-level F1; intervals are percentile intervals of a paired bootstrap over pages (5,000 resamples, seed 0). On the 372 pages ChromeRAG leads Trafilatura by +0.040 (95% CI [+0.021, +0.059]; resampling its 316 domains instead, [+0.019, +0.062]): by +0.164 on forums [+0.102, +0.230], +0.051 on services [+0.004, +0.107] and +0.057 on the 9 collection pages [+0.024, +0.090]; on articles, documentation and listings the intervals contain zero, and 2 product pages allow no conclusion. Required snippets are found more often (0.783 against 0.743) and forbidden snippets less often (0.064 against 0.083). The benchmark's publication [10] reports 0.903 for the page-type-aware Rust extractor [11] and 0.841 for Trafilatura on all 511 test pages under its own configuration; we could not build that tool, so we quote it and claim no superiority; the settings differ and the numbers are not interchangeable.</w:t>
       </w:r>
     </w:p>
     <w:p>
@@ -3055,7 +3055,7 @@
         <w:pStyle w:val="Body"/>
       </w:pPr>
       <w:r>
-        <w:t>Do chunks that carry their heading path retrieve better? We cut 354 documentation pages from 50 sites not used in training into 3,395 chunks and had Claude write one natural question for each of 400 chunks, given the chunk and its page title. Prepending the title and heading path to the embedded text raised dense MRR (text-embedding-3-small) from 0.853 to 0.913 (+0.060, 95% CI [+0.036, +0.083]) and BM25 MRR by the same amount (+0.060 [+0.039, +0.081]); the title alone gives about two thirds of the gain. This supports contextual chunk headers [20] on one corpus; the question writer saw the page title, and other page types and languages are untested.</w:t>
+        <w:t>Do chunks that carry their heading path retrieve better? We cut 354 documentation pages from 50 sites not used in training into 3,395 chunks and had Claude write one natural question for each of 400 chunks, given the chunk and its page title. Prepending the title and heading path to the embedded text raised dense MRR (text-embedding-3-small) from 0.853 to 0.913 (+0.060, 95% CI [+0.036, +0.083]) and BM25 MRR by the same amount (+0.060 [+0.039, +0.081]); the title alone gives about two thirds of the gain. This supports contextual chunk headers [19] on one corpus; the question writer saw the page title, and other page types and languages are untested.</w:t>
       </w:r>
     </w:p>
     <w:p>
@@ -3157,7 +3157,7 @@
         <w:t>Limitations.</w:t>
       </w:r>
       <w:r>
-        <w:t xml:space="preserve"> (i) No JavaScript is run; shells are flagged, not recovered. (ii) The model was trained on one mostly English benchmark, and its features include English stop words and call-to-action verbs. (iii) Labels are word overlaps with human-reviewed references, with some annotator inconsistency (documentation code samples are included on 82% of pages), which caps the gain on documentation. (iv) The public WCXB dev/ folder contains 139 test pages, and 166 test pages share a domain with development; we report test results without the former and can say little about products and collections. (v) The anchor metric and the known-item queries come from the pages themselves (self-retrieval, not answer accuracy); judged results come from language models, whose verdicts are noisy (about 83% of swapped pairs repeated in an earlier check with one judge) and, for GPT and Gemini, not exactly reproducible; none is a human assessment. (vi) The rules were developed on documentation, landing and WCXB development pages; the fresh pages were used once, but the judges' summary scores had shown which page types needed work. (vii) STCE needs at least three pages per site group and added no accuracy on the pages we measured. (viii) Only HTML is handled. (ix) The benchmark's author also builds a competing extractor; we use the public data, a scorer that follows the benchmark's F1 definition, independent corpora and independent judges. (x) We did not compare with language-model extractors [13, 21], which need a GPU or a hosted model.</w:t>
+        <w:t xml:space="preserve"> (i) No JavaScript is run; shells are flagged, not recovered. (ii) The model was trained on one mostly English benchmark, and its features include English stop words and call-to-action verbs. (iii) Labels are word overlaps with human-reviewed references, with some annotator inconsistency (documentation code samples are included on 82% of pages), which caps the gain on documentation. (iv) The public WCXB dev/ folder contains 139 test pages, and 166 test pages share a domain with development; we report test results without the former and can say little about products and collections. (v) The anchor metric and the known-item queries come from the pages themselves (self-retrieval, not answer accuracy); judged results come from language models, whose verdicts are noisy (about 83% of swapped pairs repeated in an earlier check with one judge) and, for GPT and Gemini, not exactly reproducible; none is a human assessment. (vi) The rules were developed on documentation, landing and WCXB development pages; the fresh pages were used once, but the judges' summary scores had shown which page types needed work. (vii) STCE needs at least three pages per site group and added no accuracy on the pages we measured. (viii) Only HTML is handled. (ix) The benchmark's author also builds a competing extractor; we use the public data, a scorer that follows the benchmark's F1 definition, independent corpora and independent judges. (x) We did not compare with language-model extractors [12, 20], which need a GPU or a hosted model.</w:t>
       </w:r>
     </w:p>
     <w:p>
@@ -3181,7 +3181,7 @@
         <w:pStyle w:val="Body"/>
       </w:pPr>
       <w:r>
-        <w:t>ChromeRAG is a focused, installable component for the ingest step of web RAG pipelines. A 150 KB learned block filter, structural rules adapted from Trafilatura's discard patterns and a heading-aware chunker remove site chrome across page types: on 372 held-out WCXB test pages it gains 0.040 F1 over Trafilatura (forums +0.164, services +0.051) and ties on articles, documentation and listings; on 328 fresh pages blinded judges from three model families prefer it, and it retrieves better than Trafilatura with heading context adding 0.06 MRR. It can learn a site's template, carries Schema.org metadata and tables into chunk-friendly form, and reports unusable inputs and uncertain pages. Planned work covers multilingual training data, retraining without the 139 duplicated files, human-rated judgments and an optional sentence-encoder feature [22].</w:t>
+        <w:t>ChromeRAG is a focused, installable component for the ingest step of web RAG pipelines. A 150 KB learned block filter, structural rules adapted from Trafilatura's discard patterns and a heading-aware chunker remove site chrome across page types: on 372 held-out WCXB test pages it gains 0.040 F1 over Trafilatura (forums +0.164, services +0.051) and ties on articles, documentation and listings; on 328 fresh pages blinded judges from three model families prefer it, and it retrieves better than Trafilatura with heading context adding 0.06 MRR. It can learn a site's template, carries Schema.org metadata and tables into chunk-friendly form, and reports unusable inputs and uncertain pages. Planned work covers multilingual training data, retraining without the 139 duplicated files, human-rated judgments and an optional sentence-encoder feature [21].</w:t>
       </w:r>
     </w:p>
     <w:p>
@@ -3321,167 +3321,159 @@
         <w:pStyle w:val="Body"/>
       </w:pPr>
       <w:r>
-        <w:t>2. B. C. Peddapudi, "Vector Retrieval Drift under Corpus Growth: A Controlled Empirical Study with Metadata Filtering on EnterpriseRAG-Bench," manuscript under review, 2026. Artifacts: https://pedapudibhargav.github.io/vector-drift-study/</w:t>
-      </w:r>
-    </w:p>
-    <w:p>
-      <w:pPr>
-        <w:pStyle w:val="Body"/>
-      </w:pPr>
-      <w:r>
-        <w:t>3. C. Kohlschütter, P. Fankhauser, and W. Nejdl, "Boilerplate Detection Using Shallow Text Features," in Proc. 3rd ACM Int. Conf. Web Search and Data Mining (WSDM), 2010, pp. 441–450. doi: 10.1145/1718487.1718542.</w:t>
-      </w:r>
-    </w:p>
-    <w:p>
-      <w:pPr>
-        <w:pStyle w:val="Body"/>
-      </w:pPr>
-      <w:r>
-        <w:t>4. T. Vogels, O.-E. Ganea, and C. Eickhoff, "Web2Text: Deep Structured Boilerplate Removal," in Advances in Information Retrieval (ECIR 2018), LNCS, 2018, pp. 167–179. doi: 10.1007/978-3-319-76941-7_13.</w:t>
-      </w:r>
-    </w:p>
-    <w:p>
-      <w:pPr>
-        <w:pStyle w:val="Body"/>
-      </w:pPr>
-      <w:r>
-        <w:t>5. J. Leonhardt, A. Anand, and M. Khosla, "Boilerplate Removal using a Neural Sequence Labeling Model," in Companion Proc. The Web Conf. 2020 (WWW '20), 2020, pp. 226–229. doi: 10.1145/3366424.3383547.</w:t>
-      </w:r>
-    </w:p>
-    <w:p>
-      <w:pPr>
-        <w:pStyle w:val="Body"/>
-      </w:pPr>
-      <w:r>
-        <w:t>6. A. Barbaresi, "Trafilatura: A Web Scraping Library and Command-Line Tool for Text Discovery and Extraction," in Proc. ACL-IJCNLP 2021: System Demonstrations, 2021, pp. 122–131. doi: 10.18653/v1/2021.acl-demo.15.</w:t>
-      </w:r>
-    </w:p>
-    <w:p>
-      <w:pPr>
-        <w:pStyle w:val="Body"/>
-      </w:pPr>
-      <w:r>
-        <w:t>7. Y. Baburov et al., python-readability (readability-lxml), Python port of Arc90 Readability, GitHub, accessed 2026-10-02. [Online]. Available: https://github.com/buriy/python-readability</w:t>
-      </w:r>
-    </w:p>
-    <w:p>
-      <w:pPr>
-        <w:pStyle w:val="Body"/>
-      </w:pPr>
-      <w:r>
-        <w:t>8. J. Bevendorff, S. Gupta, J. Kiesel, and B. Stein, "An Empirical Comparison of Web Content Extraction Algorithms," in Proc. 46th Int. ACM SIGIR Conf., 2023, pp. 2594–2603. doi: 10.1145/3539618.3591920.</w:t>
-      </w:r>
-    </w:p>
-    <w:p>
-      <w:pPr>
-        <w:pStyle w:val="Body"/>
-      </w:pPr>
-      <w:r>
-        <w:t>9. Microsoft, MarkItDown: Python tool for converting files and office documents to Markdown, GitHub, accessed 2026-10-02. [Online]. Available: https://github.com/microsoft/markitdown</w:t>
-      </w:r>
-    </w:p>
-    <w:p>
-      <w:pPr>
-        <w:pStyle w:val="Body"/>
-      </w:pPr>
-      <w:r>
-        <w:t>10. Crawl4AI, "Fit Markdown" (PruningContentFilter), documentation, accessed 2026-10-02. [Online]. Available: https://docs.crawl4ai.com/core/fit-markdown/</w:t>
-      </w:r>
-    </w:p>
-    <w:p>
-      <w:pPr>
-        <w:pStyle w:val="Body"/>
-      </w:pPr>
-      <w:r>
-        <w:t>11. M. Foley, "WCXB: A Multi-Type Web Content Extraction Benchmark," arXiv: 2605.21097, May 2026. Data: CC-BY-4.0.</w:t>
-      </w:r>
-    </w:p>
-    <w:p>
-      <w:pPr>
-        <w:pStyle w:val="Body"/>
-      </w:pPr>
-      <w:r>
-        <w:t>12. M. Foley, rs-trafilatura: web content extraction in Rust with page-type classification, GitHub, accessed 2026-10-02. [Online]. Available: https://github.com/Murrough-Foley/rs-trafilatura</w:t>
-      </w:r>
-    </w:p>
-    <w:p>
-      <w:pPr>
-        <w:pStyle w:val="Body"/>
-      </w:pPr>
-      <w:r>
-        <w:t>13. M. Liu et al., "Dripper: Token-Efficient Main HTML Extraction with a Lightweight LM," arXiv: 2511.23119, 2025.</w:t>
-      </w:r>
-    </w:p>
-    <w:p>
-      <w:pPr>
-        <w:pStyle w:val="Body"/>
-      </w:pPr>
-      <w:r>
-        <w:t>14. Z. Bar-Yossef and S. Rajagopalan, "Template Detection via Data Mining and its Applications," in Proc. 11th Int. World Wide Web Conf. (WWW), 2002, pp. 580–591. doi: 10.1145/511446.511522.</w:t>
-      </w:r>
-    </w:p>
-    <w:p>
-      <w:pPr>
-        <w:pStyle w:val="Body"/>
-      </w:pPr>
-      <w:r>
-        <w:t>15. L. Yi, B. Liu, and X. Li, "Eliminating Noisy Information in Web Pages for Data Mining," in Proc. 9th ACM SIGKDD Int. Conf. Knowledge Discovery and Data Mining, 2003, pp. 296–305. doi: 10.1145/956750.956785.</w:t>
-      </w:r>
-    </w:p>
-    <w:p>
-      <w:pPr>
-        <w:pStyle w:val="Body"/>
-      </w:pPr>
-      <w:r>
-        <w:t>16. J. Alarte, J. Silva, and S. Tamarit, "What Web Template Extractor Should I Use? A Benchmarking and Comparison for Five Template Extractors," ACM Trans. Web, vol. 13, no. 2, Art. 9, 2019. doi: 10.1145/3316810.</w:t>
-      </w:r>
-    </w:p>
-    <w:p>
-      <w:pPr>
-        <w:pStyle w:val="Body"/>
-      </w:pPr>
-      <w:r>
-        <w:t>17. J. Tan, Z. Dou, W. Wang, M. Wang, W. Chen, and J.-R. Wen, "HtmlRAG: HTML is Better Than Plain Text for Modeling Retrieved Knowledge in RAG Systems," in Proc. ACM Web Conf. 2025 (WWW '25), 2025, pp. 1733–1746. doi: 10.1145/3696410.3714546.</w:t>
-      </w:r>
-    </w:p>
-    <w:p>
-      <w:pPr>
-        <w:pStyle w:val="Body"/>
-      </w:pPr>
-      <w:r>
-        <w:t>18. K. Weinberger, A. Dasgupta, J. Langford, A. Smola, and J. Attenberg, "Feature Hashing for Large Scale Multitask Learning," in Proc. 26th Int. Conf. Machine Learning (ICML), 2009, pp. 1113–1120. doi: 10.1145/1553374.1553516.</w:t>
-      </w:r>
-    </w:p>
-    <w:p>
-      <w:pPr>
-        <w:pStyle w:val="Body"/>
-      </w:pPr>
-      <w:r>
-        <w:t>19. B. C. Peddapudi, ChromeRAG, version 0.1.4, Zenodo, 3 October 2026. doi: 10.5281/zenodo.23126161 (all versions: 10.5281/zenodo.22970289). Source: https://github.com/pedapudibhargav/ChromeRAG</w:t>
-      </w:r>
-    </w:p>
-    <w:p>
-      <w:pPr>
-        <w:pStyle w:val="Body"/>
-      </w:pPr>
-      <w:r>
-        <w:t>20. Anthropic, "Introducing Contextual Retrieval," 19 September 2024. [Online]. Available: https://www.anthropic.com/news/contextual-retrieval</w:t>
-      </w:r>
-    </w:p>
-    <w:p>
-      <w:pPr>
-        <w:pStyle w:val="Body"/>
-      </w:pPr>
-      <w:r>
-        <w:t>21. F. Wang, Z. Shi, B. Wang, N. Wang, and H. Xiao, "ReaderLM-v2: Small Language Model for HTML to Markdown and JSON," arXiv: 2503.01151, 2025.</w:t>
-      </w:r>
-    </w:p>
-    <w:p>
-      <w:pPr>
-        <w:pStyle w:val="Body"/>
-      </w:pPr>
-      <w:r>
-        <w:t>22. N. Reimers and I. Gurevych, "Sentence-BERT: Sentence Embeddings using Siamese BERT-Networks," in Proc. EMNLP-IJCNLP 2019, 2019, pp. 3980–3990. doi: 10.18653/v1/D19-1410.</w:t>
+        <w:t>2. C. Kohlschütter, P. Fankhauser, and W. Nejdl, "Boilerplate Detection Using Shallow Text Features," in Proc. 3rd ACM Int. Conf. Web Search and Data Mining (WSDM), 2010, pp. 441–450. doi: 10.1145/1718487.1718542.</w:t>
+      </w:r>
+    </w:p>
+    <w:p>
+      <w:pPr>
+        <w:pStyle w:val="Body"/>
+      </w:pPr>
+      <w:r>
+        <w:t>3. T. Vogels, O.-E. Ganea, and C. Eickhoff, "Web2Text: Deep Structured Boilerplate Removal," in Advances in Information Retrieval (ECIR 2018), LNCS, 2018, pp. 167–179. doi: 10.1007/978-3-319-76941-7_13.</w:t>
+      </w:r>
+    </w:p>
+    <w:p>
+      <w:pPr>
+        <w:pStyle w:val="Body"/>
+      </w:pPr>
+      <w:r>
+        <w:t>4. J. Leonhardt, A. Anand, and M. Khosla, "Boilerplate Removal using a Neural Sequence Labeling Model," in Companion Proc. The Web Conf. 2020 (WWW '20), 2020, pp. 226–229. doi: 10.1145/3366424.3383547.</w:t>
+      </w:r>
+    </w:p>
+    <w:p>
+      <w:pPr>
+        <w:pStyle w:val="Body"/>
+      </w:pPr>
+      <w:r>
+        <w:t>5. A. Barbaresi, "Trafilatura: A Web Scraping Library and Command-Line Tool for Text Discovery and Extraction," in Proc. ACL-IJCNLP 2021: System Demonstrations, 2021, pp. 122–131. doi: 10.18653/v1/2021.acl-demo.15.</w:t>
+      </w:r>
+    </w:p>
+    <w:p>
+      <w:pPr>
+        <w:pStyle w:val="Body"/>
+      </w:pPr>
+      <w:r>
+        <w:t>6. Y. Baburov et al., python-readability (readability-lxml), Python port of Arc90 Readability, GitHub, accessed 2026-10-02. [Online]. Available: https://github.com/buriy/python-readability</w:t>
+      </w:r>
+    </w:p>
+    <w:p>
+      <w:pPr>
+        <w:pStyle w:val="Body"/>
+      </w:pPr>
+      <w:r>
+        <w:t>7. J. Bevendorff, S. Gupta, J. Kiesel, and B. Stein, "An Empirical Comparison of Web Content Extraction Algorithms," in Proc. 46th Int. ACM SIGIR Conf., 2023, pp. 2594–2603. doi: 10.1145/3539618.3591920.</w:t>
+      </w:r>
+    </w:p>
+    <w:p>
+      <w:pPr>
+        <w:pStyle w:val="Body"/>
+      </w:pPr>
+      <w:r>
+        <w:t>8. Microsoft, MarkItDown: Python tool for converting files and office documents to Markdown, GitHub, accessed 2026-10-02. [Online]. Available: https://github.com/microsoft/markitdown</w:t>
+      </w:r>
+    </w:p>
+    <w:p>
+      <w:pPr>
+        <w:pStyle w:val="Body"/>
+      </w:pPr>
+      <w:r>
+        <w:t>9. Crawl4AI, "Fit Markdown" (PruningContentFilter), documentation, accessed 2026-10-02. [Online]. Available: https://docs.crawl4ai.com/core/fit-markdown/</w:t>
+      </w:r>
+    </w:p>
+    <w:p>
+      <w:pPr>
+        <w:pStyle w:val="Body"/>
+      </w:pPr>
+      <w:r>
+        <w:t>10. M. Foley, "WCXB: A Multi-Type Web Content Extraction Benchmark," arXiv: 2605.21097, May 2026. Data: CC-BY-4.0.</w:t>
+      </w:r>
+    </w:p>
+    <w:p>
+      <w:pPr>
+        <w:pStyle w:val="Body"/>
+      </w:pPr>
+      <w:r>
+        <w:t>11. M. Foley, rs-trafilatura: web content extraction in Rust with page-type classification, GitHub, accessed 2026-10-02. [Online]. Available: https://github.com/Murrough-Foley/rs-trafilatura</w:t>
+      </w:r>
+    </w:p>
+    <w:p>
+      <w:pPr>
+        <w:pStyle w:val="Body"/>
+      </w:pPr>
+      <w:r>
+        <w:t>12. M. Liu et al., "Dripper: Token-Efficient Main HTML Extraction with a Lightweight LM," arXiv: 2511.23119, 2025.</w:t>
+      </w:r>
+    </w:p>
+    <w:p>
+      <w:pPr>
+        <w:pStyle w:val="Body"/>
+      </w:pPr>
+      <w:r>
+        <w:t>13. Z. Bar-Yossef and S. Rajagopalan, "Template Detection via Data Mining and its Applications," in Proc. 11th Int. World Wide Web Conf. (WWW), 2002, pp. 580–591. doi: 10.1145/511446.511522.</w:t>
+      </w:r>
+    </w:p>
+    <w:p>
+      <w:pPr>
+        <w:pStyle w:val="Body"/>
+      </w:pPr>
+      <w:r>
+        <w:t>14. L. Yi, B. Liu, and X. Li, "Eliminating Noisy Information in Web Pages for Data Mining," in Proc. 9th ACM SIGKDD Int. Conf. Knowledge Discovery and Data Mining, 2003, pp. 296–305. doi: 10.1145/956750.956785.</w:t>
+      </w:r>
+    </w:p>
+    <w:p>
+      <w:pPr>
+        <w:pStyle w:val="Body"/>
+      </w:pPr>
+      <w:r>
+        <w:t>15. J. Alarte, J. Silva, and S. Tamarit, "What Web Template Extractor Should I Use? A Benchmarking and Comparison for Five Template Extractors," ACM Trans. Web, vol. 13, no. 2, Art. 9, 2019. doi: 10.1145/3316810.</w:t>
+      </w:r>
+    </w:p>
+    <w:p>
+      <w:pPr>
+        <w:pStyle w:val="Body"/>
+      </w:pPr>
+      <w:r>
+        <w:t>16. J. Tan, Z. Dou, W. Wang, M. Wang, W. Chen, and J.-R. Wen, "HtmlRAG: HTML is Better Than Plain Text for Modeling Retrieved Knowledge in RAG Systems," in Proc. ACM Web Conf. 2025 (WWW '25), 2025, pp. 1733–1746. doi: 10.1145/3696410.3714546.</w:t>
+      </w:r>
+    </w:p>
+    <w:p>
+      <w:pPr>
+        <w:pStyle w:val="Body"/>
+      </w:pPr>
+      <w:r>
+        <w:t>17. K. Weinberger, A. Dasgupta, J. Langford, A. Smola, and J. Attenberg, "Feature Hashing for Large Scale Multitask Learning," in Proc. 26th Int. Conf. Machine Learning (ICML), 2009, pp. 1113–1120. doi: 10.1145/1553374.1553516.</w:t>
+      </w:r>
+    </w:p>
+    <w:p>
+      <w:pPr>
+        <w:pStyle w:val="Body"/>
+      </w:pPr>
+      <w:r>
+        <w:t>18. B. C. Peddapudi, ChromeRAG, version 0.1.4, Zenodo, 3 October 2026. doi: 10.5281/zenodo.23126161 (all versions: 10.5281/zenodo.22970289). Source: https://github.com/pedapudibhargav/ChromeRAG</w:t>
+      </w:r>
+    </w:p>
+    <w:p>
+      <w:pPr>
+        <w:pStyle w:val="Body"/>
+      </w:pPr>
+      <w:r>
+        <w:t>19. Anthropic, "Introducing Contextual Retrieval," 19 September 2024. [Online]. Available: https://www.anthropic.com/news/contextual-retrieval</w:t>
+      </w:r>
+    </w:p>
+    <w:p>
+      <w:pPr>
+        <w:pStyle w:val="Body"/>
+      </w:pPr>
+      <w:r>
+        <w:t>20. F. Wang, Z. Shi, B. Wang, N. Wang, and H. Xiao, "ReaderLM-v2: Small Language Model for HTML to Markdown and JSON," arXiv: 2503.01151, 2025.</w:t>
+      </w:r>
+    </w:p>
+    <w:p>
+      <w:pPr>
+        <w:pStyle w:val="Body"/>
+      </w:pPr>
+      <w:r>
+        <w:t>21. N. Reimers and I. Gurevych, "Sentence-BERT: Sentence Embeddings using Siamese BERT-Networks," in Proc. EMNLP-IJCNLP 2019, 2019, pp. 3980–3990. doi: 10.18653/v1/D19-1410.</w:t>
       </w:r>
     </w:p>
     <w:sectPr>

</xml_diff>

<commit_message>
References: Elsevier numbered style as in the SoftwareX template
Co-Authored-By: Claude Sonnet 5.5 <noreply@anthropic.com>
</commit_message>
<xml_diff>
--- a/papers/softwarex/ChromeRAG_SoftwareX_OSP.docx
+++ b/papers/softwarex/ChromeRAG_SoftwareX_OSP.docx
@@ -3313,167 +3313,167 @@
         <w:pStyle w:val="Body"/>
       </w:pPr>
       <w:r>
-        <w:t>1. P. Lewis, E. Perez, A. Piktus, F. Petroni, V. Karpukhin, N. Goyal, H. Küttler, M. Lewis, W. Yih, T. Rocktäschel, S. Riedel, and D. Kiela, "Retrieval-Augmented Generation for Knowledge-Intensive NLP Tasks," in Advances in Neural Information Processing Systems 33 (NeurIPS 2020), 2020, pp. 9459–9474. arXiv: 2005.11401.</w:t>
-      </w:r>
-    </w:p>
-    <w:p>
-      <w:pPr>
-        <w:pStyle w:val="Body"/>
-      </w:pPr>
-      <w:r>
-        <w:t>2. C. Kohlschütter, P. Fankhauser, and W. Nejdl, "Boilerplate Detection Using Shallow Text Features," in Proc. 3rd ACM Int. Conf. Web Search and Data Mining (WSDM), 2010, pp. 441–450. doi: 10.1145/1718487.1718542.</w:t>
-      </w:r>
-    </w:p>
-    <w:p>
-      <w:pPr>
-        <w:pStyle w:val="Body"/>
-      </w:pPr>
-      <w:r>
-        <w:t>3. T. Vogels, O.-E. Ganea, and C. Eickhoff, "Web2Text: Deep Structured Boilerplate Removal," in Advances in Information Retrieval (ECIR 2018), LNCS, 2018, pp. 167–179. doi: 10.1007/978-3-319-76941-7_13.</w:t>
-      </w:r>
-    </w:p>
-    <w:p>
-      <w:pPr>
-        <w:pStyle w:val="Body"/>
-      </w:pPr>
-      <w:r>
-        <w:t>4. J. Leonhardt, A. Anand, and M. Khosla, "Boilerplate Removal using a Neural Sequence Labeling Model," in Companion Proc. The Web Conf. 2020 (WWW '20), 2020, pp. 226–229. doi: 10.1145/3366424.3383547.</w:t>
-      </w:r>
-    </w:p>
-    <w:p>
-      <w:pPr>
-        <w:pStyle w:val="Body"/>
-      </w:pPr>
-      <w:r>
-        <w:t>5. A. Barbaresi, "Trafilatura: A Web Scraping Library and Command-Line Tool for Text Discovery and Extraction," in Proc. ACL-IJCNLP 2021: System Demonstrations, 2021, pp. 122–131. doi: 10.18653/v1/2021.acl-demo.15.</w:t>
-      </w:r>
-    </w:p>
-    <w:p>
-      <w:pPr>
-        <w:pStyle w:val="Body"/>
-      </w:pPr>
-      <w:r>
-        <w:t>6. Y. Baburov et al., python-readability (readability-lxml), Python port of Arc90 Readability, GitHub, accessed 2026-10-02. [Online]. Available: https://github.com/buriy/python-readability</w:t>
-      </w:r>
-    </w:p>
-    <w:p>
-      <w:pPr>
-        <w:pStyle w:val="Body"/>
-      </w:pPr>
-      <w:r>
-        <w:t>7. J. Bevendorff, S. Gupta, J. Kiesel, and B. Stein, "An Empirical Comparison of Web Content Extraction Algorithms," in Proc. 46th Int. ACM SIGIR Conf., 2023, pp. 2594–2603. doi: 10.1145/3539618.3591920.</w:t>
-      </w:r>
-    </w:p>
-    <w:p>
-      <w:pPr>
-        <w:pStyle w:val="Body"/>
-      </w:pPr>
-      <w:r>
-        <w:t>8. Microsoft, MarkItDown: Python tool for converting files and office documents to Markdown, GitHub, accessed 2026-10-02. [Online]. Available: https://github.com/microsoft/markitdown</w:t>
-      </w:r>
-    </w:p>
-    <w:p>
-      <w:pPr>
-        <w:pStyle w:val="Body"/>
-      </w:pPr>
-      <w:r>
-        <w:t>9. Crawl4AI, "Fit Markdown" (PruningContentFilter), documentation, accessed 2026-10-02. [Online]. Available: https://docs.crawl4ai.com/core/fit-markdown/</w:t>
-      </w:r>
-    </w:p>
-    <w:p>
-      <w:pPr>
-        <w:pStyle w:val="Body"/>
-      </w:pPr>
-      <w:r>
-        <w:t>10. M. Foley, "WCXB: A Multi-Type Web Content Extraction Benchmark," arXiv: 2605.21097, May 2026. Data: CC-BY-4.0.</w:t>
-      </w:r>
-    </w:p>
-    <w:p>
-      <w:pPr>
-        <w:pStyle w:val="Body"/>
-      </w:pPr>
-      <w:r>
-        <w:t>11. M. Foley, rs-trafilatura: web content extraction in Rust with page-type classification, GitHub, accessed 2026-10-02. [Online]. Available: https://github.com/Murrough-Foley/rs-trafilatura</w:t>
-      </w:r>
-    </w:p>
-    <w:p>
-      <w:pPr>
-        <w:pStyle w:val="Body"/>
-      </w:pPr>
-      <w:r>
-        <w:t>12. M. Liu et al., "Dripper: Token-Efficient Main HTML Extraction with a Lightweight LM," arXiv: 2511.23119, 2025.</w:t>
-      </w:r>
-    </w:p>
-    <w:p>
-      <w:pPr>
-        <w:pStyle w:val="Body"/>
-      </w:pPr>
-      <w:r>
-        <w:t>13. Z. Bar-Yossef and S. Rajagopalan, "Template Detection via Data Mining and its Applications," in Proc. 11th Int. World Wide Web Conf. (WWW), 2002, pp. 580–591. doi: 10.1145/511446.511522.</w:t>
-      </w:r>
-    </w:p>
-    <w:p>
-      <w:pPr>
-        <w:pStyle w:val="Body"/>
-      </w:pPr>
-      <w:r>
-        <w:t>14. L. Yi, B. Liu, and X. Li, "Eliminating Noisy Information in Web Pages for Data Mining," in Proc. 9th ACM SIGKDD Int. Conf. Knowledge Discovery and Data Mining, 2003, pp. 296–305. doi: 10.1145/956750.956785.</w:t>
-      </w:r>
-    </w:p>
-    <w:p>
-      <w:pPr>
-        <w:pStyle w:val="Body"/>
-      </w:pPr>
-      <w:r>
-        <w:t>15. J. Alarte, J. Silva, and S. Tamarit, "What Web Template Extractor Should I Use? A Benchmarking and Comparison for Five Template Extractors," ACM Trans. Web, vol. 13, no. 2, Art. 9, 2019. doi: 10.1145/3316810.</w:t>
-      </w:r>
-    </w:p>
-    <w:p>
-      <w:pPr>
-        <w:pStyle w:val="Body"/>
-      </w:pPr>
-      <w:r>
-        <w:t>16. J. Tan, Z. Dou, W. Wang, M. Wang, W. Chen, and J.-R. Wen, "HtmlRAG: HTML is Better Than Plain Text for Modeling Retrieved Knowledge in RAG Systems," in Proc. ACM Web Conf. 2025 (WWW '25), 2025, pp. 1733–1746. doi: 10.1145/3696410.3714546.</w:t>
-      </w:r>
-    </w:p>
-    <w:p>
-      <w:pPr>
-        <w:pStyle w:val="Body"/>
-      </w:pPr>
-      <w:r>
-        <w:t>17. K. Weinberger, A. Dasgupta, J. Langford, A. Smola, and J. Attenberg, "Feature Hashing for Large Scale Multitask Learning," in Proc. 26th Int. Conf. Machine Learning (ICML), 2009, pp. 1113–1120. doi: 10.1145/1553374.1553516.</w:t>
-      </w:r>
-    </w:p>
-    <w:p>
-      <w:pPr>
-        <w:pStyle w:val="Body"/>
-      </w:pPr>
-      <w:r>
-        <w:t>18. B. C. Peddapudi, ChromeRAG, version 0.1.4, Zenodo, 3 October 2026. doi: 10.5281/zenodo.23126161 (all versions: 10.5281/zenodo.22970289). Source: https://github.com/pedapudibhargav/ChromeRAG</w:t>
-      </w:r>
-    </w:p>
-    <w:p>
-      <w:pPr>
-        <w:pStyle w:val="Body"/>
-      </w:pPr>
-      <w:r>
-        <w:t>19. Anthropic, "Introducing Contextual Retrieval," 19 September 2024. [Online]. Available: https://www.anthropic.com/news/contextual-retrieval</w:t>
-      </w:r>
-    </w:p>
-    <w:p>
-      <w:pPr>
-        <w:pStyle w:val="Body"/>
-      </w:pPr>
-      <w:r>
-        <w:t>20. F. Wang, Z. Shi, B. Wang, N. Wang, and H. Xiao, "ReaderLM-v2: Small Language Model for HTML to Markdown and JSON," arXiv: 2503.01151, 2025.</w:t>
-      </w:r>
-    </w:p>
-    <w:p>
-      <w:pPr>
-        <w:pStyle w:val="Body"/>
-      </w:pPr>
-      <w:r>
-        <w:t>21. N. Reimers and I. Gurevych, "Sentence-BERT: Sentence Embeddings using Siamese BERT-Networks," in Proc. EMNLP-IJCNLP 2019, 2019, pp. 3980–3990. doi: 10.18653/v1/D19-1410.</w:t>
+        <w:t>[1] Lewis P, Perez E, Piktus A, Petroni F, Karpukhin V, Goyal N, et al. Retrieval-augmented generation for knowledge-intensive NLP tasks. Advances in Neural Information Processing Systems 2020;33:9459–74. arXiv:2005.11401.</w:t>
+      </w:r>
+    </w:p>
+    <w:p>
+      <w:pPr>
+        <w:pStyle w:val="Body"/>
+      </w:pPr>
+      <w:r>
+        <w:t>[2] Kohlschütter C, Fankhauser P, Nejdl W. Boilerplate detection using shallow text features. Proc 3rd ACM Int Conf Web Search and Data Mining (WSDM), 2010, p. 441–50. https://doi.org/10.1145/1718487.1718542.</w:t>
+      </w:r>
+    </w:p>
+    <w:p>
+      <w:pPr>
+        <w:pStyle w:val="Body"/>
+      </w:pPr>
+      <w:r>
+        <w:t>[3] Vogels T, Ganea O-E, Eickhoff C. Web2Text: deep structured boilerplate removal. Advances in Information Retrieval (ECIR 2018), LNCS, 2018, p. 167–79. https://doi.org/10.1007/978-3-319-76941-7_13.</w:t>
+      </w:r>
+    </w:p>
+    <w:p>
+      <w:pPr>
+        <w:pStyle w:val="Body"/>
+      </w:pPr>
+      <w:r>
+        <w:t>[4] Leonhardt J, Anand A, Khosla M. Boilerplate removal using a neural sequence labeling model. Companion Proc The Web Conf 2020 (WWW '20), 2020, p. 226–9. https://doi.org/10.1145/3366424.3383547.</w:t>
+      </w:r>
+    </w:p>
+    <w:p>
+      <w:pPr>
+        <w:pStyle w:val="Body"/>
+      </w:pPr>
+      <w:r>
+        <w:t>[5] Barbaresi A. Trafilatura: a web scraping library and command-line tool for text discovery and extraction. Proc ACL-IJCNLP 2021: System Demonstrations, 2021, p. 122–31. https://doi.org/10.18653/v1/2021.acl-demo.15.</w:t>
+      </w:r>
+    </w:p>
+    <w:p>
+      <w:pPr>
+        <w:pStyle w:val="Body"/>
+      </w:pPr>
+      <w:r>
+        <w:t>[6] Baburov Y, et al. python-readability (readability-lxml): Python port of Arc90 Readability. GitHub, https://github.com/buriy/python-readability [accessed 2 October 2026].</w:t>
+      </w:r>
+    </w:p>
+    <w:p>
+      <w:pPr>
+        <w:pStyle w:val="Body"/>
+      </w:pPr>
+      <w:r>
+        <w:t>[7] Bevendorff J, Gupta S, Kiesel J, Stein B. An empirical comparison of web content extraction algorithms. Proc 46th Int ACM SIGIR Conf, 2023, p. 2594–603. https://doi.org/10.1145/3539618.3591920.</w:t>
+      </w:r>
+    </w:p>
+    <w:p>
+      <w:pPr>
+        <w:pStyle w:val="Body"/>
+      </w:pPr>
+      <w:r>
+        <w:t>[8] Microsoft. MarkItDown: Python tool for converting files and office documents to Markdown. GitHub, https://github.com/microsoft/markitdown [accessed 2 October 2026].</w:t>
+      </w:r>
+    </w:p>
+    <w:p>
+      <w:pPr>
+        <w:pStyle w:val="Body"/>
+      </w:pPr>
+      <w:r>
+        <w:t>[9] Crawl4AI. Fit Markdown (PruningContentFilter), documentation, https://docs.crawl4ai.com/core/fit-markdown/ [accessed 2 October 2026].</w:t>
+      </w:r>
+    </w:p>
+    <w:p>
+      <w:pPr>
+        <w:pStyle w:val="Body"/>
+      </w:pPr>
+      <w:r>
+        <w:t>[10] Foley M. WCXB: a multi-type web content extraction benchmark. arXiv:2605.21097, May 2026. Data: CC-BY-4.0.</w:t>
+      </w:r>
+    </w:p>
+    <w:p>
+      <w:pPr>
+        <w:pStyle w:val="Body"/>
+      </w:pPr>
+      <w:r>
+        <w:t>[11] Foley M. rs-trafilatura: web content extraction in Rust with page-type classification. GitHub, https://github.com/Murrough-Foley/rs-trafilatura [accessed 2 October 2026].</w:t>
+      </w:r>
+    </w:p>
+    <w:p>
+      <w:pPr>
+        <w:pStyle w:val="Body"/>
+      </w:pPr>
+      <w:r>
+        <w:t>[12] Liu M, et al. Dripper: token-efficient main HTML extraction with a lightweight LM. arXiv:2511.23119, 2025.</w:t>
+      </w:r>
+    </w:p>
+    <w:p>
+      <w:pPr>
+        <w:pStyle w:val="Body"/>
+      </w:pPr>
+      <w:r>
+        <w:t>[13] Bar-Yossef Z, Rajagopalan S. Template detection via data mining and its applications. Proc 11th Int World Wide Web Conf (WWW), 2002, p. 580–91. https://doi.org/10.1145/511446.511522.</w:t>
+      </w:r>
+    </w:p>
+    <w:p>
+      <w:pPr>
+        <w:pStyle w:val="Body"/>
+      </w:pPr>
+      <w:r>
+        <w:t>[14] Yi L, Liu B, Li X. Eliminating noisy information in web pages for data mining. Proc 9th ACM SIGKDD Int Conf Knowledge Discovery and Data Mining, 2003, p. 296–305. https://doi.org/10.1145/956750.956785.</w:t>
+      </w:r>
+    </w:p>
+    <w:p>
+      <w:pPr>
+        <w:pStyle w:val="Body"/>
+      </w:pPr>
+      <w:r>
+        <w:t>[15] Alarte J, Silva J, Tamarit S. What web template extractor should I use? A benchmarking and comparison for five template extractors. ACM Trans Web 2019;13(2):Art. 9. https://doi.org/10.1145/3316810.</w:t>
+      </w:r>
+    </w:p>
+    <w:p>
+      <w:pPr>
+        <w:pStyle w:val="Body"/>
+      </w:pPr>
+      <w:r>
+        <w:t>[16] Tan J, Dou Z, Wang W, Wang M, Chen W, Wen J-R. HtmlRAG: HTML is better than plain text for modeling retrieved knowledge in RAG systems. Proc ACM Web Conf 2025 (WWW '25), 2025, p. 1733–46. https://doi.org/10.1145/3696410.3714546.</w:t>
+      </w:r>
+    </w:p>
+    <w:p>
+      <w:pPr>
+        <w:pStyle w:val="Body"/>
+      </w:pPr>
+      <w:r>
+        <w:t>[17] Weinberger K, Dasgupta A, Langford J, Smola A, Attenberg J. Feature hashing for large scale multitask learning. Proc 26th Int Conf Machine Learning (ICML), 2009, p. 1113–20. https://doi.org/10.1145/1553374.1553516.</w:t>
+      </w:r>
+    </w:p>
+    <w:p>
+      <w:pPr>
+        <w:pStyle w:val="Body"/>
+      </w:pPr>
+      <w:r>
+        <w:t>[18] Peddapudi BC. ChromeRAG, version 0.1.4. Zenodo, 3 October 2026. https://doi.org/10.5281/zenodo.23126161 (all versions: https://doi.org/10.5281/zenodo.22970289). Source: https://github.com/pedapudibhargav/ChromeRAG.</w:t>
+      </w:r>
+    </w:p>
+    <w:p>
+      <w:pPr>
+        <w:pStyle w:val="Body"/>
+      </w:pPr>
+      <w:r>
+        <w:t>[19] Anthropic. Introducing contextual retrieval, 19 September 2024. https://www.anthropic.com/news/contextual-retrieval.</w:t>
+      </w:r>
+    </w:p>
+    <w:p>
+      <w:pPr>
+        <w:pStyle w:val="Body"/>
+      </w:pPr>
+      <w:r>
+        <w:t>[20] Wang F, Shi Z, Wang B, Wang N, Xiao H. ReaderLM-v2: small language model for HTML to Markdown and JSON. arXiv:2503.01151, 2025.</w:t>
+      </w:r>
+    </w:p>
+    <w:p>
+      <w:pPr>
+        <w:pStyle w:val="Body"/>
+      </w:pPr>
+      <w:r>
+        <w:t>[21] Reimers N, Gurevych I. Sentence-BERT: sentence embeddings using Siamese BERT-networks. Proc EMNLP-IJCNLP 2019, 2019, p. 3980–90. https://doi.org/10.18653/v1/D19-1410.</w:t>
       </w:r>
     </w:p>
     <w:sectPr>

</xml_diff>